<commit_message>
Regenerate DOCX with scientific paragraph-indent rule
Rebuilt both the 1-column and 2-column DOCX via the updated html2doc skill:
continuation paragraphs now carry a first-line indent (0.25" / 0.2") with no
blank line between them; paragraphs opening a section stay flush-left.

Co-Authored-By: Claude Opus 4.8 <noreply@anthropic.com>
</commit_message>
<xml_diff>
--- a/docs/coreasoning-2col.docx
+++ b/docs/coreasoning-2col.docx
@@ -109,6 +109,142 @@
       <w:pPr>
         <w:pStyle w:val="FirstParagraph"/>
         <w:jc w:val="both"/>
+        <w:keepNext w:val="0"/>
+        <w:keepLines w:val="0"/>
+        <w:widowControl w:val="1"/>
+      </w:pPr>
+      <w:r>
+        <w:t xml:space="preserve">Generative AI makes answers easy and understanding hard, and uncritical use invites cognitive offloading. Schools still measure</w:t>
+      </w:r>
+      <w:r>
+        <w:t xml:space="preserve"> </w:t>
+      </w:r>
+      <w:r>
+        <w:rPr>
+          <w:i/>
+          <w:iCs/>
+        </w:rPr>
+        <w:t xml:space="preserve">unaided</w:t>
+      </w:r>
+      <w:r>
+        <w:t xml:space="preserve"> </w:t>
+      </w:r>
+      <w:r>
+        <w:t xml:space="preserve">performance, yet the real task is to produce good work</w:t>
+      </w:r>
+      <w:r>
+        <w:t xml:space="preserve"> </w:t>
+      </w:r>
+      <w:r>
+        <w:rPr>
+          <w:i/>
+          <w:iCs/>
+        </w:rPr>
+        <w:t xml:space="preserve">with</w:t>
+      </w:r>
+      <w:r>
+        <w:t xml:space="preserve"> </w:t>
+      </w:r>
+      <w:r>
+        <w:t xml:space="preserve">AI: framing an ill-defined task, judging the output, and steering the model toward a better result. This ability is rarely assessed in its own right; where measured, it collapses into one "prompting" score that cannot diagnose</w:t>
+      </w:r>
+      <w:r>
+        <w:t xml:space="preserve"> </w:t>
+      </w:r>
+      <w:r>
+        <w:rPr>
+          <w:i/>
+          <w:iCs/>
+        </w:rPr>
+        <w:t xml:space="preserve">why</w:t>
+      </w:r>
+      <w:r>
+        <w:t xml:space="preserve"> </w:t>
+      </w:r>
+      <w:r>
+        <w:t xml:space="preserve">a learner's AI use succeeds or fails. We propose</w:t>
+      </w:r>
+      <w:r>
+        <w:t xml:space="preserve"> </w:t>
+      </w:r>
+      <w:r>
+        <w:rPr>
+          <w:b/>
+          <w:bCs/>
+        </w:rPr>
+        <w:t xml:space="preserve">CoReasoning</w:t>
+      </w:r>
+      <w:r>
+        <w:t xml:space="preserve">, a competency model factoring productive AI use into three assessable skills:</w:t>
+      </w:r>
+      <w:r>
+        <w:t xml:space="preserve"> </w:t>
+      </w:r>
+      <w:r>
+        <w:rPr>
+          <w:b/>
+          <w:bCs/>
+        </w:rPr>
+        <w:t xml:space="preserve">Framing</w:t>
+      </w:r>
+      <w:r>
+        <w:t xml:space="preserve"> </w:t>
+      </w:r>
+      <w:r>
+        <w:t xml:space="preserve">(specifying an ill-defined task before invoking AI),</w:t>
+      </w:r>
+      <w:r>
+        <w:t xml:space="preserve"> </w:t>
+      </w:r>
+      <w:r>
+        <w:rPr>
+          <w:b/>
+          <w:bCs/>
+        </w:rPr>
+        <w:t xml:space="preserve">Judging</w:t>
+      </w:r>
+      <w:r>
+        <w:t xml:space="preserve"> </w:t>
+      </w:r>
+      <w:r>
+        <w:t xml:space="preserve">(evaluating output for errors and unstated assumptions), and</w:t>
+      </w:r>
+      <w:r>
+        <w:t xml:space="preserve"> </w:t>
+      </w:r>
+      <w:r>
+        <w:rPr>
+          <w:b/>
+          <w:bCs/>
+        </w:rPr>
+        <w:t xml:space="preserve">Steering</w:t>
+      </w:r>
+      <w:r>
+        <w:t xml:space="preserve"> </w:t>
+      </w:r>
+      <w:r>
+        <w:t xml:space="preserve">(iteratively redirecting the model). Its distinguishing claim is the separation of pre-generation Framing from post-generation Steering, with Judging as the gate between. We ground the skills in theory, state five testable propositions, and instantiate them in</w:t>
+      </w:r>
+      <w:r>
+        <w:t xml:space="preserve"> </w:t>
+      </w:r>
+      <w:r>
+        <w:rPr>
+          <w:b/>
+          <w:bCs/>
+        </w:rPr>
+        <w:t xml:space="preserve">CoReasoning Lab</w:t>
+      </w:r>
+      <w:r>
+        <w:t xml:space="preserve">, an open platform that presents flawed AI output and scores the three skills independently. Over simulated learners (generated and graded by different models), the skills dissociate: each tracks its own manipulated competence while flat in the others, and grades become correlated when one competence is shared across all three (convergent and discriminant validity), across grader backends from two providers. Human-rater agreement and outcomes are the next steps; we release the instrument, data, and protocol.</w:t>
+      </w:r>
+    </w:p>
+    <w:p>
+      <w:pPr>
+        <w:rPr>
+          <w:sz w:val="4"/>
+          <w:szCs w:val="4"/>
+        </w:rPr>
         <w:sectPr>
           <w:footerReference w:type="default" r:id="rId9"/>
           <w:type w:val="continuous"/>
@@ -117,135 +253,7 @@
           <w:cols w:num="1" w:space="288"/>
           <w:docGrid w:linePitch="360"/>
         </w:sectPr>
-        <w:keepNext w:val="0"/>
-        <w:keepLines w:val="0"/>
-        <w:widowControl w:val="1"/>
-      </w:pPr>
-      <w:r>
-        <w:t xml:space="preserve">Generative AI makes answers easy and understanding hard, and uncritical use invites cognitive offloading. Schools still measure</w:t>
-      </w:r>
-      <w:r>
-        <w:t xml:space="preserve"> </w:t>
-      </w:r>
-      <w:r>
-        <w:rPr>
-          <w:i/>
-          <w:iCs/>
-        </w:rPr>
-        <w:t xml:space="preserve">unaided</w:t>
-      </w:r>
-      <w:r>
-        <w:t xml:space="preserve"> </w:t>
-      </w:r>
-      <w:r>
-        <w:t xml:space="preserve">performance, yet the real task is to produce good work</w:t>
-      </w:r>
-      <w:r>
-        <w:t xml:space="preserve"> </w:t>
-      </w:r>
-      <w:r>
-        <w:rPr>
-          <w:i/>
-          <w:iCs/>
-        </w:rPr>
-        <w:t xml:space="preserve">with</w:t>
-      </w:r>
-      <w:r>
-        <w:t xml:space="preserve"> </w:t>
-      </w:r>
-      <w:r>
-        <w:t xml:space="preserve">AI: framing an ill-defined task, judging the output, and steering the model toward a better result. This ability is rarely assessed in its own right; where measured, it collapses into one "prompting" score that cannot diagnose</w:t>
-      </w:r>
-      <w:r>
-        <w:t xml:space="preserve"> </w:t>
-      </w:r>
-      <w:r>
-        <w:rPr>
-          <w:i/>
-          <w:iCs/>
-        </w:rPr>
-        <w:t xml:space="preserve">why</w:t>
-      </w:r>
-      <w:r>
-        <w:t xml:space="preserve"> </w:t>
-      </w:r>
-      <w:r>
-        <w:t xml:space="preserve">a learner's AI use succeeds or fails. We propose</w:t>
-      </w:r>
-      <w:r>
-        <w:t xml:space="preserve"> </w:t>
-      </w:r>
-      <w:r>
-        <w:rPr>
-          <w:b/>
-          <w:bCs/>
-        </w:rPr>
-        <w:t xml:space="preserve">CoReasoning</w:t>
-      </w:r>
-      <w:r>
-        <w:t xml:space="preserve">, a competency model factoring productive AI use into three assessable skills:</w:t>
-      </w:r>
-      <w:r>
-        <w:t xml:space="preserve"> </w:t>
-      </w:r>
-      <w:r>
-        <w:rPr>
-          <w:b/>
-          <w:bCs/>
-        </w:rPr>
-        <w:t xml:space="preserve">Framing</w:t>
-      </w:r>
-      <w:r>
-        <w:t xml:space="preserve"> </w:t>
-      </w:r>
-      <w:r>
-        <w:t xml:space="preserve">(specifying an ill-defined task before invoking AI),</w:t>
-      </w:r>
-      <w:r>
-        <w:t xml:space="preserve"> </w:t>
-      </w:r>
-      <w:r>
-        <w:rPr>
-          <w:b/>
-          <w:bCs/>
-        </w:rPr>
-        <w:t xml:space="preserve">Judging</w:t>
-      </w:r>
-      <w:r>
-        <w:t xml:space="preserve"> </w:t>
-      </w:r>
-      <w:r>
-        <w:t xml:space="preserve">(evaluating output for errors and unstated assumptions), and</w:t>
-      </w:r>
-      <w:r>
-        <w:t xml:space="preserve"> </w:t>
-      </w:r>
-      <w:r>
-        <w:rPr>
-          <w:b/>
-          <w:bCs/>
-        </w:rPr>
-        <w:t xml:space="preserve">Steering</w:t>
-      </w:r>
-      <w:r>
-        <w:t xml:space="preserve"> </w:t>
-      </w:r>
-      <w:r>
-        <w:t xml:space="preserve">(iteratively redirecting the model). Its distinguishing claim is the separation of pre-generation Framing from post-generation Steering, with Judging as the gate between. We ground the skills in theory, state five testable propositions, and instantiate them in</w:t>
-      </w:r>
-      <w:r>
-        <w:t xml:space="preserve"> </w:t>
-      </w:r>
-      <w:r>
-        <w:rPr>
-          <w:b/>
-          <w:bCs/>
-        </w:rPr>
-        <w:t xml:space="preserve">CoReasoning Lab</w:t>
-      </w:r>
-      <w:r>
-        <w:t xml:space="preserve">, an open platform that presents flawed AI output and scores the three skills independently. Over simulated learners (generated and graded by different models), the skills dissociate: each tracks its own manipulated competence while flat in the others, and grades become correlated when one competence is shared across all three (convergent and discriminant validity), across grader backends from two providers. Human-rater agreement and outcomes are the next steps; we release the instrument, data, and protocol.</w:t>
-      </w:r>
+      </w:pPr>
     </w:p>
     <w:bookmarkEnd w:id="9"/>
     <w:bookmarkStart w:id="13" w:name="Xe3d0fc0bea9a42ce7605565d0964033d7f6ee47"/>
@@ -561,6 +569,68 @@
       <w:pPr>
         <w:pStyle w:val="BodyText"/>
         <w:jc w:val="both"/>
+        <w:keepNext w:val="0"/>
+        <w:keepLines w:val="0"/>
+        <w:widowControl w:val="1"/>
+      </w:pPr>
+      <w:r>
+        <w:t xml:space="preserve">This trajectory is not transient, and that is what raises the stakes for assessment. As models absorb</w:t>
+      </w:r>
+      <w:r>
+        <w:t xml:space="preserve"> </w:t>
+      </w:r>
+      <w:r>
+        <w:t xml:space="preserve">more of the execution, the human contribution does not disappear; it concentrates in the operations a</w:t>
+      </w:r>
+      <w:r>
+        <w:t xml:space="preserve"> </w:t>
+      </w:r>
+      <w:r>
+        <w:t xml:space="preserve">system cannot perform on its own behalf: choosing which problem is worth solving and specifying it,</w:t>
+      </w:r>
+      <w:r>
+        <w:t xml:space="preserve"> </w:t>
+      </w:r>
+      <w:r>
+        <w:t xml:space="preserve">judging whether a fluent output is actually right, and redirecting the model when it is not. The field</w:t>
+      </w:r>
+      <w:r>
+        <w:t xml:space="preserve"> </w:t>
+      </w:r>
+      <w:r>
+        <w:t xml:space="preserve">evidence that AI's value is conditional on the user's skill (Dell'Acqua et al., 2023; Vaccaro et al.,</w:t>
+      </w:r>
+      <w:r>
+        <w:t xml:space="preserve"> </w:t>
+      </w:r>
+      <w:r>
+        <w:t xml:space="preserve">2024) implies that this conditioning tightens rather than loosens as systems improve, so the durable,</w:t>
+      </w:r>
+      <w:r>
+        <w:t xml:space="preserve"> </w:t>
+      </w:r>
+      <w:r>
+        <w:t xml:space="preserve">assessable human skill shifts from executing a task to framing, judging, and steering it (Acar, 2023;</w:t>
+      </w:r>
+      <w:r>
+        <w:t xml:space="preserve"> </w:t>
+      </w:r>
+      <w:r>
+        <w:t xml:space="preserve">Denny et al., 2024) (Figure 1). An assessment that still measures unaided execution therefore measures</w:t>
+      </w:r>
+      <w:r>
+        <w:t xml:space="preserve"> </w:t>
+      </w:r>
+      <w:r>
+        <w:t xml:space="preserve">a shrinking part of what competent work will require.</w:t>
+      </w:r>
+    </w:p>
+    <w:p>
+      <w:pPr>
+        <w:rPr>
+          <w:sz w:val="4"/>
+          <w:szCs w:val="4"/>
+        </w:rPr>
         <w:sectPr>
           <w:type w:val="continuous"/>
           <w:pgSz w:h="15840" w:w="12240"/>
@@ -568,73 +638,12 @@
           <w:cols w:num="2" w:space="288" w:equalWidth="1"/>
           <w:docGrid w:linePitch="360"/>
         </w:sectPr>
-        <w:keepNext w:val="0"/>
-        <w:keepLines w:val="0"/>
-        <w:widowControl w:val="1"/>
-      </w:pPr>
-      <w:r>
-        <w:t xml:space="preserve">This trajectory is not transient, and that is what raises the stakes for assessment. As models absorb</w:t>
-      </w:r>
-      <w:r>
-        <w:t xml:space="preserve"> </w:t>
-      </w:r>
-      <w:r>
-        <w:t xml:space="preserve">more of the execution, the human contribution does not disappear; it concentrates in the operations a</w:t>
-      </w:r>
-      <w:r>
-        <w:t xml:space="preserve"> </w:t>
-      </w:r>
-      <w:r>
-        <w:t xml:space="preserve">system cannot perform on its own behalf: choosing which problem is worth solving and specifying it,</w:t>
-      </w:r>
-      <w:r>
-        <w:t xml:space="preserve"> </w:t>
-      </w:r>
-      <w:r>
-        <w:t xml:space="preserve">judging whether a fluent output is actually right, and redirecting the model when it is not. The field</w:t>
-      </w:r>
-      <w:r>
-        <w:t xml:space="preserve"> </w:t>
-      </w:r>
-      <w:r>
-        <w:t xml:space="preserve">evidence that AI's value is conditional on the user's skill (Dell'Acqua et al., 2023; Vaccaro et al.,</w:t>
-      </w:r>
-      <w:r>
-        <w:t xml:space="preserve"> </w:t>
-      </w:r>
-      <w:r>
-        <w:t xml:space="preserve">2024) implies that this conditioning tightens rather than loosens as systems improve, so the durable,</w:t>
-      </w:r>
-      <w:r>
-        <w:t xml:space="preserve"> </w:t>
-      </w:r>
-      <w:r>
-        <w:t xml:space="preserve">assessable human skill shifts from executing a task to framing, judging, and steering it (Acar, 2023;</w:t>
-      </w:r>
-      <w:r>
-        <w:t xml:space="preserve"> </w:t>
-      </w:r>
-      <w:r>
-        <w:t xml:space="preserve">Denny et al., 2024) (Figure 1). An assessment that still measures unaided execution therefore measures</w:t>
-      </w:r>
-      <w:r>
-        <w:t xml:space="preserve"> </w:t>
-      </w:r>
-      <w:r>
-        <w:t xml:space="preserve">a shrinking part of what competent work will require.</w:t>
-      </w:r>
+      </w:pPr>
     </w:p>
     <w:p>
       <w:pPr>
         <w:pStyle w:val="BodyText"/>
         <w:jc w:val="center"/>
-        <w:sectPr>
-          <w:type w:val="continuous"/>
-          <w:pgSz w:h="15840" w:w="12240"/>
-          <w:pgMar w:bottom="1080" w:footer="720" w:gutter="0" w:header="720" w:left="1080" w:right="1080" w:top="1080"/>
-          <w:cols w:num="1" w:space="288"/>
-          <w:docGrid w:linePitch="360"/>
-        </w:sectPr>
         <w:keepNext/>
         <w:keepLines/>
         <w:widowControl w:val="1"/>
@@ -649,7 +658,7 @@
               <a:graphicData uri="http://schemas.openxmlformats.org/drawingml/2006/picture">
                 <pic:pic>
                   <pic:nvPicPr>
-                    <pic:cNvPr descr="C:/Users/apart/AppData/Local/Temp/html2doc_svg_2FEAbc/svg_0.png" id="12" name="Picture"/>
+                    <pic:cNvPr descr="C:/Users/apart/AppData/Local/Temp/html2doc_svg_AVSlkV/svg_0.png" id="12" name="Picture"/>
                     <pic:cNvPicPr>
                       <a:picLocks noChangeArrowheads="1" noChangeAspect="1"/>
                     </pic:cNvPicPr>
@@ -684,6 +693,21 @@
     </w:p>
     <w:p>
       <w:pPr>
+        <w:rPr>
+          <w:sz w:val="4"/>
+          <w:szCs w:val="4"/>
+        </w:rPr>
+        <w:sectPr>
+          <w:type w:val="continuous"/>
+          <w:pgSz w:h="15840" w:w="12240"/>
+          <w:pgMar w:bottom="1080" w:footer="720" w:gutter="0" w:header="720" w:left="1080" w:right="1080" w:top="1080"/>
+          <w:cols w:num="1" w:space="288"/>
+          <w:docGrid w:linePitch="360"/>
+        </w:sectPr>
+      </w:pPr>
+    </w:p>
+    <w:p>
+      <w:pPr>
         <w:pStyle w:val="BodyText"/>
         <w:jc w:val="both"/>
         <w:keepNext w:val="0"/>
@@ -1680,6 +1704,32 @@
       <w:pPr>
         <w:pStyle w:val="FirstParagraph"/>
         <w:jc w:val="both"/>
+        <w:keepNext w:val="0"/>
+        <w:keepLines w:val="0"/>
+        <w:widowControl w:val="1"/>
+      </w:pPr>
+      <w:r>
+        <w:t xml:space="preserve">The Judge→Steer cycle is therefore a monitor→control loop seeded by a task definition. This is the</w:t>
+      </w:r>
+      <w:r>
+        <w:t xml:space="preserve"> </w:t>
+      </w:r>
+      <w:r>
+        <w:t xml:space="preserve">structural spine of the framework and the reason the three skills cohere rather than coexist by stipulation</w:t>
+      </w:r>
+      <w:r>
+        <w:t xml:space="preserve"> </w:t>
+      </w:r>
+      <w:r>
+        <w:t xml:space="preserve">(Figure 2).</w:t>
+      </w:r>
+    </w:p>
+    <w:p>
+      <w:pPr>
+        <w:rPr>
+          <w:sz w:val="4"/>
+          <w:szCs w:val="4"/>
+        </w:rPr>
         <w:sectPr>
           <w:type w:val="continuous"/>
           <w:pgSz w:h="15840" w:w="12240"/>
@@ -1687,25 +1737,7 @@
           <w:cols w:num="2" w:space="288" w:equalWidth="1"/>
           <w:docGrid w:linePitch="360"/>
         </w:sectPr>
-        <w:keepNext w:val="0"/>
-        <w:keepLines w:val="0"/>
-        <w:widowControl w:val="1"/>
-      </w:pPr>
-      <w:r>
-        <w:t xml:space="preserve">The Judge→Steer cycle is therefore a monitor→control loop seeded by a task definition. This is the</w:t>
-      </w:r>
-      <w:r>
-        <w:t xml:space="preserve"> </w:t>
-      </w:r>
-      <w:r>
-        <w:t xml:space="preserve">structural spine of the framework and the reason the three skills cohere rather than coexist by stipulation</w:t>
-      </w:r>
-      <w:r>
-        <w:t xml:space="preserve"> </w:t>
-      </w:r>
-      <w:r>
-        <w:t xml:space="preserve">(Figure 2).</w:t>
-      </w:r>
+      </w:pPr>
     </w:p>
     <w:p>
       <w:pPr>
@@ -1725,7 +1757,7 @@
               <a:graphicData uri="http://schemas.openxmlformats.org/drawingml/2006/picture">
                 <pic:pic>
                   <pic:nvPicPr>
-                    <pic:cNvPr descr="C:/Users/apart/AppData/Local/Temp/html2doc_svg_2FEAbc/svg_1.png" id="17" name="Picture"/>
+                    <pic:cNvPr descr="C:/Users/apart/AppData/Local/Temp/html2doc_svg_AVSlkV/svg_1.png" id="17" name="Picture"/>
                     <pic:cNvPicPr>
                       <a:picLocks noChangeArrowheads="1" noChangeAspect="1"/>
                     </pic:cNvPicPr>
@@ -1763,6 +1795,66 @@
         <w:pStyle w:val="ImageCaption"/>
         <w:spacing w:before="80" w:after="120" w:line="240" w:lineRule="auto"/>
         <w:jc w:val="center"/>
+        <w:keepNext w:val="0"/>
+        <w:keepLines/>
+        <w:widowControl w:val="1"/>
+      </w:pPr>
+      <w:r>
+        <w:rPr>
+          <w:i/>
+          <w:iCs/>
+        </w:rPr>
+        <w:t xml:space="preserve">Figure 2. The CoReasoning loop. An upstream task definition (Framing, a self-regulated-learning</w:t>
+      </w:r>
+      <w:r>
+        <w:rPr>
+          <w:i/>
+          <w:iCs/>
+        </w:rPr>
+        <w:t xml:space="preserve"> </w:t>
+      </w:r>
+      <w:r>
+        <w:rPr>
+          <w:i/>
+          <w:iCs/>
+        </w:rPr>
+        <w:t xml:space="preserve">forethought activity) sets the standards against which a metacognitive monitor-control cycle (Judging</w:t>
+      </w:r>
+      <w:r>
+        <w:rPr>
+          <w:i/>
+          <w:iCs/>
+        </w:rPr>
+        <w:t xml:space="preserve"> </w:t>
+      </w:r>
+      <w:r>
+        <w:rPr>
+          <w:i/>
+          <w:iCs/>
+        </w:rPr>
+        <w:t xml:space="preserve">then Steering) supervises a fallible AI at the object level. Judging is the monitor's read-out;</w:t>
+      </w:r>
+      <w:r>
+        <w:rPr>
+          <w:i/>
+          <w:iCs/>
+        </w:rPr>
+        <w:t xml:space="preserve"> </w:t>
+      </w:r>
+      <w:r>
+        <w:rPr>
+          <w:i/>
+          <w:iCs/>
+        </w:rPr>
+        <w:t xml:space="preserve">Steering is the controller's write.</w:t>
+      </w:r>
+    </w:p>
+    <w:p>
+      <w:pPr>
+        <w:rPr>
+          <w:sz w:val="4"/>
+          <w:szCs w:val="4"/>
+        </w:rPr>
         <w:sectPr>
           <w:type w:val="continuous"/>
           <w:pgSz w:h="15840" w:w="12240"/>
@@ -1770,59 +1862,7 @@
           <w:cols w:num="1" w:space="288"/>
           <w:docGrid w:linePitch="360"/>
         </w:sectPr>
-        <w:keepNext w:val="0"/>
-        <w:keepLines/>
-        <w:widowControl w:val="1"/>
-      </w:pPr>
-      <w:r>
-        <w:rPr>
-          <w:i/>
-          <w:iCs/>
-        </w:rPr>
-        <w:t xml:space="preserve">Figure 2. The CoReasoning loop. An upstream task definition (Framing, a self-regulated-learning</w:t>
-      </w:r>
-      <w:r>
-        <w:rPr>
-          <w:i/>
-          <w:iCs/>
-        </w:rPr>
-        <w:t xml:space="preserve"> </w:t>
-      </w:r>
-      <w:r>
-        <w:rPr>
-          <w:i/>
-          <w:iCs/>
-        </w:rPr>
-        <w:t xml:space="preserve">forethought activity) sets the standards against which a metacognitive monitor-control cycle (Judging</w:t>
-      </w:r>
-      <w:r>
-        <w:rPr>
-          <w:i/>
-          <w:iCs/>
-        </w:rPr>
-        <w:t xml:space="preserve"> </w:t>
-      </w:r>
-      <w:r>
-        <w:rPr>
-          <w:i/>
-          <w:iCs/>
-        </w:rPr>
-        <w:t xml:space="preserve">then Steering) supervises a fallible AI at the object level. Judging is the monitor's read-out;</w:t>
-      </w:r>
-      <w:r>
-        <w:rPr>
-          <w:i/>
-          <w:iCs/>
-        </w:rPr>
-        <w:t xml:space="preserve"> </w:t>
-      </w:r>
-      <w:r>
-        <w:rPr>
-          <w:i/>
-          <w:iCs/>
-        </w:rPr>
-        <w:t xml:space="preserve">Steering is the controller's write.</w:t>
-      </w:r>
+      </w:pPr>
     </w:p>
     <w:bookmarkEnd w:id="18"/>
     <w:bookmarkStart w:id="19" w:name="X1eb66af04d4702fef1ddf2edf668648ed034024"/>
@@ -3281,6 +3321,48 @@
       <w:pPr>
         <w:pStyle w:val="BodyText"/>
         <w:jc w:val="both"/>
+        <w:keepNext w:val="0"/>
+        <w:keepLines w:val="0"/>
+        <w:widowControl w:val="1"/>
+      </w:pPr>
+      <w:r>
+        <w:t xml:space="preserve">Table 1 makes the boundary explicit by mapping each nearest prior framework's constructs onto</w:t>
+      </w:r>
+      <w:r>
+        <w:t xml:space="preserve"> </w:t>
+      </w:r>
+      <w:r>
+        <w:t xml:space="preserve">Framing, Judging, and Steering. The recurring pattern is that prior frameworks either (i) omit a</w:t>
+      </w:r>
+      <w:r>
+        <w:t xml:space="preserve"> </w:t>
+      </w:r>
+      <w:r>
+        <w:t xml:space="preserve">construct, or (ii)</w:t>
+      </w:r>
+      <w:r>
+        <w:t xml:space="preserve"> </w:t>
+      </w:r>
+      <w:r>
+        <w:rPr>
+          <w:i/>
+          <w:iCs/>
+        </w:rPr>
+        <w:t xml:space="preserve">fuse</w:t>
+      </w:r>
+      <w:r>
+        <w:t xml:space="preserve"> </w:t>
+      </w:r>
+      <w:r>
+        <w:t xml:space="preserve">Framing and Steering into one "prompting/iteration" skill.</w:t>
+      </w:r>
+    </w:p>
+    <w:p>
+      <w:pPr>
+        <w:rPr>
+          <w:sz w:val="4"/>
+          <w:szCs w:val="4"/>
+        </w:rPr>
         <w:sectPr>
           <w:type w:val="continuous"/>
           <w:pgSz w:h="15840" w:w="12240"/>
@@ -3288,41 +3370,7 @@
           <w:cols w:num="2" w:space="288" w:equalWidth="1"/>
           <w:docGrid w:linePitch="360"/>
         </w:sectPr>
-        <w:keepNext w:val="0"/>
-        <w:keepLines w:val="0"/>
-        <w:widowControl w:val="1"/>
-      </w:pPr>
-      <w:r>
-        <w:t xml:space="preserve">Table 1 makes the boundary explicit by mapping each nearest prior framework's constructs onto</w:t>
-      </w:r>
-      <w:r>
-        <w:t xml:space="preserve"> </w:t>
-      </w:r>
-      <w:r>
-        <w:t xml:space="preserve">Framing, Judging, and Steering. The recurring pattern is that prior frameworks either (i) omit a</w:t>
-      </w:r>
-      <w:r>
-        <w:t xml:space="preserve"> </w:t>
-      </w:r>
-      <w:r>
-        <w:t xml:space="preserve">construct, or (ii)</w:t>
-      </w:r>
-      <w:r>
-        <w:t xml:space="preserve"> </w:t>
-      </w:r>
-      <w:r>
-        <w:rPr>
-          <w:i/>
-          <w:iCs/>
-        </w:rPr>
-        <w:t xml:space="preserve">fuse</w:t>
-      </w:r>
-      <w:r>
-        <w:t xml:space="preserve"> </w:t>
-      </w:r>
-      <w:r>
-        <w:t xml:space="preserve">Framing and Steering into one "prompting/iteration" skill.</w:t>
-      </w:r>
+      </w:pPr>
     </w:p>
     <w:p>
       <w:pPr>
@@ -4085,6 +4133,10 @@
     </w:tbl>
     <w:p>
       <w:pPr>
+        <w:rPr>
+          <w:sz w:val="4"/>
+          <w:szCs w:val="4"/>
+        </w:rPr>
         <w:sectPr>
           <w:type w:val="continuous"/>
           <w:pgSz w:h="15840" w:w="12240"/>
@@ -5684,6 +5736,161 @@
       <w:pPr>
         <w:pStyle w:val="BodyText"/>
         <w:jc w:val="both"/>
+        <w:keepNext w:val="0"/>
+        <w:keepLines w:val="0"/>
+        <w:widowControl w:val="1"/>
+      </w:pPr>
+      <w:r>
+        <w:rPr>
+          <w:b/>
+          <w:bCs/>
+        </w:rPr>
+        <w:t xml:space="preserve">Dissociation (the central result).</w:t>
+      </w:r>
+      <w:r>
+        <w:t xml:space="preserve"> </w:t>
+      </w:r>
+      <w:r>
+        <w:t xml:space="preserve">Table 2 reports, for each graded skill, the change in its mean</w:t>
+      </w:r>
+      <w:r>
+        <w:t xml:space="preserve"> </w:t>
+      </w:r>
+      <w:r>
+        <w:t xml:space="preserve">grade (on a 3-point scale, A=3..C=1) when each skill in turn is moved from weak to strong. The result</w:t>
+      </w:r>
+      <w:r>
+        <w:t xml:space="preserve"> </w:t>
+      </w:r>
+      <w:r>
+        <w:t xml:space="preserve">that carries the claim is the two</w:t>
+      </w:r>
+      <w:r>
+        <w:t xml:space="preserve"> </w:t>
+      </w:r>
+      <w:r>
+        <w:rPr>
+          <w:i/>
+          <w:iCs/>
+        </w:rPr>
+        <w:t xml:space="preserve">blind-graded</w:t>
+      </w:r>
+      <w:r>
+        <w:t xml:space="preserve"> </w:t>
+      </w:r>
+      <w:r>
+        <w:t xml:space="preserve">skills, Framing and Steering, whose free-text responses</w:t>
+      </w:r>
+      <w:r>
+        <w:t xml:space="preserve"> </w:t>
+      </w:r>
+      <w:r>
+        <w:t xml:space="preserve">the grader scores without knowing the intended competence: each shows a clear positive own-effect</w:t>
+      </w:r>
+      <w:r>
+        <w:t xml:space="preserve"> </w:t>
+      </w:r>
+      <w:r>
+        <w:t xml:space="preserve">(</w:t>
+      </w:r>
+      <w:r>
+        <w:rPr>
+          <w:b/>
+          <w:bCs/>
+        </w:rPr>
+        <w:t xml:space="preserve">+0.62</w:t>
+      </w:r>
+      <w:r>
+        <w:t xml:space="preserve"> </w:t>
+      </w:r>
+      <w:r>
+        <w:t xml:space="preserve">and</w:t>
+      </w:r>
+      <w:r>
+        <w:t xml:space="preserve"> </w:t>
+      </w:r>
+      <w:r>
+        <w:rPr>
+          <w:b/>
+          <w:bCs/>
+        </w:rPr>
+        <w:t xml:space="preserve">+0.43</w:t>
+      </w:r>
+      <w:r>
+        <w:t xml:space="preserve">) with near-zero cross-effects, so a simulated learner's two free-text grades</w:t>
+      </w:r>
+      <w:r>
+        <w:t xml:space="preserve"> </w:t>
+      </w:r>
+      <w:r>
+        <w:t xml:space="preserve">move independently. Judging's own-effect (</w:t>
+      </w:r>
+      <w:r>
+        <w:rPr>
+          <w:b/>
+          <w:bCs/>
+        </w:rPr>
+        <w:t xml:space="preserve">+2.00</w:t>
+      </w:r>
+      <w:r>
+        <w:t xml:space="preserve">) is large but</w:t>
+      </w:r>
+      <w:r>
+        <w:t xml:space="preserve"> </w:t>
+      </w:r>
+      <w:r>
+        <w:rPr>
+          <w:i/>
+          <w:iCs/>
+        </w:rPr>
+        <w:t xml:space="preserve">fixed by construction</w:t>
+      </w:r>
+      <w:r>
+        <w:t xml:space="preserve">: its</w:t>
+      </w:r>
+      <w:r>
+        <w:t xml:space="preserve"> </w:t>
+      </w:r>
+      <w:r>
+        <w:t xml:space="preserve">competence is operationalized by a controlled selection over the challenge's seeded issues, and those</w:t>
+      </w:r>
+      <w:r>
+        <w:t xml:space="preserve"> </w:t>
+      </w:r>
+      <w:r>
+        <w:t xml:space="preserve">seeded issues are themselves machine-generated and not yet human-verified (Section 11). We therefore</w:t>
+      </w:r>
+      <w:r>
+        <w:t xml:space="preserve"> </w:t>
+      </w:r>
+      <w:r>
+        <w:t xml:space="preserve">read Judging's clean diagonal as a controlled check that the grader correctly rewards recall and</w:t>
+      </w:r>
+      <w:r>
+        <w:t xml:space="preserve"> </w:t>
+      </w:r>
+      <w:r>
+        <w:t xml:space="preserve">precision, not as independent evidence that the skills separate. The off-diagonal (cross-skill) effects</w:t>
+      </w:r>
+      <w:r>
+        <w:t xml:space="preserve"> </w:t>
+      </w:r>
+      <w:r>
+        <w:t xml:space="preserve">average +0.01 across the matrix, so each grade responds to its own skill and is essentially flat in the</w:t>
+      </w:r>
+      <w:r>
+        <w:t xml:space="preserve"> </w:t>
+      </w:r>
+      <w:r>
+        <w:t xml:space="preserve">others (Figure 3).</w:t>
+      </w:r>
+    </w:p>
+    <w:p>
+      <w:pPr>
+        <w:rPr>
+          <w:sz w:val="4"/>
+          <w:szCs w:val="4"/>
+        </w:rPr>
         <w:sectPr>
           <w:type w:val="continuous"/>
           <w:pgSz w:h="15840" w:w="12240"/>
@@ -5691,154 +5898,7 @@
           <w:cols w:num="2" w:space="288" w:equalWidth="1"/>
           <w:docGrid w:linePitch="360"/>
         </w:sectPr>
-        <w:keepNext w:val="0"/>
-        <w:keepLines w:val="0"/>
-        <w:widowControl w:val="1"/>
-      </w:pPr>
-      <w:r>
-        <w:rPr>
-          <w:b/>
-          <w:bCs/>
-        </w:rPr>
-        <w:t xml:space="preserve">Dissociation (the central result).</w:t>
-      </w:r>
-      <w:r>
-        <w:t xml:space="preserve"> </w:t>
-      </w:r>
-      <w:r>
-        <w:t xml:space="preserve">Table 2 reports, for each graded skill, the change in its mean</w:t>
-      </w:r>
-      <w:r>
-        <w:t xml:space="preserve"> </w:t>
-      </w:r>
-      <w:r>
-        <w:t xml:space="preserve">grade (on a 3-point scale, A=3..C=1) when each skill in turn is moved from weak to strong. The result</w:t>
-      </w:r>
-      <w:r>
-        <w:t xml:space="preserve"> </w:t>
-      </w:r>
-      <w:r>
-        <w:t xml:space="preserve">that carries the claim is the two</w:t>
-      </w:r>
-      <w:r>
-        <w:t xml:space="preserve"> </w:t>
-      </w:r>
-      <w:r>
-        <w:rPr>
-          <w:i/>
-          <w:iCs/>
-        </w:rPr>
-        <w:t xml:space="preserve">blind-graded</w:t>
-      </w:r>
-      <w:r>
-        <w:t xml:space="preserve"> </w:t>
-      </w:r>
-      <w:r>
-        <w:t xml:space="preserve">skills, Framing and Steering, whose free-text responses</w:t>
-      </w:r>
-      <w:r>
-        <w:t xml:space="preserve"> </w:t>
-      </w:r>
-      <w:r>
-        <w:t xml:space="preserve">the grader scores without knowing the intended competence: each shows a clear positive own-effect</w:t>
-      </w:r>
-      <w:r>
-        <w:t xml:space="preserve"> </w:t>
-      </w:r>
-      <w:r>
-        <w:t xml:space="preserve">(</w:t>
-      </w:r>
-      <w:r>
-        <w:rPr>
-          <w:b/>
-          <w:bCs/>
-        </w:rPr>
-        <w:t xml:space="preserve">+0.62</w:t>
-      </w:r>
-      <w:r>
-        <w:t xml:space="preserve"> </w:t>
-      </w:r>
-      <w:r>
-        <w:t xml:space="preserve">and</w:t>
-      </w:r>
-      <w:r>
-        <w:t xml:space="preserve"> </w:t>
-      </w:r>
-      <w:r>
-        <w:rPr>
-          <w:b/>
-          <w:bCs/>
-        </w:rPr>
-        <w:t xml:space="preserve">+0.43</w:t>
-      </w:r>
-      <w:r>
-        <w:t xml:space="preserve">) with near-zero cross-effects, so a simulated learner's two free-text grades</w:t>
-      </w:r>
-      <w:r>
-        <w:t xml:space="preserve"> </w:t>
-      </w:r>
-      <w:r>
-        <w:t xml:space="preserve">move independently. Judging's own-effect (</w:t>
-      </w:r>
-      <w:r>
-        <w:rPr>
-          <w:b/>
-          <w:bCs/>
-        </w:rPr>
-        <w:t xml:space="preserve">+2.00</w:t>
-      </w:r>
-      <w:r>
-        <w:t xml:space="preserve">) is large but</w:t>
-      </w:r>
-      <w:r>
-        <w:t xml:space="preserve"> </w:t>
-      </w:r>
-      <w:r>
-        <w:rPr>
-          <w:i/>
-          <w:iCs/>
-        </w:rPr>
-        <w:t xml:space="preserve">fixed by construction</w:t>
-      </w:r>
-      <w:r>
-        <w:t xml:space="preserve">: its</w:t>
-      </w:r>
-      <w:r>
-        <w:t xml:space="preserve"> </w:t>
-      </w:r>
-      <w:r>
-        <w:t xml:space="preserve">competence is operationalized by a controlled selection over the challenge's seeded issues, and those</w:t>
-      </w:r>
-      <w:r>
-        <w:t xml:space="preserve"> </w:t>
-      </w:r>
-      <w:r>
-        <w:t xml:space="preserve">seeded issues are themselves machine-generated and not yet human-verified (Section 11). We therefore</w:t>
-      </w:r>
-      <w:r>
-        <w:t xml:space="preserve"> </w:t>
-      </w:r>
-      <w:r>
-        <w:t xml:space="preserve">read Judging's clean diagonal as a controlled check that the grader correctly rewards recall and</w:t>
-      </w:r>
-      <w:r>
-        <w:t xml:space="preserve"> </w:t>
-      </w:r>
-      <w:r>
-        <w:t xml:space="preserve">precision, not as independent evidence that the skills separate. The off-diagonal (cross-skill) effects</w:t>
-      </w:r>
-      <w:r>
-        <w:t xml:space="preserve"> </w:t>
-      </w:r>
-      <w:r>
-        <w:t xml:space="preserve">average +0.01 across the matrix, so each grade responds to its own skill and is essentially flat in the</w:t>
-      </w:r>
-      <w:r>
-        <w:t xml:space="preserve"> </w:t>
-      </w:r>
-      <w:r>
-        <w:t xml:space="preserve">others (Figure 3).</w:t>
-      </w:r>
+      </w:pPr>
     </w:p>
     <w:p>
       <w:pPr>
@@ -6345,6 +6405,10 @@
     </w:tbl>
     <w:p>
       <w:pPr>
+        <w:rPr>
+          <w:sz w:val="4"/>
+          <w:szCs w:val="4"/>
+        </w:rPr>
         <w:sectPr>
           <w:type w:val="continuous"/>
           <w:pgSz w:h="15840" w:w="12240"/>
@@ -6590,13 +6654,6 @@
       <w:pPr>
         <w:pStyle w:val="BodyText"/>
         <w:jc w:val="both"/>
-        <w:sectPr>
-          <w:type w:val="continuous"/>
-          <w:pgSz w:h="15840" w:w="12240"/>
-          <w:pgMar w:bottom="1080" w:footer="720" w:gutter="0" w:header="720" w:left="1080" w:right="1080" w:top="1080"/>
-          <w:cols w:num="2" w:space="288" w:equalWidth="1"/>
-          <w:docGrid w:linePitch="360"/>
-        </w:sectPr>
         <w:keepNext w:val="0"/>
         <w:keepLines w:val="0"/>
         <w:widowControl w:val="1"/>
@@ -6953,6 +7010,21 @@
       <w:r>
         <w:t xml:space="preserve">skills rather than of the scoring (Table 3).</w:t>
       </w:r>
+    </w:p>
+    <w:p>
+      <w:pPr>
+        <w:rPr>
+          <w:sz w:val="4"/>
+          <w:szCs w:val="4"/>
+        </w:rPr>
+        <w:sectPr>
+          <w:type w:val="continuous"/>
+          <w:pgSz w:h="15840" w:w="12240"/>
+          <w:pgMar w:bottom="1080" w:footer="720" w:gutter="0" w:header="720" w:left="1080" w:right="1080" w:top="1080"/>
+          <w:cols w:num="2" w:space="288" w:equalWidth="1"/>
+          <w:docGrid w:linePitch="360"/>
+        </w:sectPr>
+      </w:pPr>
     </w:p>
     <w:p>
       <w:pPr>
@@ -7274,6 +7346,10 @@
     </w:tbl>
     <w:p>
       <w:pPr>
+        <w:rPr>
+          <w:sz w:val="4"/>
+          <w:szCs w:val="4"/>
+        </w:rPr>
         <w:sectPr>
           <w:type w:val="continuous"/>
           <w:pgSz w:h="15840" w:w="12240"/>
@@ -7283,8 +7359,13 @@
         </w:sectPr>
       </w:pPr>
     </w:p>
+    <w:p/>
     <w:p>
       <w:pPr>
+        <w:rPr>
+          <w:sz w:val="4"/>
+          <w:szCs w:val="4"/>
+        </w:rPr>
         <w:sectPr>
           <w:type w:val="continuous"/>
           <w:pgSz w:h="15840" w:w="12240"/>
@@ -7841,6 +7922,10 @@
     </w:tbl>
     <w:p>
       <w:pPr>
+        <w:rPr>
+          <w:sz w:val="4"/>
+          <w:szCs w:val="4"/>
+        </w:rPr>
         <w:sectPr>
           <w:type w:val="continuous"/>
           <w:pgSz w:h="15840" w:w="12240"/>
@@ -7854,6 +7939,156 @@
       <w:pPr>
         <w:pStyle w:val="BodyText"/>
         <w:jc w:val="both"/>
+        <w:keepNext w:val="0"/>
+        <w:keepLines w:val="0"/>
+        <w:widowControl w:val="1"/>
+      </w:pPr>
+      <w:r>
+        <w:t xml:space="preserve">The own-skill effects are directionally consistent across subjects: broken down by the ten subject</w:t>
+      </w:r>
+      <w:r>
+        <w:t xml:space="preserve"> </w:t>
+      </w:r>
+      <w:r>
+        <w:t xml:space="preserve">areas (eight learners each), Framing and Steering each show a positive own-competence effect in nine of</w:t>
+      </w:r>
+      <w:r>
+        <w:t xml:space="preserve"> </w:t>
+      </w:r>
+      <w:r>
+        <w:t xml:space="preserve">ten subjects, with the two exceptions (Framing in statistics, Steering in microeconomics) reflecting</w:t>
+      </w:r>
+      <w:r>
+        <w:t xml:space="preserve"> </w:t>
+      </w:r>
+      <w:r>
+        <w:t xml:space="preserve">the small per-subject sample rather than a sign reversal; Judging is fixed by construction in every</w:t>
+      </w:r>
+      <w:r>
+        <w:t xml:space="preserve"> </w:t>
+      </w:r>
+      <w:r>
+        <w:t xml:space="preserve">subject. The own-competence effect is therefore not driven by any single domain; the pooled own-effects</w:t>
+      </w:r>
+      <w:r>
+        <w:t xml:space="preserve"> </w:t>
+      </w:r>
+      <w:r>
+        <w:t xml:space="preserve">and their confidence intervals above carry the estimate, and the per-subject pattern shows it holds</w:t>
+      </w:r>
+      <w:r>
+        <w:t xml:space="preserve"> </w:t>
+      </w:r>
+      <w:r>
+        <w:t xml:space="preserve">broadly across the curriculum. The designed-contrast personas make the separation concrete (Figure 4, which plots five</w:t>
+      </w:r>
+      <w:r>
+        <w:t xml:space="preserve"> </w:t>
+      </w:r>
+      <w:r>
+        <w:t xml:space="preserve">profiles). Three are especially telling: a</w:t>
+      </w:r>
+      <w:r>
+        <w:t xml:space="preserve"> </w:t>
+      </w:r>
+      <w:r>
+        <w:rPr>
+          <w:i/>
+          <w:iCs/>
+        </w:rPr>
+        <w:t xml:space="preserve">weak-framer / strong-judge</w:t>
+      </w:r>
+      <w:r>
+        <w:t xml:space="preserve"> </w:t>
+      </w:r>
+      <w:r>
+        <w:t xml:space="preserve">learner scores Framing C but</w:t>
+      </w:r>
+      <w:r>
+        <w:t xml:space="preserve"> </w:t>
+      </w:r>
+      <w:r>
+        <w:t xml:space="preserve">Judging A; a</w:t>
+      </w:r>
+      <w:r>
+        <w:t xml:space="preserve"> </w:t>
+      </w:r>
+      <w:r>
+        <w:rPr>
+          <w:i/>
+          <w:iCs/>
+        </w:rPr>
+        <w:t xml:space="preserve">strong-framer / weak-judge</w:t>
+      </w:r>
+      <w:r>
+        <w:t xml:space="preserve"> </w:t>
+      </w:r>
+      <w:r>
+        <w:t xml:space="preserve">learner inverts this to Framing B, Judging C; and a</w:t>
+      </w:r>
+      <w:r>
+        <w:t xml:space="preserve"> </w:t>
+      </w:r>
+      <w:r>
+        <w:rPr>
+          <w:i/>
+          <w:iCs/>
+        </w:rPr>
+        <w:t xml:space="preserve">weak / weak / strong-steerer</w:t>
+      </w:r>
+      <w:r>
+        <w:t xml:space="preserve"> </w:t>
+      </w:r>
+      <w:r>
+        <w:t xml:space="preserve">elevates only Steering. A single underlying "AI-use</w:t>
+      </w:r>
+      <w:r>
+        <w:t xml:space="preserve"> </w:t>
+      </w:r>
+      <w:r>
+        <w:t xml:space="preserve">ability" cannot produce these crossed profiles. Converging evidence comes from outside our synthetic</w:t>
+      </w:r>
+      <w:r>
+        <w:t xml:space="preserve"> </w:t>
+      </w:r>
+      <w:r>
+        <w:t xml:space="preserve">setting. In an intervention study, students'</w:t>
+      </w:r>
+      <w:r>
+        <w:t xml:space="preserve"> </w:t>
+      </w:r>
+      <w:r>
+        <w:rPr>
+          <w:i/>
+          <w:iCs/>
+        </w:rPr>
+        <w:t xml:space="preserve">behavioral</w:t>
+      </w:r>
+      <w:r>
+        <w:t xml:space="preserve"> </w:t>
+      </w:r>
+      <w:r>
+        <w:t xml:space="preserve">regulation of LLM use (reformulating queries,</w:t>
+      </w:r>
+      <w:r>
+        <w:t xml:space="preserve"> </w:t>
+      </w:r>
+      <w:r>
+        <w:t xml:space="preserve">checking correctness) predicts effective use, whereas self-rated AI expertise does not (Clerc et al.,</w:t>
+      </w:r>
+      <w:r>
+        <w:t xml:space="preserve"> </w:t>
+      </w:r>
+      <w:r>
+        <w:t xml:space="preserve">2026). The skill of working with AI is thus distinct from a general, self-assessed competence.</w:t>
+      </w:r>
+    </w:p>
+    <w:p>
+      <w:pPr>
+        <w:rPr>
+          <w:sz w:val="4"/>
+          <w:szCs w:val="4"/>
+        </w:rPr>
         <w:sectPr>
           <w:type w:val="continuous"/>
           <w:pgSz w:h="15840" w:w="12240"/>
@@ -7861,149 +8096,7 @@
           <w:cols w:num="2" w:space="288" w:equalWidth="1"/>
           <w:docGrid w:linePitch="360"/>
         </w:sectPr>
-        <w:keepNext w:val="0"/>
-        <w:keepLines w:val="0"/>
-        <w:widowControl w:val="1"/>
-      </w:pPr>
-      <w:r>
-        <w:t xml:space="preserve">The own-skill effects are directionally consistent across subjects: broken down by the ten subject</w:t>
-      </w:r>
-      <w:r>
-        <w:t xml:space="preserve"> </w:t>
-      </w:r>
-      <w:r>
-        <w:t xml:space="preserve">areas (eight learners each), Framing and Steering each show a positive own-competence effect in nine of</w:t>
-      </w:r>
-      <w:r>
-        <w:t xml:space="preserve"> </w:t>
-      </w:r>
-      <w:r>
-        <w:t xml:space="preserve">ten subjects, with the two exceptions (Framing in statistics, Steering in microeconomics) reflecting</w:t>
-      </w:r>
-      <w:r>
-        <w:t xml:space="preserve"> </w:t>
-      </w:r>
-      <w:r>
-        <w:t xml:space="preserve">the small per-subject sample rather than a sign reversal; Judging is fixed by construction in every</w:t>
-      </w:r>
-      <w:r>
-        <w:t xml:space="preserve"> </w:t>
-      </w:r>
-      <w:r>
-        <w:t xml:space="preserve">subject. The own-competence effect is therefore not driven by any single domain; the pooled own-effects</w:t>
-      </w:r>
-      <w:r>
-        <w:t xml:space="preserve"> </w:t>
-      </w:r>
-      <w:r>
-        <w:t xml:space="preserve">and their confidence intervals above carry the estimate, and the per-subject pattern shows it holds</w:t>
-      </w:r>
-      <w:r>
-        <w:t xml:space="preserve"> </w:t>
-      </w:r>
-      <w:r>
-        <w:t xml:space="preserve">broadly across the curriculum. The designed-contrast personas make the separation concrete (Figure 4, which plots five</w:t>
-      </w:r>
-      <w:r>
-        <w:t xml:space="preserve"> </w:t>
-      </w:r>
-      <w:r>
-        <w:t xml:space="preserve">profiles). Three are especially telling: a</w:t>
-      </w:r>
-      <w:r>
-        <w:t xml:space="preserve"> </w:t>
-      </w:r>
-      <w:r>
-        <w:rPr>
-          <w:i/>
-          <w:iCs/>
-        </w:rPr>
-        <w:t xml:space="preserve">weak-framer / strong-judge</w:t>
-      </w:r>
-      <w:r>
-        <w:t xml:space="preserve"> </w:t>
-      </w:r>
-      <w:r>
-        <w:t xml:space="preserve">learner scores Framing C but</w:t>
-      </w:r>
-      <w:r>
-        <w:t xml:space="preserve"> </w:t>
-      </w:r>
-      <w:r>
-        <w:t xml:space="preserve">Judging A; a</w:t>
-      </w:r>
-      <w:r>
-        <w:t xml:space="preserve"> </w:t>
-      </w:r>
-      <w:r>
-        <w:rPr>
-          <w:i/>
-          <w:iCs/>
-        </w:rPr>
-        <w:t xml:space="preserve">strong-framer / weak-judge</w:t>
-      </w:r>
-      <w:r>
-        <w:t xml:space="preserve"> </w:t>
-      </w:r>
-      <w:r>
-        <w:t xml:space="preserve">learner inverts this to Framing B, Judging C; and a</w:t>
-      </w:r>
-      <w:r>
-        <w:t xml:space="preserve"> </w:t>
-      </w:r>
-      <w:r>
-        <w:rPr>
-          <w:i/>
-          <w:iCs/>
-        </w:rPr>
-        <w:t xml:space="preserve">weak / weak / strong-steerer</w:t>
-      </w:r>
-      <w:r>
-        <w:t xml:space="preserve"> </w:t>
-      </w:r>
-      <w:r>
-        <w:t xml:space="preserve">elevates only Steering. A single underlying "AI-use</w:t>
-      </w:r>
-      <w:r>
-        <w:t xml:space="preserve"> </w:t>
-      </w:r>
-      <w:r>
-        <w:t xml:space="preserve">ability" cannot produce these crossed profiles. Converging evidence comes from outside our synthetic</w:t>
-      </w:r>
-      <w:r>
-        <w:t xml:space="preserve"> </w:t>
-      </w:r>
-      <w:r>
-        <w:t xml:space="preserve">setting. In an intervention study, students'</w:t>
-      </w:r>
-      <w:r>
-        <w:t xml:space="preserve"> </w:t>
-      </w:r>
-      <w:r>
-        <w:rPr>
-          <w:i/>
-          <w:iCs/>
-        </w:rPr>
-        <w:t xml:space="preserve">behavioral</w:t>
-      </w:r>
-      <w:r>
-        <w:t xml:space="preserve"> </w:t>
-      </w:r>
-      <w:r>
-        <w:t xml:space="preserve">regulation of LLM use (reformulating queries,</w:t>
-      </w:r>
-      <w:r>
-        <w:t xml:space="preserve"> </w:t>
-      </w:r>
-      <w:r>
-        <w:t xml:space="preserve">checking correctness) predicts effective use, whereas self-rated AI expertise does not (Clerc et al.,</w:t>
-      </w:r>
-      <w:r>
-        <w:t xml:space="preserve"> </w:t>
-      </w:r>
-      <w:r>
-        <w:t xml:space="preserve">2026). The skill of working with AI is thus distinct from a general, self-assessed competence.</w:t>
-      </w:r>
+      </w:pPr>
     </w:p>
     <w:p>
       <w:pPr>
@@ -8171,6 +8264,38 @@
         <w:pStyle w:val="ImageCaption"/>
         <w:spacing w:before="80" w:after="120" w:line="240" w:lineRule="auto"/>
         <w:jc w:val="center"/>
+        <w:keepNext w:val="0"/>
+        <w:keepLines/>
+        <w:widowControl w:val="1"/>
+      </w:pPr>
+      <w:r>
+        <w:rPr>
+          <w:i/>
+          <w:iCs/>
+        </w:rPr>
+        <w:t xml:space="preserve">Figure 4. Mean per-skill grade for five competence profiles. Judging reaches A only when judging is</w:t>
+      </w:r>
+      <w:r>
+        <w:rPr>
+          <w:i/>
+          <w:iCs/>
+        </w:rPr>
+        <w:t xml:space="preserve"> </w:t>
+      </w:r>
+      <w:r>
+        <w:rPr>
+          <w:i/>
+          <w:iCs/>
+        </w:rPr>
+        <w:t xml:space="preserve">strong, regardless of framing or steering; each skill responds to its own competence.</w:t>
+      </w:r>
+    </w:p>
+    <w:p>
+      <w:pPr>
+        <w:rPr>
+          <w:sz w:val="4"/>
+          <w:szCs w:val="4"/>
+        </w:rPr>
         <w:sectPr>
           <w:type w:val="continuous"/>
           <w:pgSz w:h="15840" w:w="12240"/>
@@ -8178,31 +8303,7 @@
           <w:cols w:num="1" w:space="288"/>
           <w:docGrid w:linePitch="360"/>
         </w:sectPr>
-        <w:keepNext w:val="0"/>
-        <w:keepLines/>
-        <w:widowControl w:val="1"/>
-      </w:pPr>
-      <w:r>
-        <w:rPr>
-          <w:i/>
-          <w:iCs/>
-        </w:rPr>
-        <w:t xml:space="preserve">Figure 4. Mean per-skill grade for five competence profiles. Judging reaches A only when judging is</w:t>
-      </w:r>
-      <w:r>
-        <w:rPr>
-          <w:i/>
-          <w:iCs/>
-        </w:rPr>
-        <w:t xml:space="preserve"> </w:t>
-      </w:r>
-      <w:r>
-        <w:rPr>
-          <w:i/>
-          <w:iCs/>
-        </w:rPr>
-        <w:t xml:space="preserve">strong, regardless of framing or steering; each skill responds to its own competence.</w:t>
-      </w:r>
+      </w:pPr>
     </w:p>
     <w:p>
       <w:pPr>
@@ -9334,6 +9435,56 @@
       <w:pPr>
         <w:pStyle w:val="FirstParagraph"/>
         <w:jc w:val="both"/>
+        <w:keepNext w:val="0"/>
+        <w:keepLines w:val="0"/>
+        <w:widowControl w:val="1"/>
+      </w:pPr>
+      <w:r>
+        <w:t xml:space="preserve">Figure A1 shows a single challenge run in CoReasoning Lab, illustrating how the three skills appear as</w:t>
+      </w:r>
+      <w:r>
+        <w:t xml:space="preserve"> </w:t>
+      </w:r>
+      <w:r>
+        <w:t xml:space="preserve">distinct, separately-scored stages of one continuous task. In Phase 1 the learner refines an</w:t>
+      </w:r>
+      <w:r>
+        <w:t xml:space="preserve"> </w:t>
+      </w:r>
+      <w:r>
+        <w:t xml:space="preserve">ill-defined problem and receives a Framing grade. The system then produces a deliberately flawed</w:t>
+      </w:r>
+      <w:r>
+        <w:t xml:space="preserve"> </w:t>
+      </w:r>
+      <w:r>
+        <w:t xml:space="preserve">solution. In Phase 2 the learner judges that output (flagging real issues while avoiding distractors)</w:t>
+      </w:r>
+      <w:r>
+        <w:t xml:space="preserve"> </w:t>
+      </w:r>
+      <w:r>
+        <w:t xml:space="preserve">and steers the AI with a targeted correction; the output converges across cycles. The final report</w:t>
+      </w:r>
+      <w:r>
+        <w:t xml:space="preserve"> </w:t>
+      </w:r>
+      <w:r>
+        <w:t xml:space="preserve">returns three independent grades with per-skill diagnostic feedback, the interface-level expression of</w:t>
+      </w:r>
+      <w:r>
+        <w:t xml:space="preserve"> </w:t>
+      </w:r>
+      <w:r>
+        <w:t xml:space="preserve">the framework's central claim that productive AI use is not one skill but three.</w:t>
+      </w:r>
+    </w:p>
+    <w:p>
+      <w:pPr>
+        <w:rPr>
+          <w:sz w:val="4"/>
+          <w:szCs w:val="4"/>
+        </w:rPr>
         <w:sectPr>
           <w:type w:val="continuous"/>
           <w:pgSz w:h="15840" w:w="12240"/>
@@ -9341,61 +9492,12 @@
           <w:cols w:num="2" w:space="288" w:equalWidth="1"/>
           <w:docGrid w:linePitch="360"/>
         </w:sectPr>
-        <w:keepNext w:val="0"/>
-        <w:keepLines w:val="0"/>
-        <w:widowControl w:val="1"/>
-      </w:pPr>
-      <w:r>
-        <w:t xml:space="preserve">Figure A1 shows a single challenge run in CoReasoning Lab, illustrating how the three skills appear as</w:t>
-      </w:r>
-      <w:r>
-        <w:t xml:space="preserve"> </w:t>
-      </w:r>
-      <w:r>
-        <w:t xml:space="preserve">distinct, separately-scored stages of one continuous task. In Phase 1 the learner refines an</w:t>
-      </w:r>
-      <w:r>
-        <w:t xml:space="preserve"> </w:t>
-      </w:r>
-      <w:r>
-        <w:t xml:space="preserve">ill-defined problem and receives a Framing grade. The system then produces a deliberately flawed</w:t>
-      </w:r>
-      <w:r>
-        <w:t xml:space="preserve"> </w:t>
-      </w:r>
-      <w:r>
-        <w:t xml:space="preserve">solution. In Phase 2 the learner judges that output (flagging real issues while avoiding distractors)</w:t>
-      </w:r>
-      <w:r>
-        <w:t xml:space="preserve"> </w:t>
-      </w:r>
-      <w:r>
-        <w:t xml:space="preserve">and steers the AI with a targeted correction; the output converges across cycles. The final report</w:t>
-      </w:r>
-      <w:r>
-        <w:t xml:space="preserve"> </w:t>
-      </w:r>
-      <w:r>
-        <w:t xml:space="preserve">returns three independent grades with per-skill diagnostic feedback, the interface-level expression of</w:t>
-      </w:r>
-      <w:r>
-        <w:t xml:space="preserve"> </w:t>
-      </w:r>
-      <w:r>
-        <w:t xml:space="preserve">the framework's central claim that productive AI use is not one skill but three.</w:t>
-      </w:r>
+      </w:pPr>
     </w:p>
     <w:p>
       <w:pPr>
         <w:pStyle w:val="BodyText"/>
         <w:jc w:val="center"/>
-        <w:sectPr>
-          <w:type w:val="continuous"/>
-          <w:pgSz w:h="15840" w:w="12240"/>
-          <w:pgMar w:bottom="1080" w:footer="720" w:gutter="0" w:header="720" w:left="1080" w:right="1080" w:top="1080"/>
-          <w:cols w:num="1" w:space="288"/>
-          <w:docGrid w:linePitch="360"/>
-        </w:sectPr>
         <w:keepNext/>
         <w:keepLines/>
         <w:widowControl w:val="1"/>
@@ -9445,6 +9547,21 @@
     </w:p>
     <w:p>
       <w:pPr>
+        <w:rPr>
+          <w:sz w:val="4"/>
+          <w:szCs w:val="4"/>
+        </w:rPr>
+        <w:sectPr>
+          <w:type w:val="continuous"/>
+          <w:pgSz w:h="15840" w:w="12240"/>
+          <w:pgMar w:bottom="1080" w:footer="720" w:gutter="0" w:header="720" w:left="1080" w:right="1080" w:top="1080"/>
+          <w:cols w:num="1" w:space="288"/>
+          <w:docGrid w:linePitch="360"/>
+        </w:sectPr>
+      </w:pPr>
+    </w:p>
+    <w:p>
+      <w:pPr>
         <w:pStyle w:val="BodyText"/>
         <w:jc w:val="both"/>
         <w:keepNext w:val="0"/>
@@ -9519,6 +9636,50 @@
       <w:pPr>
         <w:pStyle w:val="BodyText"/>
         <w:jc w:val="both"/>
+        <w:keepNext w:val="0"/>
+        <w:keepLines w:val="0"/>
+        <w:widowControl w:val="1"/>
+      </w:pPr>
+      <w:r>
+        <w:t xml:space="preserve">The platform exposes role-specific interfaces beyond the challenge run (Figure A2). Students see a</w:t>
+      </w:r>
+      <w:r>
+        <w:t xml:space="preserve"> </w:t>
+      </w:r>
+      <w:r>
+        <w:t xml:space="preserve">dashboard of pending challenges and courses and a personal results view that trends Framing, Judging,</w:t>
+      </w:r>
+      <w:r>
+        <w:t xml:space="preserve"> </w:t>
+      </w:r>
+      <w:r>
+        <w:t xml:space="preserve">and Steering separately over time. Instructors author challenges (the system auto-generates the</w:t>
+      </w:r>
+      <w:r>
+        <w:t xml:space="preserve"> </w:t>
+      </w:r>
+      <w:r>
+        <w:t xml:space="preserve">ill-defined problem and the three per-skill rubrics) and read course analytics that break grade</w:t>
+      </w:r>
+      <w:r>
+        <w:t xml:space="preserve"> </w:t>
+      </w:r>
+      <w:r>
+        <w:t xml:space="preserve">distributions down by rubric and by student. In every view the three skills remain distinct columns,</w:t>
+      </w:r>
+      <w:r>
+        <w:t xml:space="preserve"> </w:t>
+      </w:r>
+      <w:r>
+        <w:t xml:space="preserve">which is the design commitment the framework makes visible.</w:t>
+      </w:r>
+    </w:p>
+    <w:p>
+      <w:pPr>
+        <w:rPr>
+          <w:sz w:val="4"/>
+          <w:szCs w:val="4"/>
+        </w:rPr>
         <w:sectPr>
           <w:type w:val="continuous"/>
           <w:pgSz w:h="15840" w:w="12240"/>
@@ -9526,55 +9687,12 @@
           <w:cols w:num="2" w:space="288" w:equalWidth="1"/>
           <w:docGrid w:linePitch="360"/>
         </w:sectPr>
-        <w:keepNext w:val="0"/>
-        <w:keepLines w:val="0"/>
-        <w:widowControl w:val="1"/>
-      </w:pPr>
-      <w:r>
-        <w:t xml:space="preserve">The platform exposes role-specific interfaces beyond the challenge run (Figure A2). Students see a</w:t>
-      </w:r>
-      <w:r>
-        <w:t xml:space="preserve"> </w:t>
-      </w:r>
-      <w:r>
-        <w:t xml:space="preserve">dashboard of pending challenges and courses and a personal results view that trends Framing, Judging,</w:t>
-      </w:r>
-      <w:r>
-        <w:t xml:space="preserve"> </w:t>
-      </w:r>
-      <w:r>
-        <w:t xml:space="preserve">and Steering separately over time. Instructors author challenges (the system auto-generates the</w:t>
-      </w:r>
-      <w:r>
-        <w:t xml:space="preserve"> </w:t>
-      </w:r>
-      <w:r>
-        <w:t xml:space="preserve">ill-defined problem and the three per-skill rubrics) and read course analytics that break grade</w:t>
-      </w:r>
-      <w:r>
-        <w:t xml:space="preserve"> </w:t>
-      </w:r>
-      <w:r>
-        <w:t xml:space="preserve">distributions down by rubric and by student. In every view the three skills remain distinct columns,</w:t>
-      </w:r>
-      <w:r>
-        <w:t xml:space="preserve"> </w:t>
-      </w:r>
-      <w:r>
-        <w:t xml:space="preserve">which is the design commitment the framework makes visible.</w:t>
-      </w:r>
+      </w:pPr>
     </w:p>
     <w:p>
       <w:pPr>
         <w:pStyle w:val="BodyText"/>
         <w:jc w:val="center"/>
-        <w:sectPr>
-          <w:type w:val="continuous"/>
-          <w:pgSz w:h="15840" w:w="12240"/>
-          <w:pgMar w:bottom="1080" w:footer="720" w:gutter="0" w:header="720" w:left="1080" w:right="1080" w:top="1080"/>
-          <w:cols w:num="1" w:space="288"/>
-          <w:docGrid w:linePitch="360"/>
-        </w:sectPr>
         <w:keepNext/>
         <w:keepLines/>
         <w:widowControl w:val="1"/>
@@ -9624,8 +9742,83 @@
     </w:p>
     <w:p>
       <w:pPr>
+        <w:rPr>
+          <w:sz w:val="4"/>
+          <w:szCs w:val="4"/>
+        </w:rPr>
+        <w:sectPr>
+          <w:type w:val="continuous"/>
+          <w:pgSz w:h="15840" w:w="12240"/>
+          <w:pgMar w:bottom="1080" w:footer="720" w:gutter="0" w:header="720" w:left="1080" w:right="1080" w:top="1080"/>
+          <w:cols w:num="1" w:space="288"/>
+          <w:docGrid w:linePitch="360"/>
+        </w:sectPr>
+      </w:pPr>
+    </w:p>
+    <w:p>
+      <w:pPr>
         <w:pStyle w:val="BodyText"/>
         <w:jc w:val="both"/>
+        <w:keepNext w:val="0"/>
+        <w:keepLines w:val="0"/>
+        <w:widowControl w:val="1"/>
+      </w:pPr>
+      <w:r>
+        <w:rPr>
+          <w:i/>
+          <w:iCs/>
+        </w:rPr>
+        <w:t xml:space="preserve">Figure A2. Screenshot of the running platform: the instructor course-analytics view. Grade</w:t>
+      </w:r>
+      <w:r>
+        <w:rPr>
+          <w:i/>
+          <w:iCs/>
+        </w:rPr>
+        <w:t xml:space="preserve"> </w:t>
+      </w:r>
+      <w:r>
+        <w:rPr>
+          <w:i/>
+          <w:iCs/>
+        </w:rPr>
+        <w:t xml:space="preserve">distribution is broken out into separate Framing, Judging, and Steering panels, and the per-student</w:t>
+      </w:r>
+      <w:r>
+        <w:rPr>
+          <w:i/>
+          <w:iCs/>
+        </w:rPr>
+        <w:t xml:space="preserve"> </w:t>
+      </w:r>
+      <w:r>
+        <w:rPr>
+          <w:i/>
+          <w:iCs/>
+        </w:rPr>
+        <w:t xml:space="preserve">results list the three skills as distinct columns, the interface-level expression of the framework's</w:t>
+      </w:r>
+      <w:r>
+        <w:rPr>
+          <w:i/>
+          <w:iCs/>
+        </w:rPr>
+        <w:t xml:space="preserve"> </w:t>
+      </w:r>
+      <w:r>
+        <w:rPr>
+          <w:i/>
+          <w:iCs/>
+        </w:rPr>
+        <w:t xml:space="preserve">central claim that productive AI use is not one skill but three.</w:t>
+      </w:r>
+    </w:p>
+    <w:p>
+      <w:pPr>
+        <w:rPr>
+          <w:sz w:val="4"/>
+          <w:szCs w:val="4"/>
+        </w:rPr>
         <w:sectPr>
           <w:type w:val="continuous"/>
           <w:pgSz w:h="15840" w:w="12240"/>
@@ -9633,71 +9826,12 @@
           <w:cols w:num="2" w:space="288" w:equalWidth="1"/>
           <w:docGrid w:linePitch="360"/>
         </w:sectPr>
-        <w:keepNext w:val="0"/>
-        <w:keepLines w:val="0"/>
-        <w:widowControl w:val="1"/>
-      </w:pPr>
-      <w:r>
-        <w:rPr>
-          <w:i/>
-          <w:iCs/>
-        </w:rPr>
-        <w:t xml:space="preserve">Figure A2. Screenshot of the running platform: the instructor course-analytics view. Grade</w:t>
-      </w:r>
-      <w:r>
-        <w:rPr>
-          <w:i/>
-          <w:iCs/>
-        </w:rPr>
-        <w:t xml:space="preserve"> </w:t>
-      </w:r>
-      <w:r>
-        <w:rPr>
-          <w:i/>
-          <w:iCs/>
-        </w:rPr>
-        <w:t xml:space="preserve">distribution is broken out into separate Framing, Judging, and Steering panels, and the per-student</w:t>
-      </w:r>
-      <w:r>
-        <w:rPr>
-          <w:i/>
-          <w:iCs/>
-        </w:rPr>
-        <w:t xml:space="preserve"> </w:t>
-      </w:r>
-      <w:r>
-        <w:rPr>
-          <w:i/>
-          <w:iCs/>
-        </w:rPr>
-        <w:t xml:space="preserve">results list the three skills as distinct columns, the interface-level expression of the framework's</w:t>
-      </w:r>
-      <w:r>
-        <w:rPr>
-          <w:i/>
-          <w:iCs/>
-        </w:rPr>
-        <w:t xml:space="preserve"> </w:t>
-      </w:r>
-      <w:r>
-        <w:rPr>
-          <w:i/>
-          <w:iCs/>
-        </w:rPr>
-        <w:t xml:space="preserve">central claim that productive AI use is not one skill but three.</w:t>
-      </w:r>
+      </w:pPr>
     </w:p>
     <w:p>
       <w:pPr>
         <w:pStyle w:val="BodyText"/>
         <w:jc w:val="center"/>
-        <w:sectPr>
-          <w:type w:val="continuous"/>
-          <w:pgSz w:h="15840" w:w="12240"/>
-          <w:pgMar w:bottom="1080" w:footer="720" w:gutter="0" w:header="720" w:left="1080" w:right="1080" w:top="1080"/>
-          <w:cols w:num="1" w:space="288"/>
-          <w:docGrid w:linePitch="360"/>
-        </w:sectPr>
         <w:keepNext/>
         <w:keepLines/>
         <w:widowControl w:val="1"/>
@@ -9712,7 +9846,7 @@
               <a:graphicData uri="http://schemas.openxmlformats.org/drawingml/2006/picture">
                 <pic:pic>
                   <pic:nvPicPr>
-                    <pic:cNvPr descr="C:/Users/apart/AppData/Local/Temp/html2doc_svg_2FEAbc/svg_2.png" id="46" name="Picture"/>
+                    <pic:cNvPr descr="C:/Users/apart/AppData/Local/Temp/html2doc_svg_AVSlkV/svg_2.png" id="46" name="Picture"/>
                     <pic:cNvPicPr>
                       <a:picLocks noChangeArrowheads="1" noChangeAspect="1"/>
                     </pic:cNvPicPr>
@@ -9747,6 +9881,21 @@
     </w:p>
     <w:p>
       <w:pPr>
+        <w:rPr>
+          <w:sz w:val="4"/>
+          <w:szCs w:val="4"/>
+        </w:rPr>
+        <w:sectPr>
+          <w:type w:val="continuous"/>
+          <w:pgSz w:h="15840" w:w="12240"/>
+          <w:pgMar w:bottom="1080" w:footer="720" w:gutter="0" w:header="720" w:left="1080" w:right="1080" w:top="1080"/>
+          <w:cols w:num="1" w:space="288"/>
+          <w:docGrid w:linePitch="360"/>
+        </w:sectPr>
+      </w:pPr>
+    </w:p>
+    <w:p>
+      <w:pPr>
         <w:pStyle w:val="BodyText"/>
         <w:jc w:val="both"/>
         <w:keepNext w:val="0"/>
@@ -10289,6 +10438,24 @@
       <w:pPr>
         <w:pStyle w:val="BodyText"/>
         <w:jc w:val="both"/>
+        <w:keepNext w:val="0"/>
+        <w:keepLines w:val="0"/>
+        <w:widowControl w:val="1"/>
+      </w:pPr>
+      <w:r>
+        <w:rPr>
+          <w:b/>
+          <w:bCs/>
+        </w:rPr>
+        <w:t xml:space="preserve">Table C1. Disciplines covered by the released challenge content.</w:t>
+      </w:r>
+    </w:p>
+    <w:p>
+      <w:pPr>
+        <w:rPr>
+          <w:sz w:val="4"/>
+          <w:szCs w:val="4"/>
+        </w:rPr>
         <w:sectPr>
           <w:type w:val="continuous"/>
           <w:pgSz w:h="15840" w:w="12240"/>
@@ -10296,17 +10463,7 @@
           <w:cols w:num="2" w:space="288" w:equalWidth="1"/>
           <w:docGrid w:linePitch="360"/>
         </w:sectPr>
-        <w:keepNext w:val="0"/>
-        <w:keepLines w:val="0"/>
-        <w:widowControl w:val="1"/>
-      </w:pPr>
-      <w:r>
-        <w:rPr>
-          <w:b/>
-          <w:bCs/>
-        </w:rPr>
-        <w:t xml:space="preserve">Table C1. Disciplines covered by the released challenge content.</w:t>
-      </w:r>
+      </w:pPr>
     </w:p>
     <w:tbl>
       <w:tblPr>
@@ -10618,6 +10775,10 @@
     </w:tbl>
     <w:p>
       <w:pPr>
+        <w:rPr>
+          <w:sz w:val="4"/>
+          <w:szCs w:val="4"/>
+        </w:rPr>
         <w:sectPr>
           <w:type w:val="continuous"/>
           <w:pgSz w:h="15840" w:w="12240"/>
@@ -13672,6 +13833,7 @@
     <w:pPr>
       <w:keepNext w:val="0"/>
       <w:spacing w:after="0" w:before="0" w:line="240" w:lineRule="auto"/>
+      <w:ind w:firstLine="288"/>
       <w:jc w:val="both"/>
     </w:pPr>
     <w:rPr>
@@ -24937,6 +25099,7 @@
     <w:pPr>
       <w:keepNext w:val="0"/>
       <w:spacing w:after="0" w:before="0" w:line="240" w:lineRule="auto"/>
+      <w:ind w:firstLine="0"/>
       <w:jc w:val="both"/>
     </w:pPr>
     <w:rPr>
@@ -24968,6 +25131,7 @@
     <w:pPr>
       <w:keepNext/>
       <w:spacing w:after="80" w:before="80"/>
+      <w:ind w:firstLine="0"/>
       <w:jc w:val="center"/>
     </w:pPr>
     <w:rPr>
@@ -24983,6 +25147,7 @@
     <w:pPr>
       <w:keepNext w:val="0"/>
       <w:spacing w:after="80" w:before="0"/>
+      <w:ind w:firstLine="0"/>
       <w:jc w:val="both"/>
     </w:pPr>
     <w:rPr>

</xml_diff>

<commit_message>
Fix Figure 2 arrows: colour-traceable, correctly-sourced monitor/control lines
The cross-level control and monitor connectors were directionally correct but
read as wrong: they overlapped, shared one dark arrowhead, and the control line
dropped straight down beneath Judging (so it looked like Judging, not Steering,
commanded the AI). Now each loop arrow has its own colour with a matching
arrowhead (purple control: Steering -> AI generation; gold monitor: AI output
-> Judging), separated lanes, and a single clean crossing.

Co-Authored-By: Claude Opus 4.8 <noreply@anthropic.com>
</commit_message>
<xml_diff>
--- a/docs/coreasoning-2col.docx
+++ b/docs/coreasoning-2col.docx
@@ -241,9 +241,10 @@
     </w:p>
     <w:p>
       <w:pPr>
-        <w:rPr>
-          <w:sz w:val="4"/>
-          <w:szCs w:val="4"/>
+        <w:spacing w:before="120" w:after="120" w:line="120" w:lineRule="exact"/>
+        <w:rPr>
+          <w:sz w:val="12"/>
+          <w:szCs w:val="12"/>
         </w:rPr>
         <w:sectPr>
           <w:footerReference w:type="default" r:id="rId9"/>
@@ -627,9 +628,10 @@
     </w:p>
     <w:p>
       <w:pPr>
-        <w:rPr>
-          <w:sz w:val="4"/>
-          <w:szCs w:val="4"/>
+        <w:spacing w:before="120" w:after="120" w:line="120" w:lineRule="exact"/>
+        <w:rPr>
+          <w:sz w:val="12"/>
+          <w:szCs w:val="12"/>
         </w:rPr>
         <w:sectPr>
           <w:type w:val="continuous"/>
@@ -658,7 +660,7 @@
               <a:graphicData uri="http://schemas.openxmlformats.org/drawingml/2006/picture">
                 <pic:pic>
                   <pic:nvPicPr>
-                    <pic:cNvPr descr="C:/Users/apart/AppData/Local/Temp/html2doc_svg_AVSlkV/svg_0.png" id="12" name="Picture"/>
+                    <pic:cNvPr descr="C:/Users/apart/AppData/Local/Temp/html2doc_svg_s7VG00/svg_0.png" id="12" name="Picture"/>
                     <pic:cNvPicPr>
                       <a:picLocks noChangeArrowheads="1" noChangeAspect="1"/>
                     </pic:cNvPicPr>
@@ -693,9 +695,10 @@
     </w:p>
     <w:p>
       <w:pPr>
-        <w:rPr>
-          <w:sz w:val="4"/>
-          <w:szCs w:val="4"/>
+        <w:spacing w:before="120" w:after="120" w:line="120" w:lineRule="exact"/>
+        <w:rPr>
+          <w:sz w:val="12"/>
+          <w:szCs w:val="12"/>
         </w:rPr>
         <w:sectPr>
           <w:type w:val="continuous"/>
@@ -1726,9 +1729,10 @@
     </w:p>
     <w:p>
       <w:pPr>
-        <w:rPr>
-          <w:sz w:val="4"/>
-          <w:szCs w:val="4"/>
+        <w:spacing w:before="120" w:after="120" w:line="120" w:lineRule="exact"/>
+        <w:rPr>
+          <w:sz w:val="12"/>
+          <w:szCs w:val="12"/>
         </w:rPr>
         <w:sectPr>
           <w:type w:val="continuous"/>
@@ -1757,7 +1761,7 @@
               <a:graphicData uri="http://schemas.openxmlformats.org/drawingml/2006/picture">
                 <pic:pic>
                   <pic:nvPicPr>
-                    <pic:cNvPr descr="C:/Users/apart/AppData/Local/Temp/html2doc_svg_AVSlkV/svg_1.png" id="17" name="Picture"/>
+                    <pic:cNvPr descr="C:/Users/apart/AppData/Local/Temp/html2doc_svg_s7VG00/svg_1.png" id="17" name="Picture"/>
                     <pic:cNvPicPr>
                       <a:picLocks noChangeArrowheads="1" noChangeAspect="1"/>
                     </pic:cNvPicPr>
@@ -1851,9 +1855,10 @@
     </w:p>
     <w:p>
       <w:pPr>
-        <w:rPr>
-          <w:sz w:val="4"/>
-          <w:szCs w:val="4"/>
+        <w:spacing w:before="120" w:after="120" w:line="120" w:lineRule="exact"/>
+        <w:rPr>
+          <w:sz w:val="12"/>
+          <w:szCs w:val="12"/>
         </w:rPr>
         <w:sectPr>
           <w:type w:val="continuous"/>
@@ -3359,9 +3364,10 @@
     </w:p>
     <w:p>
       <w:pPr>
-        <w:rPr>
-          <w:sz w:val="4"/>
-          <w:szCs w:val="4"/>
+        <w:spacing w:before="120" w:after="120" w:line="120" w:lineRule="exact"/>
+        <w:rPr>
+          <w:sz w:val="12"/>
+          <w:szCs w:val="12"/>
         </w:rPr>
         <w:sectPr>
           <w:type w:val="continuous"/>
@@ -4133,9 +4139,10 @@
     </w:tbl>
     <w:p>
       <w:pPr>
-        <w:rPr>
-          <w:sz w:val="4"/>
-          <w:szCs w:val="4"/>
+        <w:spacing w:before="120" w:after="120" w:line="120" w:lineRule="exact"/>
+        <w:rPr>
+          <w:sz w:val="12"/>
+          <w:szCs w:val="12"/>
         </w:rPr>
         <w:sectPr>
           <w:type w:val="continuous"/>
@@ -5887,9 +5894,10 @@
     </w:p>
     <w:p>
       <w:pPr>
-        <w:rPr>
-          <w:sz w:val="4"/>
-          <w:szCs w:val="4"/>
+        <w:spacing w:before="120" w:after="120" w:line="120" w:lineRule="exact"/>
+        <w:rPr>
+          <w:sz w:val="12"/>
+          <w:szCs w:val="12"/>
         </w:rPr>
         <w:sectPr>
           <w:type w:val="continuous"/>
@@ -6405,9 +6413,10 @@
     </w:tbl>
     <w:p>
       <w:pPr>
-        <w:rPr>
-          <w:sz w:val="4"/>
-          <w:szCs w:val="4"/>
+        <w:spacing w:before="120" w:after="120" w:line="120" w:lineRule="exact"/>
+        <w:rPr>
+          <w:sz w:val="12"/>
+          <w:szCs w:val="12"/>
         </w:rPr>
         <w:sectPr>
           <w:type w:val="continuous"/>
@@ -7013,9 +7022,10 @@
     </w:p>
     <w:p>
       <w:pPr>
-        <w:rPr>
-          <w:sz w:val="4"/>
-          <w:szCs w:val="4"/>
+        <w:spacing w:before="120" w:after="120" w:line="120" w:lineRule="exact"/>
+        <w:rPr>
+          <w:sz w:val="12"/>
+          <w:szCs w:val="12"/>
         </w:rPr>
         <w:sectPr>
           <w:type w:val="continuous"/>
@@ -7346,9 +7356,10 @@
     </w:tbl>
     <w:p>
       <w:pPr>
-        <w:rPr>
-          <w:sz w:val="4"/>
-          <w:szCs w:val="4"/>
+        <w:spacing w:before="120" w:after="120" w:line="120" w:lineRule="exact"/>
+        <w:rPr>
+          <w:sz w:val="12"/>
+          <w:szCs w:val="12"/>
         </w:rPr>
         <w:sectPr>
           <w:type w:val="continuous"/>
@@ -7362,9 +7373,10 @@
     <w:p/>
     <w:p>
       <w:pPr>
-        <w:rPr>
-          <w:sz w:val="4"/>
-          <w:szCs w:val="4"/>
+        <w:spacing w:before="120" w:after="120" w:line="120" w:lineRule="exact"/>
+        <w:rPr>
+          <w:sz w:val="12"/>
+          <w:szCs w:val="12"/>
         </w:rPr>
         <w:sectPr>
           <w:type w:val="continuous"/>
@@ -7922,9 +7934,10 @@
     </w:tbl>
     <w:p>
       <w:pPr>
-        <w:rPr>
-          <w:sz w:val="4"/>
-          <w:szCs w:val="4"/>
+        <w:spacing w:before="120" w:after="120" w:line="120" w:lineRule="exact"/>
+        <w:rPr>
+          <w:sz w:val="12"/>
+          <w:szCs w:val="12"/>
         </w:rPr>
         <w:sectPr>
           <w:type w:val="continuous"/>
@@ -8085,9 +8098,10 @@
     </w:p>
     <w:p>
       <w:pPr>
-        <w:rPr>
-          <w:sz w:val="4"/>
-          <w:szCs w:val="4"/>
+        <w:spacing w:before="120" w:after="120" w:line="120" w:lineRule="exact"/>
+        <w:rPr>
+          <w:sz w:val="12"/>
+          <w:szCs w:val="12"/>
         </w:rPr>
         <w:sectPr>
           <w:type w:val="continuous"/>
@@ -8292,9 +8306,10 @@
     </w:p>
     <w:p>
       <w:pPr>
-        <w:rPr>
-          <w:sz w:val="4"/>
-          <w:szCs w:val="4"/>
+        <w:spacing w:before="120" w:after="120" w:line="120" w:lineRule="exact"/>
+        <w:rPr>
+          <w:sz w:val="12"/>
+          <w:szCs w:val="12"/>
         </w:rPr>
         <w:sectPr>
           <w:type w:val="continuous"/>
@@ -9481,9 +9496,10 @@
     </w:p>
     <w:p>
       <w:pPr>
-        <w:rPr>
-          <w:sz w:val="4"/>
-          <w:szCs w:val="4"/>
+        <w:spacing w:before="120" w:after="120" w:line="120" w:lineRule="exact"/>
+        <w:rPr>
+          <w:sz w:val="12"/>
+          <w:szCs w:val="12"/>
         </w:rPr>
         <w:sectPr>
           <w:type w:val="continuous"/>
@@ -9547,9 +9563,10 @@
     </w:p>
     <w:p>
       <w:pPr>
-        <w:rPr>
-          <w:sz w:val="4"/>
-          <w:szCs w:val="4"/>
+        <w:spacing w:before="120" w:after="120" w:line="120" w:lineRule="exact"/>
+        <w:rPr>
+          <w:sz w:val="12"/>
+          <w:szCs w:val="12"/>
         </w:rPr>
         <w:sectPr>
           <w:type w:val="continuous"/>
@@ -9676,9 +9693,10 @@
     </w:p>
     <w:p>
       <w:pPr>
-        <w:rPr>
-          <w:sz w:val="4"/>
-          <w:szCs w:val="4"/>
+        <w:spacing w:before="120" w:after="120" w:line="120" w:lineRule="exact"/>
+        <w:rPr>
+          <w:sz w:val="12"/>
+          <w:szCs w:val="12"/>
         </w:rPr>
         <w:sectPr>
           <w:type w:val="continuous"/>
@@ -9742,9 +9760,10 @@
     </w:p>
     <w:p>
       <w:pPr>
-        <w:rPr>
-          <w:sz w:val="4"/>
-          <w:szCs w:val="4"/>
+        <w:spacing w:before="120" w:after="120" w:line="120" w:lineRule="exact"/>
+        <w:rPr>
+          <w:sz w:val="12"/>
+          <w:szCs w:val="12"/>
         </w:rPr>
         <w:sectPr>
           <w:type w:val="continuous"/>
@@ -9815,9 +9834,10 @@
     </w:p>
     <w:p>
       <w:pPr>
-        <w:rPr>
-          <w:sz w:val="4"/>
-          <w:szCs w:val="4"/>
+        <w:spacing w:before="120" w:after="120" w:line="120" w:lineRule="exact"/>
+        <w:rPr>
+          <w:sz w:val="12"/>
+          <w:szCs w:val="12"/>
         </w:rPr>
         <w:sectPr>
           <w:type w:val="continuous"/>
@@ -9846,7 +9866,7 @@
               <a:graphicData uri="http://schemas.openxmlformats.org/drawingml/2006/picture">
                 <pic:pic>
                   <pic:nvPicPr>
-                    <pic:cNvPr descr="C:/Users/apart/AppData/Local/Temp/html2doc_svg_AVSlkV/svg_2.png" id="46" name="Picture"/>
+                    <pic:cNvPr descr="C:/Users/apart/AppData/Local/Temp/html2doc_svg_s7VG00/svg_2.png" id="46" name="Picture"/>
                     <pic:cNvPicPr>
                       <a:picLocks noChangeArrowheads="1" noChangeAspect="1"/>
                     </pic:cNvPicPr>
@@ -9881,9 +9901,10 @@
     </w:p>
     <w:p>
       <w:pPr>
-        <w:rPr>
-          <w:sz w:val="4"/>
-          <w:szCs w:val="4"/>
+        <w:spacing w:before="120" w:after="120" w:line="120" w:lineRule="exact"/>
+        <w:rPr>
+          <w:sz w:val="12"/>
+          <w:szCs w:val="12"/>
         </w:rPr>
         <w:sectPr>
           <w:type w:val="continuous"/>
@@ -10452,9 +10473,10 @@
     </w:p>
     <w:p>
       <w:pPr>
-        <w:rPr>
-          <w:sz w:val="4"/>
-          <w:szCs w:val="4"/>
+        <w:spacing w:before="120" w:after="120" w:line="120" w:lineRule="exact"/>
+        <w:rPr>
+          <w:sz w:val="12"/>
+          <w:szCs w:val="12"/>
         </w:rPr>
         <w:sectPr>
           <w:type w:val="continuous"/>
@@ -10775,9 +10797,10 @@
     </w:tbl>
     <w:p>
       <w:pPr>
-        <w:rPr>
-          <w:sz w:val="4"/>
-          <w:szCs w:val="4"/>
+        <w:spacing w:before="120" w:after="120" w:line="120" w:lineRule="exact"/>
+        <w:rPr>
+          <w:sz w:val="12"/>
+          <w:szCs w:val="12"/>
         </w:rPr>
         <w:sectPr>
           <w:type w:val="continuous"/>

</xml_diff>

<commit_message>
Figure 2: re-layout so monitor/control arrows are clean verticals
Aligned each object box under the meta box that acts on it: AI output sits
directly under Judging (monitor reads straight up) and AI generation under
Steering (control writes straight down). This removes the diagonal cross-level
routing and the crossing entirely; the controller-above-process, sensor-above-
signal layout makes outbound/inbound obvious at a glance.

Co-Authored-By: Claude Opus 4.8 <noreply@anthropic.com>
</commit_message>
<xml_diff>
--- a/docs/coreasoning-2col.docx
+++ b/docs/coreasoning-2col.docx
@@ -16,82 +16,83 @@
         <w:t xml:space="preserve">Framing, Judging, Steering: An Assessable Competency Model for Teaching Students to Reason With Generative AI</w:t>
       </w:r>
     </w:p>
-    <w:p>
-      <w:pPr>
-        <w:pStyle w:val="Subtitle"/>
-        <w:spacing w:before="0" w:after="40"/>
+    <w:tbl>
+      <w:tblPr>
+        <w:tblW w:type="pct" w:w="5000"/>
+        <w:tblLook w:firstColumn="1" w:firstRow="1" w:lastColumn="0" w:lastRow="0" w:noHBand="0" w:noVBand="1" w:val="04A0"/>
         <w:jc w:val="center"/>
-        <w:keepNext/>
-        <w:keepLines/>
-        <w:widowControl w:val="1"/>
-      </w:pPr>
-      <w:r>
-        <w:rPr>
-          <w:rFonts w:ascii="Times New Roman" w:hAnsi="Times New Roman"/>
-          <w:b/>
-          <w:bCs/>
-          <w:i w:val="0"/>
-          <w:sz w:val="22"/>
-        </w:rPr>
-        <w:t xml:space="preserve">Alexander Apartsin</w:t>
-      </w:r>
-      <w:r>
-        <w:rPr>
-          <w:rFonts w:ascii="Times New Roman" w:hAnsi="Times New Roman"/>
-          <w:b/>
-          <w:i w:val="0"/>
-          <w:sz w:val="22"/>
-        </w:rPr>
-        <w:t xml:space="preserve">¹ and</w:t>
-      </w:r>
-      <w:r>
-        <w:rPr>
-          <w:rFonts w:ascii="Times New Roman" w:hAnsi="Times New Roman"/>
-          <w:b/>
-          <w:i w:val="0"/>
-          <w:sz w:val="22"/>
-        </w:rPr>
-        <w:t xml:space="preserve"> </w:t>
-      </w:r>
-      <w:r>
-        <w:rPr>
-          <w:rFonts w:ascii="Times New Roman" w:hAnsi="Times New Roman"/>
-          <w:b/>
-          <w:bCs/>
-          <w:i w:val="0"/>
-          <w:sz w:val="22"/>
-        </w:rPr>
-        <w:t xml:space="preserve">Yehudit Aperstein</w:t>
-      </w:r>
-      <w:r>
-        <w:rPr>
-          <w:rFonts w:ascii="Times New Roman" w:hAnsi="Times New Roman"/>
-          <w:b/>
-          <w:i w:val="0"/>
-          <w:sz w:val="22"/>
-        </w:rPr>
-        <w:t xml:space="preserve">²</w:t>
-      </w:r>
-    </w:p>
-    <w:p>
-      <w:pPr>
-        <w:pStyle w:val="Subtitle"/>
-        <w:spacing w:before="0" w:after="160"/>
-        <w:jc w:val="center"/>
-        <w:keepNext w:val="0"/>
-        <w:keepLines/>
-        <w:widowControl w:val="1"/>
-      </w:pPr>
-      <w:r>
-        <w:rPr>
-          <w:rFonts w:ascii="Times New Roman" w:hAnsi="Times New Roman"/>
-          <w:b w:val="0"/>
-          <w:i/>
-          <w:sz w:val="19"/>
-        </w:rPr>
-        <w:t xml:space="preserve">¹ Holon Institute of Technology · ² Afeka College of Engineering</w:t>
-      </w:r>
-    </w:p>
+        <w:tblBorders>
+          <w:top w:val="nil"/>
+          <w:left w:val="nil"/>
+          <w:bottom w:val="nil"/>
+          <w:right w:val="nil"/>
+          <w:insideH w:val="nil"/>
+          <w:insideV w:val="nil"/>
+        </w:tblBorders>
+        <w:tblLayout w:type="autofit"/>
+      </w:tblPr>
+      <w:tblGrid>
+        <w:gridCol w:w="10080"/>
+      </w:tblGrid>
+      <w:tr>
+        <w:tc>
+          <w:tcPr>
+            <w:tcW w:type="dxa" w:w="10080"/>
+            <w:tcBorders>
+              <w:left w:val="nil"/>
+              <w:right w:val="nil"/>
+              <w:top w:val="nil"/>
+              <w:bottom w:val="nil"/>
+            </w:tcBorders>
+          </w:tcPr>
+          <w:p>
+            <w:pPr>
+              <w:spacing w:before="0" w:after="40" w:line="240" w:lineRule="auto"/>
+              <w:jc w:val="center"/>
+            </w:pPr>
+            <w:r/>
+            <w:r>
+              <w:rPr>
+                <w:rFonts w:ascii="Times New Roman" w:hAnsi="Times New Roman"/>
+                <w:b/>
+                <w:i w:val="0"/>
+                <w:sz w:val="22"/>
+              </w:rPr>
+              <w:t>Alexander Apartsin¹ and Yehudit Aperstein²</w:t>
+            </w:r>
+          </w:p>
+        </w:tc>
+      </w:tr>
+      <w:tr>
+        <w:tc>
+          <w:tcPr>
+            <w:tcW w:type="dxa" w:w="10080"/>
+            <w:tcBorders>
+              <w:left w:val="nil"/>
+              <w:right w:val="nil"/>
+              <w:top w:val="nil"/>
+              <w:bottom w:val="nil"/>
+            </w:tcBorders>
+          </w:tcPr>
+          <w:p>
+            <w:pPr>
+              <w:spacing w:before="0" w:after="120" w:line="240" w:lineRule="auto"/>
+              <w:jc w:val="center"/>
+            </w:pPr>
+            <w:r/>
+            <w:r>
+              <w:rPr>
+                <w:rFonts w:ascii="Times New Roman" w:hAnsi="Times New Roman"/>
+                <w:b w:val="0"/>
+                <w:i/>
+                <w:sz w:val="19"/>
+              </w:rPr>
+              <w:t>¹ Holon Institute of Technology · ² Afeka College of Engineering</w:t>
+            </w:r>
+          </w:p>
+        </w:tc>
+      </w:tr>
+    </w:tbl>
     <w:bookmarkStart w:id="9" w:name="abstract"/>
     <w:p>
       <w:pPr>
@@ -108,6 +109,7 @@
     <w:p>
       <w:pPr>
         <w:pStyle w:val="FirstParagraph"/>
+        <w:ind w:left="432" w:right="432" w:firstLine="0"/>
         <w:jc w:val="both"/>
         <w:keepNext w:val="0"/>
         <w:keepLines w:val="0"/>
@@ -660,7 +662,7 @@
               <a:graphicData uri="http://schemas.openxmlformats.org/drawingml/2006/picture">
                 <pic:pic>
                   <pic:nvPicPr>
-                    <pic:cNvPr descr="C:/Users/apart/AppData/Local/Temp/html2doc_svg_s7VG00/svg_0.png" id="12" name="Picture"/>
+                    <pic:cNvPr descr="C:/Users/apart/AppData/Local/Temp/html2doc_svg_Z9Rd3H/svg_0.png" id="12" name="Picture"/>
                     <pic:cNvPicPr>
                       <a:picLocks noChangeArrowheads="1" noChangeAspect="1"/>
                     </pic:cNvPicPr>
@@ -1761,7 +1763,7 @@
               <a:graphicData uri="http://schemas.openxmlformats.org/drawingml/2006/picture">
                 <pic:pic>
                   <pic:nvPicPr>
-                    <pic:cNvPr descr="C:/Users/apart/AppData/Local/Temp/html2doc_svg_s7VG00/svg_1.png" id="17" name="Picture"/>
+                    <pic:cNvPr descr="C:/Users/apart/AppData/Local/Temp/html2doc_svg_Z9Rd3H/svg_1.png" id="17" name="Picture"/>
                     <pic:cNvPicPr>
                       <a:picLocks noChangeArrowheads="1" noChangeAspect="1"/>
                     </pic:cNvPicPr>
@@ -9866,7 +9868,7 @@
               <a:graphicData uri="http://schemas.openxmlformats.org/drawingml/2006/picture">
                 <pic:pic>
                   <pic:nvPicPr>
-                    <pic:cNvPr descr="C:/Users/apart/AppData/Local/Temp/html2doc_svg_s7VG00/svg_2.png" id="46" name="Picture"/>
+                    <pic:cNvPr descr="C:/Users/apart/AppData/Local/Temp/html2doc_svg_Z9Rd3H/svg_2.png" id="46" name="Picture"/>
                     <pic:cNvPicPr>
                       <a:picLocks noChangeArrowheads="1" noChangeAspect="1"/>
                     </pic:cNvPicPr>
@@ -10470,22 +10472,6 @@
         </w:rPr>
         <w:t xml:space="preserve">Table C1. Disciplines covered by the released challenge content.</w:t>
       </w:r>
-    </w:p>
-    <w:p>
-      <w:pPr>
-        <w:spacing w:before="120" w:after="120" w:line="120" w:lineRule="exact"/>
-        <w:rPr>
-          <w:sz w:val="12"/>
-          <w:szCs w:val="12"/>
-        </w:rPr>
-        <w:sectPr>
-          <w:type w:val="continuous"/>
-          <w:pgSz w:h="15840" w:w="12240"/>
-          <w:pgMar w:bottom="1080" w:footer="720" w:gutter="0" w:header="720" w:left="1080" w:right="1080" w:top="1080"/>
-          <w:cols w:num="2" w:space="288" w:equalWidth="1"/>
-          <w:docGrid w:linePitch="360"/>
-        </w:sectPr>
-      </w:pPr>
     </w:p>
     <w:tbl>
       <w:tblPr>
@@ -10797,23 +10783,8 @@
     </w:tbl>
     <w:p>
       <w:pPr>
-        <w:spacing w:before="120" w:after="120" w:line="120" w:lineRule="exact"/>
-        <w:rPr>
-          <w:sz w:val="12"/>
-          <w:szCs w:val="12"/>
-        </w:rPr>
-        <w:sectPr>
-          <w:type w:val="continuous"/>
-          <w:pgSz w:h="15840" w:w="12240"/>
-          <w:pgMar w:bottom="1080" w:footer="720" w:gutter="0" w:header="720" w:left="1080" w:right="1080" w:top="1080"/>
-          <w:cols w:num="1" w:space="288"/>
-          <w:docGrid w:linePitch="360"/>
-        </w:sectPr>
-      </w:pPr>
-    </w:p>
-    <w:p>
-      <w:pPr>
         <w:pStyle w:val="BodyText"/>
+        <w:spacing w:before="120"/>
         <w:jc w:val="both"/>
         <w:keepNext w:val="0"/>
         <w:keepLines w:val="0"/>

</xml_diff>

<commit_message>
Match SynSmith typography: Charter/Georgia serif, navy accent, booktabs tables
HTML: rebuilt to the SynSmith paper layout - Charter/Source-Serif/Georgia serif
stack, navy #14385c accent, 720px column, exact pt sizes (11pt body, 19/13/11.5
headings, 10pt abstract, 9pt refs/footer, 9.5pt tables/captions, 1.55 leading),
booktabs-style tables (top/bottom rules only), centered small-caps abstract,
outline download badges. DOCX: body/heading font set to Georgia (the SynSmith
stack's installed Windows fallback) via the new --font-family flag; camera-ready
sizes retained.

Co-Authored-By: Claude Opus 4.8 <noreply@anthropic.com>
</commit_message>
<xml_diff>
--- a/docs/coreasoning-2col.docx
+++ b/docs/coreasoning-2col.docx
@@ -53,7 +53,7 @@
             <w:r/>
             <w:r>
               <w:rPr>
-                <w:rFonts w:ascii="Times New Roman" w:hAnsi="Times New Roman"/>
+                <w:rFonts w:ascii="Georgia" w:hAnsi="Georgia"/>
                 <w:b/>
                 <w:i w:val="0"/>
                 <w:sz w:val="22"/>
@@ -82,7 +82,7 @@
             <w:r/>
             <w:r>
               <w:rPr>
-                <w:rFonts w:ascii="Times New Roman" w:hAnsi="Times New Roman"/>
+                <w:rFonts w:ascii="Georgia" w:hAnsi="Georgia"/>
                 <w:b w:val="0"/>
                 <w:i/>
                 <w:sz w:val="19"/>
@@ -662,7 +662,7 @@
               <a:graphicData uri="http://schemas.openxmlformats.org/drawingml/2006/picture">
                 <pic:pic>
                   <pic:nvPicPr>
-                    <pic:cNvPr descr="C:/Users/apart/AppData/Local/Temp/html2doc_svg_Z9Rd3H/svg_0.png" id="12" name="Picture"/>
+                    <pic:cNvPr descr="C:/Users/apart/AppData/Local/Temp/html2doc_svg_z9EReJ/svg_0.png" id="12" name="Picture"/>
                     <pic:cNvPicPr>
                       <a:picLocks noChangeArrowheads="1" noChangeAspect="1"/>
                     </pic:cNvPicPr>
@@ -1763,7 +1763,7 @@
               <a:graphicData uri="http://schemas.openxmlformats.org/drawingml/2006/picture">
                 <pic:pic>
                   <pic:nvPicPr>
-                    <pic:cNvPr descr="C:/Users/apart/AppData/Local/Temp/html2doc_svg_Z9Rd3H/svg_1.png" id="17" name="Picture"/>
+                    <pic:cNvPr descr="C:/Users/apart/AppData/Local/Temp/html2doc_svg_z9EReJ/svg_1.png" id="17" name="Picture"/>
                     <pic:cNvPicPr>
                       <a:picLocks noChangeArrowheads="1" noChangeAspect="1"/>
                     </pic:cNvPicPr>
@@ -3444,7 +3444,7 @@
             </w:pPr>
             <w:r>
               <w:rPr>
-                <w:rFonts w:ascii="Times New Roman" w:hAnsi="Times New Roman"/>
+                <w:rFonts w:ascii="Georgia" w:hAnsi="Georgia"/>
                 <w:b/>
                 <w:sz w:val="19"/>
               </w:rPr>
@@ -3473,7 +3473,7 @@
             </w:pPr>
             <w:r>
               <w:rPr>
-                <w:rFonts w:ascii="Times New Roman" w:hAnsi="Times New Roman"/>
+                <w:rFonts w:ascii="Georgia" w:hAnsi="Georgia"/>
                 <w:b/>
                 <w:sz w:val="19"/>
               </w:rPr>
@@ -3502,7 +3502,7 @@
             </w:pPr>
             <w:r>
               <w:rPr>
-                <w:rFonts w:ascii="Times New Roman" w:hAnsi="Times New Roman"/>
+                <w:rFonts w:ascii="Georgia" w:hAnsi="Georgia"/>
                 <w:b/>
                 <w:sz w:val="19"/>
               </w:rPr>
@@ -3531,7 +3531,7 @@
             </w:pPr>
             <w:r>
               <w:rPr>
-                <w:rFonts w:ascii="Times New Roman" w:hAnsi="Times New Roman"/>
+                <w:rFonts w:ascii="Georgia" w:hAnsi="Georgia"/>
                 <w:b/>
                 <w:sz w:val="19"/>
               </w:rPr>
@@ -3561,7 +3561,7 @@
             </w:pPr>
             <w:r>
               <w:rPr>
-                <w:rFonts w:ascii="Times New Roman" w:hAnsi="Times New Roman"/>
+                <w:rFonts w:ascii="Georgia" w:hAnsi="Georgia"/>
                 <w:sz w:val="20"/>
               </w:rPr>
               <w:t xml:space="preserve">4D AI Fluency (Dakan &amp; Feller, 2025)</w:t>
@@ -3588,7 +3588,7 @@
             </w:pPr>
             <w:r>
               <w:rPr>
-                <w:rFonts w:ascii="Times New Roman" w:hAnsi="Times New Roman"/>
+                <w:rFonts w:ascii="Georgia" w:hAnsi="Georgia"/>
                 <w:sz w:val="20"/>
               </w:rPr>
               <w:t xml:space="preserve">Delegation + part of Description</w:t>
@@ -3615,7 +3615,7 @@
             </w:pPr>
             <w:r>
               <w:rPr>
-                <w:rFonts w:ascii="Times New Roman" w:hAnsi="Times New Roman"/>
+                <w:rFonts w:ascii="Georgia" w:hAnsi="Georgia"/>
                 <w:sz w:val="20"/>
               </w:rPr>
               <w:t xml:space="preserve">Discernment</w:t>
@@ -3642,7 +3642,7 @@
             </w:pPr>
             <w:r>
               <w:rPr>
-                <w:rFonts w:ascii="Times New Roman" w:hAnsi="Times New Roman"/>
+                <w:rFonts w:ascii="Georgia" w:hAnsi="Georgia"/>
                 <w:i/>
                 <w:iCs/>
                 <w:sz w:val="20"/>
@@ -3651,14 +3651,14 @@
             </w:r>
             <w:r>
               <w:rPr>
-                <w:rFonts w:ascii="Times New Roman" w:hAnsi="Times New Roman"/>
+                <w:rFonts w:ascii="Georgia" w:hAnsi="Georgia"/>
                 <w:sz w:val="20"/>
               </w:rPr>
               <w:t xml:space="preserve"> </w:t>
             </w:r>
             <w:r>
               <w:rPr>
-                <w:rFonts w:ascii="Times New Roman" w:hAnsi="Times New Roman"/>
+                <w:rFonts w:ascii="Georgia" w:hAnsi="Georgia"/>
                 <w:sz w:val="20"/>
               </w:rPr>
               <w:t xml:space="preserve">Description</w:t>
@@ -3687,7 +3687,7 @@
             </w:pPr>
             <w:r>
               <w:rPr>
-                <w:rFonts w:ascii="Times New Roman" w:hAnsi="Times New Roman"/>
+                <w:rFonts w:ascii="Georgia" w:hAnsi="Georgia"/>
                 <w:sz w:val="20"/>
               </w:rPr>
               <w:t xml:space="preserve">Metacognitive demands (Tankelevitch et al., 2024)</w:t>
@@ -3714,7 +3714,7 @@
             </w:pPr>
             <w:r>
               <w:rPr>
-                <w:rFonts w:ascii="Times New Roman" w:hAnsi="Times New Roman"/>
+                <w:rFonts w:ascii="Georgia" w:hAnsi="Georgia"/>
                 <w:sz w:val="20"/>
               </w:rPr>
               <w:t xml:space="preserve">"prompting" (as a demand, not a skill)</w:t>
@@ -3741,7 +3741,7 @@
             </w:pPr>
             <w:r>
               <w:rPr>
-                <w:rFonts w:ascii="Times New Roman" w:hAnsi="Times New Roman"/>
+                <w:rFonts w:ascii="Georgia" w:hAnsi="Georgia"/>
                 <w:sz w:val="20"/>
               </w:rPr>
               <w:t xml:space="preserve">"evaluating outputs"</w:t>
@@ -3768,7 +3768,7 @@
             </w:pPr>
             <w:r>
               <w:rPr>
-                <w:rFonts w:ascii="Times New Roman" w:hAnsi="Times New Roman"/>
+                <w:rFonts w:ascii="Georgia" w:hAnsi="Georgia"/>
                 <w:sz w:val="20"/>
               </w:rPr>
               <w:t xml:space="preserve">"workflow iteration"</w:t>
@@ -3797,7 +3797,7 @@
             </w:pPr>
             <w:r>
               <w:rPr>
-                <w:rFonts w:ascii="Times New Roman" w:hAnsi="Times New Roman"/>
+                <w:rFonts w:ascii="Georgia" w:hAnsi="Georgia"/>
                 <w:sz w:val="20"/>
               </w:rPr>
               <w:t xml:space="preserve">Prompt literacy / CLEAR (Lo, 2023)</w:t>
@@ -3824,7 +3824,7 @@
             </w:pPr>
             <w:r>
               <w:rPr>
-                <w:rFonts w:ascii="Times New Roman" w:hAnsi="Times New Roman"/>
+                <w:rFonts w:ascii="Georgia" w:hAnsi="Georgia"/>
                 <w:i/>
                 <w:iCs/>
                 <w:sz w:val="20"/>
@@ -3833,14 +3833,14 @@
             </w:r>
             <w:r>
               <w:rPr>
-                <w:rFonts w:ascii="Times New Roman" w:hAnsi="Times New Roman"/>
+                <w:rFonts w:ascii="Georgia" w:hAnsi="Georgia"/>
                 <w:sz w:val="20"/>
               </w:rPr>
               <w:t xml:space="preserve"> </w:t>
             </w:r>
             <w:r>
               <w:rPr>
-                <w:rFonts w:ascii="Times New Roman" w:hAnsi="Times New Roman"/>
+                <w:rFonts w:ascii="Georgia" w:hAnsi="Georgia"/>
                 <w:sz w:val="20"/>
               </w:rPr>
               <w:t xml:space="preserve">"prompting"</w:t>
@@ -3867,7 +3867,7 @@
             </w:pPr>
             <w:r>
               <w:rPr>
-                <w:rFonts w:ascii="Times New Roman" w:hAnsi="Times New Roman"/>
+                <w:rFonts w:ascii="Georgia" w:hAnsi="Georgia"/>
                 <w:sz w:val="20"/>
               </w:rPr>
               <w:t xml:space="preserve">weakly present</w:t>
@@ -3894,7 +3894,7 @@
             </w:pPr>
             <w:r>
               <w:rPr>
-                <w:rFonts w:ascii="Times New Roman" w:hAnsi="Times New Roman"/>
+                <w:rFonts w:ascii="Georgia" w:hAnsi="Georgia"/>
                 <w:i/>
                 <w:iCs/>
                 <w:sz w:val="20"/>
@@ -3903,14 +3903,14 @@
             </w:r>
             <w:r>
               <w:rPr>
-                <w:rFonts w:ascii="Times New Roman" w:hAnsi="Times New Roman"/>
+                <w:rFonts w:ascii="Georgia" w:hAnsi="Georgia"/>
                 <w:sz w:val="20"/>
               </w:rPr>
               <w:t xml:space="preserve"> </w:t>
             </w:r>
             <w:r>
               <w:rPr>
-                <w:rFonts w:ascii="Times New Roman" w:hAnsi="Times New Roman"/>
+                <w:rFonts w:ascii="Georgia" w:hAnsi="Georgia"/>
                 <w:sz w:val="20"/>
               </w:rPr>
               <w:t xml:space="preserve">"iterative refinement"</w:t>
@@ -3939,7 +3939,7 @@
             </w:pPr>
             <w:r>
               <w:rPr>
-                <w:rFonts w:ascii="Times New Roman" w:hAnsi="Times New Roman"/>
+                <w:rFonts w:ascii="Georgia" w:hAnsi="Georgia"/>
                 <w:sz w:val="20"/>
               </w:rPr>
               <w:t xml:space="preserve">AI literacy (Long &amp; Magerko, 2020; UNESCO, 2024)</w:t>
@@ -3966,7 +3966,7 @@
             </w:pPr>
             <w:r>
               <w:rPr>
-                <w:rFonts w:ascii="Times New Roman" w:hAnsi="Times New Roman"/>
+                <w:rFonts w:ascii="Georgia" w:hAnsi="Georgia"/>
                 <w:sz w:val="20"/>
               </w:rPr>
               <w:t xml:space="preserve">absent</w:t>
@@ -3993,7 +3993,7 @@
             </w:pPr>
             <w:r>
               <w:rPr>
-                <w:rFonts w:ascii="Times New Roman" w:hAnsi="Times New Roman"/>
+                <w:rFonts w:ascii="Georgia" w:hAnsi="Georgia"/>
                 <w:sz w:val="20"/>
               </w:rPr>
               <w:t xml:space="preserve">diffuse "critical evaluation"</w:t>
@@ -4020,7 +4020,7 @@
             </w:pPr>
             <w:r>
               <w:rPr>
-                <w:rFonts w:ascii="Times New Roman" w:hAnsi="Times New Roman"/>
+                <w:rFonts w:ascii="Georgia" w:hAnsi="Georgia"/>
                 <w:sz w:val="20"/>
               </w:rPr>
               <w:t xml:space="preserve">absent</w:t>
@@ -4049,7 +4049,7 @@
             </w:pPr>
             <w:r>
               <w:rPr>
-                <w:rFonts w:ascii="Times New Roman" w:hAnsi="Times New Roman"/>
+                <w:rFonts w:ascii="Georgia" w:hAnsi="Georgia"/>
                 <w:sz w:val="20"/>
               </w:rPr>
               <w:t xml:space="preserve">Cyborg/Centaur modes (Randazzo et al., 2025)</w:t>
@@ -4076,7 +4076,7 @@
             </w:pPr>
             <w:r>
               <w:rPr>
-                <w:rFonts w:ascii="Times New Roman" w:hAnsi="Times New Roman"/>
+                <w:rFonts w:ascii="Georgia" w:hAnsi="Georgia"/>
                 <w:sz w:val="20"/>
               </w:rPr>
               <w:t xml:space="preserve">"directed" mode (described, not assessed)</w:t>
@@ -4103,7 +4103,7 @@
             </w:pPr>
             <w:r>
               <w:rPr>
-                <w:rFonts w:ascii="Times New Roman" w:hAnsi="Times New Roman"/>
+                <w:rFonts w:ascii="Georgia" w:hAnsi="Georgia"/>
                 <w:sz w:val="20"/>
               </w:rPr>
               <w:t xml:space="preserve">"push back / validate"</w:t>
@@ -4130,7 +4130,7 @@
             </w:pPr>
             <w:r>
               <w:rPr>
-                <w:rFonts w:ascii="Times New Roman" w:hAnsi="Times New Roman"/>
+                <w:rFonts w:ascii="Georgia" w:hAnsi="Georgia"/>
                 <w:sz w:val="20"/>
               </w:rPr>
               <w:t xml:space="preserve">"continuous dialogue"</w:t>
@@ -5974,7 +5974,7 @@
             </w:pPr>
             <w:r>
               <w:rPr>
-                <w:rFonts w:ascii="Times New Roman" w:hAnsi="Times New Roman"/>
+                <w:rFonts w:ascii="Georgia" w:hAnsi="Georgia"/>
                 <w:b/>
                 <w:sz w:val="19"/>
               </w:rPr>
@@ -6003,7 +6003,7 @@
             </w:pPr>
             <w:r>
               <w:rPr>
-                <w:rFonts w:ascii="Times New Roman" w:hAnsi="Times New Roman"/>
+                <w:rFonts w:ascii="Georgia" w:hAnsi="Georgia"/>
                 <w:b/>
                 <w:sz w:val="19"/>
               </w:rPr>
@@ -6032,7 +6032,7 @@
             </w:pPr>
             <w:r>
               <w:rPr>
-                <w:rFonts w:ascii="Times New Roman" w:hAnsi="Times New Roman"/>
+                <w:rFonts w:ascii="Georgia" w:hAnsi="Georgia"/>
                 <w:b/>
                 <w:sz w:val="19"/>
               </w:rPr>
@@ -6061,7 +6061,7 @@
             </w:pPr>
             <w:r>
               <w:rPr>
-                <w:rFonts w:ascii="Times New Roman" w:hAnsi="Times New Roman"/>
+                <w:rFonts w:ascii="Georgia" w:hAnsi="Georgia"/>
                 <w:b/>
                 <w:sz w:val="19"/>
               </w:rPr>
@@ -6091,7 +6091,7 @@
             </w:pPr>
             <w:r>
               <w:rPr>
-                <w:rFonts w:ascii="Times New Roman" w:hAnsi="Times New Roman"/>
+                <w:rFonts w:ascii="Georgia" w:hAnsi="Georgia"/>
                 <w:b/>
                 <w:bCs/>
                 <w:sz w:val="20"/>
@@ -6120,7 +6120,7 @@
             </w:pPr>
             <w:r>
               <w:rPr>
-                <w:rFonts w:ascii="Times New Roman" w:hAnsi="Times New Roman"/>
+                <w:rFonts w:ascii="Georgia" w:hAnsi="Georgia"/>
                 <w:b/>
                 <w:bCs/>
                 <w:sz w:val="20"/>
@@ -6149,7 +6149,7 @@
             </w:pPr>
             <w:r>
               <w:rPr>
-                <w:rFonts w:ascii="Times New Roman" w:hAnsi="Times New Roman"/>
+                <w:rFonts w:ascii="Georgia" w:hAnsi="Georgia"/>
                 <w:sz w:val="20"/>
               </w:rPr>
               <w:t xml:space="preserve">−0.02</w:t>
@@ -6176,7 +6176,7 @@
             </w:pPr>
             <w:r>
               <w:rPr>
-                <w:rFonts w:ascii="Times New Roman" w:hAnsi="Times New Roman"/>
+                <w:rFonts w:ascii="Georgia" w:hAnsi="Georgia"/>
                 <w:sz w:val="20"/>
               </w:rPr>
               <w:t xml:space="preserve">−0.07</w:t>
@@ -6205,7 +6205,7 @@
             </w:pPr>
             <w:r>
               <w:rPr>
-                <w:rFonts w:ascii="Times New Roman" w:hAnsi="Times New Roman"/>
+                <w:rFonts w:ascii="Georgia" w:hAnsi="Georgia"/>
                 <w:b/>
                 <w:bCs/>
                 <w:sz w:val="20"/>
@@ -6234,7 +6234,7 @@
             </w:pPr>
             <w:r>
               <w:rPr>
-                <w:rFonts w:ascii="Times New Roman" w:hAnsi="Times New Roman"/>
+                <w:rFonts w:ascii="Georgia" w:hAnsi="Georgia"/>
                 <w:sz w:val="20"/>
               </w:rPr>
               <w:t xml:space="preserve">+0.00</w:t>
@@ -6261,7 +6261,7 @@
             </w:pPr>
             <w:r>
               <w:rPr>
-                <w:rFonts w:ascii="Times New Roman" w:hAnsi="Times New Roman"/>
+                <w:rFonts w:ascii="Georgia" w:hAnsi="Georgia"/>
                 <w:b/>
                 <w:bCs/>
                 <w:sz w:val="20"/>
@@ -6290,7 +6290,7 @@
             </w:pPr>
             <w:r>
               <w:rPr>
-                <w:rFonts w:ascii="Times New Roman" w:hAnsi="Times New Roman"/>
+                <w:rFonts w:ascii="Georgia" w:hAnsi="Georgia"/>
                 <w:sz w:val="20"/>
               </w:rPr>
               <w:t xml:space="preserve">+0.00</w:t>
@@ -6319,7 +6319,7 @@
             </w:pPr>
             <w:r>
               <w:rPr>
-                <w:rFonts w:ascii="Times New Roman" w:hAnsi="Times New Roman"/>
+                <w:rFonts w:ascii="Georgia" w:hAnsi="Georgia"/>
                 <w:b/>
                 <w:bCs/>
                 <w:sz w:val="20"/>
@@ -6348,7 +6348,7 @@
             </w:pPr>
             <w:r>
               <w:rPr>
-                <w:rFonts w:ascii="Times New Roman" w:hAnsi="Times New Roman"/>
+                <w:rFonts w:ascii="Georgia" w:hAnsi="Georgia"/>
                 <w:sz w:val="20"/>
               </w:rPr>
               <w:t xml:space="preserve">−0.12</w:t>
@@ -6375,7 +6375,7 @@
             </w:pPr>
             <w:r>
               <w:rPr>
-                <w:rFonts w:ascii="Times New Roman" w:hAnsi="Times New Roman"/>
+                <w:rFonts w:ascii="Georgia" w:hAnsi="Georgia"/>
                 <w:sz w:val="20"/>
               </w:rPr>
               <w:t xml:space="preserve">+0.27</w:t>
@@ -6402,7 +6402,7 @@
             </w:pPr>
             <w:r>
               <w:rPr>
-                <w:rFonts w:ascii="Times New Roman" w:hAnsi="Times New Roman"/>
+                <w:rFonts w:ascii="Georgia" w:hAnsi="Georgia"/>
                 <w:b/>
                 <w:bCs/>
                 <w:sz w:val="20"/>
@@ -7132,7 +7132,7 @@
             </w:pPr>
             <w:r>
               <w:rPr>
-                <w:rFonts w:ascii="Times New Roman" w:hAnsi="Times New Roman"/>
+                <w:rFonts w:ascii="Georgia" w:hAnsi="Georgia"/>
                 <w:b/>
                 <w:sz w:val="19"/>
               </w:rPr>
@@ -7145,7 +7145,7 @@
             </m:oMath>
             <w:r>
               <w:rPr>
-                <w:rFonts w:ascii="Times New Roman" w:hAnsi="Times New Roman"/>
+                <w:rFonts w:ascii="Georgia" w:hAnsi="Georgia"/>
                 <w:b/>
                 <w:sz w:val="19"/>
               </w:rPr>
@@ -7174,7 +7174,7 @@
             </w:pPr>
             <w:r>
               <w:rPr>
-                <w:rFonts w:ascii="Times New Roman" w:hAnsi="Times New Roman"/>
+                <w:rFonts w:ascii="Georgia" w:hAnsi="Georgia"/>
                 <w:b/>
                 <w:sz w:val="19"/>
               </w:rPr>
@@ -7203,7 +7203,7 @@
             </w:pPr>
             <w:r>
               <w:rPr>
-                <w:rFonts w:ascii="Times New Roman" w:hAnsi="Times New Roman"/>
+                <w:rFonts w:ascii="Georgia" w:hAnsi="Georgia"/>
                 <w:b/>
                 <w:sz w:val="19"/>
               </w:rPr>
@@ -7232,7 +7232,7 @@
             </w:pPr>
             <w:r>
               <w:rPr>
-                <w:rFonts w:ascii="Times New Roman" w:hAnsi="Times New Roman"/>
+                <w:rFonts w:ascii="Georgia" w:hAnsi="Georgia"/>
                 <w:b/>
                 <w:sz w:val="19"/>
               </w:rPr>
@@ -7262,7 +7262,7 @@
             </w:pPr>
             <w:r>
               <w:rPr>
-                <w:rFonts w:ascii="Times New Roman" w:hAnsi="Times New Roman"/>
+                <w:rFonts w:ascii="Georgia" w:hAnsi="Georgia"/>
                 <w:sz w:val="20"/>
               </w:rPr>
               <w:t xml:space="preserve">same skill across gpt-4o, gpt-4o-mini, llama-3.3-70b</w:t>
@@ -7289,7 +7289,7 @@
             </w:pPr>
             <w:r>
               <w:rPr>
-                <w:rFonts w:ascii="Times New Roman" w:hAnsi="Times New Roman"/>
+                <w:rFonts w:ascii="Georgia" w:hAnsi="Georgia"/>
                 <w:b/>
                 <w:bCs/>
                 <w:sz w:val="20"/>
@@ -7318,7 +7318,7 @@
             </w:pPr>
             <w:r>
               <w:rPr>
-                <w:rFonts w:ascii="Times New Roman" w:hAnsi="Times New Roman"/>
+                <w:rFonts w:ascii="Georgia" w:hAnsi="Georgia"/>
                 <w:b/>
                 <w:bCs/>
                 <w:sz w:val="20"/>
@@ -7347,7 +7347,7 @@
             </w:pPr>
             <w:r>
               <w:rPr>
-                <w:rFonts w:ascii="Times New Roman" w:hAnsi="Times New Roman"/>
+                <w:rFonts w:ascii="Georgia" w:hAnsi="Georgia"/>
                 <w:sz w:val="20"/>
               </w:rPr>
               <w:t xml:space="preserve">+0.21</w:t>
@@ -7437,7 +7437,7 @@
             </w:pPr>
             <w:r>
               <w:rPr>
-                <w:rFonts w:ascii="Times New Roman" w:hAnsi="Times New Roman"/>
+                <w:rFonts w:ascii="Georgia" w:hAnsi="Georgia"/>
                 <w:b/>
                 <w:sz w:val="19"/>
               </w:rPr>
@@ -7445,7 +7445,7 @@
             </w:r>
             <w:r>
               <w:rPr>
-                <w:rFonts w:ascii="Times New Roman" w:hAnsi="Times New Roman"/>
+                <w:rFonts w:ascii="Georgia" w:hAnsi="Georgia"/>
                 <w:b/>
                 <w:sz w:val="19"/>
               </w:rPr>
@@ -7458,7 +7458,7 @@
             </m:oMath>
             <w:r>
               <w:rPr>
-                <w:rFonts w:ascii="Times New Roman" w:hAnsi="Times New Roman"/>
+                <w:rFonts w:ascii="Georgia" w:hAnsi="Georgia"/>
                 <w:b/>
                 <w:sz w:val="19"/>
               </w:rPr>
@@ -7466,7 +7466,7 @@
             </w:r>
             <w:r>
               <w:rPr>
-                <w:rFonts w:ascii="Times New Roman" w:hAnsi="Times New Roman"/>
+                <w:rFonts w:ascii="Georgia" w:hAnsi="Georgia"/>
                 <w:b/>
                 <w:sz w:val="19"/>
               </w:rPr>
@@ -7495,7 +7495,7 @@
             </w:pPr>
             <w:r>
               <w:rPr>
-                <w:rFonts w:ascii="Times New Roman" w:hAnsi="Times New Roman"/>
+                <w:rFonts w:ascii="Georgia" w:hAnsi="Georgia"/>
                 <w:b/>
                 <w:sz w:val="19"/>
               </w:rPr>
@@ -7524,7 +7524,7 @@
             </w:pPr>
             <w:r>
               <w:rPr>
-                <w:rFonts w:ascii="Times New Roman" w:hAnsi="Times New Roman"/>
+                <w:rFonts w:ascii="Georgia" w:hAnsi="Georgia"/>
                 <w:b/>
                 <w:sz w:val="19"/>
               </w:rPr>
@@ -7553,7 +7553,7 @@
             </w:pPr>
             <w:r>
               <w:rPr>
-                <w:rFonts w:ascii="Times New Roman" w:hAnsi="Times New Roman"/>
+                <w:rFonts w:ascii="Georgia" w:hAnsi="Georgia"/>
                 <w:b/>
                 <w:sz w:val="19"/>
               </w:rPr>
@@ -7582,7 +7582,7 @@
             </w:pPr>
             <w:r>
               <w:rPr>
-                <w:rFonts w:ascii="Times New Roman" w:hAnsi="Times New Roman"/>
+                <w:rFonts w:ascii="Georgia" w:hAnsi="Georgia"/>
                 <w:b/>
                 <w:sz w:val="19"/>
               </w:rPr>
@@ -7612,7 +7612,7 @@
             </w:pPr>
             <w:r>
               <w:rPr>
-                <w:rFonts w:ascii="Times New Roman" w:hAnsi="Times New Roman"/>
+                <w:rFonts w:ascii="Georgia" w:hAnsi="Georgia"/>
                 <w:sz w:val="20"/>
               </w:rPr>
               <w:t xml:space="preserve">independent (crossed) competences</w:t>
@@ -7639,7 +7639,7 @@
             </w:pPr>
             <w:r>
               <w:rPr>
-                <w:rFonts w:ascii="Times New Roman" w:hAnsi="Times New Roman"/>
+                <w:rFonts w:ascii="Georgia" w:hAnsi="Georgia"/>
                 <w:sz w:val="20"/>
               </w:rPr>
               <w:t xml:space="preserve">−0.03</w:t>
@@ -7666,7 +7666,7 @@
             </w:pPr>
             <w:r>
               <w:rPr>
-                <w:rFonts w:ascii="Times New Roman" w:hAnsi="Times New Roman"/>
+                <w:rFonts w:ascii="Georgia" w:hAnsi="Georgia"/>
                 <w:sz w:val="20"/>
               </w:rPr>
               <w:t xml:space="preserve">−0.12</w:t>
@@ -7693,7 +7693,7 @@
             </w:pPr>
             <w:r>
               <w:rPr>
-                <w:rFonts w:ascii="Times New Roman" w:hAnsi="Times New Roman"/>
+                <w:rFonts w:ascii="Georgia" w:hAnsi="Georgia"/>
                 <w:sz w:val="20"/>
               </w:rPr>
               <w:t xml:space="preserve">+0.25</w:t>
@@ -7720,14 +7720,14 @@
             </w:pPr>
             <w:r>
               <w:rPr>
-                <w:rFonts w:ascii="Times New Roman" w:hAnsi="Times New Roman"/>
+                <w:rFonts w:ascii="Georgia" w:hAnsi="Georgia"/>
                 <w:sz w:val="20"/>
               </w:rPr>
               <w:t xml:space="preserve">mean</w:t>
             </w:r>
             <w:r>
               <w:rPr>
-                <w:rFonts w:ascii="Times New Roman" w:hAnsi="Times New Roman"/>
+                <w:rFonts w:ascii="Georgia" w:hAnsi="Georgia"/>
                 <w:sz w:val="20"/>
               </w:rPr>
               <w:t xml:space="preserve"> </w:t>
@@ -7751,14 +7751,14 @@
             </m:oMath>
             <w:r>
               <w:rPr>
-                <w:rFonts w:ascii="Times New Roman" w:hAnsi="Times New Roman"/>
+                <w:rFonts w:ascii="Georgia" w:hAnsi="Georgia"/>
                 <w:sz w:val="20"/>
               </w:rPr>
               <w:t xml:space="preserve"> </w:t>
             </w:r>
             <w:r>
               <w:rPr>
-                <w:rFonts w:ascii="Times New Roman" w:hAnsi="Times New Roman"/>
+                <w:rFonts w:ascii="Georgia" w:hAnsi="Georgia"/>
                 <w:sz w:val="20"/>
               </w:rPr>
               <w:t xml:space="preserve">= 0.13</w:t>
@@ -7787,7 +7787,7 @@
             </w:pPr>
             <w:r>
               <w:rPr>
-                <w:rFonts w:ascii="Times New Roman" w:hAnsi="Times New Roman"/>
+                <w:rFonts w:ascii="Georgia" w:hAnsi="Georgia"/>
                 <w:sz w:val="20"/>
               </w:rPr>
               <w:t xml:space="preserve">shared single-ability level</w:t>
@@ -7814,7 +7814,7 @@
             </w:pPr>
             <w:r>
               <w:rPr>
-                <w:rFonts w:ascii="Times New Roman" w:hAnsi="Times New Roman"/>
+                <w:rFonts w:ascii="Georgia" w:hAnsi="Georgia"/>
                 <w:b/>
                 <w:bCs/>
                 <w:sz w:val="20"/>
@@ -7843,7 +7843,7 @@
             </w:pPr>
             <w:r>
               <w:rPr>
-                <w:rFonts w:ascii="Times New Roman" w:hAnsi="Times New Roman"/>
+                <w:rFonts w:ascii="Georgia" w:hAnsi="Georgia"/>
                 <w:sz w:val="20"/>
               </w:rPr>
               <w:t xml:space="preserve">+0.14</w:t>
@@ -7870,7 +7870,7 @@
             </w:pPr>
             <w:r>
               <w:rPr>
-                <w:rFonts w:ascii="Times New Roman" w:hAnsi="Times New Roman"/>
+                <w:rFonts w:ascii="Georgia" w:hAnsi="Georgia"/>
                 <w:b/>
                 <w:bCs/>
                 <w:sz w:val="20"/>
@@ -7899,14 +7899,14 @@
             </w:pPr>
             <w:r>
               <w:rPr>
-                <w:rFonts w:ascii="Times New Roman" w:hAnsi="Times New Roman"/>
+                <w:rFonts w:ascii="Georgia" w:hAnsi="Georgia"/>
                 <w:sz w:val="20"/>
               </w:rPr>
               <w:t xml:space="preserve">mean</w:t>
             </w:r>
             <w:r>
               <w:rPr>
-                <w:rFonts w:ascii="Times New Roman" w:hAnsi="Times New Roman"/>
+                <w:rFonts w:ascii="Georgia" w:hAnsi="Georgia"/>
                 <w:sz w:val="20"/>
               </w:rPr>
               <w:t xml:space="preserve"> </w:t>
@@ -7918,14 +7918,14 @@
             </m:oMath>
             <w:r>
               <w:rPr>
-                <w:rFonts w:ascii="Times New Roman" w:hAnsi="Times New Roman"/>
+                <w:rFonts w:ascii="Georgia" w:hAnsi="Georgia"/>
                 <w:sz w:val="20"/>
               </w:rPr>
               <w:t xml:space="preserve"> </w:t>
             </w:r>
             <w:r>
               <w:rPr>
-                <w:rFonts w:ascii="Times New Roman" w:hAnsi="Times New Roman"/>
+                <w:rFonts w:ascii="Georgia" w:hAnsi="Georgia"/>
                 <w:sz w:val="20"/>
               </w:rPr>
               <w:t xml:space="preserve">= +0.41</w:t>
@@ -9868,7 +9868,7 @@
               <a:graphicData uri="http://schemas.openxmlformats.org/drawingml/2006/picture">
                 <pic:pic>
                   <pic:nvPicPr>
-                    <pic:cNvPr descr="C:/Users/apart/AppData/Local/Temp/html2doc_svg_Z9Rd3H/svg_2.png" id="46" name="Picture"/>
+                    <pic:cNvPr descr="C:/Users/apart/AppData/Local/Temp/html2doc_svg_z9EReJ/svg_2.png" id="46" name="Picture"/>
                     <pic:cNvPicPr>
                       <a:picLocks noChangeArrowheads="1" noChangeAspect="1"/>
                     </pic:cNvPicPr>
@@ -10518,7 +10518,7 @@
             </w:pPr>
             <w:r>
               <w:rPr>
-                <w:rFonts w:ascii="Times New Roman" w:hAnsi="Times New Roman"/>
+                <w:rFonts w:ascii="Georgia" w:hAnsi="Georgia"/>
                 <w:b/>
                 <w:sz w:val="19"/>
               </w:rPr>
@@ -10547,7 +10547,7 @@
             </w:pPr>
             <w:r>
               <w:rPr>
-                <w:rFonts w:ascii="Times New Roman" w:hAnsi="Times New Roman"/>
+                <w:rFonts w:ascii="Georgia" w:hAnsi="Georgia"/>
                 <w:b/>
                 <w:sz w:val="19"/>
               </w:rPr>
@@ -10577,7 +10577,7 @@
             </w:pPr>
             <w:r>
               <w:rPr>
-                <w:rFonts w:ascii="Times New Roman" w:hAnsi="Times New Roman"/>
+                <w:rFonts w:ascii="Georgia" w:hAnsi="Georgia"/>
                 <w:sz w:val="20"/>
               </w:rPr>
               <w:t xml:space="preserve">STEM</w:t>
@@ -10604,7 +10604,7 @@
             </w:pPr>
             <w:r>
               <w:rPr>
-                <w:rFonts w:ascii="Times New Roman" w:hAnsi="Times New Roman"/>
+                <w:rFonts w:ascii="Georgia" w:hAnsi="Georgia"/>
                 <w:sz w:val="20"/>
               </w:rPr>
               <w:t xml:space="preserve">Computer Science (algorithms); Physics (classical mechanics); Mathematics (linear algebra); Electrical Engineering (signal processing); Biology (molecular biology)</w:t>
@@ -10633,7 +10633,7 @@
             </w:pPr>
             <w:r>
               <w:rPr>
-                <w:rFonts w:ascii="Times New Roman" w:hAnsi="Times New Roman"/>
+                <w:rFonts w:ascii="Georgia" w:hAnsi="Georgia"/>
                 <w:sz w:val="20"/>
               </w:rPr>
               <w:t xml:space="preserve">Social sciences</w:t>
@@ -10660,7 +10660,7 @@
             </w:pPr>
             <w:r>
               <w:rPr>
-                <w:rFonts w:ascii="Times New Roman" w:hAnsi="Times New Roman"/>
+                <w:rFonts w:ascii="Georgia" w:hAnsi="Georgia"/>
                 <w:sz w:val="20"/>
               </w:rPr>
               <w:t xml:space="preserve">Economics (microeconomics); Political Science (international relations); Psychology (cognitive psychology)</w:t>
@@ -10689,7 +10689,7 @@
             </w:pPr>
             <w:r>
               <w:rPr>
-                <w:rFonts w:ascii="Times New Roman" w:hAnsi="Times New Roman"/>
+                <w:rFonts w:ascii="Georgia" w:hAnsi="Georgia"/>
                 <w:sz w:val="20"/>
               </w:rPr>
               <w:t xml:space="preserve">Humanities and law</w:t>
@@ -10716,7 +10716,7 @@
             </w:pPr>
             <w:r>
               <w:rPr>
-                <w:rFonts w:ascii="Times New Roman" w:hAnsi="Times New Roman"/>
+                <w:rFonts w:ascii="Georgia" w:hAnsi="Georgia"/>
                 <w:sz w:val="20"/>
               </w:rPr>
               <w:t xml:space="preserve">Philosophy (applied ethics); Law (constitutional law)</w:t>
@@ -10745,7 +10745,7 @@
             </w:pPr>
             <w:r>
               <w:rPr>
-                <w:rFonts w:ascii="Times New Roman" w:hAnsi="Times New Roman"/>
+                <w:rFonts w:ascii="Georgia" w:hAnsi="Georgia"/>
                 <w:sz w:val="20"/>
               </w:rPr>
               <w:t xml:space="preserve">Professional and education</w:t>
@@ -10772,7 +10772,7 @@
             </w:pPr>
             <w:r>
               <w:rPr>
-                <w:rFonts w:ascii="Times New Roman" w:hAnsi="Times New Roman"/>
+                <w:rFonts w:ascii="Georgia" w:hAnsi="Georgia"/>
                 <w:sz w:val="20"/>
               </w:rPr>
               <w:t xml:space="preserve">Business (organizational behavior); Education (educational technology)</w:t>
@@ -12639,7 +12639,7 @@
     </w:pPr>
     <w:r>
       <w:rPr>
-        <w:rFonts w:ascii="Times New Roman" w:hAnsi="Times New Roman"/>
+        <w:rFonts w:ascii="Georgia" w:hAnsi="Georgia"/>
         <w:sz w:val="18"/>
       </w:rPr>
       <w:fldChar w:fldCharType="begin"/>
@@ -13378,7 +13378,7 @@
       <w:spacing w:after="0" w:before="0" w:line="240" w:lineRule="auto"/>
     </w:pPr>
     <w:rPr>
-      <w:rFonts w:ascii="Times New Roman" w:hAnsi="Times New Roman"/>
+      <w:rFonts w:ascii="Georgia" w:hAnsi="Georgia"/>
       <w:b w:val="0"/>
       <w:i w:val="0"/>
       <w:sz w:val="20"/>
@@ -13443,7 +13443,7 @@
       <w:outlineLvl w:val="0"/>
     </w:pPr>
     <w:rPr>
-      <w:rFonts w:ascii="Times New Roman" w:asciiTheme="majorHAnsi" w:cstheme="majorBidi" w:eastAsiaTheme="majorEastAsia" w:hAnsi="Times New Roman" w:hAnsiTheme="majorHAnsi"/>
+      <w:rFonts w:ascii="Georgia" w:asciiTheme="majorHAnsi" w:cstheme="majorBidi" w:eastAsiaTheme="majorEastAsia" w:hAnsi="Georgia" w:hAnsiTheme="majorHAnsi"/>
       <w:b/>
       <w:bCs/>
       <w:i w:val="0"/>
@@ -13468,7 +13468,7 @@
       <w:outlineLvl w:val="1"/>
     </w:pPr>
     <w:rPr>
-      <w:rFonts w:ascii="Times New Roman" w:asciiTheme="majorHAnsi" w:cstheme="majorBidi" w:eastAsiaTheme="majorEastAsia" w:hAnsi="Times New Roman" w:hAnsiTheme="majorHAnsi"/>
+      <w:rFonts w:ascii="Georgia" w:asciiTheme="majorHAnsi" w:cstheme="majorBidi" w:eastAsiaTheme="majorEastAsia" w:hAnsi="Georgia" w:hAnsiTheme="majorHAnsi"/>
       <w:b/>
       <w:bCs/>
       <w:i w:val="0"/>
@@ -13493,7 +13493,7 @@
       <w:outlineLvl w:val="2"/>
     </w:pPr>
     <w:rPr>
-      <w:rFonts w:ascii="Times New Roman" w:asciiTheme="majorHAnsi" w:cstheme="majorBidi" w:eastAsiaTheme="majorEastAsia" w:hAnsi="Times New Roman" w:hAnsiTheme="majorHAnsi"/>
+      <w:rFonts w:ascii="Georgia" w:asciiTheme="majorHAnsi" w:cstheme="majorBidi" w:eastAsiaTheme="majorEastAsia" w:hAnsi="Georgia" w:hAnsiTheme="majorHAnsi"/>
       <w:b/>
       <w:bCs/>
       <w:i w:val="0"/>
@@ -13738,7 +13738,7 @@
       <w:jc w:val="center"/>
     </w:pPr>
     <w:rPr>
-      <w:rFonts w:ascii="Times New Roman" w:asciiTheme="majorHAnsi" w:cstheme="majorBidi" w:eastAsiaTheme="majorEastAsia" w:hAnsi="Times New Roman" w:hAnsiTheme="majorHAnsi"/>
+      <w:rFonts w:ascii="Georgia" w:asciiTheme="majorHAnsi" w:cstheme="majorBidi" w:eastAsiaTheme="majorEastAsia" w:hAnsi="Georgia" w:hAnsiTheme="majorHAnsi"/>
       <w:b/>
       <w:i w:val="0"/>
       <w:color w:themeColor="text2" w:themeShade="BF" w:val="17365D"/>
@@ -13780,7 +13780,7 @@
       <w:jc w:val="center"/>
     </w:pPr>
     <w:rPr>
-      <w:rFonts w:ascii="Times New Roman" w:asciiTheme="majorHAnsi" w:cstheme="majorBidi" w:eastAsiaTheme="majorEastAsia" w:hAnsi="Times New Roman" w:hAnsiTheme="majorHAnsi"/>
+      <w:rFonts w:ascii="Georgia" w:asciiTheme="majorHAnsi" w:cstheme="majorBidi" w:eastAsiaTheme="majorEastAsia" w:hAnsi="Georgia" w:hAnsiTheme="majorHAnsi"/>
       <w:b w:val="0"/>
       <w:i w:val="0"/>
       <w:iCs/>
@@ -13831,7 +13831,7 @@
       <w:jc w:val="both"/>
     </w:pPr>
     <w:rPr>
-      <w:rFonts w:ascii="Times New Roman" w:hAnsi="Times New Roman"/>
+      <w:rFonts w:ascii="Georgia" w:hAnsi="Georgia"/>
       <w:b w:val="0"/>
       <w:i w:val="0"/>
       <w:sz w:val="20"/>
@@ -25097,7 +25097,7 @@
       <w:jc w:val="both"/>
     </w:pPr>
     <w:rPr>
-      <w:rFonts w:ascii="Times New Roman" w:hAnsi="Times New Roman"/>
+      <w:rFonts w:ascii="Georgia" w:hAnsi="Georgia"/>
       <w:b w:val="0"/>
       <w:i w:val="0"/>
       <w:sz w:val="20"/>
@@ -25113,7 +25113,7 @@
       <w:jc w:val="both"/>
     </w:pPr>
     <w:rPr>
-      <w:rFonts w:ascii="Times New Roman" w:hAnsi="Times New Roman"/>
+      <w:rFonts w:ascii="Georgia" w:hAnsi="Georgia"/>
       <w:b w:val="0"/>
       <w:i w:val="0"/>
       <w:sz w:val="20"/>
@@ -25129,7 +25129,7 @@
       <w:jc w:val="center"/>
     </w:pPr>
     <w:rPr>
-      <w:rFonts w:ascii="Times New Roman" w:hAnsi="Times New Roman"/>
+      <w:rFonts w:ascii="Georgia" w:hAnsi="Georgia"/>
       <w:b/>
       <w:i w:val="0"/>
       <w:sz w:val="20"/>
@@ -25145,7 +25145,7 @@
       <w:jc w:val="both"/>
     </w:pPr>
     <w:rPr>
-      <w:rFonts w:ascii="Times New Roman" w:hAnsi="Times New Roman"/>
+      <w:rFonts w:ascii="Georgia" w:hAnsi="Georgia"/>
       <w:b w:val="0"/>
       <w:i w:val="0"/>
       <w:sz w:val="20"/>
@@ -25160,7 +25160,7 @@
       <w:jc w:val="center"/>
     </w:pPr>
     <w:rPr>
-      <w:rFonts w:ascii="Times New Roman" w:hAnsi="Times New Roman"/>
+      <w:rFonts w:ascii="Georgia" w:hAnsi="Georgia"/>
       <w:b w:val="0"/>
       <w:i/>
       <w:sz w:val="18"/>
@@ -25175,7 +25175,7 @@
       <w:jc w:val="center"/>
     </w:pPr>
     <w:rPr>
-      <w:rFonts w:ascii="Times New Roman" w:hAnsi="Times New Roman"/>
+      <w:rFonts w:ascii="Georgia" w:hAnsi="Georgia"/>
       <w:b w:val="0"/>
       <w:i/>
       <w:sz w:val="18"/>
@@ -25205,7 +25205,7 @@
       <w:jc w:val="both"/>
     </w:pPr>
     <w:rPr>
-      <w:rFonts w:ascii="Times New Roman" w:hAnsi="Times New Roman"/>
+      <w:rFonts w:ascii="Georgia" w:hAnsi="Georgia"/>
       <w:b w:val="0"/>
       <w:i w:val="0"/>
       <w:sz w:val="18"/>

</xml_diff>

<commit_message>
SynSmith typography: wrap abstract (centered small-caps, 10pt) + 9.5pt captions
Wrap the abstract in a .abstract block so it gets SynSmith's centered small-caps
heading and 10pt justified body; target figure captions with p:has(img)+p for
9.5pt. Abstract text and DOCX content unchanged (1494 chars; 7 figures, tables,
Georgia font all intact).

Co-Authored-By: Claude Opus 4.8 <noreply@anthropic.com>
</commit_message>
<xml_diff>
--- a/docs/coreasoning-2col.docx
+++ b/docs/coreasoning-2col.docx
@@ -662,7 +662,7 @@
               <a:graphicData uri="http://schemas.openxmlformats.org/drawingml/2006/picture">
                 <pic:pic>
                   <pic:nvPicPr>
-                    <pic:cNvPr descr="C:/Users/apart/AppData/Local/Temp/html2doc_svg_z9EReJ/svg_0.png" id="12" name="Picture"/>
+                    <pic:cNvPr descr="C:/Users/apart/AppData/Local/Temp/html2doc_svg_TcfdV3/svg_0.png" id="12" name="Picture"/>
                     <pic:cNvPicPr>
                       <a:picLocks noChangeArrowheads="1" noChangeAspect="1"/>
                     </pic:cNvPicPr>
@@ -1763,7 +1763,7 @@
               <a:graphicData uri="http://schemas.openxmlformats.org/drawingml/2006/picture">
                 <pic:pic>
                   <pic:nvPicPr>
-                    <pic:cNvPr descr="C:/Users/apart/AppData/Local/Temp/html2doc_svg_z9EReJ/svg_1.png" id="17" name="Picture"/>
+                    <pic:cNvPr descr="C:/Users/apart/AppData/Local/Temp/html2doc_svg_TcfdV3/svg_1.png" id="17" name="Picture"/>
                     <pic:cNvPicPr>
                       <a:picLocks noChangeArrowheads="1" noChangeAspect="1"/>
                     </pic:cNvPicPr>
@@ -9868,7 +9868,7 @@
               <a:graphicData uri="http://schemas.openxmlformats.org/drawingml/2006/picture">
                 <pic:pic>
                   <pic:nvPicPr>
-                    <pic:cNvPr descr="C:/Users/apart/AppData/Local/Temp/html2doc_svg_z9EReJ/svg_2.png" id="46" name="Picture"/>
+                    <pic:cNvPr descr="C:/Users/apart/AppData/Local/Temp/html2doc_svg_TcfdV3/svg_2.png" id="46" name="Picture"/>
                     <pic:cNvPicPr>
                       <a:picLocks noChangeArrowheads="1" noChangeAspect="1"/>
                     </pic:cNvPicPr>

</xml_diff>

<commit_message>
Regenerate 2-col DOCX with abstract->body margin fix
Co-Authored-By: Claude Opus 4.8 <noreply@anthropic.com>
</commit_message>
<xml_diff>
--- a/docs/coreasoning-2col.docx
+++ b/docs/coreasoning-2col.docx
@@ -243,7 +243,7 @@
     </w:p>
     <w:p>
       <w:pPr>
-        <w:spacing w:before="120" w:after="120" w:line="120" w:lineRule="exact"/>
+        <w:spacing w:before="120" w:after="300" w:line="120" w:lineRule="exact"/>
         <w:rPr>
           <w:sz w:val="12"/>
           <w:szCs w:val="12"/>
@@ -662,7 +662,7 @@
               <a:graphicData uri="http://schemas.openxmlformats.org/drawingml/2006/picture">
                 <pic:pic>
                   <pic:nvPicPr>
-                    <pic:cNvPr descr="C:/Users/apart/AppData/Local/Temp/html2doc_svg_TcfdV3/svg_0.png" id="12" name="Picture"/>
+                    <pic:cNvPr descr="C:/Users/apart/AppData/Local/Temp/html2doc_svg_RRgh4F/svg_0.png" id="12" name="Picture"/>
                     <pic:cNvPicPr>
                       <a:picLocks noChangeArrowheads="1" noChangeAspect="1"/>
                     </pic:cNvPicPr>
@@ -1763,7 +1763,7 @@
               <a:graphicData uri="http://schemas.openxmlformats.org/drawingml/2006/picture">
                 <pic:pic>
                   <pic:nvPicPr>
-                    <pic:cNvPr descr="C:/Users/apart/AppData/Local/Temp/html2doc_svg_TcfdV3/svg_1.png" id="17" name="Picture"/>
+                    <pic:cNvPr descr="C:/Users/apart/AppData/Local/Temp/html2doc_svg_RRgh4F/svg_1.png" id="17" name="Picture"/>
                     <pic:cNvPicPr>
                       <a:picLocks noChangeArrowheads="1" noChangeAspect="1"/>
                     </pic:cNvPicPr>
@@ -9868,7 +9868,7 @@
               <a:graphicData uri="http://schemas.openxmlformats.org/drawingml/2006/picture">
                 <pic:pic>
                   <pic:nvPicPr>
-                    <pic:cNvPr descr="C:/Users/apart/AppData/Local/Temp/html2doc_svg_TcfdV3/svg_2.png" id="46" name="Picture"/>
+                    <pic:cNvPr descr="C:/Users/apart/AppData/Local/Temp/html2doc_svg_RRgh4F/svg_2.png" id="46" name="Picture"/>
                     <pic:cNvPicPr>
                       <a:picLocks noChangeArrowheads="1" noChangeAspect="1"/>
                     </pic:cNvPicPr>

</xml_diff>

<commit_message>
Regenerate DOCX: bold caption labels, tight lists, table spacing, appendix figures bundled with captions
Co-Authored-By: Claude Opus 4.8 <noreply@anthropic.com>
</commit_message>
<xml_diff>
--- a/docs/coreasoning-2col.docx
+++ b/docs/coreasoning-2col.docx
@@ -662,7 +662,7 @@
               <a:graphicData uri="http://schemas.openxmlformats.org/drawingml/2006/picture">
                 <pic:pic>
                   <pic:nvPicPr>
-                    <pic:cNvPr descr="C:/Users/apart/AppData/Local/Temp/html2doc_svg_RRgh4F/svg_0.png" id="12" name="Picture"/>
+                    <pic:cNvPr descr="C:/Users/apart/AppData/Local/Temp/html2doc_svg_GRV8Be/svg_0.png" id="12" name="Picture"/>
                     <pic:cNvPicPr>
                       <a:picLocks noChangeArrowheads="1" noChangeAspect="1"/>
                     </pic:cNvPicPr>
@@ -807,6 +807,7 @@
           <w:ilvl w:val="0"/>
           <w:numId w:val="1001"/>
         </w:numPr>
+        <w:ind w:left="360" w:hanging="259"/>
         <w:jc w:val="both"/>
         <w:keepNext w:val="0"/>
         <w:keepLines w:val="0"/>
@@ -861,6 +862,7 @@
           <w:ilvl w:val="0"/>
           <w:numId w:val="1001"/>
         </w:numPr>
+        <w:ind w:left="360" w:hanging="259"/>
         <w:jc w:val="both"/>
         <w:keepNext w:val="0"/>
         <w:keepLines w:val="0"/>
@@ -899,6 +901,7 @@
           <w:ilvl w:val="0"/>
           <w:numId w:val="1001"/>
         </w:numPr>
+        <w:ind w:left="360" w:hanging="259"/>
         <w:jc w:val="both"/>
         <w:keepNext w:val="0"/>
         <w:keepLines w:val="0"/>
@@ -969,6 +972,7 @@
           <w:ilvl w:val="0"/>
           <w:numId w:val="1002"/>
         </w:numPr>
+        <w:ind w:left="360" w:hanging="259"/>
         <w:jc w:val="both"/>
         <w:keepNext w:val="0"/>
         <w:keepLines w:val="0"/>
@@ -1013,6 +1017,7 @@
           <w:ilvl w:val="0"/>
           <w:numId w:val="1002"/>
         </w:numPr>
+        <w:ind w:left="360" w:hanging="259"/>
         <w:jc w:val="both"/>
         <w:keepNext w:val="0"/>
         <w:keepLines w:val="0"/>
@@ -1057,6 +1062,7 @@
           <w:ilvl w:val="0"/>
           <w:numId w:val="1002"/>
         </w:numPr>
+        <w:ind w:left="360" w:hanging="259"/>
         <w:jc w:val="both"/>
         <w:keepNext w:val="0"/>
         <w:keepLines w:val="0"/>
@@ -1101,6 +1107,7 @@
           <w:ilvl w:val="0"/>
           <w:numId w:val="1002"/>
         </w:numPr>
+        <w:ind w:left="360" w:hanging="259"/>
         <w:jc w:val="both"/>
         <w:keepNext w:val="0"/>
         <w:keepLines w:val="0"/>
@@ -1133,6 +1140,7 @@
           <w:ilvl w:val="0"/>
           <w:numId w:val="1002"/>
         </w:numPr>
+        <w:ind w:left="360" w:hanging="259"/>
         <w:jc w:val="both"/>
         <w:keepNext w:val="0"/>
         <w:keepLines w:val="0"/>
@@ -1177,6 +1185,7 @@
           <w:ilvl w:val="0"/>
           <w:numId w:val="1002"/>
         </w:numPr>
+        <w:ind w:left="360" w:hanging="259"/>
         <w:jc w:val="both"/>
         <w:keepNext w:val="0"/>
         <w:keepLines w:val="0"/>
@@ -1588,6 +1597,7 @@
           <w:ilvl w:val="0"/>
           <w:numId w:val="1003"/>
         </w:numPr>
+        <w:ind w:left="360" w:hanging="259"/>
         <w:jc w:val="both"/>
         <w:keepNext w:val="0"/>
         <w:keepLines w:val="0"/>
@@ -1620,6 +1630,7 @@
           <w:ilvl w:val="0"/>
           <w:numId w:val="1003"/>
         </w:numPr>
+        <w:ind w:left="360" w:hanging="259"/>
         <w:jc w:val="both"/>
         <w:keepNext w:val="0"/>
         <w:keepLines w:val="0"/>
@@ -1652,6 +1663,7 @@
           <w:ilvl w:val="0"/>
           <w:numId w:val="1003"/>
         </w:numPr>
+        <w:ind w:left="360" w:hanging="259"/>
         <w:jc w:val="both"/>
         <w:keepNext w:val="0"/>
         <w:keepLines w:val="0"/>
@@ -1763,7 +1775,7 @@
               <a:graphicData uri="http://schemas.openxmlformats.org/drawingml/2006/picture">
                 <pic:pic>
                   <pic:nvPicPr>
-                    <pic:cNvPr descr="C:/Users/apart/AppData/Local/Temp/html2doc_svg_RRgh4F/svg_1.png" id="17" name="Picture"/>
+                    <pic:cNvPr descr="C:/Users/apart/AppData/Local/Temp/html2doc_svg_GRV8Be/svg_1.png" id="17" name="Picture"/>
                     <pic:cNvPicPr>
                       <a:picLocks noChangeArrowheads="1" noChangeAspect="1"/>
                     </pic:cNvPicPr>
@@ -1798,61 +1810,31 @@
     </w:p>
     <w:p>
       <w:pPr>
-        <w:pStyle w:val="ImageCaption"/>
         <w:spacing w:before="80" w:after="120" w:line="240" w:lineRule="auto"/>
-        <w:jc w:val="center"/>
         <w:keepNext w:val="0"/>
         <w:keepLines/>
         <w:widowControl w:val="1"/>
       </w:pPr>
       <w:r>
         <w:rPr>
+          <w:b/>
           <w:i/>
-          <w:iCs/>
-        </w:rPr>
-        <w:t xml:space="preserve">Figure 2. The CoReasoning loop. An upstream task definition (Framing, a self-regulated-learning</w:t>
-      </w:r>
-      <w:r>
-        <w:rPr>
+        </w:rPr>
+        <w:t>Figure 2.</w:t>
+      </w:r>
+      <w:r>
+        <w:rPr>
+          <w:b w:val="0"/>
           <w:i/>
-          <w:iCs/>
-        </w:rPr>
-        <w:t xml:space="preserve"> </w:t>
-      </w:r>
-      <w:r>
-        <w:rPr>
+        </w:rPr>
+        <w:t xml:space="preserve"> </w:t>
+      </w:r>
+      <w:r>
+        <w:rPr>
+          <w:b w:val="0"/>
           <w:i/>
-          <w:iCs/>
-        </w:rPr>
-        <w:t xml:space="preserve">forethought activity) sets the standards against which a metacognitive monitor-control cycle (Judging</w:t>
-      </w:r>
-      <w:r>
-        <w:rPr>
-          <w:i/>
-          <w:iCs/>
-        </w:rPr>
-        <w:t xml:space="preserve"> </w:t>
-      </w:r>
-      <w:r>
-        <w:rPr>
-          <w:i/>
-          <w:iCs/>
-        </w:rPr>
-        <w:t xml:space="preserve">then Steering) supervises a fallible AI at the object level. Judging is the monitor's read-out;</w:t>
-      </w:r>
-      <w:r>
-        <w:rPr>
-          <w:i/>
-          <w:iCs/>
-        </w:rPr>
-        <w:t xml:space="preserve"> </w:t>
-      </w:r>
-      <w:r>
-        <w:rPr>
-          <w:i/>
-          <w:iCs/>
-        </w:rPr>
-        <w:t xml:space="preserve">Steering is the controller's write.</w:t>
+        </w:rPr>
+        <w:t>The CoReasoning loop. An upstream task definition (Framing, a self-regulated-learning forethought activity) sets the standards against which a metacognitive monitor-control cycle (Judging then Steering) supervises a fallible AI at the object level. Judging is the monitor's read-out; Steering is the controller's write.</w:t>
       </w:r>
     </w:p>
     <w:p>
@@ -2607,6 +2589,7 @@
           <w:ilvl w:val="0"/>
           <w:numId w:val="1004"/>
         </w:numPr>
+        <w:ind w:left="360" w:hanging="259"/>
         <w:jc w:val="both"/>
         <w:keepNext w:val="0"/>
         <w:keepLines w:val="0"/>
@@ -2645,6 +2628,7 @@
           <w:ilvl w:val="0"/>
           <w:numId w:val="1004"/>
         </w:numPr>
+        <w:ind w:left="360" w:hanging="259"/>
         <w:jc w:val="both"/>
         <w:keepNext w:val="0"/>
         <w:keepLines w:val="0"/>
@@ -2683,6 +2667,7 @@
           <w:ilvl w:val="0"/>
           <w:numId w:val="1004"/>
         </w:numPr>
+        <w:ind w:left="360" w:hanging="259"/>
         <w:jc w:val="both"/>
         <w:keepNext w:val="0"/>
         <w:keepLines w:val="0"/>
@@ -2721,6 +2706,7 @@
           <w:ilvl w:val="0"/>
           <w:numId w:val="1004"/>
         </w:numPr>
+        <w:ind w:left="360" w:hanging="259"/>
         <w:jc w:val="both"/>
         <w:keepNext w:val="0"/>
         <w:keepLines w:val="0"/>
@@ -2753,6 +2739,7 @@
           <w:ilvl w:val="0"/>
           <w:numId w:val="1004"/>
         </w:numPr>
+        <w:ind w:left="360" w:hanging="259"/>
         <w:jc w:val="both"/>
         <w:keepNext w:val="0"/>
         <w:keepLines w:val="0"/>
@@ -3382,9 +3369,7 @@
     </w:p>
     <w:p>
       <w:pPr>
-        <w:pStyle w:val="TableCaption"/>
-        <w:spacing w:before="120" w:after="60" w:line="240" w:lineRule="auto"/>
-        <w:jc w:val="center"/>
+        <w:spacing w:before="240" w:after="60" w:line="240" w:lineRule="auto"/>
         <w:keepNext/>
         <w:keepLines/>
         <w:widowControl w:val="1"/>
@@ -3392,9 +3377,23 @@
       <w:r>
         <w:rPr>
           <w:b/>
-          <w:bCs/>
-        </w:rPr>
-        <w:t xml:space="preserve">Table 1. Where prior frameworks place the three CoReasoning skills.</w:t>
+          <w:i/>
+        </w:rPr>
+        <w:t>Table 1.</w:t>
+      </w:r>
+      <w:r>
+        <w:rPr>
+          <w:b w:val="0"/>
+          <w:i/>
+        </w:rPr>
+        <w:t xml:space="preserve"> </w:t>
+      </w:r>
+      <w:r>
+        <w:rPr>
+          <w:b w:val="0"/>
+          <w:i/>
+        </w:rPr>
+        <w:t>Where prior frameworks place the three CoReasoning skills.</w:t>
       </w:r>
     </w:p>
     <w:tbl>
@@ -4875,6 +4874,7 @@
           <w:ilvl w:val="0"/>
           <w:numId w:val="1005"/>
         </w:numPr>
+        <w:ind w:left="360" w:hanging="259"/>
         <w:jc w:val="both"/>
         <w:keepNext w:val="0"/>
         <w:keepLines w:val="0"/>
@@ -4913,6 +4913,7 @@
           <w:ilvl w:val="0"/>
           <w:numId w:val="1005"/>
         </w:numPr>
+        <w:ind w:left="360" w:hanging="259"/>
         <w:jc w:val="both"/>
         <w:keepNext w:val="0"/>
         <w:keepLines w:val="0"/>
@@ -4939,6 +4940,7 @@
           <w:ilvl w:val="0"/>
           <w:numId w:val="1005"/>
         </w:numPr>
+        <w:ind w:left="360" w:hanging="259"/>
         <w:jc w:val="both"/>
         <w:keepNext w:val="0"/>
         <w:keepLines w:val="0"/>
@@ -5015,6 +5017,7 @@
           <w:ilvl w:val="0"/>
           <w:numId w:val="1005"/>
         </w:numPr>
+        <w:ind w:left="360" w:hanging="259"/>
         <w:jc w:val="both"/>
         <w:keepNext w:val="0"/>
         <w:keepLines w:val="0"/>
@@ -5912,9 +5915,7 @@
     </w:p>
     <w:p>
       <w:pPr>
-        <w:pStyle w:val="TableCaption"/>
-        <w:spacing w:before="120" w:after="60" w:line="240" w:lineRule="auto"/>
-        <w:jc w:val="center"/>
+        <w:spacing w:before="240" w:after="60" w:line="240" w:lineRule="auto"/>
         <w:keepNext/>
         <w:keepLines/>
         <w:widowControl w:val="1"/>
@@ -5922,9 +5923,23 @@
       <w:r>
         <w:rPr>
           <w:b/>
-          <w:bCs/>
-        </w:rPr>
-        <w:t xml:space="preserve">Table 2. Effect on each skill's grade of manipulating each skill's competence (grade Δ, strong − weak; N=80).</w:t>
+          <w:i/>
+        </w:rPr>
+        <w:t>Table 2.</w:t>
+      </w:r>
+      <w:r>
+        <w:rPr>
+          <w:b w:val="0"/>
+          <w:i/>
+        </w:rPr>
+        <w:t xml:space="preserve"> </w:t>
+      </w:r>
+      <w:r>
+        <w:rPr>
+          <w:b w:val="0"/>
+          <w:i/>
+        </w:rPr>
+        <w:t>Effect on each skill's grade of manipulating each skill's competence (grade Δ, strong − weak; N=80).</w:t>
       </w:r>
     </w:p>
     <w:tbl>
@@ -7040,9 +7055,7 @@
     </w:p>
     <w:p>
       <w:pPr>
-        <w:pStyle w:val="TableCaption"/>
-        <w:spacing w:before="120" w:after="60" w:line="240" w:lineRule="auto"/>
-        <w:jc w:val="center"/>
+        <w:spacing w:before="240" w:after="60" w:line="240" w:lineRule="auto"/>
         <w:keepNext/>
         <w:keepLines/>
         <w:widowControl w:val="1"/>
@@ -7050,39 +7063,23 @@
       <w:r>
         <w:rPr>
           <w:b/>
-          <w:bCs/>
-        </w:rPr>
-        <w:t xml:space="preserve">Table 3. Multitrait-multimethod validity.</w:t>
-      </w:r>
-      <w:r>
-        <w:t xml:space="preserve"> </w:t>
-      </w:r>
-      <w:r>
-        <w:t xml:space="preserve">Panel A: convergent agreement of the same skill across</w:t>
-      </w:r>
-      <w:r>
-        <w:t xml:space="preserve"> </w:t>
-      </w:r>
-      <w:r>
-        <w:t xml:space="preserve">the three grader backends (mean pairwise per-learner rank correlation on the 40 shared transcripts).</w:t>
-      </w:r>
-      <w:r>
-        <w:t xml:space="preserve"> </w:t>
-      </w:r>
-      <w:r>
-        <w:t xml:space="preserve">Panel B: inter-skill grade correlation by population, showing the instrument recovers the population's</w:t>
-      </w:r>
-      <w:r>
-        <w:t xml:space="preserve"> </w:t>
-      </w:r>
-      <w:r>
-        <w:t xml:space="preserve">dependence structure (discriminant on the full crossed design, convergent on the n=20 all-strong and</w:t>
-      </w:r>
-      <w:r>
-        <w:t xml:space="preserve"> </w:t>
-      </w:r>
-      <w:r>
-        <w:t xml:space="preserve">all-weak learners whose three competences share one level).</w:t>
+          <w:i/>
+        </w:rPr>
+        <w:t>Table 3.</w:t>
+      </w:r>
+      <w:r>
+        <w:rPr>
+          <w:b w:val="0"/>
+          <w:i/>
+        </w:rPr>
+        <w:t xml:space="preserve"> </w:t>
+      </w:r>
+      <w:r>
+        <w:rPr>
+          <w:b w:val="0"/>
+          <w:i/>
+        </w:rPr>
+        <w:t>Multitrait-multimethod validity. Panel A: convergent agreement of the same skill across the three grader backends (mean pairwise per-learner rank correlation on the 40 shared transcripts). Panel B: inter-skill grade correlation by population, showing the instrument recovers the population's dependence structure (discriminant on the full crossed design, convergent on the n=20 all-strong and all-weak learners whose three competences share one level).</w:t>
       </w:r>
     </w:p>
     <w:tbl>
@@ -8167,61 +8164,31 @@
     </w:p>
     <w:p>
       <w:pPr>
-        <w:pStyle w:val="ImageCaption"/>
         <w:spacing w:before="80" w:after="120" w:line="240" w:lineRule="auto"/>
-        <w:jc w:val="center"/>
         <w:keepNext w:val="0"/>
         <w:keepLines/>
         <w:widowControl w:val="1"/>
       </w:pPr>
       <w:r>
         <w:rPr>
+          <w:b/>
           <w:i/>
-          <w:iCs/>
-        </w:rPr>
-        <w:t xml:space="preserve">Figure 3. Effect of manipulating each skill's competence (columns) on each skill's grade (rows). Each</w:t>
-      </w:r>
-      <w:r>
-        <w:rPr>
+        </w:rPr>
+        <w:t>Figure 3.</w:t>
+      </w:r>
+      <w:r>
+        <w:rPr>
+          <w:b w:val="0"/>
           <w:i/>
-          <w:iCs/>
-        </w:rPr>
-        <w:t xml:space="preserve"> </w:t>
-      </w:r>
-      <w:r>
-        <w:rPr>
+        </w:rPr>
+        <w:t xml:space="preserve"> </w:t>
+      </w:r>
+      <w:r>
+        <w:rPr>
+          <w:b w:val="0"/>
           <w:i/>
-          <w:iCs/>
-        </w:rPr>
-        <w:t xml:space="preserve">cell is the grade change (strong minus weak) on the 3-point scale (A=3, B=2, C=1); warmer cells are</w:t>
-      </w:r>
-      <w:r>
-        <w:rPr>
-          <w:i/>
-          <w:iCs/>
-        </w:rPr>
-        <w:t xml:space="preserve"> </w:t>
-      </w:r>
-      <w:r>
-        <w:rPr>
-          <w:i/>
-          <w:iCs/>
-        </w:rPr>
-        <w:t xml:space="preserve">larger positive effects. The diagonal (own-skill effect) dominates; off-diagonal (cross-skill) effects</w:t>
-      </w:r>
-      <w:r>
-        <w:rPr>
-          <w:i/>
-          <w:iCs/>
-        </w:rPr>
-        <w:t xml:space="preserve"> </w:t>
-      </w:r>
-      <w:r>
-        <w:rPr>
-          <w:i/>
-          <w:iCs/>
-        </w:rPr>
-        <w:t xml:space="preserve">are near zero.</w:t>
+        </w:rPr>
+        <w:t>Effect of manipulating each skill's competence (columns) on each skill's grade (rows). Each cell is the grade change (strong minus weak) on the 3-point scale (A=3, B=2, C=1); warmer cells are larger positive effects. The diagonal (own-skill effect) dominates; off-diagonal (cross-skill) effects are near zero.</w:t>
       </w:r>
     </w:p>
     <w:p>
@@ -8277,33 +8244,31 @@
     </w:p>
     <w:p>
       <w:pPr>
-        <w:pStyle w:val="ImageCaption"/>
         <w:spacing w:before="80" w:after="120" w:line="240" w:lineRule="auto"/>
-        <w:jc w:val="center"/>
         <w:keepNext w:val="0"/>
         <w:keepLines/>
         <w:widowControl w:val="1"/>
       </w:pPr>
       <w:r>
         <w:rPr>
+          <w:b/>
           <w:i/>
-          <w:iCs/>
-        </w:rPr>
-        <w:t xml:space="preserve">Figure 4. Mean per-skill grade for five competence profiles. Judging reaches A only when judging is</w:t>
-      </w:r>
-      <w:r>
-        <w:rPr>
+        </w:rPr>
+        <w:t>Figure 4.</w:t>
+      </w:r>
+      <w:r>
+        <w:rPr>
+          <w:b w:val="0"/>
           <w:i/>
-          <w:iCs/>
-        </w:rPr>
-        <w:t xml:space="preserve"> </w:t>
-      </w:r>
-      <w:r>
-        <w:rPr>
+        </w:rPr>
+        <w:t xml:space="preserve"> </w:t>
+      </w:r>
+      <w:r>
+        <w:rPr>
+          <w:b w:val="0"/>
           <w:i/>
-          <w:iCs/>
-        </w:rPr>
-        <w:t xml:space="preserve">strong, regardless of framing or steering; each skill responds to its own competence.</w:t>
+        </w:rPr>
+        <w:t>Mean per-skill grade for five competence profiles. Judging reaches A only when judging is strong, regardless of framing or steering; each skill responds to its own competence.</w:t>
       </w:r>
     </w:p>
     <w:p>
@@ -9565,6 +9530,35 @@
     </w:p>
     <w:p>
       <w:pPr>
+        <w:spacing w:before="80" w:after="120" w:line="240" w:lineRule="auto"/>
+        <w:keepNext w:val="0"/>
+        <w:keepLines/>
+        <w:widowControl w:val="1"/>
+      </w:pPr>
+      <w:r>
+        <w:rPr>
+          <w:b/>
+          <w:i/>
+        </w:rPr>
+        <w:t>Figure A1.</w:t>
+      </w:r>
+      <w:r>
+        <w:rPr>
+          <w:b w:val="0"/>
+          <w:i/>
+        </w:rPr>
+        <w:t xml:space="preserve"> </w:t>
+      </w:r>
+      <w:r>
+        <w:rPr>
+          <w:b w:val="0"/>
+          <w:i/>
+        </w:rPr>
+        <w:t>Screenshot of the running platform: a learner's challenge run at the Framing phase. The engine has generated an ill-defined problem (here, an AI hiring-screening task), and the learner specifies refinements before any solution is produced. The two-phase structure is explicit in the interface, Phase 1 (Framing) and Phase 2 (the Judge-Steer cycle), and each skill is scored and given feedback independently.</w:t>
+      </w:r>
+    </w:p>
+    <w:p>
+      <w:pPr>
         <w:spacing w:before="120" w:after="120" w:line="120" w:lineRule="exact"/>
         <w:rPr>
           <w:sz w:val="12"/>
@@ -9578,78 +9572,6 @@
           <w:docGrid w:linePitch="360"/>
         </w:sectPr>
       </w:pPr>
-    </w:p>
-    <w:p>
-      <w:pPr>
-        <w:pStyle w:val="BodyText"/>
-        <w:jc w:val="both"/>
-        <w:keepNext w:val="0"/>
-        <w:keepLines w:val="0"/>
-        <w:widowControl w:val="1"/>
-      </w:pPr>
-      <w:r>
-        <w:rPr>
-          <w:i/>
-          <w:iCs/>
-        </w:rPr>
-        <w:t xml:space="preserve">Figure A1. Screenshot of the running platform: a learner's challenge run at the Framing phase. The</w:t>
-      </w:r>
-      <w:r>
-        <w:rPr>
-          <w:i/>
-          <w:iCs/>
-        </w:rPr>
-        <w:t xml:space="preserve"> </w:t>
-      </w:r>
-      <w:r>
-        <w:rPr>
-          <w:i/>
-          <w:iCs/>
-        </w:rPr>
-        <w:t xml:space="preserve">engine has generated an ill-defined problem (here, an AI hiring-screening task), and the learner</w:t>
-      </w:r>
-      <w:r>
-        <w:rPr>
-          <w:i/>
-          <w:iCs/>
-        </w:rPr>
-        <w:t xml:space="preserve"> </w:t>
-      </w:r>
-      <w:r>
-        <w:rPr>
-          <w:i/>
-          <w:iCs/>
-        </w:rPr>
-        <w:t xml:space="preserve">specifies refinements before any solution is produced. The two-phase structure is explicit in the</w:t>
-      </w:r>
-      <w:r>
-        <w:rPr>
-          <w:i/>
-          <w:iCs/>
-        </w:rPr>
-        <w:t xml:space="preserve"> </w:t>
-      </w:r>
-      <w:r>
-        <w:rPr>
-          <w:i/>
-          <w:iCs/>
-        </w:rPr>
-        <w:t xml:space="preserve">interface, Phase 1 (Framing) and Phase 2 (the Judge-Steer cycle), and each skill is scored and given</w:t>
-      </w:r>
-      <w:r>
-        <w:rPr>
-          <w:i/>
-          <w:iCs/>
-        </w:rPr>
-        <w:t xml:space="preserve"> </w:t>
-      </w:r>
-      <w:r>
-        <w:rPr>
-          <w:i/>
-          <w:iCs/>
-        </w:rPr>
-        <w:t xml:space="preserve">feedback independently.</w:t>
-      </w:r>
     </w:p>
     <w:p>
       <w:pPr>
@@ -9762,93 +9684,32 @@
     </w:p>
     <w:p>
       <w:pPr>
-        <w:spacing w:before="120" w:after="120" w:line="120" w:lineRule="exact"/>
-        <w:rPr>
-          <w:sz w:val="12"/>
-          <w:szCs w:val="12"/>
-        </w:rPr>
-        <w:sectPr>
-          <w:type w:val="continuous"/>
-          <w:pgSz w:h="15840" w:w="12240"/>
-          <w:pgMar w:bottom="1080" w:footer="720" w:gutter="0" w:header="720" w:left="1080" w:right="1080" w:top="1080"/>
-          <w:cols w:num="1" w:space="288"/>
-          <w:docGrid w:linePitch="360"/>
-        </w:sectPr>
-      </w:pPr>
-    </w:p>
-    <w:p>
-      <w:pPr>
-        <w:pStyle w:val="BodyText"/>
-        <w:jc w:val="both"/>
+        <w:spacing w:before="80" w:after="120" w:line="240" w:lineRule="auto"/>
         <w:keepNext w:val="0"/>
-        <w:keepLines w:val="0"/>
+        <w:keepLines/>
         <w:widowControl w:val="1"/>
       </w:pPr>
       <w:r>
         <w:rPr>
+          <w:b/>
           <w:i/>
-          <w:iCs/>
-        </w:rPr>
-        <w:t xml:space="preserve">Figure A2. Screenshot of the running platform: the instructor course-analytics view. Grade</w:t>
-      </w:r>
-      <w:r>
-        <w:rPr>
+        </w:rPr>
+        <w:t>Figure A2.</w:t>
+      </w:r>
+      <w:r>
+        <w:rPr>
+          <w:b w:val="0"/>
           <w:i/>
-          <w:iCs/>
-        </w:rPr>
-        <w:t xml:space="preserve"> </w:t>
-      </w:r>
-      <w:r>
-        <w:rPr>
+        </w:rPr>
+        <w:t xml:space="preserve"> </w:t>
+      </w:r>
+      <w:r>
+        <w:rPr>
+          <w:b w:val="0"/>
           <w:i/>
-          <w:iCs/>
-        </w:rPr>
-        <w:t xml:space="preserve">distribution is broken out into separate Framing, Judging, and Steering panels, and the per-student</w:t>
-      </w:r>
-      <w:r>
-        <w:rPr>
-          <w:i/>
-          <w:iCs/>
-        </w:rPr>
-        <w:t xml:space="preserve"> </w:t>
-      </w:r>
-      <w:r>
-        <w:rPr>
-          <w:i/>
-          <w:iCs/>
-        </w:rPr>
-        <w:t xml:space="preserve">results list the three skills as distinct columns, the interface-level expression of the framework's</w:t>
-      </w:r>
-      <w:r>
-        <w:rPr>
-          <w:i/>
-          <w:iCs/>
-        </w:rPr>
-        <w:t xml:space="preserve"> </w:t>
-      </w:r>
-      <w:r>
-        <w:rPr>
-          <w:i/>
-          <w:iCs/>
-        </w:rPr>
-        <w:t xml:space="preserve">central claim that productive AI use is not one skill but three.</w:t>
-      </w:r>
-    </w:p>
-    <w:p>
-      <w:pPr>
-        <w:spacing w:before="120" w:after="120" w:line="120" w:lineRule="exact"/>
-        <w:rPr>
-          <w:sz w:val="12"/>
-          <w:szCs w:val="12"/>
-        </w:rPr>
-        <w:sectPr>
-          <w:type w:val="continuous"/>
-          <w:pgSz w:h="15840" w:w="12240"/>
-          <w:pgMar w:bottom="1080" w:footer="720" w:gutter="0" w:header="720" w:left="1080" w:right="1080" w:top="1080"/>
-          <w:cols w:num="2" w:space="288" w:equalWidth="1"/>
-          <w:docGrid w:linePitch="360"/>
-        </w:sectPr>
-      </w:pPr>
+        </w:rPr>
+        <w:t>Screenshot of the running platform: the instructor course-analytics view. Grade distribution is broken out into separate Framing, Judging, and Steering panels, and the per-student results list the three skills as distinct columns, the interface-level expression of the framework's central claim that productive AI use is not one skill but three.</w:t>
+      </w:r>
     </w:p>
     <w:p>
       <w:pPr>
@@ -9868,7 +9729,7 @@
               <a:graphicData uri="http://schemas.openxmlformats.org/drawingml/2006/picture">
                 <pic:pic>
                   <pic:nvPicPr>
-                    <pic:cNvPr descr="C:/Users/apart/AppData/Local/Temp/html2doc_svg_RRgh4F/svg_2.png" id="46" name="Picture"/>
+                    <pic:cNvPr descr="C:/Users/apart/AppData/Local/Temp/html2doc_svg_GRV8Be/svg_2.png" id="46" name="Picture"/>
                     <pic:cNvPicPr>
                       <a:picLocks noChangeArrowheads="1" noChangeAspect="1"/>
                     </pic:cNvPicPr>
@@ -9903,6 +9764,35 @@
     </w:p>
     <w:p>
       <w:pPr>
+        <w:spacing w:before="80" w:after="120" w:line="240" w:lineRule="auto"/>
+        <w:keepNext w:val="0"/>
+        <w:keepLines/>
+        <w:widowControl w:val="1"/>
+      </w:pPr>
+      <w:r>
+        <w:rPr>
+          <w:b/>
+          <w:i/>
+        </w:rPr>
+        <w:t>Figure A3.</w:t>
+      </w:r>
+      <w:r>
+        <w:rPr>
+          <w:b w:val="0"/>
+          <w:i/>
+        </w:rPr>
+        <w:t xml:space="preserve"> </w:t>
+      </w:r>
+      <w:r>
+        <w:rPr>
+          <w:b w:val="0"/>
+          <w:i/>
+        </w:rPr>
+        <w:t>The sixteen-prompt engine in two phases. In authoring, the instructor names a subject and the engine generates the ill-defined problem (prompt 01), three per-skill rubrics and a gold framing (02, 14), and a deliberately flawed AI solution carrying seeded issues (03). In assessment, each learner response is scored against a different referent: Framing against the gold framing and rubric (08), Judging against the seeded issues (09), and Steering against the corrected trajectory after the output is re-run (04, 10); a single grader prompt (11) then assigns each skill its own grade, and the three feed the per-student report and course analytics. Because the three evaluation prompts interrogate different referents, the grades are produced independently rather than as one global impression.</w:t>
+      </w:r>
+    </w:p>
+    <w:p>
+      <w:pPr>
         <w:spacing w:before="120" w:after="120" w:line="120" w:lineRule="exact"/>
         <w:rPr>
           <w:sz w:val="12"/>
@@ -9917,6 +9807,137 @@
         </w:sectPr>
       </w:pPr>
     </w:p>
+    <w:bookmarkEnd w:id="47"/>
+    <w:bookmarkStart w:id="48" w:name="appendix-b-robustness-and-ablations"/>
+    <w:p>
+      <w:pPr>
+        <w:pStyle w:val="Heading2"/>
+        <w:keepNext/>
+        <w:keepLines/>
+        <w:widowControl w:val="1"/>
+      </w:pPr>
+      <w:r>
+        <w:t xml:space="preserve">Appendix B. Robustness and ablations</w:t>
+      </w:r>
+    </w:p>
+    <w:p>
+      <w:pPr>
+        <w:pStyle w:val="FirstParagraph"/>
+        <w:jc w:val="both"/>
+        <w:keepNext w:val="0"/>
+        <w:keepLines w:val="0"/>
+        <w:widowControl w:val="1"/>
+      </w:pPr>
+      <w:r>
+        <w:rPr>
+          <w:b/>
+          <w:bCs/>
+        </w:rPr>
+        <w:t xml:space="preserve">Reliability.</w:t>
+      </w:r>
+      <w:r>
+        <w:t xml:space="preserve"> </w:t>
+      </w:r>
+      <w:r>
+        <w:t xml:space="preserve">To check that the grades are not noise, we hold four learner transcripts fixed and</w:t>
+      </w:r>
+      <w:r>
+        <w:t xml:space="preserve"> </w:t>
+      </w:r>
+      <w:r>
+        <w:t xml:space="preserve">re-run the evaluation-and-grading prompts five times each, an independent sample each time at the</w:t>
+      </w:r>
+      <w:r>
+        <w:t xml:space="preserve"> </w:t>
+      </w:r>
+      <w:r>
+        <w:t xml:space="preserve">production temperatures. The grader is</w:t>
+      </w:r>
+      <w:r>
+        <w:t xml:space="preserve"> </w:t>
+      </w:r>
+      <w:r>
+        <w:rPr>
+          <w:b/>
+          <w:bCs/>
+        </w:rPr>
+        <w:t xml:space="preserve">92% self-consistent</w:t>
+      </w:r>
+      <w:r>
+        <w:t xml:space="preserve"> </w:t>
+      </w:r>
+      <w:r>
+        <w:t xml:space="preserve">overall: the</w:t>
+      </w:r>
+      <w:r>
+        <w:t xml:space="preserve"> </w:t>
+      </w:r>
+      <w:r>
+        <w:t xml:space="preserve">mean grade-flip rate across repeats is 0.08, with Judging deterministic (0.00, by construction),</w:t>
+      </w:r>
+      <w:r>
+        <w:t xml:space="preserve"> </w:t>
+      </w:r>
+      <w:r>
+        <w:t xml:space="preserve">Framing 0.15, and Steering 0.10, and a mean within-cell grade standard deviation near 0.2 on the</w:t>
+      </w:r>
+      <w:r>
+        <w:t xml:space="preserve"> </w:t>
+      </w:r>
+      <w:r>
+        <w:t xml:space="preserve">three-point scale, indicating that disagreements are occasional one-level boundary jitter rather than</w:t>
+      </w:r>
+      <w:r>
+        <w:t xml:space="preserve"> </w:t>
+      </w:r>
+      <w:r>
+        <w:t xml:space="preserve">unstable scoring. This addresses the documented self-inconsistency of LLM judges, though it measures</w:t>
+      </w:r>
+      <w:r>
+        <w:t xml:space="preserve"> </w:t>
+      </w:r>
+      <w:r>
+        <w:rPr>
+          <w:i/>
+          <w:iCs/>
+        </w:rPr>
+        <w:t xml:space="preserve">precision</w:t>
+      </w:r>
+      <w:r>
+        <w:t xml:space="preserve"> </w:t>
+      </w:r>
+      <w:r>
+        <w:t xml:space="preserve">(repeatability), not</w:t>
+      </w:r>
+      <w:r>
+        <w:t xml:space="preserve"> </w:t>
+      </w:r>
+      <w:r>
+        <w:rPr>
+          <w:i/>
+          <w:iCs/>
+        </w:rPr>
+        <w:t xml:space="preserve">accuracy</w:t>
+      </w:r>
+      <w:r>
+        <w:t xml:space="preserve"> </w:t>
+      </w:r>
+      <w:r>
+        <w:t xml:space="preserve">against humans (Section 10). Because Judging contributes a</w:t>
+      </w:r>
+      <w:r>
+        <w:t xml:space="preserve"> </w:t>
+      </w:r>
+      <w:r>
+        <w:t xml:space="preserve">flip rate of zero by construction, the load-bearing figure is the blind-graded skills, whose flip rate</w:t>
+      </w:r>
+      <w:r>
+        <w:t xml:space="preserve"> </w:t>
+      </w:r>
+      <w:r>
+        <w:t xml:space="preserve">is near 0.12.</w:t>
+      </w:r>
+    </w:p>
     <w:p>
       <w:pPr>
         <w:pStyle w:val="BodyText"/>
@@ -9927,112 +9948,232 @@
       </w:pPr>
       <w:r>
         <w:rPr>
+          <w:b/>
+          <w:bCs/>
+        </w:rPr>
+        <w:t xml:space="preserve">Grader-backend robustness (across vendors).</w:t>
+      </w:r>
+      <w:r>
+        <w:t xml:space="preserve"> </w:t>
+      </w:r>
+      <w:r>
+        <w:t xml:space="preserve">The dissociation holds across three grader backends</w:t>
+      </w:r>
+      <w:r>
+        <w:t xml:space="preserve"> </w:t>
+      </w:r>
+      <w:r>
+        <w:t xml:space="preserve">spanning two providers. The primary grades come from gpt-4o; re-grading the identical 40 transcripts</w:t>
+      </w:r>
+      <w:r>
+        <w:t xml:space="preserve"> </w:t>
+      </w:r>
+      <w:r>
+        <w:t xml:space="preserve">(challenges and learner responses held fixed) with gpt-4o-mini reproduces it (diagonal +0.47 versus</w:t>
+      </w:r>
+      <w:r>
+        <w:t xml:space="preserve"> </w:t>
+      </w:r>
+      <w:r>
+        <w:t xml:space="preserve">off-diagonal +0.07), and re-grading the same transcripts with an independent-vendor model,</w:t>
+      </w:r>
+      <w:r>
+        <w:t xml:space="preserve"> </w:t>
+      </w:r>
+      <w:r>
+        <w:t xml:space="preserve">Meta's llama-3.3-70b (the prototype's own engine), reproduces it again with a stronger margin:</w:t>
+      </w:r>
+      <w:r>
+        <w:t xml:space="preserve"> </w:t>
+      </w:r>
+      <w:r>
+        <w:t xml:space="preserve">own-skill effects of +0.80 (Framing), +0.75 (Judging), and +0.40 (Steering) against a mean cross-skill</w:t>
+      </w:r>
+      <w:r>
+        <w:t xml:space="preserve"> </w:t>
+      </w:r>
+      <w:r>
+        <w:t xml:space="preserve">effect of +0.02, a diagonal-to-off-diagonal ratio of 39. Two facts stand out across backends. First,</w:t>
+      </w:r>
+      <w:r>
+        <w:t xml:space="preserve"> </w:t>
+      </w:r>
+      <w:r>
+        <w:t xml:space="preserve">Judging's own-effect is +2.00 only under gpt-4o's strict adherence to the seeded-issue selection; under</w:t>
+      </w:r>
+      <w:r>
+        <w:t xml:space="preserve"> </w:t>
+      </w:r>
+      <w:r>
+        <w:t xml:space="preserve">both gpt-4o-mini and the independent-vendor llama it settles to +0.65 and +0.75, level with Framing</w:t>
+      </w:r>
+      <w:r>
+        <w:t xml:space="preserve"> </w:t>
+      </w:r>
+      <w:r>
+        <w:t xml:space="preserve">(+0.65 and +0.80), so the separation is balanced across all three skills, not propped up by the built-in</w:t>
+      </w:r>
+      <w:r>
+        <w:t xml:space="preserve"> </w:t>
+      </w:r>
+      <w:r>
+        <w:t xml:space="preserve">Judging diagonal. Second, every backend reproduces the designed contrast profiles (a strong-framer /</w:t>
+      </w:r>
+      <w:r>
+        <w:t xml:space="preserve"> </w:t>
+      </w:r>
+      <w:r>
+        <w:t xml:space="preserve">weak-judge learner scores high Framing and low Judging, and the inverse for a weak-framer / strong-judge</w:t>
+      </w:r>
+      <w:r>
+        <w:t xml:space="preserve"> </w:t>
+      </w:r>
+      <w:r>
+        <w:t xml:space="preserve">learner), which a single general-ability account cannot produce. Because the result holds across three</w:t>
+      </w:r>
+      <w:r>
+        <w:t xml:space="preserve"> </w:t>
+      </w:r>
+      <w:r>
+        <w:t xml:space="preserve">independently-versioned models from two vendors (gpt-4o, gpt-4o-mini, and Meta's llama-3.3-70b), it does</w:t>
+      </w:r>
+      <w:r>
+        <w:t xml:space="preserve"> </w:t>
+      </w:r>
+      <w:r>
+        <w:t xml:space="preserve">not hinge on a single model snapshot; the released harness pins the model identifiers so the run</w:t>
+      </w:r>
+      <w:r>
+        <w:t xml:space="preserve"> </w:t>
+      </w:r>
+      <w:r>
+        <w:t xml:space="preserve">reproduces, and the cross-backend agreement is the evidence that it generalizes beyond any one of them.</w:t>
+      </w:r>
+      <w:r>
+        <w:t xml:space="preserve"> </w:t>
+      </w:r>
+      <w:r>
+        <w:t xml:space="preserve">Cross-vendor replication is therefore established, not deferred.</w:t>
+      </w:r>
+    </w:p>
+    <w:p>
+      <w:pPr>
+        <w:pStyle w:val="BodyText"/>
+        <w:jc w:val="both"/>
+        <w:keepNext w:val="0"/>
+        <w:keepLines w:val="0"/>
+        <w:widowControl w:val="1"/>
+      </w:pPr>
+      <w:r>
+        <w:rPr>
+          <w:b/>
+          <w:bCs/>
+        </w:rPr>
+        <w:t xml:space="preserve">Dependence on ground-truth scaffolding.</w:t>
+      </w:r>
+      <w:r>
+        <w:t xml:space="preserve"> </w:t>
+      </w:r>
+      <w:r>
+        <w:t xml:space="preserve">To probe how much the instrument's discrimination relies on</w:t>
+      </w:r>
+      <w:r>
+        <w:t xml:space="preserve"> </w:t>
+      </w:r>
+      <w:r>
+        <w:t xml:space="preserve">the seeded ground truth (the gold framing supplied to the framing evaluator and the known seeded issues</w:t>
+      </w:r>
+      <w:r>
+        <w:t xml:space="preserve"> </w:t>
+      </w:r>
+      <w:r>
+        <w:t xml:space="preserve">supplied to the judging evaluator) versus the model's own judgment, we re-grade a 40-learner subset</w:t>
+      </w:r>
+      <w:r>
+        <w:t xml:space="preserve"> </w:t>
+      </w:r>
+      <w:r>
+        <w:t xml:space="preserve">(five subjects) with that scaffolding removed, comparing against that subset's own baseline (Framing</w:t>
+      </w:r>
+      <w:r>
+        <w:t xml:space="preserve"> </w:t>
+      </w:r>
+      <w:r>
+        <w:t xml:space="preserve">+0.60, Judging +2.00, Steering +0.50). The effect is sharply skill-specific. Framing discrimination is essentially</w:t>
+      </w:r>
+      <w:r>
+        <w:t xml:space="preserve"> </w:t>
+      </w:r>
+      <w:r>
+        <w:t xml:space="preserve">unaffected (own-effect +0.75 without the gold reference, versus +0.60 with it): the rubric and the</w:t>
+      </w:r>
+      <w:r>
+        <w:t xml:space="preserve"> </w:t>
+      </w:r>
+      <w:r>
+        <w:t xml:space="preserve">model's own judgment carry it. Judging discrimination, by contrast, falls sharply (+2.00 to +0.45):</w:t>
+      </w:r>
+      <w:r>
+        <w:t xml:space="preserve"> </w:t>
+      </w:r>
+      <w:r>
+        <w:t xml:space="preserve">without the known issues the grader has no recall-precision anchor and no longer separates strong from</w:t>
+      </w:r>
+      <w:r>
+        <w:t xml:space="preserve"> </w:t>
+      </w:r>
+      <w:r>
+        <w:t xml:space="preserve">weak judging. Steering falls in between (+0.50 to +0.25). The skills still</w:t>
+      </w:r>
+      <w:r>
+        <w:t xml:space="preserve"> </w:t>
+      </w:r>
+      <w:r>
+        <w:t xml:space="preserve">dissociate (ratio 29), and the result pinpoints what each grade measures: Framing and Steering are</w:t>
+      </w:r>
+      <w:r>
+        <w:t xml:space="preserve"> </w:t>
+      </w:r>
+      <w:r>
+        <w:t xml:space="preserve">scored largely by rubric-guided model judgment, whereas Judging</w:t>
+      </w:r>
+      <w:r>
+        <w:t xml:space="preserve"> </w:t>
+      </w:r>
+      <w:r>
+        <w:rPr>
           <w:i/>
           <w:iCs/>
         </w:rPr>
-        <w:t xml:space="preserve">Figure A3. The sixteen-prompt engine in two phases. In authoring, the instructor names a subject and the</w:t>
-      </w:r>
-      <w:r>
-        <w:rPr>
-          <w:i/>
-          <w:iCs/>
-        </w:rPr>
-        <w:t xml:space="preserve"> </w:t>
-      </w:r>
-      <w:r>
-        <w:rPr>
-          <w:i/>
-          <w:iCs/>
-        </w:rPr>
-        <w:t xml:space="preserve">engine generates the ill-defined problem (prompt 01), three per-skill rubrics and a gold framing (02, 14),</w:t>
-      </w:r>
-      <w:r>
-        <w:rPr>
-          <w:i/>
-          <w:iCs/>
-        </w:rPr>
-        <w:t xml:space="preserve"> </w:t>
-      </w:r>
-      <w:r>
-        <w:rPr>
-          <w:i/>
-          <w:iCs/>
-        </w:rPr>
-        <w:t xml:space="preserve">and a deliberately flawed AI solution carrying seeded issues (03). In assessment, each learner response is</w:t>
-      </w:r>
-      <w:r>
-        <w:rPr>
-          <w:i/>
-          <w:iCs/>
-        </w:rPr>
-        <w:t xml:space="preserve"> </w:t>
-      </w:r>
-      <w:r>
-        <w:rPr>
-          <w:i/>
-          <w:iCs/>
-        </w:rPr>
-        <w:t xml:space="preserve">scored against a different referent: Framing against the gold framing and rubric (08), Judging against the</w:t>
-      </w:r>
-      <w:r>
-        <w:rPr>
-          <w:i/>
-          <w:iCs/>
-        </w:rPr>
-        <w:t xml:space="preserve"> </w:t>
-      </w:r>
-      <w:r>
-        <w:rPr>
-          <w:i/>
-          <w:iCs/>
-        </w:rPr>
-        <w:t xml:space="preserve">seeded issues (09), and Steering against the corrected trajectory after the output is re-run (04, 10); a</w:t>
-      </w:r>
-      <w:r>
-        <w:rPr>
-          <w:i/>
-          <w:iCs/>
-        </w:rPr>
-        <w:t xml:space="preserve"> </w:t>
-      </w:r>
-      <w:r>
-        <w:rPr>
-          <w:i/>
-          <w:iCs/>
-        </w:rPr>
-        <w:t xml:space="preserve">single grader prompt (11) then assigns each skill its own grade, and the three feed the per-student report</w:t>
-      </w:r>
-      <w:r>
-        <w:rPr>
-          <w:i/>
-          <w:iCs/>
-        </w:rPr>
-        <w:t xml:space="preserve"> </w:t>
-      </w:r>
-      <w:r>
-        <w:rPr>
-          <w:i/>
-          <w:iCs/>
-        </w:rPr>
-        <w:t xml:space="preserve">and course analytics. Because the three evaluation prompts interrogate different referents, the grades are</w:t>
-      </w:r>
-      <w:r>
-        <w:rPr>
-          <w:i/>
-          <w:iCs/>
-        </w:rPr>
-        <w:t xml:space="preserve"> </w:t>
-      </w:r>
-      <w:r>
-        <w:rPr>
-          <w:i/>
-          <w:iCs/>
-        </w:rPr>
-        <w:t xml:space="preserve">produced independently rather than as one global impression.</w:t>
+        <w:t xml:space="preserve">as instrumented here</w:t>
+      </w:r>
+      <w:r>
+        <w:t xml:space="preserve"> </w:t>
+      </w:r>
+      <w:r>
+        <w:t xml:space="preserve">tracks agreement</w:t>
+      </w:r>
+      <w:r>
+        <w:t xml:space="preserve"> </w:t>
+      </w:r>
+      <w:r>
+        <w:t xml:space="preserve">with a known answer key. This both explains Judging's by-construction +2.00 and locates the Judging</w:t>
+      </w:r>
+      <w:r>
+        <w:t xml:space="preserve"> </w:t>
+      </w:r>
+      <w:r>
+        <w:t xml:space="preserve">score precisely: it applies where ground truth is known, and open-ended judging without a key is the</w:t>
+      </w:r>
+      <w:r>
+        <w:t xml:space="preserve"> </w:t>
+      </w:r>
+      <w:r>
+        <w:t xml:space="preserve">distinct instrumentation Section 10 specifies.</w:t>
       </w:r>
     </w:p>
-    <w:bookmarkEnd w:id="47"/>
-    <w:bookmarkStart w:id="48" w:name="appendix-b-robustness-and-ablations"/>
+    <w:bookmarkEnd w:id="48"/>
+    <w:bookmarkStart w:id="49" w:name="X20431813dc1d9ebe06088c2967a8c6d7cfc2771"/>
     <w:p>
       <w:pPr>
         <w:pStyle w:val="Heading2"/>
@@ -10041,7 +10182,7 @@
         <w:widowControl w:val="1"/>
       </w:pPr>
       <w:r>
-        <w:t xml:space="preserve">Appendix B. Robustness and ablations</w:t>
+        <w:t xml:space="preserve">Appendix C. Cross-disciplinary challenge showcase</w:t>
       </w:r>
     </w:p>
     <w:p>
@@ -10053,424 +10194,72 @@
         <w:widowControl w:val="1"/>
       </w:pPr>
       <w:r>
-        <w:rPr>
-          <w:b/>
-          <w:bCs/>
-        </w:rPr>
-        <w:t xml:space="preserve">Reliability.</w:t>
-      </w:r>
-      <w:r>
-        <w:t xml:space="preserve"> </w:t>
-      </w:r>
-      <w:r>
-        <w:t xml:space="preserve">To check that the grades are not noise, we hold four learner transcripts fixed and</w:t>
-      </w:r>
-      <w:r>
-        <w:t xml:space="preserve"> </w:t>
-      </w:r>
-      <w:r>
-        <w:t xml:space="preserve">re-run the evaluation-and-grading prompts five times each, an independent sample each time at the</w:t>
-      </w:r>
-      <w:r>
-        <w:t xml:space="preserve"> </w:t>
-      </w:r>
-      <w:r>
-        <w:t xml:space="preserve">production temperatures. The grader is</w:t>
-      </w:r>
-      <w:r>
-        <w:t xml:space="preserve"> </w:t>
-      </w:r>
-      <w:r>
-        <w:rPr>
-          <w:b/>
-          <w:bCs/>
-        </w:rPr>
-        <w:t xml:space="preserve">92% self-consistent</w:t>
-      </w:r>
-      <w:r>
-        <w:t xml:space="preserve"> </w:t>
-      </w:r>
-      <w:r>
-        <w:t xml:space="preserve">overall: the</w:t>
-      </w:r>
-      <w:r>
-        <w:t xml:space="preserve"> </w:t>
-      </w:r>
-      <w:r>
-        <w:t xml:space="preserve">mean grade-flip rate across repeats is 0.08, with Judging deterministic (0.00, by construction),</w:t>
-      </w:r>
-      <w:r>
-        <w:t xml:space="preserve"> </w:t>
-      </w:r>
-      <w:r>
-        <w:t xml:space="preserve">Framing 0.15, and Steering 0.10, and a mean within-cell grade standard deviation near 0.2 on the</w:t>
-      </w:r>
-      <w:r>
-        <w:t xml:space="preserve"> </w:t>
-      </w:r>
-      <w:r>
-        <w:t xml:space="preserve">three-point scale, indicating that disagreements are occasional one-level boundary jitter rather than</w:t>
-      </w:r>
-      <w:r>
-        <w:t xml:space="preserve"> </w:t>
-      </w:r>
-      <w:r>
-        <w:t xml:space="preserve">unstable scoring. This addresses the documented self-inconsistency of LLM judges, though it measures</w:t>
-      </w:r>
-      <w:r>
-        <w:t xml:space="preserve"> </w:t>
-      </w:r>
-      <w:r>
-        <w:rPr>
-          <w:i/>
-          <w:iCs/>
-        </w:rPr>
-        <w:t xml:space="preserve">precision</w:t>
-      </w:r>
-      <w:r>
-        <w:t xml:space="preserve"> </w:t>
-      </w:r>
-      <w:r>
-        <w:t xml:space="preserve">(repeatability), not</w:t>
-      </w:r>
-      <w:r>
-        <w:t xml:space="preserve"> </w:t>
-      </w:r>
-      <w:r>
-        <w:rPr>
-          <w:i/>
-          <w:iCs/>
-        </w:rPr>
-        <w:t xml:space="preserve">accuracy</w:t>
-      </w:r>
-      <w:r>
-        <w:t xml:space="preserve"> </w:t>
-      </w:r>
-      <w:r>
-        <w:t xml:space="preserve">against humans (Section 10). Because Judging contributes a</w:t>
-      </w:r>
-      <w:r>
-        <w:t xml:space="preserve"> </w:t>
-      </w:r>
-      <w:r>
-        <w:t xml:space="preserve">flip rate of zero by construction, the load-bearing figure is the blind-graded skills, whose flip rate</w:t>
-      </w:r>
-      <w:r>
-        <w:t xml:space="preserve"> </w:t>
-      </w:r>
-      <w:r>
-        <w:t xml:space="preserve">is near 0.12.</w:t>
+        <w:t xml:space="preserve">The framework and the platform are domain-general. An ill-defined problem with seeded flaws, three</w:t>
+      </w:r>
+      <w:r>
+        <w:t xml:space="preserve"> </w:t>
+      </w:r>
+      <w:r>
+        <w:t xml:space="preserve">per-skill rubrics, and a deliberately-imperfect AI solution can be generated for any subject, because</w:t>
+      </w:r>
+      <w:r>
+        <w:t xml:space="preserve"> </w:t>
+      </w:r>
+      <w:r>
+        <w:t xml:space="preserve">each is produced by a prompt that an educator parameterizes with a course and topic. The released</w:t>
+      </w:r>
+      <w:r>
+        <w:t xml:space="preserve"> </w:t>
+      </w:r>
+      <w:r>
+        <w:t xml:space="preserve">platform ships challenge content across twelve disciplines (Table C1) spanning STEM, the social</w:t>
+      </w:r>
+      <w:r>
+        <w:t xml:space="preserve"> </w:t>
+      </w:r>
+      <w:r>
+        <w:t xml:space="preserve">sciences, the humanities, law, and professional and education fields. CoReasoning Lab is in this sense</w:t>
+      </w:r>
+      <w:r>
+        <w:t xml:space="preserve"> </w:t>
+      </w:r>
+      <w:r>
+        <w:t xml:space="preserve">not a computing-education tool but a generic instrument for any discipline in which a learner must</w:t>
+      </w:r>
+      <w:r>
+        <w:t xml:space="preserve"> </w:t>
+      </w:r>
+      <w:r>
+        <w:t xml:space="preserve">specify an ill-defined task, judge a fallible solution, and steer it toward a better one.</w:t>
       </w:r>
     </w:p>
     <w:p>
       <w:pPr>
-        <w:pStyle w:val="BodyText"/>
-        <w:jc w:val="both"/>
-        <w:keepNext w:val="0"/>
-        <w:keepLines w:val="0"/>
-        <w:widowControl w:val="1"/>
-      </w:pPr>
-      <w:r>
-        <w:rPr>
-          <w:b/>
-          <w:bCs/>
-        </w:rPr>
-        <w:t xml:space="preserve">Grader-backend robustness (across vendors).</w:t>
-      </w:r>
-      <w:r>
-        <w:t xml:space="preserve"> </w:t>
-      </w:r>
-      <w:r>
-        <w:t xml:space="preserve">The dissociation holds across three grader backends</w:t>
-      </w:r>
-      <w:r>
-        <w:t xml:space="preserve"> </w:t>
-      </w:r>
-      <w:r>
-        <w:t xml:space="preserve">spanning two providers. The primary grades come from gpt-4o; re-grading the identical 40 transcripts</w:t>
-      </w:r>
-      <w:r>
-        <w:t xml:space="preserve"> </w:t>
-      </w:r>
-      <w:r>
-        <w:t xml:space="preserve">(challenges and learner responses held fixed) with gpt-4o-mini reproduces it (diagonal +0.47 versus</w:t>
-      </w:r>
-      <w:r>
-        <w:t xml:space="preserve"> </w:t>
-      </w:r>
-      <w:r>
-        <w:t xml:space="preserve">off-diagonal +0.07), and re-grading the same transcripts with an independent-vendor model,</w:t>
-      </w:r>
-      <w:r>
-        <w:t xml:space="preserve"> </w:t>
-      </w:r>
-      <w:r>
-        <w:t xml:space="preserve">Meta's llama-3.3-70b (the prototype's own engine), reproduces it again with a stronger margin:</w:t>
-      </w:r>
-      <w:r>
-        <w:t xml:space="preserve"> </w:t>
-      </w:r>
-      <w:r>
-        <w:t xml:space="preserve">own-skill effects of +0.80 (Framing), +0.75 (Judging), and +0.40 (Steering) against a mean cross-skill</w:t>
-      </w:r>
-      <w:r>
-        <w:t xml:space="preserve"> </w:t>
-      </w:r>
-      <w:r>
-        <w:t xml:space="preserve">effect of +0.02, a diagonal-to-off-diagonal ratio of 39. Two facts stand out across backends. First,</w:t>
-      </w:r>
-      <w:r>
-        <w:t xml:space="preserve"> </w:t>
-      </w:r>
-      <w:r>
-        <w:t xml:space="preserve">Judging's own-effect is +2.00 only under gpt-4o's strict adherence to the seeded-issue selection; under</w:t>
-      </w:r>
-      <w:r>
-        <w:t xml:space="preserve"> </w:t>
-      </w:r>
-      <w:r>
-        <w:t xml:space="preserve">both gpt-4o-mini and the independent-vendor llama it settles to +0.65 and +0.75, level with Framing</w:t>
-      </w:r>
-      <w:r>
-        <w:t xml:space="preserve"> </w:t>
-      </w:r>
-      <w:r>
-        <w:t xml:space="preserve">(+0.65 and +0.80), so the separation is balanced across all three skills, not propped up by the built-in</w:t>
-      </w:r>
-      <w:r>
-        <w:t xml:space="preserve"> </w:t>
-      </w:r>
-      <w:r>
-        <w:t xml:space="preserve">Judging diagonal. Second, every backend reproduces the designed contrast profiles (a strong-framer /</w:t>
-      </w:r>
-      <w:r>
-        <w:t xml:space="preserve"> </w:t>
-      </w:r>
-      <w:r>
-        <w:t xml:space="preserve">weak-judge learner scores high Framing and low Judging, and the inverse for a weak-framer / strong-judge</w:t>
-      </w:r>
-      <w:r>
-        <w:t xml:space="preserve"> </w:t>
-      </w:r>
-      <w:r>
-        <w:t xml:space="preserve">learner), which a single general-ability account cannot produce. Because the result holds across three</w:t>
-      </w:r>
-      <w:r>
-        <w:t xml:space="preserve"> </w:t>
-      </w:r>
-      <w:r>
-        <w:t xml:space="preserve">independently-versioned models from two vendors (gpt-4o, gpt-4o-mini, and Meta's llama-3.3-70b), it does</w:t>
-      </w:r>
-      <w:r>
-        <w:t xml:space="preserve"> </w:t>
-      </w:r>
-      <w:r>
-        <w:t xml:space="preserve">not hinge on a single model snapshot; the released harness pins the model identifiers so the run</w:t>
-      </w:r>
-      <w:r>
-        <w:t xml:space="preserve"> </w:t>
-      </w:r>
-      <w:r>
-        <w:t xml:space="preserve">reproduces, and the cross-backend agreement is the evidence that it generalizes beyond any one of them.</w:t>
-      </w:r>
-      <w:r>
-        <w:t xml:space="preserve"> </w:t>
-      </w:r>
-      <w:r>
-        <w:t xml:space="preserve">Cross-vendor replication is therefore established, not deferred.</w:t>
-      </w:r>
-    </w:p>
-    <w:p>
-      <w:pPr>
-        <w:pStyle w:val="BodyText"/>
-        <w:jc w:val="both"/>
-        <w:keepNext w:val="0"/>
-        <w:keepLines w:val="0"/>
-        <w:widowControl w:val="1"/>
-      </w:pPr>
-      <w:r>
-        <w:rPr>
-          <w:b/>
-          <w:bCs/>
-        </w:rPr>
-        <w:t xml:space="preserve">Dependence on ground-truth scaffolding.</w:t>
-      </w:r>
-      <w:r>
-        <w:t xml:space="preserve"> </w:t>
-      </w:r>
-      <w:r>
-        <w:t xml:space="preserve">To probe how much the instrument's discrimination relies on</w:t>
-      </w:r>
-      <w:r>
-        <w:t xml:space="preserve"> </w:t>
-      </w:r>
-      <w:r>
-        <w:t xml:space="preserve">the seeded ground truth (the gold framing supplied to the framing evaluator and the known seeded issues</w:t>
-      </w:r>
-      <w:r>
-        <w:t xml:space="preserve"> </w:t>
-      </w:r>
-      <w:r>
-        <w:t xml:space="preserve">supplied to the judging evaluator) versus the model's own judgment, we re-grade a 40-learner subset</w:t>
-      </w:r>
-      <w:r>
-        <w:t xml:space="preserve"> </w:t>
-      </w:r>
-      <w:r>
-        <w:t xml:space="preserve">(five subjects) with that scaffolding removed, comparing against that subset's own baseline (Framing</w:t>
-      </w:r>
-      <w:r>
-        <w:t xml:space="preserve"> </w:t>
-      </w:r>
-      <w:r>
-        <w:t xml:space="preserve">+0.60, Judging +2.00, Steering +0.50). The effect is sharply skill-specific. Framing discrimination is essentially</w:t>
-      </w:r>
-      <w:r>
-        <w:t xml:space="preserve"> </w:t>
-      </w:r>
-      <w:r>
-        <w:t xml:space="preserve">unaffected (own-effect +0.75 without the gold reference, versus +0.60 with it): the rubric and the</w:t>
-      </w:r>
-      <w:r>
-        <w:t xml:space="preserve"> </w:t>
-      </w:r>
-      <w:r>
-        <w:t xml:space="preserve">model's own judgment carry it. Judging discrimination, by contrast, falls sharply (+2.00 to +0.45):</w:t>
-      </w:r>
-      <w:r>
-        <w:t xml:space="preserve"> </w:t>
-      </w:r>
-      <w:r>
-        <w:t xml:space="preserve">without the known issues the grader has no recall-precision anchor and no longer separates strong from</w:t>
-      </w:r>
-      <w:r>
-        <w:t xml:space="preserve"> </w:t>
-      </w:r>
-      <w:r>
-        <w:t xml:space="preserve">weak judging. Steering falls in between (+0.50 to +0.25). The skills still</w:t>
-      </w:r>
-      <w:r>
-        <w:t xml:space="preserve"> </w:t>
-      </w:r>
-      <w:r>
-        <w:t xml:space="preserve">dissociate (ratio 29), and the result pinpoints what each grade measures: Framing and Steering are</w:t>
-      </w:r>
-      <w:r>
-        <w:t xml:space="preserve"> </w:t>
-      </w:r>
-      <w:r>
-        <w:t xml:space="preserve">scored largely by rubric-guided model judgment, whereas Judging</w:t>
-      </w:r>
-      <w:r>
-        <w:t xml:space="preserve"> </w:t>
-      </w:r>
-      <w:r>
-        <w:rPr>
-          <w:i/>
-          <w:iCs/>
-        </w:rPr>
-        <w:t xml:space="preserve">as instrumented here</w:t>
-      </w:r>
-      <w:r>
-        <w:t xml:space="preserve"> </w:t>
-      </w:r>
-      <w:r>
-        <w:t xml:space="preserve">tracks agreement</w:t>
-      </w:r>
-      <w:r>
-        <w:t xml:space="preserve"> </w:t>
-      </w:r>
-      <w:r>
-        <w:t xml:space="preserve">with a known answer key. This both explains Judging's by-construction +2.00 and locates the Judging</w:t>
-      </w:r>
-      <w:r>
-        <w:t xml:space="preserve"> </w:t>
-      </w:r>
-      <w:r>
-        <w:t xml:space="preserve">score precisely: it applies where ground truth is known, and open-ended judging without a key is the</w:t>
-      </w:r>
-      <w:r>
-        <w:t xml:space="preserve"> </w:t>
-      </w:r>
-      <w:r>
-        <w:t xml:space="preserve">distinct instrumentation Section 10 specifies.</w:t>
-      </w:r>
-    </w:p>
-    <w:bookmarkEnd w:id="48"/>
-    <w:bookmarkStart w:id="49" w:name="X20431813dc1d9ebe06088c2967a8c6d7cfc2771"/>
-    <w:p>
-      <w:pPr>
-        <w:pStyle w:val="Heading2"/>
+        <w:spacing w:before="240" w:after="60" w:line="240" w:lineRule="auto"/>
         <w:keepNext/>
         <w:keepLines/>
         <w:widowControl w:val="1"/>
       </w:pPr>
       <w:r>
-        <w:t xml:space="preserve">Appendix C. Cross-disciplinary challenge showcase</w:t>
-      </w:r>
-    </w:p>
-    <w:p>
-      <w:pPr>
-        <w:pStyle w:val="FirstParagraph"/>
-        <w:jc w:val="both"/>
-        <w:keepNext w:val="0"/>
-        <w:keepLines w:val="0"/>
-        <w:widowControl w:val="1"/>
-      </w:pPr>
-      <w:r>
-        <w:t xml:space="preserve">The framework and the platform are domain-general. An ill-defined problem with seeded flaws, three</w:t>
-      </w:r>
-      <w:r>
-        <w:t xml:space="preserve"> </w:t>
-      </w:r>
-      <w:r>
-        <w:t xml:space="preserve">per-skill rubrics, and a deliberately-imperfect AI solution can be generated for any subject, because</w:t>
-      </w:r>
-      <w:r>
-        <w:t xml:space="preserve"> </w:t>
-      </w:r>
-      <w:r>
-        <w:t xml:space="preserve">each is produced by a prompt that an educator parameterizes with a course and topic. The released</w:t>
-      </w:r>
-      <w:r>
-        <w:t xml:space="preserve"> </w:t>
-      </w:r>
-      <w:r>
-        <w:t xml:space="preserve">platform ships challenge content across twelve disciplines (Table C1) spanning STEM, the social</w:t>
-      </w:r>
-      <w:r>
-        <w:t xml:space="preserve"> </w:t>
-      </w:r>
-      <w:r>
-        <w:t xml:space="preserve">sciences, the humanities, law, and professional and education fields. CoReasoning Lab is in this sense</w:t>
-      </w:r>
-      <w:r>
-        <w:t xml:space="preserve"> </w:t>
-      </w:r>
-      <w:r>
-        <w:t xml:space="preserve">not a computing-education tool but a generic instrument for any discipline in which a learner must</w:t>
-      </w:r>
-      <w:r>
-        <w:t xml:space="preserve"> </w:t>
-      </w:r>
-      <w:r>
-        <w:t xml:space="preserve">specify an ill-defined task, judge a fallible solution, and steer it toward a better one.</w:t>
-      </w:r>
-    </w:p>
-    <w:p>
-      <w:pPr>
-        <w:pStyle w:val="BodyText"/>
-        <w:jc w:val="both"/>
-        <w:keepNext w:val="0"/>
-        <w:keepLines w:val="0"/>
-        <w:widowControl w:val="1"/>
-      </w:pPr>
-      <w:r>
         <w:rPr>
           <w:b/>
-          <w:bCs/>
-        </w:rPr>
-        <w:t xml:space="preserve">Table C1. Disciplines covered by the released challenge content.</w:t>
+          <w:i/>
+        </w:rPr>
+        <w:t>Table C1.</w:t>
+      </w:r>
+      <w:r>
+        <w:rPr>
+          <w:b w:val="0"/>
+          <w:i/>
+        </w:rPr>
+        <w:t xml:space="preserve"> </w:t>
+      </w:r>
+      <w:r>
+        <w:rPr>
+          <w:b w:val="0"/>
+          <w:i/>
+        </w:rPr>
+        <w:t>Disciplines covered by the released challenge content.</w:t>
       </w:r>
     </w:p>
     <w:tbl>
@@ -10784,7 +10573,7 @@
     <w:p>
       <w:pPr>
         <w:pStyle w:val="BodyText"/>
-        <w:spacing w:before="120"/>
+        <w:spacing w:before="200"/>
         <w:jc w:val="both"/>
         <w:keepNext w:val="0"/>
         <w:keepLines w:val="0"/>
@@ -10813,6 +10602,7 @@
           <w:ilvl w:val="0"/>
           <w:numId w:val="1006"/>
         </w:numPr>
+        <w:ind w:left="360" w:hanging="259"/>
         <w:jc w:val="both"/>
         <w:keepNext w:val="0"/>
         <w:keepLines w:val="0"/>
@@ -10839,6 +10629,7 @@
           <w:ilvl w:val="0"/>
           <w:numId w:val="1006"/>
         </w:numPr>
+        <w:ind w:left="360" w:hanging="259"/>
         <w:jc w:val="both"/>
         <w:keepNext w:val="0"/>
         <w:keepLines w:val="0"/>
@@ -10865,6 +10656,7 @@
           <w:ilvl w:val="0"/>
           <w:numId w:val="1006"/>
         </w:numPr>
+        <w:ind w:left="360" w:hanging="259"/>
         <w:jc w:val="both"/>
         <w:keepNext w:val="0"/>
         <w:keepLines w:val="0"/>
@@ -10891,6 +10683,7 @@
           <w:ilvl w:val="0"/>
           <w:numId w:val="1006"/>
         </w:numPr>
+        <w:ind w:left="360" w:hanging="259"/>
         <w:jc w:val="both"/>
         <w:keepNext w:val="0"/>
         <w:keepLines w:val="0"/>
@@ -25171,7 +24964,7 @@
     <w:basedOn w:val="BodyText"/>
     <w:pPr>
       <w:keepNext/>
-      <w:spacing w:after="60" w:before="120" w:line="240" w:lineRule="auto"/>
+      <w:spacing w:after="60" w:before="240" w:line="240" w:lineRule="auto"/>
       <w:jc w:val="center"/>
     </w:pPr>
     <w:rPr>

</xml_diff>

<commit_message>
Regenerate DOCX: centered captions + numbered references
Co-Authored-By: Claude Opus 4.8 <noreply@anthropic.com>
</commit_message>
<xml_diff>
--- a/docs/coreasoning-2col.docx
+++ b/docs/coreasoning-2col.docx
@@ -662,7 +662,7 @@
               <a:graphicData uri="http://schemas.openxmlformats.org/drawingml/2006/picture">
                 <pic:pic>
                   <pic:nvPicPr>
-                    <pic:cNvPr descr="C:/Users/apart/AppData/Local/Temp/html2doc_svg_GRV8Be/svg_0.png" id="12" name="Picture"/>
+                    <pic:cNvPr descr="C:/Users/apart/AppData/Local/Temp/html2doc_svg_RicTun/svg_0.png" id="12" name="Picture"/>
                     <pic:cNvPicPr>
                       <a:picLocks noChangeArrowheads="1" noChangeAspect="1"/>
                     </pic:cNvPicPr>
@@ -1775,7 +1775,7 @@
               <a:graphicData uri="http://schemas.openxmlformats.org/drawingml/2006/picture">
                 <pic:pic>
                   <pic:nvPicPr>
-                    <pic:cNvPr descr="C:/Users/apart/AppData/Local/Temp/html2doc_svg_GRV8Be/svg_1.png" id="17" name="Picture"/>
+                    <pic:cNvPr descr="C:/Users/apart/AppData/Local/Temp/html2doc_svg_RicTun/svg_1.png" id="17" name="Picture"/>
                     <pic:cNvPicPr>
                       <a:picLocks noChangeArrowheads="1" noChangeAspect="1"/>
                     </pic:cNvPicPr>
@@ -1810,7 +1810,9 @@
     </w:p>
     <w:p>
       <w:pPr>
+        <w:pStyle w:val="ImageCaption"/>
         <w:spacing w:before="80" w:after="120" w:line="240" w:lineRule="auto"/>
+        <w:jc w:val="center"/>
         <w:keepNext w:val="0"/>
         <w:keepLines/>
         <w:widowControl w:val="1"/>
@@ -3369,7 +3371,9 @@
     </w:p>
     <w:p>
       <w:pPr>
+        <w:pStyle w:val="TableCaption"/>
         <w:spacing w:before="240" w:after="60" w:line="240" w:lineRule="auto"/>
+        <w:jc w:val="center"/>
         <w:keepNext/>
         <w:keepLines/>
         <w:widowControl w:val="1"/>
@@ -5915,7 +5919,9 @@
     </w:p>
     <w:p>
       <w:pPr>
+        <w:pStyle w:val="TableCaption"/>
         <w:spacing w:before="240" w:after="60" w:line="240" w:lineRule="auto"/>
+        <w:jc w:val="center"/>
         <w:keepNext/>
         <w:keepLines/>
         <w:widowControl w:val="1"/>
@@ -7055,7 +7061,9 @@
     </w:p>
     <w:p>
       <w:pPr>
+        <w:pStyle w:val="TableCaption"/>
         <w:spacing w:before="240" w:after="60" w:line="240" w:lineRule="auto"/>
+        <w:jc w:val="center"/>
         <w:keepNext/>
         <w:keepLines/>
         <w:widowControl w:val="1"/>
@@ -8164,7 +8172,9 @@
     </w:p>
     <w:p>
       <w:pPr>
+        <w:pStyle w:val="ImageCaption"/>
         <w:spacing w:before="80" w:after="120" w:line="240" w:lineRule="auto"/>
+        <w:jc w:val="center"/>
         <w:keepNext w:val="0"/>
         <w:keepLines/>
         <w:widowControl w:val="1"/>
@@ -8244,7 +8254,9 @@
     </w:p>
     <w:p>
       <w:pPr>
+        <w:pStyle w:val="ImageCaption"/>
         <w:spacing w:before="80" w:after="120" w:line="240" w:lineRule="auto"/>
+        <w:jc w:val="center"/>
         <w:keepNext w:val="0"/>
         <w:keepLines/>
         <w:widowControl w:val="1"/>
@@ -9530,7 +9542,9 @@
     </w:p>
     <w:p>
       <w:pPr>
+        <w:pStyle w:val="ImageCaption"/>
         <w:spacing w:before="80" w:after="120" w:line="240" w:lineRule="auto"/>
+        <w:jc w:val="center"/>
         <w:keepNext w:val="0"/>
         <w:keepLines/>
         <w:widowControl w:val="1"/>
@@ -9684,7 +9698,9 @@
     </w:p>
     <w:p>
       <w:pPr>
+        <w:pStyle w:val="ImageCaption"/>
         <w:spacing w:before="80" w:after="120" w:line="240" w:lineRule="auto"/>
+        <w:jc w:val="center"/>
         <w:keepNext w:val="0"/>
         <w:keepLines/>
         <w:widowControl w:val="1"/>
@@ -9729,7 +9745,7 @@
               <a:graphicData uri="http://schemas.openxmlformats.org/drawingml/2006/picture">
                 <pic:pic>
                   <pic:nvPicPr>
-                    <pic:cNvPr descr="C:/Users/apart/AppData/Local/Temp/html2doc_svg_GRV8Be/svg_2.png" id="46" name="Picture"/>
+                    <pic:cNvPr descr="C:/Users/apart/AppData/Local/Temp/html2doc_svg_RicTun/svg_2.png" id="46" name="Picture"/>
                     <pic:cNvPicPr>
                       <a:picLocks noChangeArrowheads="1" noChangeAspect="1"/>
                     </pic:cNvPicPr>
@@ -9764,7 +9780,9 @@
     </w:p>
     <w:p>
       <w:pPr>
+        <w:pStyle w:val="ImageCaption"/>
         <w:spacing w:before="80" w:after="120" w:line="240" w:lineRule="auto"/>
+        <w:jc w:val="center"/>
         <w:keepNext w:val="0"/>
         <w:keepLines/>
         <w:widowControl w:val="1"/>
@@ -10235,7 +10253,9 @@
     </w:p>
     <w:p>
       <w:pPr>
+        <w:pStyle w:val="TableCaption"/>
         <w:spacing w:before="240" w:after="60" w:line="240" w:lineRule="auto"/>
+        <w:jc w:val="center"/>
         <w:keepNext/>
         <w:keepLines/>
         <w:widowControl w:val="1"/>
@@ -10762,6 +10782,13 @@
         <w:widowControl w:val="1"/>
       </w:pPr>
       <w:r>
+        <w:rPr>
+          <w:rFonts w:ascii="Georgia" w:hAnsi="Georgia"/>
+          <w:sz w:val="18"/>
+        </w:rPr>
+        <w:t xml:space="preserve">1. </w:t>
+      </w:r>
+      <w:r>
         <w:t xml:space="preserve">Acar, O. A. (2023). AI Prompt Engineering Isn't the Future.</w:t>
       </w:r>
       <w:r>
@@ -10787,6 +10814,13 @@
         <w:widowControl w:val="1"/>
       </w:pPr>
       <w:r>
+        <w:rPr>
+          <w:rFonts w:ascii="Georgia" w:hAnsi="Georgia"/>
+          <w:sz w:val="18"/>
+        </w:rPr>
+        <w:t xml:space="preserve">2. </w:t>
+      </w:r>
+      <w:r>
         <w:t xml:space="preserve">Anderson, L. W., &amp; Krathwohl, D. R. (2001). A Taxonomy for Learning, Teaching, and Assessing: A Revision of Bloom's Taxonomy of Educational Objectives.</w:t>
       </w:r>
       <w:r>
@@ -10812,6 +10846,13 @@
         <w:widowControl w:val="1"/>
       </w:pPr>
       <w:r>
+        <w:rPr>
+          <w:rFonts w:ascii="Georgia" w:hAnsi="Georgia"/>
+          <w:sz w:val="18"/>
+        </w:rPr>
+        <w:t xml:space="preserve">3. </w:t>
+      </w:r>
+      <w:r>
         <w:t xml:space="preserve">Annapureddy, R., Fornaroli, A., &amp; Gatica-Perez, D. (2024). Generative AI Literacy: Twelve Defining Competencies.</w:t>
       </w:r>
       <w:r>
@@ -10837,6 +10878,13 @@
         <w:widowControl w:val="1"/>
       </w:pPr>
       <w:r>
+        <w:rPr>
+          <w:rFonts w:ascii="Georgia" w:hAnsi="Georgia"/>
+          <w:sz w:val="18"/>
+        </w:rPr>
+        <w:t xml:space="preserve">4. </w:t>
+      </w:r>
+      <w:r>
         <w:t xml:space="preserve">Bansal, G., Wu, T., Zhou, J., Fok, R., Nushi, B., Kamar, E., Ribeiro, M. T., &amp; Weld, D. S. (2021). Does the Whole Exceed Its Parts? The Effect of AI Explanations on Complementary Team Performance.</w:t>
       </w:r>
       <w:r>
@@ -10862,6 +10910,13 @@
         <w:widowControl w:val="1"/>
       </w:pPr>
       <w:r>
+        <w:rPr>
+          <w:rFonts w:ascii="Georgia" w:hAnsi="Georgia"/>
+          <w:sz w:val="18"/>
+        </w:rPr>
+        <w:t xml:space="preserve">5. </w:t>
+      </w:r>
+      <w:r>
         <w:t xml:space="preserve">Barzilai, S., &amp; Chinn, C. A. (2018). On the Goals of Epistemic Education: Promoting Apt Epistemic Performance.</w:t>
       </w:r>
       <w:r>
@@ -10887,6 +10942,13 @@
         <w:widowControl w:val="1"/>
       </w:pPr>
       <w:r>
+        <w:rPr>
+          <w:rFonts w:ascii="Georgia" w:hAnsi="Georgia"/>
+          <w:sz w:val="18"/>
+        </w:rPr>
+        <w:t xml:space="preserve">6. </w:t>
+      </w:r>
+      <w:r>
         <w:t xml:space="preserve">Bearman, M., Tai, J., Dawson, P., Boud, D., &amp; Ajjawi, R. (2024). Developing Evaluative Judgement for a Time of Generative Artificial Intelligence.</w:t>
       </w:r>
       <w:r>
@@ -10912,6 +10974,13 @@
         <w:widowControl w:val="1"/>
       </w:pPr>
       <w:r>
+        <w:rPr>
+          <w:rFonts w:ascii="Georgia" w:hAnsi="Georgia"/>
+          <w:sz w:val="18"/>
+        </w:rPr>
+        <w:t xml:space="preserve">7. </w:t>
+      </w:r>
+      <w:r>
         <w:t xml:space="preserve">Bjork, E. L., &amp; Bjork, R. A. (2011). Making Things Hard on Yourself, but in a Good Way: Creating Desirable Difficulties to Enhance Learning.</w:t>
       </w:r>
       <w:r>
@@ -10937,6 +11006,13 @@
         <w:widowControl w:val="1"/>
       </w:pPr>
       <w:r>
+        <w:rPr>
+          <w:rFonts w:ascii="Georgia" w:hAnsi="Georgia"/>
+          <w:sz w:val="18"/>
+        </w:rPr>
+        <w:t xml:space="preserve">8. </w:t>
+      </w:r>
+      <w:r>
         <w:t xml:space="preserve">Buçinca, Z., Malaya, M. B., &amp; Gajos, K. Z. (2021). To Trust or to Think: Cognitive Forcing Functions Can Reduce Overreliance on AI in AI-Assisted Decision-Making.</w:t>
       </w:r>
       <w:r>
@@ -10962,6 +11038,13 @@
         <w:widowControl w:val="1"/>
       </w:pPr>
       <w:r>
+        <w:rPr>
+          <w:rFonts w:ascii="Georgia" w:hAnsi="Georgia"/>
+          <w:sz w:val="18"/>
+        </w:rPr>
+        <w:t xml:space="preserve">9. </w:t>
+      </w:r>
+      <w:r>
         <w:t xml:space="preserve">Campbell, D. T., &amp; Fiske, D. W. (1959). Convergent and Discriminant Validation by the Multitrait-Multimethod Matrix.</w:t>
       </w:r>
       <w:r>
@@ -10987,6 +11070,13 @@
         <w:widowControl w:val="1"/>
       </w:pPr>
       <w:r>
+        <w:rPr>
+          <w:rFonts w:ascii="Georgia" w:hAnsi="Georgia"/>
+          <w:sz w:val="18"/>
+        </w:rPr>
+        <w:t xml:space="preserve">10. </w:t>
+      </w:r>
+      <w:r>
         <w:t xml:space="preserve">Chi, M. T. H., &amp; Wylie, R. (2014). The ICAP Framework: Linking Cognitive Engagement to Active Learning Outcomes.</w:t>
       </w:r>
       <w:r>
@@ -11012,6 +11102,13 @@
         <w:widowControl w:val="1"/>
       </w:pPr>
       <w:r>
+        <w:rPr>
+          <w:rFonts w:ascii="Georgia" w:hAnsi="Georgia"/>
+          <w:sz w:val="18"/>
+        </w:rPr>
+        <w:t xml:space="preserve">11. </w:t>
+      </w:r>
+      <w:r>
         <w:t xml:space="preserve">Clerc, O., Abdelghani, R., Desvaux, C., Poisson, E., Oudeyer, P., &amp; Sauzéon, H. (2026). Teaching Students to Question the Machine: An AI Literacy Intervention Improves Students' Regulation of LLM Use in a Science Task.</w:t>
       </w:r>
       <w:r>
@@ -11037,6 +11134,13 @@
         <w:widowControl w:val="1"/>
       </w:pPr>
       <w:r>
+        <w:rPr>
+          <w:rFonts w:ascii="Georgia" w:hAnsi="Georgia"/>
+          <w:sz w:val="18"/>
+        </w:rPr>
+        <w:t xml:space="preserve">12. </w:t>
+      </w:r>
+      <w:r>
         <w:t xml:space="preserve">Collins, A., Brown, J. S., &amp; Newman, S. E. (1989). Cognitive Apprenticeship: Teaching the Crafts of Reading, Writing, and Mathematics.</w:t>
       </w:r>
       <w:r>
@@ -11062,6 +11166,13 @@
         <w:widowControl w:val="1"/>
       </w:pPr>
       <w:r>
+        <w:rPr>
+          <w:rFonts w:ascii="Georgia" w:hAnsi="Georgia"/>
+          <w:sz w:val="18"/>
+        </w:rPr>
+        <w:t xml:space="preserve">13. </w:t>
+      </w:r>
+      <w:r>
         <w:t xml:space="preserve">Dakan, R., &amp; Feller, J. (2025). Framework for AI Fluency.</w:t>
       </w:r>
       <w:r>
@@ -11087,6 +11198,13 @@
         <w:widowControl w:val="1"/>
       </w:pPr>
       <w:r>
+        <w:rPr>
+          <w:rFonts w:ascii="Georgia" w:hAnsi="Georgia"/>
+          <w:sz w:val="18"/>
+        </w:rPr>
+        <w:t xml:space="preserve">14. </w:t>
+      </w:r>
+      <w:r>
         <w:t xml:space="preserve">Dell'Acqua, F., McFowland III, E., Mollick, E., Lifshitz-Assaf, H., Kellogg, K., Rajendran, S., Krayer, L., Candelon, F., &amp; Lakhani, K. R. (2023). Navigating the Jagged Technological Frontier.</w:t>
       </w:r>
       <w:r>
@@ -11112,6 +11230,13 @@
         <w:widowControl w:val="1"/>
       </w:pPr>
       <w:r>
+        <w:rPr>
+          <w:rFonts w:ascii="Georgia" w:hAnsi="Georgia"/>
+          <w:sz w:val="18"/>
+        </w:rPr>
+        <w:t xml:space="preserve">15. </w:t>
+      </w:r>
+      <w:r>
         <w:t xml:space="preserve">Denny, P., Leinonen, J., Prather, J., Luxton-Reilly, A., Amarouche, T., Becker, B. A., &amp; Reeves, B. N. (2024). Prompt Problems: A New Programming Exercise for the Generative AI Era.</w:t>
       </w:r>
       <w:r>
@@ -11137,6 +11262,13 @@
         <w:widowControl w:val="1"/>
       </w:pPr>
       <w:r>
+        <w:rPr>
+          <w:rFonts w:ascii="Georgia" w:hAnsi="Georgia"/>
+          <w:sz w:val="18"/>
+        </w:rPr>
+        <w:t xml:space="preserve">16. </w:t>
+      </w:r>
+      <w:r>
         <w:t xml:space="preserve">Di Santi, E. (2026). Cognitive Amplification vs Cognitive Delegation in Human-AI Systems: A Metric Framework.</w:t>
       </w:r>
       <w:r>
@@ -11162,6 +11294,13 @@
         <w:widowControl w:val="1"/>
       </w:pPr>
       <w:r>
+        <w:rPr>
+          <w:rFonts w:ascii="Georgia" w:hAnsi="Georgia"/>
+          <w:sz w:val="18"/>
+        </w:rPr>
+        <w:t xml:space="preserve">17. </w:t>
+      </w:r>
+      <w:r>
         <w:t xml:space="preserve">Durkin, K., &amp; Rittle-Johnson, B. (2012). The Effectiveness of Using Incorrect Examples to Support Learning about Decimal Magnitude.</w:t>
       </w:r>
       <w:r>
@@ -11187,6 +11326,13 @@
         <w:widowControl w:val="1"/>
       </w:pPr>
       <w:r>
+        <w:rPr>
+          <w:rFonts w:ascii="Georgia" w:hAnsi="Georgia"/>
+          <w:sz w:val="18"/>
+        </w:rPr>
+        <w:t xml:space="preserve">18. </w:t>
+      </w:r>
+      <w:r>
         <w:t xml:space="preserve">Elshall, A. S., &amp; Badir, A. (2025). Balancing AI-Assisted Learning and Traditional Assessment: The FACT Assessment in Environmental Data Science Education.</w:t>
       </w:r>
       <w:r>
@@ -11212,6 +11358,13 @@
         <w:widowControl w:val="1"/>
       </w:pPr>
       <w:r>
+        <w:rPr>
+          <w:rFonts w:ascii="Georgia" w:hAnsi="Georgia"/>
+          <w:sz w:val="18"/>
+        </w:rPr>
+        <w:t xml:space="preserve">19. </w:t>
+      </w:r>
+      <w:r>
         <w:t xml:space="preserve">Facione, P. A. (1990). Critical Thinking: A Statement of Expert Consensus for Purposes of Educational Assessment and Instruction (The Delphi Report).</w:t>
       </w:r>
       <w:r>
@@ -11237,6 +11390,13 @@
         <w:widowControl w:val="1"/>
       </w:pPr>
       <w:r>
+        <w:rPr>
+          <w:rFonts w:ascii="Georgia" w:hAnsi="Georgia"/>
+          <w:sz w:val="18"/>
+        </w:rPr>
+        <w:t xml:space="preserve">20. </w:t>
+      </w:r>
+      <w:r>
         <w:t xml:space="preserve">Fan, Y., Tang, L., Le, H., Shen, K., Tan, S., Zhao, Y., Shen, Y., Li, X., &amp; Gašević, D. (2025). Beware of Metacognitive Laziness: Effects of Generative Artificial Intelligence on Learning Motivation, Processes, and Performance.</w:t>
       </w:r>
       <w:r>
@@ -11262,6 +11422,13 @@
         <w:widowControl w:val="1"/>
       </w:pPr>
       <w:r>
+        <w:rPr>
+          <w:rFonts w:ascii="Georgia" w:hAnsi="Georgia"/>
+          <w:sz w:val="18"/>
+        </w:rPr>
+        <w:t xml:space="preserve">21. </w:t>
+      </w:r>
+      <w:r>
         <w:t xml:space="preserve">Feng, Y., Wang, S., Cheng, Z., Wan, Y., &amp; Chen, D. (2025). Are We on the Right Way to Assessing LLM-as-a-Judge?.</w:t>
       </w:r>
       <w:r>
@@ -11287,6 +11454,13 @@
         <w:widowControl w:val="1"/>
       </w:pPr>
       <w:r>
+        <w:rPr>
+          <w:rFonts w:ascii="Georgia" w:hAnsi="Georgia"/>
+          <w:sz w:val="18"/>
+        </w:rPr>
+        <w:t xml:space="preserve">22. </w:t>
+      </w:r>
+      <w:r>
         <w:t xml:space="preserve">Fernandes, D., Villa, S., Nicholls, S., Haavisto, O., Buschek, D., Schmidt, A., Kosch, T., Shen, C., &amp; Welsch, R. (2024). Performance and Metacognition Disconnect when Reasoning in Human-AI Interaction.</w:t>
       </w:r>
       <w:r>
@@ -11312,6 +11486,13 @@
         <w:widowControl w:val="1"/>
       </w:pPr>
       <w:r>
+        <w:rPr>
+          <w:rFonts w:ascii="Georgia" w:hAnsi="Georgia"/>
+          <w:sz w:val="18"/>
+        </w:rPr>
+        <w:t xml:space="preserve">23. </w:t>
+      </w:r>
+      <w:r>
         <w:t xml:space="preserve">Flavell, J. H. (1979). Metacognition and Cognitive Monitoring: A New Area of Cognitive-Developmental Inquiry.</w:t>
       </w:r>
       <w:r>
@@ -11337,6 +11518,13 @@
         <w:widowControl w:val="1"/>
       </w:pPr>
       <w:r>
+        <w:rPr>
+          <w:rFonts w:ascii="Georgia" w:hAnsi="Georgia"/>
+          <w:sz w:val="18"/>
+        </w:rPr>
+        <w:t xml:space="preserve">24. </w:t>
+      </w:r>
+      <w:r>
         <w:t xml:space="preserve">Ganuthula, V. R. R., &amp; Balaraman, K. K. (2025). Artificial Intelligence Quotient Framework for Measuring Human Collaboration with Artificial Intelligence.</w:t>
       </w:r>
       <w:r>
@@ -11362,6 +11550,13 @@
         <w:widowControl w:val="1"/>
       </w:pPr>
       <w:r>
+        <w:rPr>
+          <w:rFonts w:ascii="Georgia" w:hAnsi="Georgia"/>
+          <w:sz w:val="18"/>
+        </w:rPr>
+        <w:t xml:space="preserve">25. </w:t>
+      </w:r>
+      <w:r>
         <w:t xml:space="preserve">Gerlich, M. (2025). AI Tools in Society: Impacts on Cognitive Offloading and the Future of Critical Thinking.</w:t>
       </w:r>
       <w:r>
@@ -11387,6 +11582,13 @@
         <w:widowControl w:val="1"/>
       </w:pPr>
       <w:r>
+        <w:rPr>
+          <w:rFonts w:ascii="Georgia" w:hAnsi="Georgia"/>
+          <w:sz w:val="18"/>
+        </w:rPr>
+        <w:t xml:space="preserve">26. </w:t>
+      </w:r>
+      <w:r>
         <w:t xml:space="preserve">Gilson, L. L., &amp; Goldberg, C. B. (2015). Editors' Comment: So, What Is a Conceptual Paper?.</w:t>
       </w:r>
       <w:r>
@@ -11412,6 +11614,13 @@
         <w:widowControl w:val="1"/>
       </w:pPr>
       <w:r>
+        <w:rPr>
+          <w:rFonts w:ascii="Georgia" w:hAnsi="Georgia"/>
+          <w:sz w:val="18"/>
+        </w:rPr>
+        <w:t xml:space="preserve">27. </w:t>
+      </w:r>
+      <w:r>
         <w:t xml:space="preserve">Große, C. S., &amp; Renkl, A. (2007). Finding and Fixing Errors in Worked Examples: Can This Foster Learning Outcomes?.</w:t>
       </w:r>
       <w:r>
@@ -11437,6 +11646,13 @@
         <w:widowControl w:val="1"/>
       </w:pPr>
       <w:r>
+        <w:rPr>
+          <w:rFonts w:ascii="Georgia" w:hAnsi="Georgia"/>
+          <w:sz w:val="18"/>
+        </w:rPr>
+        <w:t xml:space="preserve">28. </w:t>
+      </w:r>
+      <w:r>
         <w:t xml:space="preserve">Gu, X., &amp; Ericson, B. J. (2025). AI Literacy in K-12 and Higher Education in the Wake of Generative AI: An Integrative Review.</w:t>
       </w:r>
       <w:r>
@@ -11462,6 +11678,13 @@
         <w:widowControl w:val="1"/>
       </w:pPr>
       <w:r>
+        <w:rPr>
+          <w:rFonts w:ascii="Georgia" w:hAnsi="Georgia"/>
+          <w:sz w:val="18"/>
+        </w:rPr>
+        <w:t xml:space="preserve">29. </w:t>
+      </w:r>
+      <w:r>
         <w:t xml:space="preserve">Hattie, J., &amp; Timperley, H. (2007). The Power of Feedback.</w:t>
       </w:r>
       <w:r>
@@ -11487,6 +11710,13 @@
         <w:widowControl w:val="1"/>
       </w:pPr>
       <w:r>
+        <w:rPr>
+          <w:rFonts w:ascii="Georgia" w:hAnsi="Georgia"/>
+          <w:sz w:val="18"/>
+        </w:rPr>
+        <w:t xml:space="preserve">30. </w:t>
+      </w:r>
+      <w:r>
         <w:t xml:space="preserve">Jaakkola, E. (2020). Designing Conceptual Articles: Four Approaches.</w:t>
       </w:r>
       <w:r>
@@ -11512,6 +11742,13 @@
         <w:widowControl w:val="1"/>
       </w:pPr>
       <w:r>
+        <w:rPr>
+          <w:rFonts w:ascii="Georgia" w:hAnsi="Georgia"/>
+          <w:sz w:val="18"/>
+        </w:rPr>
+        <w:t xml:space="preserve">31. </w:t>
+      </w:r>
+      <w:r>
         <w:t xml:space="preserve">Jin, Y., Martinez-Maldonado, R., Gašević, D., &amp; Yan, L. (2024). GLAT: The Generative AI Literacy Assessment Test.</w:t>
       </w:r>
       <w:r>
@@ -11537,6 +11774,13 @@
         <w:widowControl w:val="1"/>
       </w:pPr>
       <w:r>
+        <w:rPr>
+          <w:rFonts w:ascii="Georgia" w:hAnsi="Georgia"/>
+          <w:sz w:val="18"/>
+        </w:rPr>
+        <w:t xml:space="preserve">32. </w:t>
+      </w:r>
+      <w:r>
         <w:t xml:space="preserve">Kane, M. T. (2013). Validating the Interpretations and Uses of Test Scores.</w:t>
       </w:r>
       <w:r>
@@ -11562,6 +11806,13 @@
         <w:widowControl w:val="1"/>
       </w:pPr>
       <w:r>
+        <w:rPr>
+          <w:rFonts w:ascii="Georgia" w:hAnsi="Georgia"/>
+          <w:sz w:val="18"/>
+        </w:rPr>
+        <w:t xml:space="preserve">33. </w:t>
+      </w:r>
+      <w:r>
         <w:t xml:space="preserve">Kapur, M. (2008). Productive Failure.</w:t>
       </w:r>
       <w:r>
@@ -11587,6 +11838,13 @@
         <w:widowControl w:val="1"/>
       </w:pPr>
       <w:r>
+        <w:rPr>
+          <w:rFonts w:ascii="Georgia" w:hAnsi="Georgia"/>
+          <w:sz w:val="18"/>
+        </w:rPr>
+        <w:t xml:space="preserve">34. </w:t>
+      </w:r>
+      <w:r>
         <w:t xml:space="preserve">Kim, P., Wang, W., &amp; Bonk, C. J. (2025). Generative AI as a Coach to Help Students Enhance Proficiency in Question Formulation.</w:t>
       </w:r>
       <w:r>
@@ -11612,6 +11870,13 @@
         <w:widowControl w:val="1"/>
       </w:pPr>
       <w:r>
+        <w:rPr>
+          <w:rFonts w:ascii="Georgia" w:hAnsi="Georgia"/>
+          <w:sz w:val="18"/>
+        </w:rPr>
+        <w:t xml:space="preserve">35. </w:t>
+      </w:r>
+      <w:r>
         <w:t xml:space="preserve">Kosmyna, N., Hauptmann, E., Yuan, Y. T., Situ, J., Liao, X., Beresnitzky, A. V., Braunstein, I., &amp; Maes, P. (2025). Your Brain on ChatGPT: Accumulation of Cognitive Debt when Using an AI Assistant for Essay Writing Task.</w:t>
       </w:r>
       <w:r>
@@ -11637,6 +11902,13 @@
         <w:widowControl w:val="1"/>
       </w:pPr>
       <w:r>
+        <w:rPr>
+          <w:rFonts w:ascii="Georgia" w:hAnsi="Georgia"/>
+          <w:sz w:val="18"/>
+        </w:rPr>
+        <w:t xml:space="preserve">36. </w:t>
+      </w:r>
+      <w:r>
         <w:t xml:space="preserve">Lee, H., &amp; Bosch, N. (2025). Calibration Discrepancy Predicts Students' Subsequent Metacognitive Strategy Use in Computer-Based Learning Environments.</w:t>
       </w:r>
       <w:r>
@@ -11662,6 +11934,13 @@
         <w:widowControl w:val="1"/>
       </w:pPr>
       <w:r>
+        <w:rPr>
+          <w:rFonts w:ascii="Georgia" w:hAnsi="Georgia"/>
+          <w:sz w:val="18"/>
+        </w:rPr>
+        <w:t xml:space="preserve">37. </w:t>
+      </w:r>
+      <w:r>
         <w:t xml:space="preserve">Lee, J. D., &amp; See, K. A. (2004). Trust in Automation: Designing for Appropriate Reliance.</w:t>
       </w:r>
       <w:r>
@@ -11687,6 +11966,13 @@
         <w:widowControl w:val="1"/>
       </w:pPr>
       <w:r>
+        <w:rPr>
+          <w:rFonts w:ascii="Georgia" w:hAnsi="Georgia"/>
+          <w:sz w:val="18"/>
+        </w:rPr>
+        <w:t xml:space="preserve">38. </w:t>
+      </w:r>
+      <w:r>
         <w:t xml:space="preserve">Lee, S. C., Baby, T., Vongvit, R., Lee, J., Kim, Y., Min, C., &amp; Yoon, S. H. (2025). Development and Validation of a Generative AI Competence Scale.</w:t>
       </w:r>
       <w:r>
@@ -11712,6 +11998,13 @@
         <w:widowControl w:val="1"/>
       </w:pPr>
       <w:r>
+        <w:rPr>
+          <w:rFonts w:ascii="Georgia" w:hAnsi="Georgia"/>
+          <w:sz w:val="18"/>
+        </w:rPr>
+        <w:t xml:space="preserve">39. </w:t>
+      </w:r>
+      <w:r>
         <w:t xml:space="preserve">Li, C., Cui, H., &amp; Hagedorn, L. S. (2026). The Cognitive Impact of ChatGPT in Higher Education: A Systematic Review of Critical and Creative Thinking Outcomes.</w:t>
       </w:r>
       <w:r>
@@ -11737,6 +12030,13 @@
         <w:widowControl w:val="1"/>
       </w:pPr>
       <w:r>
+        <w:rPr>
+          <w:rFonts w:ascii="Georgia" w:hAnsi="Georgia"/>
+          <w:sz w:val="18"/>
+        </w:rPr>
+        <w:t xml:space="preserve">40. </w:t>
+      </w:r>
+      <w:r>
         <w:t xml:space="preserve">Lo, L. S. (2023). The CLEAR Path: A Framework for Enhancing Information Literacy through Prompt Engineering.</w:t>
       </w:r>
       <w:r>
@@ -11762,6 +12062,13 @@
         <w:widowControl w:val="1"/>
       </w:pPr>
       <w:r>
+        <w:rPr>
+          <w:rFonts w:ascii="Georgia" w:hAnsi="Georgia"/>
+          <w:sz w:val="18"/>
+        </w:rPr>
+        <w:t xml:space="preserve">41. </w:t>
+      </w:r>
+      <w:r>
         <w:t xml:space="preserve">Long, D., &amp; Magerko, B. (2020). What Is AI Literacy? Competencies and Design Considerations.</w:t>
       </w:r>
       <w:r>
@@ -11787,6 +12094,13 @@
         <w:widowControl w:val="1"/>
       </w:pPr>
       <w:r>
+        <w:rPr>
+          <w:rFonts w:ascii="Georgia" w:hAnsi="Georgia"/>
+          <w:sz w:val="18"/>
+        </w:rPr>
+        <w:t xml:space="preserve">42. </w:t>
+      </w:r>
+      <w:r>
         <w:t xml:space="preserve">McNichols, H., Ikram, F., &amp; Lan, A. (2025). The StudyChat Dataset: Student Dialogues With ChatGPT in an Artificial Intelligence Course.</w:t>
       </w:r>
       <w:r>
@@ -11812,6 +12126,13 @@
         <w:widowControl w:val="1"/>
       </w:pPr>
       <w:r>
+        <w:rPr>
+          <w:rFonts w:ascii="Georgia" w:hAnsi="Georgia"/>
+          <w:sz w:val="18"/>
+        </w:rPr>
+        <w:t xml:space="preserve">43. </w:t>
+      </w:r>
+      <w:r>
         <w:t xml:space="preserve">Messick, S. (1995). Validity of Psychological Assessment: Validation of Inferences from Persons' Responses and Performances as Scientific Inquiry into Score Meaning.</w:t>
       </w:r>
       <w:r>
@@ -11837,6 +12158,13 @@
         <w:widowControl w:val="1"/>
       </w:pPr>
       <w:r>
+        <w:rPr>
+          <w:rFonts w:ascii="Georgia" w:hAnsi="Georgia"/>
+          <w:sz w:val="18"/>
+        </w:rPr>
+        <w:t xml:space="preserve">44. </w:t>
+      </w:r>
+      <w:r>
         <w:t xml:space="preserve">Nazaretsky, T., Gabbay, H., &amp; Käser, T. (2025). Can Students Judge Like Experts? A Large-Scale Study on AI and Human Personalized Formative Feedback.</w:t>
       </w:r>
       <w:r>
@@ -11862,6 +12190,13 @@
         <w:widowControl w:val="1"/>
       </w:pPr>
       <w:r>
+        <w:rPr>
+          <w:rFonts w:ascii="Georgia" w:hAnsi="Georgia"/>
+          <w:sz w:val="18"/>
+        </w:rPr>
+        <w:t xml:space="preserve">45. </w:t>
+      </w:r>
+      <w:r>
         <w:t xml:space="preserve">Nelson, T. O., &amp; Narens, L. (1990). Metamemory: A Theoretical Framework and New Findings.</w:t>
       </w:r>
       <w:r>
@@ -11887,6 +12222,13 @@
         <w:widowControl w:val="1"/>
       </w:pPr>
       <w:r>
+        <w:rPr>
+          <w:rFonts w:ascii="Georgia" w:hAnsi="Georgia"/>
+          <w:sz w:val="18"/>
+        </w:rPr>
+        <w:t xml:space="preserve">46. </w:t>
+      </w:r>
+      <w:r>
         <w:t xml:space="preserve">Parasuraman, R., &amp; Manzey, D. H. (2010). Complacency and Bias in Human Use of Automation: An Attentional Integration.</w:t>
       </w:r>
       <w:r>
@@ -11912,6 +12254,13 @@
         <w:widowControl w:val="1"/>
       </w:pPr>
       <w:r>
+        <w:rPr>
+          <w:rFonts w:ascii="Georgia" w:hAnsi="Georgia"/>
+          <w:sz w:val="18"/>
+        </w:rPr>
+        <w:t xml:space="preserve">47. </w:t>
+      </w:r>
+      <w:r>
         <w:t xml:space="preserve">Paul, R., &amp; Elder, L. (2006). The Miniature Guide to Critical Thinking: Concepts and Tools.</w:t>
       </w:r>
       <w:r>
@@ -11937,6 +12286,13 @@
         <w:widowControl w:val="1"/>
       </w:pPr>
       <w:r>
+        <w:rPr>
+          <w:rFonts w:ascii="Georgia" w:hAnsi="Georgia"/>
+          <w:sz w:val="18"/>
+        </w:rPr>
+        <w:t xml:space="preserve">48. </w:t>
+      </w:r>
+      <w:r>
         <w:t xml:space="preserve">Randazzo, B., Lifshitz-Assaf, H., Kellogg, K., Dell'Acqua, F., Mollick, E., Candelon, F., &amp; Lakhani, K. R. (2025). Cyborgs, Centaurs and Self-Automators: Modes of Human-AI Collaboration in Knowledge Work.</w:t>
       </w:r>
       <w:r>
@@ -11962,6 +12318,13 @@
         <w:widowControl w:val="1"/>
       </w:pPr>
       <w:r>
+        <w:rPr>
+          <w:rFonts w:ascii="Georgia" w:hAnsi="Georgia"/>
+          <w:sz w:val="18"/>
+        </w:rPr>
+        <w:t xml:space="preserve">49. </w:t>
+      </w:r>
+      <w:r>
         <w:t xml:space="preserve">Runco, M. A., &amp; Chand, I. (1995). Cognition and Creativity.</w:t>
       </w:r>
       <w:r>
@@ -11987,6 +12350,13 @@
         <w:widowControl w:val="1"/>
       </w:pPr>
       <w:r>
+        <w:rPr>
+          <w:rFonts w:ascii="Georgia" w:hAnsi="Georgia"/>
+          <w:sz w:val="18"/>
+        </w:rPr>
+        <w:t xml:space="preserve">50. </w:t>
+      </w:r>
+      <w:r>
         <w:t xml:space="preserve">Sadler, D. R. (1989). Formative Assessment and the Design of Instructional Systems.</w:t>
       </w:r>
       <w:r>
@@ -12012,6 +12382,13 @@
         <w:widowControl w:val="1"/>
       </w:pPr>
       <w:r>
+        <w:rPr>
+          <w:rFonts w:ascii="Georgia" w:hAnsi="Georgia"/>
+          <w:sz w:val="18"/>
+        </w:rPr>
+        <w:t xml:space="preserve">51. </w:t>
+      </w:r>
+      <w:r>
         <w:t xml:space="preserve">Salomon, G., Perkins, D. N., &amp; Globerson, T. (1991). Partners in Cognition: Extending Human Intelligence with Intelligent Technologies.</w:t>
       </w:r>
       <w:r>
@@ -12037,6 +12414,13 @@
         <w:widowControl w:val="1"/>
       </w:pPr>
       <w:r>
+        <w:rPr>
+          <w:rFonts w:ascii="Georgia" w:hAnsi="Georgia"/>
+          <w:sz w:val="18"/>
+        </w:rPr>
+        <w:t xml:space="preserve">52. </w:t>
+      </w:r>
+      <w:r>
         <w:t xml:space="preserve">Sidra, S., &amp; Mason, C. (2025). Generative AI in Human-AI Collaboration: Validation of the Collaborative AI Literacy and Collaborative AI Metacognition Scales.</w:t>
       </w:r>
       <w:r>
@@ -12062,6 +12446,13 @@
         <w:widowControl w:val="1"/>
       </w:pPr>
       <w:r>
+        <w:rPr>
+          <w:rFonts w:ascii="Georgia" w:hAnsi="Georgia"/>
+          <w:sz w:val="18"/>
+        </w:rPr>
+        <w:t xml:space="preserve">53. </w:t>
+      </w:r>
+      <w:r>
         <w:t xml:space="preserve">Sperber, D., Clément, F., Heintz, C., Mascaro, O., Mercier, H., Origgi, G., &amp; Wilson, D. (2010). Epistemic Vigilance.</w:t>
       </w:r>
       <w:r>
@@ -12087,6 +12478,13 @@
         <w:widowControl w:val="1"/>
       </w:pPr>
       <w:r>
+        <w:rPr>
+          <w:rFonts w:ascii="Georgia" w:hAnsi="Georgia"/>
+          <w:sz w:val="18"/>
+        </w:rPr>
+        <w:t xml:space="preserve">54. </w:t>
+      </w:r>
+      <w:r>
         <w:t xml:space="preserve">Srinath, S., Vadaparty, A., Smith IV, D. H., Porter, L., &amp; Zingaro, D. (2025). Assessing Problem Decomposition in CS1 for the GenAI Era.</w:t>
       </w:r>
       <w:r>
@@ -12112,6 +12510,13 @@
         <w:widowControl w:val="1"/>
       </w:pPr>
       <w:r>
+        <w:rPr>
+          <w:rFonts w:ascii="Georgia" w:hAnsi="Georgia"/>
+          <w:sz w:val="18"/>
+        </w:rPr>
+        <w:t xml:space="preserve">55. </w:t>
+      </w:r>
+      <w:r>
         <w:t xml:space="preserve">Tankelevitch, L., Kewenig, V., Simkute, A., Scott, A. E., Sarkar, A., Sellen, A., &amp; Rintel, S. (2024). The Metacognitive Demands and Opportunities of Generative AI.</w:t>
       </w:r>
       <w:r>
@@ -12137,6 +12542,13 @@
         <w:widowControl w:val="1"/>
       </w:pPr>
       <w:r>
+        <w:rPr>
+          <w:rFonts w:ascii="Georgia" w:hAnsi="Georgia"/>
+          <w:sz w:val="18"/>
+        </w:rPr>
+        <w:t xml:space="preserve">56. </w:t>
+      </w:r>
+      <w:r>
         <w:t xml:space="preserve">Tour, E., &amp; Zadorozhnyy, A. (2025). Conceptualizing and Operationalizing Prompt Literacy for English Language Learners.</w:t>
       </w:r>
       <w:r>
@@ -12162,6 +12574,13 @@
         <w:widowControl w:val="1"/>
       </w:pPr>
       <w:r>
+        <w:rPr>
+          <w:rFonts w:ascii="Georgia" w:hAnsi="Georgia"/>
+          <w:sz w:val="18"/>
+        </w:rPr>
+        <w:t xml:space="preserve">57. </w:t>
+      </w:r>
+      <w:r>
         <w:t xml:space="preserve">Vaccaro, M., Almaatouq, A., &amp; Malone, T. (2024). When Combinations of Humans and AI Are Useful: A Systematic Review and Meta-Analysis.</w:t>
       </w:r>
       <w:r>
@@ -12187,6 +12606,13 @@
         <w:widowControl w:val="1"/>
       </w:pPr>
       <w:r>
+        <w:rPr>
+          <w:rFonts w:ascii="Georgia" w:hAnsi="Georgia"/>
+          <w:sz w:val="18"/>
+        </w:rPr>
+        <w:t xml:space="preserve">58. </w:t>
+      </w:r>
+      <w:r>
         <w:t xml:space="preserve">Vygotsky, L. S. (1978). Mind in Society: The Development of Higher Psychological Processes.</w:t>
       </w:r>
       <w:r>
@@ -12212,6 +12638,13 @@
         <w:widowControl w:val="1"/>
       </w:pPr>
       <w:r>
+        <w:rPr>
+          <w:rFonts w:ascii="Georgia" w:hAnsi="Georgia"/>
+          <w:sz w:val="18"/>
+        </w:rPr>
+        <w:t xml:space="preserve">59. </w:t>
+      </w:r>
+      <w:r>
         <w:t xml:space="preserve">Walton, J., Bearman, M., Crawford, N., Tai, J., &amp; Boud, D. (2025). How University Students Work on Assessment Tasks with Generative Artificial Intelligence: Matters of Judgement.</w:t>
       </w:r>
       <w:r>
@@ -12240,6 +12673,13 @@
         <w:widowControl w:val="1"/>
       </w:pPr>
       <w:r>
+        <w:rPr>
+          <w:rFonts w:ascii="Georgia" w:hAnsi="Georgia"/>
+          <w:sz w:val="18"/>
+        </w:rPr>
+        <w:t xml:space="preserve">60. </w:t>
+      </w:r>
+      <w:r>
         <w:t xml:space="preserve">Wingerter, T. L., Straub, T., &amp; Schweitzer, S. (2025). Mitigating Automation Bias in Generative AI through Nudges: A Cognitive Reflection Test Study.</w:t>
       </w:r>
       <w:r>
@@ -12265,6 +12705,13 @@
         <w:widowControl w:val="1"/>
       </w:pPr>
       <w:r>
+        <w:rPr>
+          <w:rFonts w:ascii="Georgia" w:hAnsi="Georgia"/>
+          <w:sz w:val="18"/>
+        </w:rPr>
+        <w:t xml:space="preserve">61. </w:t>
+      </w:r>
+      <w:r>
         <w:t xml:space="preserve">Winne, P. H., &amp; Hadwin, A. F. (1998). Studying as Self-Regulated Learning.</w:t>
       </w:r>
       <w:r>
@@ -12290,6 +12737,13 @@
         <w:widowControl w:val="1"/>
       </w:pPr>
       <w:r>
+        <w:rPr>
+          <w:rFonts w:ascii="Georgia" w:hAnsi="Georgia"/>
+          <w:sz w:val="18"/>
+        </w:rPr>
+        <w:t xml:space="preserve">62. </w:t>
+      </w:r>
+      <w:r>
         <w:t xml:space="preserve">Wirth, J., Weber-Reuter, X.-L., Schuster, C., Fleischer, J., Leutner, D., &amp; Stebner, F. (2025). Far Transfer of Metacognitive Regulation: From Cognitive Learning Strategy Use to Mental Effort Regulation.</w:t>
       </w:r>
       <w:r>
@@ -12315,6 +12769,13 @@
         <w:widowControl w:val="1"/>
       </w:pPr>
       <w:r>
+        <w:rPr>
+          <w:rFonts w:ascii="Georgia" w:hAnsi="Georgia"/>
+          <w:sz w:val="18"/>
+        </w:rPr>
+        <w:t xml:space="preserve">63. </w:t>
+      </w:r>
+      <w:r>
         <w:t xml:space="preserve">Yao, G., &amp; Fan, L. (2025). Cognitive Load Scale for AI-Assisted L2 Writing: Scale Development and Validation.</w:t>
       </w:r>
       <w:r>
@@ -12340,6 +12801,13 @@
         <w:widowControl w:val="1"/>
       </w:pPr>
       <w:r>
+        <w:rPr>
+          <w:rFonts w:ascii="Georgia" w:hAnsi="Georgia"/>
+          <w:sz w:val="18"/>
+        </w:rPr>
+        <w:t xml:space="preserve">64. </w:t>
+      </w:r>
+      <w:r>
         <w:t xml:space="preserve">Yavuz, F., Çelik, Ö., &amp; Yavaş Çelik, G. (2025). Utilizing Large Language Models for EFL Essay Grading: An Examination of Reliability and Validity in Rubric-Based Assessments.</w:t>
       </w:r>
       <w:r>
@@ -12365,6 +12833,13 @@
         <w:widowControl w:val="1"/>
       </w:pPr>
       <w:r>
+        <w:rPr>
+          <w:rFonts w:ascii="Georgia" w:hAnsi="Georgia"/>
+          <w:sz w:val="18"/>
+        </w:rPr>
+        <w:t xml:space="preserve">65. </w:t>
+      </w:r>
+      <w:r>
         <w:t xml:space="preserve">Zimmerman, B. J. (2000). Attaining Self-Regulation: A Social Cognitive Perspective.</w:t>
       </w:r>
       <w:r>
@@ -12389,6 +12864,13 @@
         <w:keepLines w:val="0"/>
         <w:widowControl w:val="1"/>
       </w:pPr>
+      <w:r>
+        <w:rPr>
+          <w:rFonts w:ascii="Georgia" w:hAnsi="Georgia"/>
+          <w:sz w:val="18"/>
+        </w:rPr>
+        <w:t xml:space="preserve">66. </w:t>
+      </w:r>
       <w:r>
         <w:t xml:space="preserve">UNESCO (2024). AI Competency Framework for Students.</w:t>
       </w:r>

</xml_diff>

<commit_message>
Reference Appendix A from body; uniform paragraph indent + abstract/table margins in DOCX
Co-Authored-By: Claude Opus 4.8 <noreply@anthropic.com>
</commit_message>
<xml_diff>
--- a/docs/coreasoning-2col.docx
+++ b/docs/coreasoning-2col.docx
@@ -243,7 +243,7 @@
     </w:p>
     <w:p>
       <w:pPr>
-        <w:spacing w:before="120" w:after="300" w:line="120" w:lineRule="exact"/>
+        <w:spacing w:before="120" w:after="460" w:line="120" w:lineRule="exact"/>
         <w:rPr>
           <w:sz w:val="12"/>
           <w:szCs w:val="12"/>
@@ -630,7 +630,7 @@
     </w:p>
     <w:p>
       <w:pPr>
-        <w:spacing w:before="120" w:after="120" w:line="120" w:lineRule="exact"/>
+        <w:spacing w:before="240" w:after="240" w:line="120" w:lineRule="exact"/>
         <w:rPr>
           <w:sz w:val="12"/>
           <w:szCs w:val="12"/>
@@ -662,7 +662,7 @@
               <a:graphicData uri="http://schemas.openxmlformats.org/drawingml/2006/picture">
                 <pic:pic>
                   <pic:nvPicPr>
-                    <pic:cNvPr descr="C:/Users/apart/AppData/Local/Temp/html2doc_svg_RicTun/svg_0.png" id="12" name="Picture"/>
+                    <pic:cNvPr descr="C:/Users/apart/AppData/Local/Temp/html2doc_svg_gJ2jxO/svg_0.png" id="12" name="Picture"/>
                     <pic:cNvPicPr>
                       <a:picLocks noChangeArrowheads="1" noChangeAspect="1"/>
                     </pic:cNvPicPr>
@@ -697,7 +697,7 @@
     </w:p>
     <w:p>
       <w:pPr>
-        <w:spacing w:before="120" w:after="120" w:line="120" w:lineRule="exact"/>
+        <w:spacing w:before="240" w:after="240" w:line="120" w:lineRule="exact"/>
         <w:rPr>
           <w:sz w:val="12"/>
           <w:szCs w:val="12"/>
@@ -1743,7 +1743,7 @@
     </w:p>
     <w:p>
       <w:pPr>
-        <w:spacing w:before="120" w:after="120" w:line="120" w:lineRule="exact"/>
+        <w:spacing w:before="240" w:after="240" w:line="120" w:lineRule="exact"/>
         <w:rPr>
           <w:sz w:val="12"/>
           <w:szCs w:val="12"/>
@@ -1775,7 +1775,7 @@
               <a:graphicData uri="http://schemas.openxmlformats.org/drawingml/2006/picture">
                 <pic:pic>
                   <pic:nvPicPr>
-                    <pic:cNvPr descr="C:/Users/apart/AppData/Local/Temp/html2doc_svg_RicTun/svg_1.png" id="17" name="Picture"/>
+                    <pic:cNvPr descr="C:/Users/apart/AppData/Local/Temp/html2doc_svg_gJ2jxO/svg_1.png" id="17" name="Picture"/>
                     <pic:cNvPicPr>
                       <a:picLocks noChangeArrowheads="1" noChangeAspect="1"/>
                     </pic:cNvPicPr>
@@ -1841,7 +1841,7 @@
     </w:p>
     <w:p>
       <w:pPr>
-        <w:spacing w:before="120" w:after="120" w:line="120" w:lineRule="exact"/>
+        <w:spacing w:before="240" w:after="240" w:line="120" w:lineRule="exact"/>
         <w:rPr>
           <w:sz w:val="12"/>
           <w:szCs w:val="12"/>
@@ -3355,7 +3355,7 @@
     </w:p>
     <w:p>
       <w:pPr>
-        <w:spacing w:before="120" w:after="120" w:line="120" w:lineRule="exact"/>
+        <w:spacing w:before="240" w:after="240" w:line="120" w:lineRule="exact"/>
         <w:rPr>
           <w:sz w:val="12"/>
           <w:szCs w:val="12"/>
@@ -4144,7 +4144,7 @@
     </w:tbl>
     <w:p>
       <w:pPr>
-        <w:spacing w:before="120" w:after="120" w:line="120" w:lineRule="exact"/>
+        <w:spacing w:before="240" w:after="240" w:line="120" w:lineRule="exact"/>
         <w:rPr>
           <w:sz w:val="12"/>
           <w:szCs w:val="12"/>
@@ -4669,7 +4669,13 @@
         <w:t xml:space="preserve"> </w:t>
       </w:r>
       <w:r>
-        <w:t xml:space="preserve">theory. Figures A1 and A2 are screenshots of the running platform. All challenges evaluated in this paper are</w:t>
+        <w:t xml:space="preserve">theory. Figures A1 and A2 are screenshots of the running platform, and Appendix A walks through the</w:t>
+      </w:r>
+      <w:r>
+        <w:t xml:space="preserve"> </w:t>
+      </w:r>
+      <w:r>
+        <w:t xml:space="preserve">system end to end. All challenges evaluated in this paper are</w:t>
       </w:r>
       <w:r>
         <w:t xml:space="preserve"> </w:t>
@@ -5903,7 +5909,7 @@
     </w:p>
     <w:p>
       <w:pPr>
-        <w:spacing w:before="120" w:after="120" w:line="120" w:lineRule="exact"/>
+        <w:spacing w:before="240" w:after="240" w:line="120" w:lineRule="exact"/>
         <w:rPr>
           <w:sz w:val="12"/>
           <w:szCs w:val="12"/>
@@ -6436,7 +6442,7 @@
     </w:tbl>
     <w:p>
       <w:pPr>
-        <w:spacing w:before="120" w:after="120" w:line="120" w:lineRule="exact"/>
+        <w:spacing w:before="240" w:after="240" w:line="120" w:lineRule="exact"/>
         <w:rPr>
           <w:sz w:val="12"/>
           <w:szCs w:val="12"/>
@@ -7045,7 +7051,7 @@
     </w:p>
     <w:p>
       <w:pPr>
-        <w:spacing w:before="120" w:after="120" w:line="120" w:lineRule="exact"/>
+        <w:spacing w:before="240" w:after="240" w:line="120" w:lineRule="exact"/>
         <w:rPr>
           <w:sz w:val="12"/>
           <w:szCs w:val="12"/>
@@ -7363,7 +7369,7 @@
     </w:tbl>
     <w:p>
       <w:pPr>
-        <w:spacing w:before="120" w:after="120" w:line="120" w:lineRule="exact"/>
+        <w:spacing w:before="240" w:after="240" w:line="120" w:lineRule="exact"/>
         <w:rPr>
           <w:sz w:val="12"/>
           <w:szCs w:val="12"/>
@@ -7380,7 +7386,7 @@
     <w:p/>
     <w:p>
       <w:pPr>
-        <w:spacing w:before="120" w:after="120" w:line="120" w:lineRule="exact"/>
+        <w:spacing w:before="240" w:after="240" w:line="120" w:lineRule="exact"/>
         <w:rPr>
           <w:sz w:val="12"/>
           <w:szCs w:val="12"/>
@@ -7941,7 +7947,7 @@
     </w:tbl>
     <w:p>
       <w:pPr>
-        <w:spacing w:before="120" w:after="120" w:line="120" w:lineRule="exact"/>
+        <w:spacing w:before="240" w:after="240" w:line="120" w:lineRule="exact"/>
         <w:rPr>
           <w:sz w:val="12"/>
           <w:szCs w:val="12"/>
@@ -8105,7 +8111,7 @@
     </w:p>
     <w:p>
       <w:pPr>
-        <w:spacing w:before="120" w:after="120" w:line="120" w:lineRule="exact"/>
+        <w:spacing w:before="240" w:after="240" w:line="120" w:lineRule="exact"/>
         <w:rPr>
           <w:sz w:val="12"/>
           <w:szCs w:val="12"/>
@@ -8285,7 +8291,7 @@
     </w:p>
     <w:p>
       <w:pPr>
-        <w:spacing w:before="120" w:after="120" w:line="120" w:lineRule="exact"/>
+        <w:spacing w:before="240" w:after="240" w:line="120" w:lineRule="exact"/>
         <w:rPr>
           <w:sz w:val="12"/>
           <w:szCs w:val="12"/>
@@ -9475,7 +9481,7 @@
     </w:p>
     <w:p>
       <w:pPr>
-        <w:spacing w:before="120" w:after="120" w:line="120" w:lineRule="exact"/>
+        <w:spacing w:before="240" w:after="240" w:line="120" w:lineRule="exact"/>
         <w:rPr>
           <w:sz w:val="12"/>
           <w:szCs w:val="12"/>
@@ -9573,7 +9579,7 @@
     </w:p>
     <w:p>
       <w:pPr>
-        <w:spacing w:before="120" w:after="120" w:line="120" w:lineRule="exact"/>
+        <w:spacing w:before="240" w:after="240" w:line="120" w:lineRule="exact"/>
         <w:rPr>
           <w:sz w:val="12"/>
           <w:szCs w:val="12"/>
@@ -9631,7 +9637,7 @@
     </w:p>
     <w:p>
       <w:pPr>
-        <w:spacing w:before="120" w:after="120" w:line="120" w:lineRule="exact"/>
+        <w:spacing w:before="240" w:after="240" w:line="120" w:lineRule="exact"/>
         <w:rPr>
           <w:sz w:val="12"/>
           <w:szCs w:val="12"/>
@@ -9745,7 +9751,7 @@
               <a:graphicData uri="http://schemas.openxmlformats.org/drawingml/2006/picture">
                 <pic:pic>
                   <pic:nvPicPr>
-                    <pic:cNvPr descr="C:/Users/apart/AppData/Local/Temp/html2doc_svg_RicTun/svg_2.png" id="46" name="Picture"/>
+                    <pic:cNvPr descr="C:/Users/apart/AppData/Local/Temp/html2doc_svg_gJ2jxO/svg_2.png" id="46" name="Picture"/>
                     <pic:cNvPicPr>
                       <a:picLocks noChangeArrowheads="1" noChangeAspect="1"/>
                     </pic:cNvPicPr>
@@ -9811,7 +9817,7 @@
     </w:p>
     <w:p>
       <w:pPr>
-        <w:spacing w:before="120" w:after="120" w:line="120" w:lineRule="exact"/>
+        <w:spacing w:before="240" w:after="240" w:line="120" w:lineRule="exact"/>
         <w:rPr>
           <w:sz w:val="12"/>
           <w:szCs w:val="12"/>
@@ -25368,7 +25374,7 @@
     <w:pPr>
       <w:keepNext w:val="0"/>
       <w:spacing w:after="0" w:before="0" w:line="240" w:lineRule="auto"/>
-      <w:ind w:firstLine="0"/>
+      <w:ind w:firstLine="288"/>
       <w:jc w:val="both"/>
     </w:pPr>
     <w:rPr>

</xml_diff>

<commit_message>
Regenerate DOCX: cleaner left-aligned numbered references + float placement
Co-Authored-By: Claude Opus 4.8 <noreply@anthropic.com>
</commit_message>
<xml_diff>
--- a/docs/coreasoning-2col.docx
+++ b/docs/coreasoning-2col.docx
@@ -662,7 +662,7 @@
               <a:graphicData uri="http://schemas.openxmlformats.org/drawingml/2006/picture">
                 <pic:pic>
                   <pic:nvPicPr>
-                    <pic:cNvPr descr="C:/Users/apart/AppData/Local/Temp/html2doc_svg_gJ2jxO/svg_0.png" id="12" name="Picture"/>
+                    <pic:cNvPr descr="C:/Users/apart/AppData/Local/Temp/html2doc_svg_lNh4Nc/svg_0.png" id="12" name="Picture"/>
                     <pic:cNvPicPr>
                       <a:picLocks noChangeArrowheads="1" noChangeAspect="1"/>
                     </pic:cNvPicPr>
@@ -1775,7 +1775,7 @@
               <a:graphicData uri="http://schemas.openxmlformats.org/drawingml/2006/picture">
                 <pic:pic>
                   <pic:nvPicPr>
-                    <pic:cNvPr descr="C:/Users/apart/AppData/Local/Temp/html2doc_svg_gJ2jxO/svg_1.png" id="17" name="Picture"/>
+                    <pic:cNvPr descr="C:/Users/apart/AppData/Local/Temp/html2doc_svg_lNh4Nc/svg_1.png" id="17" name="Picture"/>
                     <pic:cNvPicPr>
                       <a:picLocks noChangeArrowheads="1" noChangeAspect="1"/>
                     </pic:cNvPicPr>
@@ -8111,22 +8111,6 @@
     </w:p>
     <w:p>
       <w:pPr>
-        <w:spacing w:before="240" w:after="240" w:line="120" w:lineRule="exact"/>
-        <w:rPr>
-          <w:sz w:val="12"/>
-          <w:szCs w:val="12"/>
-        </w:rPr>
-        <w:sectPr>
-          <w:type w:val="continuous"/>
-          <w:pgSz w:h="15840" w:w="12240"/>
-          <w:pgMar w:bottom="1080" w:footer="720" w:gutter="0" w:header="720" w:left="1080" w:right="1080" w:top="1080"/>
-          <w:cols w:num="2" w:space="288" w:equalWidth="1"/>
-          <w:docGrid w:linePitch="360"/>
-        </w:sectPr>
-      </w:pPr>
-    </w:p>
-    <w:p>
-      <w:pPr>
         <w:pStyle w:val="BodyText"/>
         <w:jc w:val="center"/>
         <w:keepNext/>
@@ -8136,7 +8120,7 @@
       <w:r>
         <w:drawing>
           <wp:inline>
-            <wp:extent cx="4600754" cy="3864633"/>
+            <wp:extent cx="3108960" cy="2611526"/>
             <wp:effectExtent b="0" l="0" r="0" t="0"/>
             <wp:docPr descr="Figure 3. Own-competence effects dominate cross-competence effects on every skill's grade." title="" id="28" name="Picture"/>
             <a:graphic>
@@ -8157,7 +8141,7 @@
                   <pic:spPr bwMode="auto">
                     <a:xfrm>
                       <a:off x="0" y="0"/>
-                      <a:ext cx="4600754" cy="3864633"/>
+                      <a:ext cx="3108960" cy="2611526"/>
                     </a:xfrm>
                     <a:prstGeom prst="rect">
                       <a:avLst/>
@@ -8175,6 +8159,22 @@
           </wp:inline>
         </w:drawing>
       </w:r>
+    </w:p>
+    <w:p>
+      <w:pPr>
+        <w:spacing w:before="240" w:after="240" w:line="120" w:lineRule="exact"/>
+        <w:rPr>
+          <w:sz w:val="12"/>
+          <w:szCs w:val="12"/>
+        </w:rPr>
+        <w:sectPr>
+          <w:type w:val="continuous"/>
+          <w:pgSz w:h="15840" w:w="12240"/>
+          <w:pgMar w:bottom="1080" w:footer="720" w:gutter="0" w:header="720" w:left="1080" w:right="1080" w:top="1080"/>
+          <w:cols w:num="2" w:space="288" w:equalWidth="1"/>
+          <w:docGrid w:linePitch="360"/>
+        </w:sectPr>
+      </w:pPr>
     </w:p>
     <w:p>
       <w:pPr>
@@ -9481,22 +9481,6 @@
     </w:p>
     <w:p>
       <w:pPr>
-        <w:spacing w:before="240" w:after="240" w:line="120" w:lineRule="exact"/>
-        <w:rPr>
-          <w:sz w:val="12"/>
-          <w:szCs w:val="12"/>
-        </w:rPr>
-        <w:sectPr>
-          <w:type w:val="continuous"/>
-          <w:pgSz w:h="15840" w:w="12240"/>
-          <w:pgMar w:bottom="1080" w:footer="720" w:gutter="0" w:header="720" w:left="1080" w:right="1080" w:top="1080"/>
-          <w:cols w:num="2" w:space="288" w:equalWidth="1"/>
-          <w:docGrid w:linePitch="360"/>
-        </w:sectPr>
-      </w:pPr>
-    </w:p>
-    <w:p>
-      <w:pPr>
         <w:pStyle w:val="BodyText"/>
         <w:jc w:val="center"/>
         <w:keepNext/>
@@ -9506,7 +9490,7 @@
       <w:r>
         <w:drawing>
           <wp:inline>
-            <wp:extent cx="6400800" cy="5154377"/>
+            <wp:extent cx="3108960" cy="2503554"/>
             <wp:effectExtent b="0" l="0" r="0" t="0"/>
             <wp:docPr descr="Figure A1. A CoReasoning Lab challenge run." title="" id="39" name="Picture"/>
             <a:graphic>
@@ -9527,7 +9511,7 @@
                   <pic:spPr bwMode="auto">
                     <a:xfrm>
                       <a:off x="0" y="0"/>
-                      <a:ext cx="6400800" cy="5154377"/>
+                      <a:ext cx="3108960" cy="2503554"/>
                     </a:xfrm>
                     <a:prstGeom prst="rect">
                       <a:avLst/>
@@ -9579,22 +9563,6 @@
     </w:p>
     <w:p>
       <w:pPr>
-        <w:spacing w:before="240" w:after="240" w:line="120" w:lineRule="exact"/>
-        <w:rPr>
-          <w:sz w:val="12"/>
-          <w:szCs w:val="12"/>
-        </w:rPr>
-        <w:sectPr>
-          <w:type w:val="continuous"/>
-          <w:pgSz w:h="15840" w:w="12240"/>
-          <w:pgMar w:bottom="1080" w:footer="720" w:gutter="0" w:header="720" w:left="1080" w:right="1080" w:top="1080"/>
-          <w:cols w:num="1" w:space="288"/>
-          <w:docGrid w:linePitch="360"/>
-        </w:sectPr>
-      </w:pPr>
-    </w:p>
-    <w:p>
-      <w:pPr>
         <w:pStyle w:val="BodyText"/>
         <w:jc w:val="both"/>
         <w:keepNext w:val="0"/>
@@ -9637,22 +9605,6 @@
     </w:p>
     <w:p>
       <w:pPr>
-        <w:spacing w:before="240" w:after="240" w:line="120" w:lineRule="exact"/>
-        <w:rPr>
-          <w:sz w:val="12"/>
-          <w:szCs w:val="12"/>
-        </w:rPr>
-        <w:sectPr>
-          <w:type w:val="continuous"/>
-          <w:pgSz w:h="15840" w:w="12240"/>
-          <w:pgMar w:bottom="1080" w:footer="720" w:gutter="0" w:header="720" w:left="1080" w:right="1080" w:top="1080"/>
-          <w:cols w:num="2" w:space="288" w:equalWidth="1"/>
-          <w:docGrid w:linePitch="360"/>
-        </w:sectPr>
-      </w:pPr>
-    </w:p>
-    <w:p>
-      <w:pPr>
         <w:pStyle w:val="BodyText"/>
         <w:jc w:val="center"/>
         <w:keepNext/>
@@ -9662,7 +9614,7 @@
       <w:r>
         <w:drawing>
           <wp:inline>
-            <wp:extent cx="6400800" cy="4752109"/>
+            <wp:extent cx="3108960" cy="2308167"/>
             <wp:effectExtent b="0" l="0" r="0" t="0"/>
             <wp:docPr descr="Figure A2. CoReasoning Lab instructor course analytics." title="" id="42" name="Picture"/>
             <a:graphic>
@@ -9683,7 +9635,7 @@
                   <pic:spPr bwMode="auto">
                     <a:xfrm>
                       <a:off x="0" y="0"/>
-                      <a:ext cx="6400800" cy="4752109"/>
+                      <a:ext cx="3108960" cy="2308167"/>
                     </a:xfrm>
                     <a:prstGeom prst="rect">
                       <a:avLst/>
@@ -9704,6 +9656,22 @@
     </w:p>
     <w:p>
       <w:pPr>
+        <w:spacing w:before="240" w:after="240" w:line="120" w:lineRule="exact"/>
+        <w:rPr>
+          <w:sz w:val="12"/>
+          <w:szCs w:val="12"/>
+        </w:rPr>
+        <w:sectPr>
+          <w:type w:val="continuous"/>
+          <w:pgSz w:h="15840" w:w="12240"/>
+          <w:pgMar w:bottom="1080" w:footer="720" w:gutter="0" w:header="720" w:left="1080" w:right="1080" w:top="1080"/>
+          <w:cols w:num="2" w:space="288" w:equalWidth="1"/>
+          <w:docGrid w:linePitch="360"/>
+        </w:sectPr>
+      </w:pPr>
+    </w:p>
+    <w:p>
+      <w:pPr>
         <w:pStyle w:val="ImageCaption"/>
         <w:spacing w:before="80" w:after="120" w:line="240" w:lineRule="auto"/>
         <w:jc w:val="center"/>
@@ -9751,7 +9719,7 @@
               <a:graphicData uri="http://schemas.openxmlformats.org/drawingml/2006/picture">
                 <pic:pic>
                   <pic:nvPicPr>
-                    <pic:cNvPr descr="C:/Users/apart/AppData/Local/Temp/html2doc_svg_gJ2jxO/svg_2.png" id="46" name="Picture"/>
+                    <pic:cNvPr descr="C:/Users/apart/AppData/Local/Temp/html2doc_svg_lNh4Nc/svg_2.png" id="46" name="Picture"/>
                     <pic:cNvPicPr>
                       <a:picLocks noChangeArrowheads="1" noChangeAspect="1"/>
                     </pic:cNvPicPr>
@@ -10782,6 +10750,8 @@
     <w:p>
       <w:pPr>
         <w:pStyle w:val="ReferenceEntry"/>
+        <w:spacing w:after="60"/>
+        <w:ind w:left="403" w:hanging="403"/>
         <w:jc w:val="left"/>
         <w:keepNext w:val="0"/>
         <w:keepLines w:val="0"/>
@@ -10814,6 +10784,8 @@
     <w:p>
       <w:pPr>
         <w:pStyle w:val="ReferenceEntry"/>
+        <w:spacing w:after="60"/>
+        <w:ind w:left="403" w:hanging="403"/>
         <w:jc w:val="left"/>
         <w:keepNext w:val="0"/>
         <w:keepLines w:val="0"/>
@@ -10846,6 +10818,8 @@
     <w:p>
       <w:pPr>
         <w:pStyle w:val="ReferenceEntry"/>
+        <w:spacing w:after="60"/>
+        <w:ind w:left="403" w:hanging="403"/>
         <w:jc w:val="left"/>
         <w:keepNext w:val="0"/>
         <w:keepLines w:val="0"/>
@@ -10878,6 +10852,8 @@
     <w:p>
       <w:pPr>
         <w:pStyle w:val="ReferenceEntry"/>
+        <w:spacing w:after="60"/>
+        <w:ind w:left="403" w:hanging="403"/>
         <w:jc w:val="left"/>
         <w:keepNext w:val="0"/>
         <w:keepLines w:val="0"/>
@@ -10910,6 +10886,8 @@
     <w:p>
       <w:pPr>
         <w:pStyle w:val="ReferenceEntry"/>
+        <w:spacing w:after="60"/>
+        <w:ind w:left="403" w:hanging="403"/>
         <w:jc w:val="left"/>
         <w:keepNext w:val="0"/>
         <w:keepLines w:val="0"/>
@@ -10942,6 +10920,8 @@
     <w:p>
       <w:pPr>
         <w:pStyle w:val="ReferenceEntry"/>
+        <w:spacing w:after="60"/>
+        <w:ind w:left="403" w:hanging="403"/>
         <w:jc w:val="left"/>
         <w:keepNext w:val="0"/>
         <w:keepLines w:val="0"/>
@@ -10974,6 +10954,8 @@
     <w:p>
       <w:pPr>
         <w:pStyle w:val="ReferenceEntry"/>
+        <w:spacing w:after="60"/>
+        <w:ind w:left="403" w:hanging="403"/>
         <w:jc w:val="left"/>
         <w:keepNext w:val="0"/>
         <w:keepLines w:val="0"/>
@@ -11006,6 +10988,8 @@
     <w:p>
       <w:pPr>
         <w:pStyle w:val="ReferenceEntry"/>
+        <w:spacing w:after="60"/>
+        <w:ind w:left="403" w:hanging="403"/>
         <w:jc w:val="left"/>
         <w:keepNext w:val="0"/>
         <w:keepLines w:val="0"/>
@@ -11038,6 +11022,8 @@
     <w:p>
       <w:pPr>
         <w:pStyle w:val="ReferenceEntry"/>
+        <w:spacing w:after="60"/>
+        <w:ind w:left="403" w:hanging="403"/>
         <w:jc w:val="left"/>
         <w:keepNext w:val="0"/>
         <w:keepLines w:val="0"/>
@@ -11070,6 +11056,8 @@
     <w:p>
       <w:pPr>
         <w:pStyle w:val="ReferenceEntry"/>
+        <w:spacing w:after="60"/>
+        <w:ind w:left="403" w:hanging="403"/>
         <w:jc w:val="left"/>
         <w:keepNext w:val="0"/>
         <w:keepLines w:val="0"/>
@@ -11102,6 +11090,8 @@
     <w:p>
       <w:pPr>
         <w:pStyle w:val="ReferenceEntry"/>
+        <w:spacing w:after="60"/>
+        <w:ind w:left="403" w:hanging="403"/>
         <w:jc w:val="left"/>
         <w:keepNext w:val="0"/>
         <w:keepLines w:val="0"/>
@@ -11134,6 +11124,8 @@
     <w:p>
       <w:pPr>
         <w:pStyle w:val="ReferenceEntry"/>
+        <w:spacing w:after="60"/>
+        <w:ind w:left="403" w:hanging="403"/>
         <w:jc w:val="left"/>
         <w:keepNext w:val="0"/>
         <w:keepLines w:val="0"/>
@@ -11166,6 +11158,8 @@
     <w:p>
       <w:pPr>
         <w:pStyle w:val="ReferenceEntry"/>
+        <w:spacing w:after="60"/>
+        <w:ind w:left="403" w:hanging="403"/>
         <w:jc w:val="left"/>
         <w:keepNext w:val="0"/>
         <w:keepLines w:val="0"/>
@@ -11198,6 +11192,8 @@
     <w:p>
       <w:pPr>
         <w:pStyle w:val="ReferenceEntry"/>
+        <w:spacing w:after="60"/>
+        <w:ind w:left="403" w:hanging="403"/>
         <w:jc w:val="left"/>
         <w:keepNext w:val="0"/>
         <w:keepLines w:val="0"/>
@@ -11230,6 +11226,8 @@
     <w:p>
       <w:pPr>
         <w:pStyle w:val="ReferenceEntry"/>
+        <w:spacing w:after="60"/>
+        <w:ind w:left="403" w:hanging="403"/>
         <w:jc w:val="left"/>
         <w:keepNext w:val="0"/>
         <w:keepLines w:val="0"/>
@@ -11262,6 +11260,8 @@
     <w:p>
       <w:pPr>
         <w:pStyle w:val="ReferenceEntry"/>
+        <w:spacing w:after="60"/>
+        <w:ind w:left="403" w:hanging="403"/>
         <w:jc w:val="left"/>
         <w:keepNext w:val="0"/>
         <w:keepLines w:val="0"/>
@@ -11294,6 +11294,8 @@
     <w:p>
       <w:pPr>
         <w:pStyle w:val="ReferenceEntry"/>
+        <w:spacing w:after="60"/>
+        <w:ind w:left="403" w:hanging="403"/>
         <w:jc w:val="left"/>
         <w:keepNext w:val="0"/>
         <w:keepLines w:val="0"/>
@@ -11326,6 +11328,8 @@
     <w:p>
       <w:pPr>
         <w:pStyle w:val="ReferenceEntry"/>
+        <w:spacing w:after="60"/>
+        <w:ind w:left="403" w:hanging="403"/>
         <w:jc w:val="left"/>
         <w:keepNext w:val="0"/>
         <w:keepLines w:val="0"/>
@@ -11358,6 +11362,8 @@
     <w:p>
       <w:pPr>
         <w:pStyle w:val="ReferenceEntry"/>
+        <w:spacing w:after="60"/>
+        <w:ind w:left="403" w:hanging="403"/>
         <w:jc w:val="left"/>
         <w:keepNext w:val="0"/>
         <w:keepLines w:val="0"/>
@@ -11390,6 +11396,8 @@
     <w:p>
       <w:pPr>
         <w:pStyle w:val="ReferenceEntry"/>
+        <w:spacing w:after="60"/>
+        <w:ind w:left="403" w:hanging="403"/>
         <w:jc w:val="left"/>
         <w:keepNext w:val="0"/>
         <w:keepLines w:val="0"/>
@@ -11422,6 +11430,8 @@
     <w:p>
       <w:pPr>
         <w:pStyle w:val="ReferenceEntry"/>
+        <w:spacing w:after="60"/>
+        <w:ind w:left="403" w:hanging="403"/>
         <w:jc w:val="left"/>
         <w:keepNext w:val="0"/>
         <w:keepLines w:val="0"/>
@@ -11454,6 +11464,8 @@
     <w:p>
       <w:pPr>
         <w:pStyle w:val="ReferenceEntry"/>
+        <w:spacing w:after="60"/>
+        <w:ind w:left="403" w:hanging="403"/>
         <w:jc w:val="left"/>
         <w:keepNext w:val="0"/>
         <w:keepLines w:val="0"/>
@@ -11486,6 +11498,8 @@
     <w:p>
       <w:pPr>
         <w:pStyle w:val="ReferenceEntry"/>
+        <w:spacing w:after="60"/>
+        <w:ind w:left="403" w:hanging="403"/>
         <w:jc w:val="left"/>
         <w:keepNext w:val="0"/>
         <w:keepLines w:val="0"/>
@@ -11518,6 +11532,8 @@
     <w:p>
       <w:pPr>
         <w:pStyle w:val="ReferenceEntry"/>
+        <w:spacing w:after="60"/>
+        <w:ind w:left="403" w:hanging="403"/>
         <w:jc w:val="left"/>
         <w:keepNext w:val="0"/>
         <w:keepLines w:val="0"/>
@@ -11550,6 +11566,8 @@
     <w:p>
       <w:pPr>
         <w:pStyle w:val="ReferenceEntry"/>
+        <w:spacing w:after="60"/>
+        <w:ind w:left="403" w:hanging="403"/>
         <w:jc w:val="left"/>
         <w:keepNext w:val="0"/>
         <w:keepLines w:val="0"/>
@@ -11582,6 +11600,8 @@
     <w:p>
       <w:pPr>
         <w:pStyle w:val="ReferenceEntry"/>
+        <w:spacing w:after="60"/>
+        <w:ind w:left="403" w:hanging="403"/>
         <w:jc w:val="left"/>
         <w:keepNext w:val="0"/>
         <w:keepLines w:val="0"/>
@@ -11614,6 +11634,8 @@
     <w:p>
       <w:pPr>
         <w:pStyle w:val="ReferenceEntry"/>
+        <w:spacing w:after="60"/>
+        <w:ind w:left="403" w:hanging="403"/>
         <w:jc w:val="left"/>
         <w:keepNext w:val="0"/>
         <w:keepLines w:val="0"/>
@@ -11646,6 +11668,8 @@
     <w:p>
       <w:pPr>
         <w:pStyle w:val="ReferenceEntry"/>
+        <w:spacing w:after="60"/>
+        <w:ind w:left="403" w:hanging="403"/>
         <w:jc w:val="left"/>
         <w:keepNext w:val="0"/>
         <w:keepLines w:val="0"/>
@@ -11678,6 +11702,8 @@
     <w:p>
       <w:pPr>
         <w:pStyle w:val="ReferenceEntry"/>
+        <w:spacing w:after="60"/>
+        <w:ind w:left="403" w:hanging="403"/>
         <w:jc w:val="left"/>
         <w:keepNext w:val="0"/>
         <w:keepLines w:val="0"/>
@@ -11710,6 +11736,8 @@
     <w:p>
       <w:pPr>
         <w:pStyle w:val="ReferenceEntry"/>
+        <w:spacing w:after="60"/>
+        <w:ind w:left="403" w:hanging="403"/>
         <w:jc w:val="left"/>
         <w:keepNext w:val="0"/>
         <w:keepLines w:val="0"/>
@@ -11742,6 +11770,8 @@
     <w:p>
       <w:pPr>
         <w:pStyle w:val="ReferenceEntry"/>
+        <w:spacing w:after="60"/>
+        <w:ind w:left="403" w:hanging="403"/>
         <w:jc w:val="left"/>
         <w:keepNext w:val="0"/>
         <w:keepLines w:val="0"/>
@@ -11774,6 +11804,8 @@
     <w:p>
       <w:pPr>
         <w:pStyle w:val="ReferenceEntry"/>
+        <w:spacing w:after="60"/>
+        <w:ind w:left="403" w:hanging="403"/>
         <w:jc w:val="left"/>
         <w:keepNext w:val="0"/>
         <w:keepLines w:val="0"/>
@@ -11806,6 +11838,8 @@
     <w:p>
       <w:pPr>
         <w:pStyle w:val="ReferenceEntry"/>
+        <w:spacing w:after="60"/>
+        <w:ind w:left="403" w:hanging="403"/>
         <w:jc w:val="left"/>
         <w:keepNext w:val="0"/>
         <w:keepLines w:val="0"/>
@@ -11838,6 +11872,8 @@
     <w:p>
       <w:pPr>
         <w:pStyle w:val="ReferenceEntry"/>
+        <w:spacing w:after="60"/>
+        <w:ind w:left="403" w:hanging="403"/>
         <w:jc w:val="left"/>
         <w:keepNext w:val="0"/>
         <w:keepLines w:val="0"/>
@@ -11870,6 +11906,8 @@
     <w:p>
       <w:pPr>
         <w:pStyle w:val="ReferenceEntry"/>
+        <w:spacing w:after="60"/>
+        <w:ind w:left="403" w:hanging="403"/>
         <w:jc w:val="left"/>
         <w:keepNext w:val="0"/>
         <w:keepLines w:val="0"/>
@@ -11902,6 +11940,8 @@
     <w:p>
       <w:pPr>
         <w:pStyle w:val="ReferenceEntry"/>
+        <w:spacing w:after="60"/>
+        <w:ind w:left="403" w:hanging="403"/>
         <w:jc w:val="left"/>
         <w:keepNext w:val="0"/>
         <w:keepLines w:val="0"/>
@@ -11934,6 +11974,8 @@
     <w:p>
       <w:pPr>
         <w:pStyle w:val="ReferenceEntry"/>
+        <w:spacing w:after="60"/>
+        <w:ind w:left="403" w:hanging="403"/>
         <w:jc w:val="left"/>
         <w:keepNext w:val="0"/>
         <w:keepLines w:val="0"/>
@@ -11966,6 +12008,8 @@
     <w:p>
       <w:pPr>
         <w:pStyle w:val="ReferenceEntry"/>
+        <w:spacing w:after="60"/>
+        <w:ind w:left="403" w:hanging="403"/>
         <w:jc w:val="left"/>
         <w:keepNext w:val="0"/>
         <w:keepLines w:val="0"/>
@@ -11998,6 +12042,8 @@
     <w:p>
       <w:pPr>
         <w:pStyle w:val="ReferenceEntry"/>
+        <w:spacing w:after="60"/>
+        <w:ind w:left="403" w:hanging="403"/>
         <w:jc w:val="left"/>
         <w:keepNext w:val="0"/>
         <w:keepLines w:val="0"/>
@@ -12030,6 +12076,8 @@
     <w:p>
       <w:pPr>
         <w:pStyle w:val="ReferenceEntry"/>
+        <w:spacing w:after="60"/>
+        <w:ind w:left="403" w:hanging="403"/>
         <w:jc w:val="left"/>
         <w:keepNext w:val="0"/>
         <w:keepLines w:val="0"/>
@@ -12062,6 +12110,8 @@
     <w:p>
       <w:pPr>
         <w:pStyle w:val="ReferenceEntry"/>
+        <w:spacing w:after="60"/>
+        <w:ind w:left="403" w:hanging="403"/>
         <w:jc w:val="left"/>
         <w:keepNext w:val="0"/>
         <w:keepLines w:val="0"/>
@@ -12094,6 +12144,8 @@
     <w:p>
       <w:pPr>
         <w:pStyle w:val="ReferenceEntry"/>
+        <w:spacing w:after="60"/>
+        <w:ind w:left="403" w:hanging="403"/>
         <w:jc w:val="left"/>
         <w:keepNext w:val="0"/>
         <w:keepLines w:val="0"/>
@@ -12126,6 +12178,8 @@
     <w:p>
       <w:pPr>
         <w:pStyle w:val="ReferenceEntry"/>
+        <w:spacing w:after="60"/>
+        <w:ind w:left="403" w:hanging="403"/>
         <w:jc w:val="left"/>
         <w:keepNext w:val="0"/>
         <w:keepLines w:val="0"/>
@@ -12158,6 +12212,8 @@
     <w:p>
       <w:pPr>
         <w:pStyle w:val="ReferenceEntry"/>
+        <w:spacing w:after="60"/>
+        <w:ind w:left="403" w:hanging="403"/>
         <w:jc w:val="left"/>
         <w:keepNext w:val="0"/>
         <w:keepLines w:val="0"/>
@@ -12190,6 +12246,8 @@
     <w:p>
       <w:pPr>
         <w:pStyle w:val="ReferenceEntry"/>
+        <w:spacing w:after="60"/>
+        <w:ind w:left="403" w:hanging="403"/>
         <w:jc w:val="left"/>
         <w:keepNext w:val="0"/>
         <w:keepLines w:val="0"/>
@@ -12222,6 +12280,8 @@
     <w:p>
       <w:pPr>
         <w:pStyle w:val="ReferenceEntry"/>
+        <w:spacing w:after="60"/>
+        <w:ind w:left="403" w:hanging="403"/>
         <w:jc w:val="left"/>
         <w:keepNext w:val="0"/>
         <w:keepLines w:val="0"/>
@@ -12254,6 +12314,8 @@
     <w:p>
       <w:pPr>
         <w:pStyle w:val="ReferenceEntry"/>
+        <w:spacing w:after="60"/>
+        <w:ind w:left="403" w:hanging="403"/>
         <w:jc w:val="left"/>
         <w:keepNext w:val="0"/>
         <w:keepLines w:val="0"/>
@@ -12286,6 +12348,8 @@
     <w:p>
       <w:pPr>
         <w:pStyle w:val="ReferenceEntry"/>
+        <w:spacing w:after="60"/>
+        <w:ind w:left="403" w:hanging="403"/>
         <w:jc w:val="left"/>
         <w:keepNext w:val="0"/>
         <w:keepLines w:val="0"/>
@@ -12318,6 +12382,8 @@
     <w:p>
       <w:pPr>
         <w:pStyle w:val="ReferenceEntry"/>
+        <w:spacing w:after="60"/>
+        <w:ind w:left="403" w:hanging="403"/>
         <w:jc w:val="left"/>
         <w:keepNext w:val="0"/>
         <w:keepLines w:val="0"/>
@@ -12350,6 +12416,8 @@
     <w:p>
       <w:pPr>
         <w:pStyle w:val="ReferenceEntry"/>
+        <w:spacing w:after="60"/>
+        <w:ind w:left="403" w:hanging="403"/>
         <w:jc w:val="left"/>
         <w:keepNext w:val="0"/>
         <w:keepLines w:val="0"/>
@@ -12382,6 +12450,8 @@
     <w:p>
       <w:pPr>
         <w:pStyle w:val="ReferenceEntry"/>
+        <w:spacing w:after="60"/>
+        <w:ind w:left="403" w:hanging="403"/>
         <w:jc w:val="left"/>
         <w:keepNext w:val="0"/>
         <w:keepLines w:val="0"/>
@@ -12414,6 +12484,8 @@
     <w:p>
       <w:pPr>
         <w:pStyle w:val="ReferenceEntry"/>
+        <w:spacing w:after="60"/>
+        <w:ind w:left="403" w:hanging="403"/>
         <w:jc w:val="left"/>
         <w:keepNext w:val="0"/>
         <w:keepLines w:val="0"/>
@@ -12446,6 +12518,8 @@
     <w:p>
       <w:pPr>
         <w:pStyle w:val="ReferenceEntry"/>
+        <w:spacing w:after="60"/>
+        <w:ind w:left="403" w:hanging="403"/>
         <w:jc w:val="left"/>
         <w:keepNext w:val="0"/>
         <w:keepLines w:val="0"/>
@@ -12478,6 +12552,8 @@
     <w:p>
       <w:pPr>
         <w:pStyle w:val="ReferenceEntry"/>
+        <w:spacing w:after="60"/>
+        <w:ind w:left="403" w:hanging="403"/>
         <w:jc w:val="left"/>
         <w:keepNext w:val="0"/>
         <w:keepLines w:val="0"/>
@@ -12510,6 +12586,8 @@
     <w:p>
       <w:pPr>
         <w:pStyle w:val="ReferenceEntry"/>
+        <w:spacing w:after="60"/>
+        <w:ind w:left="403" w:hanging="403"/>
         <w:jc w:val="left"/>
         <w:keepNext w:val="0"/>
         <w:keepLines w:val="0"/>
@@ -12542,6 +12620,8 @@
     <w:p>
       <w:pPr>
         <w:pStyle w:val="ReferenceEntry"/>
+        <w:spacing w:after="60"/>
+        <w:ind w:left="403" w:hanging="403"/>
         <w:jc w:val="left"/>
         <w:keepNext w:val="0"/>
         <w:keepLines w:val="0"/>
@@ -12574,6 +12654,8 @@
     <w:p>
       <w:pPr>
         <w:pStyle w:val="ReferenceEntry"/>
+        <w:spacing w:after="60"/>
+        <w:ind w:left="403" w:hanging="403"/>
         <w:jc w:val="left"/>
         <w:keepNext w:val="0"/>
         <w:keepLines w:val="0"/>
@@ -12606,6 +12688,8 @@
     <w:p>
       <w:pPr>
         <w:pStyle w:val="ReferenceEntry"/>
+        <w:spacing w:after="60"/>
+        <w:ind w:left="403" w:hanging="403"/>
         <w:jc w:val="left"/>
         <w:keepNext w:val="0"/>
         <w:keepLines w:val="0"/>
@@ -12638,6 +12722,8 @@
     <w:p>
       <w:pPr>
         <w:pStyle w:val="ReferenceEntry"/>
+        <w:spacing w:after="60"/>
+        <w:ind w:left="403" w:hanging="403"/>
         <w:jc w:val="left"/>
         <w:keepNext w:val="0"/>
         <w:keepLines w:val="0"/>
@@ -12673,6 +12759,8 @@
     <w:p>
       <w:pPr>
         <w:pStyle w:val="ReferenceEntry"/>
+        <w:spacing w:after="60"/>
+        <w:ind w:left="403" w:hanging="403"/>
         <w:jc w:val="left"/>
         <w:keepNext w:val="0"/>
         <w:keepLines w:val="0"/>
@@ -12705,6 +12793,8 @@
     <w:p>
       <w:pPr>
         <w:pStyle w:val="ReferenceEntry"/>
+        <w:spacing w:after="60"/>
+        <w:ind w:left="403" w:hanging="403"/>
         <w:jc w:val="left"/>
         <w:keepNext w:val="0"/>
         <w:keepLines w:val="0"/>
@@ -12737,6 +12827,8 @@
     <w:p>
       <w:pPr>
         <w:pStyle w:val="ReferenceEntry"/>
+        <w:spacing w:after="60"/>
+        <w:ind w:left="403" w:hanging="403"/>
         <w:jc w:val="left"/>
         <w:keepNext w:val="0"/>
         <w:keepLines w:val="0"/>
@@ -12769,6 +12861,8 @@
     <w:p>
       <w:pPr>
         <w:pStyle w:val="ReferenceEntry"/>
+        <w:spacing w:after="60"/>
+        <w:ind w:left="403" w:hanging="403"/>
         <w:jc w:val="left"/>
         <w:keepNext w:val="0"/>
         <w:keepLines w:val="0"/>
@@ -12801,6 +12895,8 @@
     <w:p>
       <w:pPr>
         <w:pStyle w:val="ReferenceEntry"/>
+        <w:spacing w:after="60"/>
+        <w:ind w:left="403" w:hanging="403"/>
         <w:jc w:val="left"/>
         <w:keepNext w:val="0"/>
         <w:keepLines w:val="0"/>
@@ -12833,6 +12929,8 @@
     <w:p>
       <w:pPr>
         <w:pStyle w:val="ReferenceEntry"/>
+        <w:spacing w:after="60"/>
+        <w:ind w:left="403" w:hanging="403"/>
         <w:jc w:val="left"/>
         <w:keepNext w:val="0"/>
         <w:keepLines w:val="0"/>
@@ -12865,6 +12963,8 @@
     <w:p>
       <w:pPr>
         <w:pStyle w:val="ReferenceEntry"/>
+        <w:spacing w:after="60"/>
+        <w:ind w:left="403" w:hanging="403"/>
         <w:jc w:val="left"/>
         <w:keepNext w:val="0"/>
         <w:keepLines w:val="0"/>
@@ -25470,7 +25570,7 @@
       <w:spacing w:after="120" w:before="240"/>
     </w:pPr>
     <w:rPr>
-      <w:rFonts w:ascii="Times New Roman" w:hAnsi="Times New Roman"/>
+      <w:rFonts w:ascii="Georgia" w:hAnsi="Georgia"/>
       <w:b/>
       <w:i w:val="0"/>
       <w:sz w:val="24"/>
@@ -25481,9 +25581,9 @@
     <w:basedOn w:val="BodyText"/>
     <w:pPr>
       <w:keepNext w:val="0"/>
-      <w:spacing w:after="40" w:before="0" w:line="240" w:lineRule="auto"/>
-      <w:ind w:left="0" w:firstLine="0"/>
-      <w:jc w:val="both"/>
+      <w:spacing w:after="60" w:before="0" w:line="252" w:lineRule="auto"/>
+      <w:ind w:left="403" w:hanging="403"/>
+      <w:jc w:val="left"/>
     </w:pPr>
     <w:rPr>
       <w:rFonts w:ascii="Georgia" w:hAnsi="Georgia"/>

</xml_diff>

<commit_message>
Regenerate DOCX: 2-col abstract separation + table margins (line-height carrier)
Co-Authored-By: Claude Opus 4.8 <noreply@anthropic.com>
</commit_message>
<xml_diff>
--- a/docs/coreasoning-2col.docx
+++ b/docs/coreasoning-2col.docx
@@ -243,7 +243,7 @@
     </w:p>
     <w:p>
       <w:pPr>
-        <w:spacing w:before="120" w:after="460" w:line="120" w:lineRule="exact"/>
+        <w:spacing w:before="0" w:after="0" w:line="520" w:lineRule="exact"/>
         <w:rPr>
           <w:sz w:val="12"/>
           <w:szCs w:val="12"/>
@@ -630,7 +630,7 @@
     </w:p>
     <w:p>
       <w:pPr>
-        <w:spacing w:before="240" w:after="240" w:line="120" w:lineRule="exact"/>
+        <w:spacing w:before="0" w:after="0" w:line="300" w:lineRule="exact"/>
         <w:rPr>
           <w:sz w:val="12"/>
           <w:szCs w:val="12"/>
@@ -662,7 +662,7 @@
               <a:graphicData uri="http://schemas.openxmlformats.org/drawingml/2006/picture">
                 <pic:pic>
                   <pic:nvPicPr>
-                    <pic:cNvPr descr="C:/Users/apart/AppData/Local/Temp/html2doc_svg_lNh4Nc/svg_0.png" id="12" name="Picture"/>
+                    <pic:cNvPr descr="C:/Users/apart/AppData/Local/Temp/html2doc_svg_Ihlcji/svg_0.png" id="12" name="Picture"/>
                     <pic:cNvPicPr>
                       <a:picLocks noChangeArrowheads="1" noChangeAspect="1"/>
                     </pic:cNvPicPr>
@@ -697,7 +697,7 @@
     </w:p>
     <w:p>
       <w:pPr>
-        <w:spacing w:before="240" w:after="240" w:line="120" w:lineRule="exact"/>
+        <w:spacing w:before="0" w:after="0" w:line="300" w:lineRule="exact"/>
         <w:rPr>
           <w:sz w:val="12"/>
           <w:szCs w:val="12"/>
@@ -1743,7 +1743,7 @@
     </w:p>
     <w:p>
       <w:pPr>
-        <w:spacing w:before="240" w:after="240" w:line="120" w:lineRule="exact"/>
+        <w:spacing w:before="0" w:after="0" w:line="300" w:lineRule="exact"/>
         <w:rPr>
           <w:sz w:val="12"/>
           <w:szCs w:val="12"/>
@@ -1775,7 +1775,7 @@
               <a:graphicData uri="http://schemas.openxmlformats.org/drawingml/2006/picture">
                 <pic:pic>
                   <pic:nvPicPr>
-                    <pic:cNvPr descr="C:/Users/apart/AppData/Local/Temp/html2doc_svg_lNh4Nc/svg_1.png" id="17" name="Picture"/>
+                    <pic:cNvPr descr="C:/Users/apart/AppData/Local/Temp/html2doc_svg_Ihlcji/svg_1.png" id="17" name="Picture"/>
                     <pic:cNvPicPr>
                       <a:picLocks noChangeArrowheads="1" noChangeAspect="1"/>
                     </pic:cNvPicPr>
@@ -1841,7 +1841,7 @@
     </w:p>
     <w:p>
       <w:pPr>
-        <w:spacing w:before="240" w:after="240" w:line="120" w:lineRule="exact"/>
+        <w:spacing w:before="0" w:after="0" w:line="300" w:lineRule="exact"/>
         <w:rPr>
           <w:sz w:val="12"/>
           <w:szCs w:val="12"/>
@@ -3355,7 +3355,7 @@
     </w:p>
     <w:p>
       <w:pPr>
-        <w:spacing w:before="240" w:after="240" w:line="120" w:lineRule="exact"/>
+        <w:spacing w:before="0" w:after="0" w:line="300" w:lineRule="exact"/>
         <w:rPr>
           <w:sz w:val="12"/>
           <w:szCs w:val="12"/>
@@ -4144,7 +4144,7 @@
     </w:tbl>
     <w:p>
       <w:pPr>
-        <w:spacing w:before="240" w:after="240" w:line="120" w:lineRule="exact"/>
+        <w:spacing w:before="0" w:after="0" w:line="300" w:lineRule="exact"/>
         <w:rPr>
           <w:sz w:val="12"/>
           <w:szCs w:val="12"/>
@@ -5909,7 +5909,7 @@
     </w:p>
     <w:p>
       <w:pPr>
-        <w:spacing w:before="240" w:after="240" w:line="120" w:lineRule="exact"/>
+        <w:spacing w:before="0" w:after="0" w:line="300" w:lineRule="exact"/>
         <w:rPr>
           <w:sz w:val="12"/>
           <w:szCs w:val="12"/>
@@ -6442,7 +6442,7 @@
     </w:tbl>
     <w:p>
       <w:pPr>
-        <w:spacing w:before="240" w:after="240" w:line="120" w:lineRule="exact"/>
+        <w:spacing w:before="0" w:after="0" w:line="300" w:lineRule="exact"/>
         <w:rPr>
           <w:sz w:val="12"/>
           <w:szCs w:val="12"/>
@@ -7051,7 +7051,7 @@
     </w:p>
     <w:p>
       <w:pPr>
-        <w:spacing w:before="240" w:after="240" w:line="120" w:lineRule="exact"/>
+        <w:spacing w:before="0" w:after="0" w:line="300" w:lineRule="exact"/>
         <w:rPr>
           <w:sz w:val="12"/>
           <w:szCs w:val="12"/>
@@ -7369,7 +7369,7 @@
     </w:tbl>
     <w:p>
       <w:pPr>
-        <w:spacing w:before="240" w:after="240" w:line="120" w:lineRule="exact"/>
+        <w:spacing w:before="0" w:after="0" w:line="300" w:lineRule="exact"/>
         <w:rPr>
           <w:sz w:val="12"/>
           <w:szCs w:val="12"/>
@@ -7386,7 +7386,7 @@
     <w:p/>
     <w:p>
       <w:pPr>
-        <w:spacing w:before="240" w:after="240" w:line="120" w:lineRule="exact"/>
+        <w:spacing w:before="0" w:after="0" w:line="300" w:lineRule="exact"/>
         <w:rPr>
           <w:sz w:val="12"/>
           <w:szCs w:val="12"/>
@@ -7947,7 +7947,7 @@
     </w:tbl>
     <w:p>
       <w:pPr>
-        <w:spacing w:before="240" w:after="240" w:line="120" w:lineRule="exact"/>
+        <w:spacing w:before="0" w:after="0" w:line="300" w:lineRule="exact"/>
         <w:rPr>
           <w:sz w:val="12"/>
           <w:szCs w:val="12"/>
@@ -8162,7 +8162,7 @@
     </w:p>
     <w:p>
       <w:pPr>
-        <w:spacing w:before="240" w:after="240" w:line="120" w:lineRule="exact"/>
+        <w:spacing w:before="0" w:after="0" w:line="300" w:lineRule="exact"/>
         <w:rPr>
           <w:sz w:val="12"/>
           <w:szCs w:val="12"/>
@@ -8291,7 +8291,7 @@
     </w:p>
     <w:p>
       <w:pPr>
-        <w:spacing w:before="240" w:after="240" w:line="120" w:lineRule="exact"/>
+        <w:spacing w:before="0" w:after="0" w:line="300" w:lineRule="exact"/>
         <w:rPr>
           <w:sz w:val="12"/>
           <w:szCs w:val="12"/>
@@ -9656,7 +9656,7 @@
     </w:p>
     <w:p>
       <w:pPr>
-        <w:spacing w:before="240" w:after="240" w:line="120" w:lineRule="exact"/>
+        <w:spacing w:before="0" w:after="0" w:line="300" w:lineRule="exact"/>
         <w:rPr>
           <w:sz w:val="12"/>
           <w:szCs w:val="12"/>
@@ -9719,7 +9719,7 @@
               <a:graphicData uri="http://schemas.openxmlformats.org/drawingml/2006/picture">
                 <pic:pic>
                   <pic:nvPicPr>
-                    <pic:cNvPr descr="C:/Users/apart/AppData/Local/Temp/html2doc_svg_lNh4Nc/svg_2.png" id="46" name="Picture"/>
+                    <pic:cNvPr descr="C:/Users/apart/AppData/Local/Temp/html2doc_svg_Ihlcji/svg_2.png" id="46" name="Picture"/>
                     <pic:cNvPicPr>
                       <a:picLocks noChangeArrowheads="1" noChangeAspect="1"/>
                     </pic:cNvPicPr>
@@ -9785,7 +9785,7 @@
     </w:p>
     <w:p>
       <w:pPr>
-        <w:spacing w:before="240" w:after="240" w:line="120" w:lineRule="exact"/>
+        <w:spacing w:before="0" w:after="0" w:line="300" w:lineRule="exact"/>
         <w:rPr>
           <w:sz w:val="12"/>
           <w:szCs w:val="12"/>

</xml_diff>

<commit_message>
Regenerate DOCX: 2-col Figure 1 now renders (parenthetical-caption float fix)
Co-Authored-By: Claude Opus 4.8 <noreply@anthropic.com>
</commit_message>
<xml_diff>
--- a/docs/coreasoning-2col.docx
+++ b/docs/coreasoning-2col.docx
@@ -662,7 +662,7 @@
               <a:graphicData uri="http://schemas.openxmlformats.org/drawingml/2006/picture">
                 <pic:pic>
                   <pic:nvPicPr>
-                    <pic:cNvPr descr="C:/Users/apart/AppData/Local/Temp/html2doc_svg_Ihlcji/svg_0.png" id="12" name="Picture"/>
+                    <pic:cNvPr descr="C:/Users/apart/AppData/Local/Temp/html2doc_svg_7WxKQ8/svg_0.png" id="12" name="Picture"/>
                     <pic:cNvPicPr>
                       <a:picLocks noChangeArrowheads="1" noChangeAspect="1"/>
                     </pic:cNvPicPr>
@@ -697,6 +697,37 @@
     </w:p>
     <w:p>
       <w:pPr>
+        <w:pStyle w:val="ImageCaption"/>
+        <w:spacing w:before="80" w:after="120" w:line="240" w:lineRule="auto"/>
+        <w:jc w:val="center"/>
+        <w:keepNext w:val="0"/>
+        <w:keepLines/>
+        <w:widowControl w:val="1"/>
+      </w:pPr>
+      <w:r>
+        <w:rPr>
+          <w:b/>
+          <w:i/>
+        </w:rPr>
+        <w:t>Figure 1 (schematic).</w:t>
+      </w:r>
+      <w:r>
+        <w:rPr>
+          <w:b w:val="0"/>
+          <w:i/>
+        </w:rPr>
+        <w:t xml:space="preserve"> </w:t>
+      </w:r>
+      <w:r>
+        <w:rPr>
+          <w:b w:val="0"/>
+          <w:i/>
+        </w:rPr>
+        <w:t>As models absorb more of the execution, the part of a task a competent person must still own shifts from doing the work toward framing, judging, and steering it; the axes are conceptual, not quantitative. CoReasoning is a decomposition and assessment of that shifting contribution.</w:t>
+      </w:r>
+    </w:p>
+    <w:p>
+      <w:pPr>
         <w:spacing w:before="0" w:after="0" w:line="300" w:lineRule="exact"/>
         <w:rPr>
           <w:sz w:val="12"/>
@@ -710,64 +741,6 @@
           <w:docGrid w:linePitch="360"/>
         </w:sectPr>
       </w:pPr>
-    </w:p>
-    <w:p>
-      <w:pPr>
-        <w:pStyle w:val="BodyText"/>
-        <w:jc w:val="both"/>
-        <w:keepNext w:val="0"/>
-        <w:keepLines w:val="0"/>
-        <w:widowControl w:val="1"/>
-      </w:pPr>
-      <w:r>
-        <w:rPr>
-          <w:i/>
-          <w:iCs/>
-        </w:rPr>
-        <w:t xml:space="preserve">Figure 1 (schematic). As models absorb more of the execution, the part of a task a competent person</w:t>
-      </w:r>
-      <w:r>
-        <w:rPr>
-          <w:i/>
-          <w:iCs/>
-        </w:rPr>
-        <w:t xml:space="preserve"> </w:t>
-      </w:r>
-      <w:r>
-        <w:rPr>
-          <w:i/>
-          <w:iCs/>
-        </w:rPr>
-        <w:t xml:space="preserve">must still own shifts from doing the work toward framing, judging, and steering it; the axes are</w:t>
-      </w:r>
-      <w:r>
-        <w:rPr>
-          <w:i/>
-          <w:iCs/>
-        </w:rPr>
-        <w:t xml:space="preserve"> </w:t>
-      </w:r>
-      <w:r>
-        <w:rPr>
-          <w:i/>
-          <w:iCs/>
-        </w:rPr>
-        <w:t xml:space="preserve">conceptual, not quantitative. CoReasoning is a decomposition and assessment of that shifting</w:t>
-      </w:r>
-      <w:r>
-        <w:rPr>
-          <w:i/>
-          <w:iCs/>
-        </w:rPr>
-        <w:t xml:space="preserve"> </w:t>
-      </w:r>
-      <w:r>
-        <w:rPr>
-          <w:i/>
-          <w:iCs/>
-        </w:rPr>
-        <w:t xml:space="preserve">contribution.</w:t>
-      </w:r>
     </w:p>
     <w:p>
       <w:pPr>
@@ -1775,7 +1748,7 @@
               <a:graphicData uri="http://schemas.openxmlformats.org/drawingml/2006/picture">
                 <pic:pic>
                   <pic:nvPicPr>
-                    <pic:cNvPr descr="C:/Users/apart/AppData/Local/Temp/html2doc_svg_Ihlcji/svg_1.png" id="17" name="Picture"/>
+                    <pic:cNvPr descr="C:/Users/apart/AppData/Local/Temp/html2doc_svg_7WxKQ8/svg_1.png" id="17" name="Picture"/>
                     <pic:cNvPicPr>
                       <a:picLocks noChangeArrowheads="1" noChangeAspect="1"/>
                     </pic:cNvPicPr>
@@ -9719,7 +9692,7 @@
               <a:graphicData uri="http://schemas.openxmlformats.org/drawingml/2006/picture">
                 <pic:pic>
                   <pic:nvPicPr>
-                    <pic:cNvPr descr="C:/Users/apart/AppData/Local/Temp/html2doc_svg_Ihlcji/svg_2.png" id="46" name="Picture"/>
+                    <pic:cNvPr descr="C:/Users/apart/AppData/Local/Temp/html2doc_svg_7WxKQ8/svg_2.png" id="46" name="Picture"/>
                     <pic:cNvPicPr>
                       <a:picLocks noChangeArrowheads="1" noChangeAspect="1"/>
                     </pic:cNvPicPr>

</xml_diff>

<commit_message>
Regenerate DOCX: wider 2-col abstract->body gap (right column clears)
Co-Authored-By: Claude Opus 4.8 <noreply@anthropic.com>
</commit_message>
<xml_diff>
--- a/docs/coreasoning-2col.docx
+++ b/docs/coreasoning-2col.docx
@@ -243,7 +243,7 @@
     </w:p>
     <w:p>
       <w:pPr>
-        <w:spacing w:before="0" w:after="0" w:line="520" w:lineRule="exact"/>
+        <w:spacing w:before="0" w:after="0" w:line="760" w:lineRule="exact"/>
         <w:rPr>
           <w:sz w:val="12"/>
           <w:szCs w:val="12"/>
@@ -662,7 +662,7 @@
               <a:graphicData uri="http://schemas.openxmlformats.org/drawingml/2006/picture">
                 <pic:pic>
                   <pic:nvPicPr>
-                    <pic:cNvPr descr="C:/Users/apart/AppData/Local/Temp/html2doc_svg_7WxKQ8/svg_0.png" id="12" name="Picture"/>
+                    <pic:cNvPr descr="C:/Users/apart/AppData/Local/Temp/html2doc_svg_43jpok/svg_0.png" id="12" name="Picture"/>
                     <pic:cNvPicPr>
                       <a:picLocks noChangeArrowheads="1" noChangeAspect="1"/>
                     </pic:cNvPicPr>
@@ -1748,7 +1748,7 @@
               <a:graphicData uri="http://schemas.openxmlformats.org/drawingml/2006/picture">
                 <pic:pic>
                   <pic:nvPicPr>
-                    <pic:cNvPr descr="C:/Users/apart/AppData/Local/Temp/html2doc_svg_7WxKQ8/svg_1.png" id="17" name="Picture"/>
+                    <pic:cNvPr descr="C:/Users/apart/AppData/Local/Temp/html2doc_svg_43jpok/svg_1.png" id="17" name="Picture"/>
                     <pic:cNvPicPr>
                       <a:picLocks noChangeArrowheads="1" noChangeAspect="1"/>
                     </pic:cNvPicPr>
@@ -9692,7 +9692,7 @@
               <a:graphicData uri="http://schemas.openxmlformats.org/drawingml/2006/picture">
                 <pic:pic>
                   <pic:nvPicPr>
-                    <pic:cNvPr descr="C:/Users/apart/AppData/Local/Temp/html2doc_svg_7WxKQ8/svg_2.png" id="46" name="Picture"/>
+                    <pic:cNvPr descr="C:/Users/apart/AppData/Local/Temp/html2doc_svg_43jpok/svg_2.png" id="46" name="Picture"/>
                     <pic:cNvPicPr>
                       <a:picLocks noChangeArrowheads="1" noChangeAspect="1"/>
                     </pic:cNvPicPr>

</xml_diff>

<commit_message>
Regenerate DOCX: tables span + centered captions, in-column figs fit, float margins
Co-Authored-By: Claude Opus 4.8 <noreply@anthropic.com>
</commit_message>
<xml_diff>
--- a/docs/coreasoning-2col.docx
+++ b/docs/coreasoning-2col.docx
@@ -630,7 +630,7 @@
     </w:p>
     <w:p>
       <w:pPr>
-        <w:spacing w:before="0" w:after="0" w:line="300" w:lineRule="exact"/>
+        <w:spacing w:before="0" w:after="0" w:line="440" w:lineRule="exact"/>
         <w:rPr>
           <w:sz w:val="12"/>
           <w:szCs w:val="12"/>
@@ -662,7 +662,7 @@
               <a:graphicData uri="http://schemas.openxmlformats.org/drawingml/2006/picture">
                 <pic:pic>
                   <pic:nvPicPr>
-                    <pic:cNvPr descr="C:/Users/apart/AppData/Local/Temp/html2doc_svg_43jpok/svg_0.png" id="12" name="Picture"/>
+                    <pic:cNvPr descr="C:/Users/apart/AppData/Local/Temp/html2doc_svg_gLmVV3/svg_0.png" id="12" name="Picture"/>
                     <pic:cNvPicPr>
                       <a:picLocks noChangeArrowheads="1" noChangeAspect="1"/>
                     </pic:cNvPicPr>
@@ -728,7 +728,7 @@
     </w:p>
     <w:p>
       <w:pPr>
-        <w:spacing w:before="0" w:after="0" w:line="300" w:lineRule="exact"/>
+        <w:spacing w:before="0" w:after="0" w:line="440" w:lineRule="exact"/>
         <w:rPr>
           <w:sz w:val="12"/>
           <w:szCs w:val="12"/>
@@ -1716,7 +1716,7 @@
     </w:p>
     <w:p>
       <w:pPr>
-        <w:spacing w:before="0" w:after="0" w:line="300" w:lineRule="exact"/>
+        <w:spacing w:before="0" w:after="0" w:line="440" w:lineRule="exact"/>
         <w:rPr>
           <w:sz w:val="12"/>
           <w:szCs w:val="12"/>
@@ -1748,7 +1748,7 @@
               <a:graphicData uri="http://schemas.openxmlformats.org/drawingml/2006/picture">
                 <pic:pic>
                   <pic:nvPicPr>
-                    <pic:cNvPr descr="C:/Users/apart/AppData/Local/Temp/html2doc_svg_43jpok/svg_1.png" id="17" name="Picture"/>
+                    <pic:cNvPr descr="C:/Users/apart/AppData/Local/Temp/html2doc_svg_gLmVV3/svg_1.png" id="17" name="Picture"/>
                     <pic:cNvPicPr>
                       <a:picLocks noChangeArrowheads="1" noChangeAspect="1"/>
                     </pic:cNvPicPr>
@@ -1814,7 +1814,7 @@
     </w:p>
     <w:p>
       <w:pPr>
-        <w:spacing w:before="0" w:after="0" w:line="300" w:lineRule="exact"/>
+        <w:spacing w:before="0" w:after="0" w:line="440" w:lineRule="exact"/>
         <w:rPr>
           <w:sz w:val="12"/>
           <w:szCs w:val="12"/>
@@ -3328,7 +3328,7 @@
     </w:p>
     <w:p>
       <w:pPr>
-        <w:spacing w:before="0" w:after="0" w:line="300" w:lineRule="exact"/>
+        <w:spacing w:before="0" w:after="0" w:line="440" w:lineRule="exact"/>
         <w:rPr>
           <w:sz w:val="12"/>
           <w:szCs w:val="12"/>
@@ -4117,7 +4117,7 @@
     </w:tbl>
     <w:p>
       <w:pPr>
-        <w:spacing w:before="0" w:after="0" w:line="300" w:lineRule="exact"/>
+        <w:spacing w:before="0" w:after="0" w:line="440" w:lineRule="exact"/>
         <w:rPr>
           <w:sz w:val="12"/>
           <w:szCs w:val="12"/>
@@ -5882,7 +5882,7 @@
     </w:p>
     <w:p>
       <w:pPr>
-        <w:spacing w:before="0" w:after="0" w:line="300" w:lineRule="exact"/>
+        <w:spacing w:before="0" w:after="0" w:line="440" w:lineRule="exact"/>
         <w:rPr>
           <w:sz w:val="12"/>
           <w:szCs w:val="12"/>
@@ -6415,7 +6415,7 @@
     </w:tbl>
     <w:p>
       <w:pPr>
-        <w:spacing w:before="0" w:after="0" w:line="300" w:lineRule="exact"/>
+        <w:spacing w:before="0" w:after="0" w:line="440" w:lineRule="exact"/>
         <w:rPr>
           <w:sz w:val="12"/>
           <w:szCs w:val="12"/>
@@ -7024,7 +7024,7 @@
     </w:p>
     <w:p>
       <w:pPr>
-        <w:spacing w:before="0" w:after="0" w:line="300" w:lineRule="exact"/>
+        <w:spacing w:before="0" w:after="0" w:line="440" w:lineRule="exact"/>
         <w:rPr>
           <w:sz w:val="12"/>
           <w:szCs w:val="12"/>
@@ -7342,7 +7342,7 @@
     </w:tbl>
     <w:p>
       <w:pPr>
-        <w:spacing w:before="0" w:after="0" w:line="300" w:lineRule="exact"/>
+        <w:spacing w:before="0" w:after="0" w:line="440" w:lineRule="exact"/>
         <w:rPr>
           <w:sz w:val="12"/>
           <w:szCs w:val="12"/>
@@ -7359,7 +7359,7 @@
     <w:p/>
     <w:p>
       <w:pPr>
-        <w:spacing w:before="0" w:after="0" w:line="300" w:lineRule="exact"/>
+        <w:spacing w:before="0" w:after="0" w:line="440" w:lineRule="exact"/>
         <w:rPr>
           <w:sz w:val="12"/>
           <w:szCs w:val="12"/>
@@ -7920,7 +7920,7 @@
     </w:tbl>
     <w:p>
       <w:pPr>
-        <w:spacing w:before="0" w:after="0" w:line="300" w:lineRule="exact"/>
+        <w:spacing w:before="0" w:after="0" w:line="440" w:lineRule="exact"/>
         <w:rPr>
           <w:sz w:val="12"/>
           <w:szCs w:val="12"/>
@@ -8093,7 +8093,7 @@
       <w:r>
         <w:drawing>
           <wp:inline>
-            <wp:extent cx="3108960" cy="2611526"/>
+            <wp:extent cx="2984601" cy="2507064"/>
             <wp:effectExtent b="0" l="0" r="0" t="0"/>
             <wp:docPr descr="Figure 3. Own-competence effects dominate cross-competence effects on every skill's grade." title="" id="28" name="Picture"/>
             <a:graphic>
@@ -8114,7 +8114,7 @@
                   <pic:spPr bwMode="auto">
                     <a:xfrm>
                       <a:off x="0" y="0"/>
-                      <a:ext cx="3108960" cy="2611526"/>
+                      <a:ext cx="2984601" cy="2507064"/>
                     </a:xfrm>
                     <a:prstGeom prst="rect">
                       <a:avLst/>
@@ -8135,7 +8135,7 @@
     </w:p>
     <w:p>
       <w:pPr>
-        <w:spacing w:before="0" w:after="0" w:line="300" w:lineRule="exact"/>
+        <w:spacing w:before="0" w:after="0" w:line="440" w:lineRule="exact"/>
         <w:rPr>
           <w:sz w:val="12"/>
           <w:szCs w:val="12"/>
@@ -8264,7 +8264,7 @@
     </w:p>
     <w:p>
       <w:pPr>
-        <w:spacing w:before="0" w:after="0" w:line="300" w:lineRule="exact"/>
+        <w:spacing w:before="0" w:after="0" w:line="440" w:lineRule="exact"/>
         <w:rPr>
           <w:sz w:val="12"/>
           <w:szCs w:val="12"/>
@@ -9463,7 +9463,7 @@
       <w:r>
         <w:drawing>
           <wp:inline>
-            <wp:extent cx="3108960" cy="2503554"/>
+            <wp:extent cx="2984601" cy="2403411"/>
             <wp:effectExtent b="0" l="0" r="0" t="0"/>
             <wp:docPr descr="Figure A1. A CoReasoning Lab challenge run." title="" id="39" name="Picture"/>
             <a:graphic>
@@ -9484,7 +9484,7 @@
                   <pic:spPr bwMode="auto">
                     <a:xfrm>
                       <a:off x="0" y="0"/>
-                      <a:ext cx="3108960" cy="2503554"/>
+                      <a:ext cx="2984601" cy="2403411"/>
                     </a:xfrm>
                     <a:prstGeom prst="rect">
                       <a:avLst/>
@@ -9587,7 +9587,7 @@
       <w:r>
         <w:drawing>
           <wp:inline>
-            <wp:extent cx="3108960" cy="2308167"/>
+            <wp:extent cx="2984601" cy="2215840"/>
             <wp:effectExtent b="0" l="0" r="0" t="0"/>
             <wp:docPr descr="Figure A2. CoReasoning Lab instructor course analytics." title="" id="42" name="Picture"/>
             <a:graphic>
@@ -9608,7 +9608,7 @@
                   <pic:spPr bwMode="auto">
                     <a:xfrm>
                       <a:off x="0" y="0"/>
-                      <a:ext cx="3108960" cy="2308167"/>
+                      <a:ext cx="2984601" cy="2215840"/>
                     </a:xfrm>
                     <a:prstGeom prst="rect">
                       <a:avLst/>
@@ -9629,7 +9629,7 @@
     </w:p>
     <w:p>
       <w:pPr>
-        <w:spacing w:before="0" w:after="0" w:line="300" w:lineRule="exact"/>
+        <w:spacing w:before="0" w:after="0" w:line="440" w:lineRule="exact"/>
         <w:rPr>
           <w:sz w:val="12"/>
           <w:szCs w:val="12"/>
@@ -9692,7 +9692,7 @@
               <a:graphicData uri="http://schemas.openxmlformats.org/drawingml/2006/picture">
                 <pic:pic>
                   <pic:nvPicPr>
-                    <pic:cNvPr descr="C:/Users/apart/AppData/Local/Temp/html2doc_svg_43jpok/svg_2.png" id="46" name="Picture"/>
+                    <pic:cNvPr descr="C:/Users/apart/AppData/Local/Temp/html2doc_svg_gLmVV3/svg_2.png" id="46" name="Picture"/>
                     <pic:cNvPicPr>
                       <a:picLocks noChangeArrowheads="1" noChangeAspect="1"/>
                     </pic:cNvPicPr>
@@ -9758,7 +9758,7 @@
     </w:p>
     <w:p>
       <w:pPr>
-        <w:spacing w:before="0" w:after="0" w:line="300" w:lineRule="exact"/>
+        <w:spacing w:before="0" w:after="0" w:line="440" w:lineRule="exact"/>
         <w:rPr>
           <w:sz w:val="12"/>
           <w:szCs w:val="12"/>
@@ -10197,6 +10197,22 @@
       <w:r>
         <w:t xml:space="preserve">specify an ill-defined task, judge a fallible solution, and steer it toward a better one.</w:t>
       </w:r>
+    </w:p>
+    <w:p>
+      <w:pPr>
+        <w:spacing w:before="0" w:after="0" w:line="440" w:lineRule="exact"/>
+        <w:rPr>
+          <w:sz w:val="12"/>
+          <w:szCs w:val="12"/>
+        </w:rPr>
+        <w:sectPr>
+          <w:type w:val="continuous"/>
+          <w:pgSz w:h="15840" w:w="12240"/>
+          <w:pgMar w:bottom="1080" w:footer="720" w:gutter="0" w:header="720" w:left="1080" w:right="1080" w:top="1080"/>
+          <w:cols w:num="2" w:space="288" w:equalWidth="1"/>
+          <w:docGrid w:linePitch="360"/>
+        </w:sectPr>
+      </w:pPr>
     </w:p>
     <w:p>
       <w:pPr>
@@ -10539,8 +10555,23 @@
     </w:tbl>
     <w:p>
       <w:pPr>
+        <w:spacing w:before="0" w:after="0" w:line="440" w:lineRule="exact"/>
+        <w:rPr>
+          <w:sz w:val="12"/>
+          <w:szCs w:val="12"/>
+        </w:rPr>
+        <w:sectPr>
+          <w:type w:val="continuous"/>
+          <w:pgSz w:h="15840" w:w="12240"/>
+          <w:pgMar w:bottom="1080" w:footer="720" w:gutter="0" w:header="720" w:left="1080" w:right="1080" w:top="1080"/>
+          <w:cols w:num="1" w:space="288"/>
+          <w:docGrid w:linePitch="360"/>
+        </w:sectPr>
+      </w:pPr>
+    </w:p>
+    <w:p>
+      <w:pPr>
         <w:pStyle w:val="BodyText"/>
-        <w:spacing w:before="200"/>
         <w:jc w:val="both"/>
         <w:keepNext w:val="0"/>
         <w:keepLines w:val="0"/>

</xml_diff>

<commit_message>
Regenerate DOCX: spacer-carrier section breaks (abstract gap + table margins render)
Co-Authored-By: Claude Opus 4.8 <noreply@anthropic.com>
</commit_message>
<xml_diff>
--- a/docs/coreasoning-2col.docx
+++ b/docs/coreasoning-2col.docx
@@ -245,8 +245,17 @@
       <w:pPr>
         <w:spacing w:before="0" w:after="0" w:line="760" w:lineRule="exact"/>
         <w:rPr>
-          <w:sz w:val="12"/>
-          <w:szCs w:val="12"/>
+          <w:sz w:val="2"/>
+          <w:szCs w:val="2"/>
+        </w:rPr>
+      </w:pPr>
+    </w:p>
+    <w:p>
+      <w:pPr>
+        <w:spacing w:before="0" w:after="0" w:line="20" w:lineRule="exact"/>
+        <w:rPr>
+          <w:sz w:val="2"/>
+          <w:szCs w:val="2"/>
         </w:rPr>
         <w:sectPr>
           <w:footerReference w:type="default" r:id="rId9"/>
@@ -632,8 +641,17 @@
       <w:pPr>
         <w:spacing w:before="0" w:after="0" w:line="440" w:lineRule="exact"/>
         <w:rPr>
-          <w:sz w:val="12"/>
-          <w:szCs w:val="12"/>
+          <w:sz w:val="2"/>
+          <w:szCs w:val="2"/>
+        </w:rPr>
+      </w:pPr>
+    </w:p>
+    <w:p>
+      <w:pPr>
+        <w:spacing w:before="0" w:after="0" w:line="20" w:lineRule="exact"/>
+        <w:rPr>
+          <w:sz w:val="2"/>
+          <w:szCs w:val="2"/>
         </w:rPr>
         <w:sectPr>
           <w:type w:val="continuous"/>
@@ -662,7 +680,7 @@
               <a:graphicData uri="http://schemas.openxmlformats.org/drawingml/2006/picture">
                 <pic:pic>
                   <pic:nvPicPr>
-                    <pic:cNvPr descr="C:/Users/apart/AppData/Local/Temp/html2doc_svg_gLmVV3/svg_0.png" id="12" name="Picture"/>
+                    <pic:cNvPr descr="C:/Users/apart/AppData/Local/Temp/html2doc_svg_baqNz7/svg_0.png" id="12" name="Picture"/>
                     <pic:cNvPicPr>
                       <a:picLocks noChangeArrowheads="1" noChangeAspect="1"/>
                     </pic:cNvPicPr>
@@ -730,8 +748,17 @@
       <w:pPr>
         <w:spacing w:before="0" w:after="0" w:line="440" w:lineRule="exact"/>
         <w:rPr>
-          <w:sz w:val="12"/>
-          <w:szCs w:val="12"/>
+          <w:sz w:val="2"/>
+          <w:szCs w:val="2"/>
+        </w:rPr>
+      </w:pPr>
+    </w:p>
+    <w:p>
+      <w:pPr>
+        <w:spacing w:before="0" w:after="0" w:line="20" w:lineRule="exact"/>
+        <w:rPr>
+          <w:sz w:val="2"/>
+          <w:szCs w:val="2"/>
         </w:rPr>
         <w:sectPr>
           <w:type w:val="continuous"/>
@@ -1718,8 +1745,17 @@
       <w:pPr>
         <w:spacing w:before="0" w:after="0" w:line="440" w:lineRule="exact"/>
         <w:rPr>
-          <w:sz w:val="12"/>
-          <w:szCs w:val="12"/>
+          <w:sz w:val="2"/>
+          <w:szCs w:val="2"/>
+        </w:rPr>
+      </w:pPr>
+    </w:p>
+    <w:p>
+      <w:pPr>
+        <w:spacing w:before="0" w:after="0" w:line="20" w:lineRule="exact"/>
+        <w:rPr>
+          <w:sz w:val="2"/>
+          <w:szCs w:val="2"/>
         </w:rPr>
         <w:sectPr>
           <w:type w:val="continuous"/>
@@ -1748,7 +1784,7 @@
               <a:graphicData uri="http://schemas.openxmlformats.org/drawingml/2006/picture">
                 <pic:pic>
                   <pic:nvPicPr>
-                    <pic:cNvPr descr="C:/Users/apart/AppData/Local/Temp/html2doc_svg_gLmVV3/svg_1.png" id="17" name="Picture"/>
+                    <pic:cNvPr descr="C:/Users/apart/AppData/Local/Temp/html2doc_svg_baqNz7/svg_1.png" id="17" name="Picture"/>
                     <pic:cNvPicPr>
                       <a:picLocks noChangeArrowheads="1" noChangeAspect="1"/>
                     </pic:cNvPicPr>
@@ -1816,8 +1852,17 @@
       <w:pPr>
         <w:spacing w:before="0" w:after="0" w:line="440" w:lineRule="exact"/>
         <w:rPr>
-          <w:sz w:val="12"/>
-          <w:szCs w:val="12"/>
+          <w:sz w:val="2"/>
+          <w:szCs w:val="2"/>
+        </w:rPr>
+      </w:pPr>
+    </w:p>
+    <w:p>
+      <w:pPr>
+        <w:spacing w:before="0" w:after="0" w:line="20" w:lineRule="exact"/>
+        <w:rPr>
+          <w:sz w:val="2"/>
+          <w:szCs w:val="2"/>
         </w:rPr>
         <w:sectPr>
           <w:type w:val="continuous"/>
@@ -3330,8 +3375,17 @@
       <w:pPr>
         <w:spacing w:before="0" w:after="0" w:line="440" w:lineRule="exact"/>
         <w:rPr>
-          <w:sz w:val="12"/>
-          <w:szCs w:val="12"/>
+          <w:sz w:val="2"/>
+          <w:szCs w:val="2"/>
+        </w:rPr>
+      </w:pPr>
+    </w:p>
+    <w:p>
+      <w:pPr>
+        <w:spacing w:before="0" w:after="0" w:line="20" w:lineRule="exact"/>
+        <w:rPr>
+          <w:sz w:val="2"/>
+          <w:szCs w:val="2"/>
         </w:rPr>
         <w:sectPr>
           <w:type w:val="continuous"/>
@@ -4119,8 +4173,17 @@
       <w:pPr>
         <w:spacing w:before="0" w:after="0" w:line="440" w:lineRule="exact"/>
         <w:rPr>
-          <w:sz w:val="12"/>
-          <w:szCs w:val="12"/>
+          <w:sz w:val="2"/>
+          <w:szCs w:val="2"/>
+        </w:rPr>
+      </w:pPr>
+    </w:p>
+    <w:p>
+      <w:pPr>
+        <w:spacing w:before="0" w:after="0" w:line="20" w:lineRule="exact"/>
+        <w:rPr>
+          <w:sz w:val="2"/>
+          <w:szCs w:val="2"/>
         </w:rPr>
         <w:sectPr>
           <w:type w:val="continuous"/>
@@ -5884,8 +5947,17 @@
       <w:pPr>
         <w:spacing w:before="0" w:after="0" w:line="440" w:lineRule="exact"/>
         <w:rPr>
-          <w:sz w:val="12"/>
-          <w:szCs w:val="12"/>
+          <w:sz w:val="2"/>
+          <w:szCs w:val="2"/>
+        </w:rPr>
+      </w:pPr>
+    </w:p>
+    <w:p>
+      <w:pPr>
+        <w:spacing w:before="0" w:after="0" w:line="20" w:lineRule="exact"/>
+        <w:rPr>
+          <w:sz w:val="2"/>
+          <w:szCs w:val="2"/>
         </w:rPr>
         <w:sectPr>
           <w:type w:val="continuous"/>
@@ -6417,8 +6489,17 @@
       <w:pPr>
         <w:spacing w:before="0" w:after="0" w:line="440" w:lineRule="exact"/>
         <w:rPr>
-          <w:sz w:val="12"/>
-          <w:szCs w:val="12"/>
+          <w:sz w:val="2"/>
+          <w:szCs w:val="2"/>
+        </w:rPr>
+      </w:pPr>
+    </w:p>
+    <w:p>
+      <w:pPr>
+        <w:spacing w:before="0" w:after="0" w:line="20" w:lineRule="exact"/>
+        <w:rPr>
+          <w:sz w:val="2"/>
+          <w:szCs w:val="2"/>
         </w:rPr>
         <w:sectPr>
           <w:type w:val="continuous"/>
@@ -7026,8 +7107,17 @@
       <w:pPr>
         <w:spacing w:before="0" w:after="0" w:line="440" w:lineRule="exact"/>
         <w:rPr>
-          <w:sz w:val="12"/>
-          <w:szCs w:val="12"/>
+          <w:sz w:val="2"/>
+          <w:szCs w:val="2"/>
+        </w:rPr>
+      </w:pPr>
+    </w:p>
+    <w:p>
+      <w:pPr>
+        <w:spacing w:before="0" w:after="0" w:line="20" w:lineRule="exact"/>
+        <w:rPr>
+          <w:sz w:val="2"/>
+          <w:szCs w:val="2"/>
         </w:rPr>
         <w:sectPr>
           <w:type w:val="continuous"/>
@@ -7344,8 +7434,17 @@
       <w:pPr>
         <w:spacing w:before="0" w:after="0" w:line="440" w:lineRule="exact"/>
         <w:rPr>
-          <w:sz w:val="12"/>
-          <w:szCs w:val="12"/>
+          <w:sz w:val="2"/>
+          <w:szCs w:val="2"/>
+        </w:rPr>
+      </w:pPr>
+    </w:p>
+    <w:p>
+      <w:pPr>
+        <w:spacing w:before="0" w:after="0" w:line="20" w:lineRule="exact"/>
+        <w:rPr>
+          <w:sz w:val="2"/>
+          <w:szCs w:val="2"/>
         </w:rPr>
         <w:sectPr>
           <w:type w:val="continuous"/>
@@ -7361,8 +7460,17 @@
       <w:pPr>
         <w:spacing w:before="0" w:after="0" w:line="440" w:lineRule="exact"/>
         <w:rPr>
-          <w:sz w:val="12"/>
-          <w:szCs w:val="12"/>
+          <w:sz w:val="2"/>
+          <w:szCs w:val="2"/>
+        </w:rPr>
+      </w:pPr>
+    </w:p>
+    <w:p>
+      <w:pPr>
+        <w:spacing w:before="0" w:after="0" w:line="20" w:lineRule="exact"/>
+        <w:rPr>
+          <w:sz w:val="2"/>
+          <w:szCs w:val="2"/>
         </w:rPr>
         <w:sectPr>
           <w:type w:val="continuous"/>
@@ -7922,8 +8030,17 @@
       <w:pPr>
         <w:spacing w:before="0" w:after="0" w:line="440" w:lineRule="exact"/>
         <w:rPr>
-          <w:sz w:val="12"/>
-          <w:szCs w:val="12"/>
+          <w:sz w:val="2"/>
+          <w:szCs w:val="2"/>
+        </w:rPr>
+      </w:pPr>
+    </w:p>
+    <w:p>
+      <w:pPr>
+        <w:spacing w:before="0" w:after="0" w:line="20" w:lineRule="exact"/>
+        <w:rPr>
+          <w:sz w:val="2"/>
+          <w:szCs w:val="2"/>
         </w:rPr>
         <w:sectPr>
           <w:type w:val="continuous"/>
@@ -8137,8 +8254,17 @@
       <w:pPr>
         <w:spacing w:before="0" w:after="0" w:line="440" w:lineRule="exact"/>
         <w:rPr>
-          <w:sz w:val="12"/>
-          <w:szCs w:val="12"/>
+          <w:sz w:val="2"/>
+          <w:szCs w:val="2"/>
+        </w:rPr>
+      </w:pPr>
+    </w:p>
+    <w:p>
+      <w:pPr>
+        <w:spacing w:before="0" w:after="0" w:line="20" w:lineRule="exact"/>
+        <w:rPr>
+          <w:sz w:val="2"/>
+          <w:szCs w:val="2"/>
         </w:rPr>
         <w:sectPr>
           <w:type w:val="continuous"/>
@@ -8266,8 +8392,17 @@
       <w:pPr>
         <w:spacing w:before="0" w:after="0" w:line="440" w:lineRule="exact"/>
         <w:rPr>
-          <w:sz w:val="12"/>
-          <w:szCs w:val="12"/>
+          <w:sz w:val="2"/>
+          <w:szCs w:val="2"/>
+        </w:rPr>
+      </w:pPr>
+    </w:p>
+    <w:p>
+      <w:pPr>
+        <w:spacing w:before="0" w:after="0" w:line="20" w:lineRule="exact"/>
+        <w:rPr>
+          <w:sz w:val="2"/>
+          <w:szCs w:val="2"/>
         </w:rPr>
         <w:sectPr>
           <w:type w:val="continuous"/>
@@ -9631,8 +9766,17 @@
       <w:pPr>
         <w:spacing w:before="0" w:after="0" w:line="440" w:lineRule="exact"/>
         <w:rPr>
-          <w:sz w:val="12"/>
-          <w:szCs w:val="12"/>
+          <w:sz w:val="2"/>
+          <w:szCs w:val="2"/>
+        </w:rPr>
+      </w:pPr>
+    </w:p>
+    <w:p>
+      <w:pPr>
+        <w:spacing w:before="0" w:after="0" w:line="20" w:lineRule="exact"/>
+        <w:rPr>
+          <w:sz w:val="2"/>
+          <w:szCs w:val="2"/>
         </w:rPr>
         <w:sectPr>
           <w:type w:val="continuous"/>
@@ -9692,7 +9836,7 @@
               <a:graphicData uri="http://schemas.openxmlformats.org/drawingml/2006/picture">
                 <pic:pic>
                   <pic:nvPicPr>
-                    <pic:cNvPr descr="C:/Users/apart/AppData/Local/Temp/html2doc_svg_gLmVV3/svg_2.png" id="46" name="Picture"/>
+                    <pic:cNvPr descr="C:/Users/apart/AppData/Local/Temp/html2doc_svg_baqNz7/svg_2.png" id="46" name="Picture"/>
                     <pic:cNvPicPr>
                       <a:picLocks noChangeArrowheads="1" noChangeAspect="1"/>
                     </pic:cNvPicPr>
@@ -9760,8 +9904,17 @@
       <w:pPr>
         <w:spacing w:before="0" w:after="0" w:line="440" w:lineRule="exact"/>
         <w:rPr>
-          <w:sz w:val="12"/>
-          <w:szCs w:val="12"/>
+          <w:sz w:val="2"/>
+          <w:szCs w:val="2"/>
+        </w:rPr>
+      </w:pPr>
+    </w:p>
+    <w:p>
+      <w:pPr>
+        <w:spacing w:before="0" w:after="0" w:line="20" w:lineRule="exact"/>
+        <w:rPr>
+          <w:sz w:val="2"/>
+          <w:szCs w:val="2"/>
         </w:rPr>
         <w:sectPr>
           <w:type w:val="continuous"/>
@@ -10202,8 +10355,17 @@
       <w:pPr>
         <w:spacing w:before="0" w:after="0" w:line="440" w:lineRule="exact"/>
         <w:rPr>
-          <w:sz w:val="12"/>
-          <w:szCs w:val="12"/>
+          <w:sz w:val="2"/>
+          <w:szCs w:val="2"/>
+        </w:rPr>
+      </w:pPr>
+    </w:p>
+    <w:p>
+      <w:pPr>
+        <w:spacing w:before="0" w:after="0" w:line="20" w:lineRule="exact"/>
+        <w:rPr>
+          <w:sz w:val="2"/>
+          <w:szCs w:val="2"/>
         </w:rPr>
         <w:sectPr>
           <w:type w:val="continuous"/>
@@ -10557,8 +10719,17 @@
       <w:pPr>
         <w:spacing w:before="0" w:after="0" w:line="440" w:lineRule="exact"/>
         <w:rPr>
-          <w:sz w:val="12"/>
-          <w:szCs w:val="12"/>
+          <w:sz w:val="2"/>
+          <w:szCs w:val="2"/>
+        </w:rPr>
+      </w:pPr>
+    </w:p>
+    <w:p>
+      <w:pPr>
+        <w:spacing w:before="0" w:after="0" w:line="20" w:lineRule="exact"/>
+        <w:rPr>
+          <w:sz w:val="2"/>
+          <w:szCs w:val="2"/>
         </w:rPr>
         <w:sectPr>
           <w:type w:val="continuous"/>

</xml_diff>

<commit_message>
Regenerate DOCX: in-column figure captions aligned + table cells vertical-centered
Co-Authored-By: Claude Opus 4.8 <noreply@anthropic.com>
</commit_message>
<xml_diff>
--- a/docs/coreasoning-2col.docx
+++ b/docs/coreasoning-2col.docx
@@ -680,7 +680,7 @@
               <a:graphicData uri="http://schemas.openxmlformats.org/drawingml/2006/picture">
                 <pic:pic>
                   <pic:nvPicPr>
-                    <pic:cNvPr descr="C:/Users/apart/AppData/Local/Temp/html2doc_svg_baqNz7/svg_0.png" id="12" name="Picture"/>
+                    <pic:cNvPr descr="C:/Users/apart/AppData/Local/Temp/html2doc_svg_aA3z3Y/svg_0.png" id="12" name="Picture"/>
                     <pic:cNvPicPr>
                       <a:picLocks noChangeArrowheads="1" noChangeAspect="1"/>
                     </pic:cNvPicPr>
@@ -1784,7 +1784,7 @@
               <a:graphicData uri="http://schemas.openxmlformats.org/drawingml/2006/picture">
                 <pic:pic>
                   <pic:nvPicPr>
-                    <pic:cNvPr descr="C:/Users/apart/AppData/Local/Temp/html2doc_svg_baqNz7/svg_1.png" id="17" name="Picture"/>
+                    <pic:cNvPr descr="C:/Users/apart/AppData/Local/Temp/html2doc_svg_aA3z3Y/svg_1.png" id="17" name="Picture"/>
                     <pic:cNvPicPr>
                       <a:picLocks noChangeArrowheads="1" noChangeAspect="1"/>
                     </pic:cNvPicPr>
@@ -3462,6 +3462,7 @@
               <w:top w:val="nil"/>
               <w:bottom w:val="single" w:sz="8" w:color="9FB0C2"/>
             </w:tcBorders>
+            <w:vAlign w:val="center"/>
           </w:tcPr>
           <w:p>
             <w:pPr>
@@ -3491,6 +3492,7 @@
               <w:top w:val="nil"/>
               <w:bottom w:val="single" w:sz="8" w:color="9FB0C2"/>
             </w:tcBorders>
+            <w:vAlign w:val="center"/>
           </w:tcPr>
           <w:p>
             <w:pPr>
@@ -3520,6 +3522,7 @@
               <w:top w:val="nil"/>
               <w:bottom w:val="single" w:sz="8" w:color="9FB0C2"/>
             </w:tcBorders>
+            <w:vAlign w:val="center"/>
           </w:tcPr>
           <w:p>
             <w:pPr>
@@ -3549,6 +3552,7 @@
               <w:top w:val="nil"/>
               <w:bottom w:val="single" w:sz="8" w:color="9FB0C2"/>
             </w:tcBorders>
+            <w:vAlign w:val="center"/>
           </w:tcPr>
           <w:p>
             <w:pPr>
@@ -3579,6 +3583,7 @@
               <w:top w:val="nil"/>
               <w:bottom w:val="single" w:sz="4" w:color="D9E1E8"/>
             </w:tcBorders>
+            <w:vAlign w:val="center"/>
           </w:tcPr>
           <w:p>
             <w:pPr>
@@ -3606,6 +3611,7 @@
               <w:top w:val="nil"/>
               <w:bottom w:val="single" w:sz="4" w:color="D9E1E8"/>
             </w:tcBorders>
+            <w:vAlign w:val="center"/>
           </w:tcPr>
           <w:p>
             <w:pPr>
@@ -3633,6 +3639,7 @@
               <w:top w:val="nil"/>
               <w:bottom w:val="single" w:sz="4" w:color="D9E1E8"/>
             </w:tcBorders>
+            <w:vAlign w:val="center"/>
           </w:tcPr>
           <w:p>
             <w:pPr>
@@ -3660,6 +3667,7 @@
               <w:top w:val="nil"/>
               <w:bottom w:val="single" w:sz="4" w:color="D9E1E8"/>
             </w:tcBorders>
+            <w:vAlign w:val="center"/>
           </w:tcPr>
           <w:p>
             <w:pPr>
@@ -3705,6 +3713,7 @@
               <w:top w:val="nil"/>
               <w:bottom w:val="single" w:sz="4" w:color="D9E1E8"/>
             </w:tcBorders>
+            <w:vAlign w:val="center"/>
           </w:tcPr>
           <w:p>
             <w:pPr>
@@ -3732,6 +3741,7 @@
               <w:top w:val="nil"/>
               <w:bottom w:val="single" w:sz="4" w:color="D9E1E8"/>
             </w:tcBorders>
+            <w:vAlign w:val="center"/>
           </w:tcPr>
           <w:p>
             <w:pPr>
@@ -3759,6 +3769,7 @@
               <w:top w:val="nil"/>
               <w:bottom w:val="single" w:sz="4" w:color="D9E1E8"/>
             </w:tcBorders>
+            <w:vAlign w:val="center"/>
           </w:tcPr>
           <w:p>
             <w:pPr>
@@ -3786,6 +3797,7 @@
               <w:top w:val="nil"/>
               <w:bottom w:val="single" w:sz="4" w:color="D9E1E8"/>
             </w:tcBorders>
+            <w:vAlign w:val="center"/>
           </w:tcPr>
           <w:p>
             <w:pPr>
@@ -3815,6 +3827,7 @@
               <w:top w:val="nil"/>
               <w:bottom w:val="single" w:sz="4" w:color="D9E1E8"/>
             </w:tcBorders>
+            <w:vAlign w:val="center"/>
           </w:tcPr>
           <w:p>
             <w:pPr>
@@ -3842,6 +3855,7 @@
               <w:top w:val="nil"/>
               <w:bottom w:val="single" w:sz="4" w:color="D9E1E8"/>
             </w:tcBorders>
+            <w:vAlign w:val="center"/>
           </w:tcPr>
           <w:p>
             <w:pPr>
@@ -3885,6 +3899,7 @@
               <w:top w:val="nil"/>
               <w:bottom w:val="single" w:sz="4" w:color="D9E1E8"/>
             </w:tcBorders>
+            <w:vAlign w:val="center"/>
           </w:tcPr>
           <w:p>
             <w:pPr>
@@ -3912,6 +3927,7 @@
               <w:top w:val="nil"/>
               <w:bottom w:val="single" w:sz="4" w:color="D9E1E8"/>
             </w:tcBorders>
+            <w:vAlign w:val="center"/>
           </w:tcPr>
           <w:p>
             <w:pPr>
@@ -3957,6 +3973,7 @@
               <w:top w:val="nil"/>
               <w:bottom w:val="single" w:sz="4" w:color="D9E1E8"/>
             </w:tcBorders>
+            <w:vAlign w:val="center"/>
           </w:tcPr>
           <w:p>
             <w:pPr>
@@ -3984,6 +4001,7 @@
               <w:top w:val="nil"/>
               <w:bottom w:val="single" w:sz="4" w:color="D9E1E8"/>
             </w:tcBorders>
+            <w:vAlign w:val="center"/>
           </w:tcPr>
           <w:p>
             <w:pPr>
@@ -4011,6 +4029,7 @@
               <w:top w:val="nil"/>
               <w:bottom w:val="single" w:sz="4" w:color="D9E1E8"/>
             </w:tcBorders>
+            <w:vAlign w:val="center"/>
           </w:tcPr>
           <w:p>
             <w:pPr>
@@ -4038,6 +4057,7 @@
               <w:top w:val="nil"/>
               <w:bottom w:val="single" w:sz="4" w:color="D9E1E8"/>
             </w:tcBorders>
+            <w:vAlign w:val="center"/>
           </w:tcPr>
           <w:p>
             <w:pPr>
@@ -4067,6 +4087,7 @@
               <w:top w:val="nil"/>
               <w:bottom w:val="nil"/>
             </w:tcBorders>
+            <w:vAlign w:val="center"/>
           </w:tcPr>
           <w:p>
             <w:pPr>
@@ -4094,6 +4115,7 @@
               <w:top w:val="nil"/>
               <w:bottom w:val="nil"/>
             </w:tcBorders>
+            <w:vAlign w:val="center"/>
           </w:tcPr>
           <w:p>
             <w:pPr>
@@ -4121,6 +4143,7 @@
               <w:top w:val="nil"/>
               <w:bottom w:val="nil"/>
             </w:tcBorders>
+            <w:vAlign w:val="center"/>
           </w:tcPr>
           <w:p>
             <w:pPr>
@@ -4148,6 +4171,7 @@
               <w:top w:val="nil"/>
               <w:bottom w:val="nil"/>
             </w:tcBorders>
+            <w:vAlign w:val="center"/>
           </w:tcPr>
           <w:p>
             <w:pPr>
@@ -6034,6 +6058,7 @@
               <w:top w:val="nil"/>
               <w:bottom w:val="single" w:sz="8" w:color="9FB0C2"/>
             </w:tcBorders>
+            <w:vAlign w:val="center"/>
           </w:tcPr>
           <w:p>
             <w:pPr>
@@ -6063,6 +6088,7 @@
               <w:top w:val="nil"/>
               <w:bottom w:val="single" w:sz="8" w:color="9FB0C2"/>
             </w:tcBorders>
+            <w:vAlign w:val="center"/>
           </w:tcPr>
           <w:p>
             <w:pPr>
@@ -6092,6 +6118,7 @@
               <w:top w:val="nil"/>
               <w:bottom w:val="single" w:sz="8" w:color="9FB0C2"/>
             </w:tcBorders>
+            <w:vAlign w:val="center"/>
           </w:tcPr>
           <w:p>
             <w:pPr>
@@ -6121,6 +6148,7 @@
               <w:top w:val="nil"/>
               <w:bottom w:val="single" w:sz="8" w:color="9FB0C2"/>
             </w:tcBorders>
+            <w:vAlign w:val="center"/>
           </w:tcPr>
           <w:p>
             <w:pPr>
@@ -6151,6 +6179,7 @@
               <w:top w:val="nil"/>
               <w:bottom w:val="single" w:sz="4" w:color="D9E1E8"/>
             </w:tcBorders>
+            <w:vAlign w:val="center"/>
           </w:tcPr>
           <w:p>
             <w:pPr>
@@ -6180,6 +6209,7 @@
               <w:top w:val="nil"/>
               <w:bottom w:val="single" w:sz="4" w:color="D9E1E8"/>
             </w:tcBorders>
+            <w:vAlign w:val="center"/>
           </w:tcPr>
           <w:p>
             <w:pPr>
@@ -6209,6 +6239,7 @@
               <w:top w:val="nil"/>
               <w:bottom w:val="single" w:sz="4" w:color="D9E1E8"/>
             </w:tcBorders>
+            <w:vAlign w:val="center"/>
           </w:tcPr>
           <w:p>
             <w:pPr>
@@ -6236,6 +6267,7 @@
               <w:top w:val="nil"/>
               <w:bottom w:val="single" w:sz="4" w:color="D9E1E8"/>
             </w:tcBorders>
+            <w:vAlign w:val="center"/>
           </w:tcPr>
           <w:p>
             <w:pPr>
@@ -6265,6 +6297,7 @@
               <w:top w:val="nil"/>
               <w:bottom w:val="single" w:sz="4" w:color="D9E1E8"/>
             </w:tcBorders>
+            <w:vAlign w:val="center"/>
           </w:tcPr>
           <w:p>
             <w:pPr>
@@ -6294,6 +6327,7 @@
               <w:top w:val="nil"/>
               <w:bottom w:val="single" w:sz="4" w:color="D9E1E8"/>
             </w:tcBorders>
+            <w:vAlign w:val="center"/>
           </w:tcPr>
           <w:p>
             <w:pPr>
@@ -6321,6 +6355,7 @@
               <w:top w:val="nil"/>
               <w:bottom w:val="single" w:sz="4" w:color="D9E1E8"/>
             </w:tcBorders>
+            <w:vAlign w:val="center"/>
           </w:tcPr>
           <w:p>
             <w:pPr>
@@ -6350,6 +6385,7 @@
               <w:top w:val="nil"/>
               <w:bottom w:val="single" w:sz="4" w:color="D9E1E8"/>
             </w:tcBorders>
+            <w:vAlign w:val="center"/>
           </w:tcPr>
           <w:p>
             <w:pPr>
@@ -6379,6 +6415,7 @@
               <w:top w:val="nil"/>
               <w:bottom w:val="nil"/>
             </w:tcBorders>
+            <w:vAlign w:val="center"/>
           </w:tcPr>
           <w:p>
             <w:pPr>
@@ -6408,6 +6445,7 @@
               <w:top w:val="nil"/>
               <w:bottom w:val="nil"/>
             </w:tcBorders>
+            <w:vAlign w:val="center"/>
           </w:tcPr>
           <w:p>
             <w:pPr>
@@ -6435,6 +6473,7 @@
               <w:top w:val="nil"/>
               <w:bottom w:val="nil"/>
             </w:tcBorders>
+            <w:vAlign w:val="center"/>
           </w:tcPr>
           <w:p>
             <w:pPr>
@@ -6462,6 +6501,7 @@
               <w:top w:val="nil"/>
               <w:bottom w:val="nil"/>
             </w:tcBorders>
+            <w:vAlign w:val="center"/>
           </w:tcPr>
           <w:p>
             <w:pPr>
@@ -7194,6 +7234,7 @@
               <w:top w:val="nil"/>
               <w:bottom w:val="single" w:sz="8" w:color="9FB0C2"/>
             </w:tcBorders>
+            <w:vAlign w:val="center"/>
           </w:tcPr>
           <w:p>
             <w:pPr>
@@ -7236,6 +7277,7 @@
               <w:top w:val="nil"/>
               <w:bottom w:val="single" w:sz="8" w:color="9FB0C2"/>
             </w:tcBorders>
+            <w:vAlign w:val="center"/>
           </w:tcPr>
           <w:p>
             <w:pPr>
@@ -7265,6 +7307,7 @@
               <w:top w:val="nil"/>
               <w:bottom w:val="single" w:sz="8" w:color="9FB0C2"/>
             </w:tcBorders>
+            <w:vAlign w:val="center"/>
           </w:tcPr>
           <w:p>
             <w:pPr>
@@ -7294,6 +7337,7 @@
               <w:top w:val="nil"/>
               <w:bottom w:val="single" w:sz="8" w:color="9FB0C2"/>
             </w:tcBorders>
+            <w:vAlign w:val="center"/>
           </w:tcPr>
           <w:p>
             <w:pPr>
@@ -7324,6 +7368,7 @@
               <w:top w:val="nil"/>
               <w:bottom w:val="nil"/>
             </w:tcBorders>
+            <w:vAlign w:val="center"/>
           </w:tcPr>
           <w:p>
             <w:pPr>
@@ -7351,6 +7396,7 @@
               <w:top w:val="nil"/>
               <w:bottom w:val="nil"/>
             </w:tcBorders>
+            <w:vAlign w:val="center"/>
           </w:tcPr>
           <w:p>
             <w:pPr>
@@ -7380,6 +7426,7 @@
               <w:top w:val="nil"/>
               <w:bottom w:val="nil"/>
             </w:tcBorders>
+            <w:vAlign w:val="center"/>
           </w:tcPr>
           <w:p>
             <w:pPr>
@@ -7409,6 +7456,7 @@
               <w:top w:val="nil"/>
               <w:bottom w:val="nil"/>
             </w:tcBorders>
+            <w:vAlign w:val="center"/>
           </w:tcPr>
           <w:p>
             <w:pPr>
@@ -7517,6 +7565,7 @@
               <w:top w:val="nil"/>
               <w:bottom w:val="single" w:sz="8" w:color="9FB0C2"/>
             </w:tcBorders>
+            <w:vAlign w:val="center"/>
           </w:tcPr>
           <w:p>
             <w:pPr>
@@ -7575,6 +7624,7 @@
               <w:top w:val="nil"/>
               <w:bottom w:val="single" w:sz="8" w:color="9FB0C2"/>
             </w:tcBorders>
+            <w:vAlign w:val="center"/>
           </w:tcPr>
           <w:p>
             <w:pPr>
@@ -7604,6 +7654,7 @@
               <w:top w:val="nil"/>
               <w:bottom w:val="single" w:sz="8" w:color="9FB0C2"/>
             </w:tcBorders>
+            <w:vAlign w:val="center"/>
           </w:tcPr>
           <w:p>
             <w:pPr>
@@ -7633,6 +7684,7 @@
               <w:top w:val="nil"/>
               <w:bottom w:val="single" w:sz="8" w:color="9FB0C2"/>
             </w:tcBorders>
+            <w:vAlign w:val="center"/>
           </w:tcPr>
           <w:p>
             <w:pPr>
@@ -7662,6 +7714,7 @@
               <w:top w:val="nil"/>
               <w:bottom w:val="single" w:sz="8" w:color="9FB0C2"/>
             </w:tcBorders>
+            <w:vAlign w:val="center"/>
           </w:tcPr>
           <w:p>
             <w:pPr>
@@ -7692,6 +7745,7 @@
               <w:top w:val="nil"/>
               <w:bottom w:val="single" w:sz="4" w:color="D9E1E8"/>
             </w:tcBorders>
+            <w:vAlign w:val="center"/>
           </w:tcPr>
           <w:p>
             <w:pPr>
@@ -7719,6 +7773,7 @@
               <w:top w:val="nil"/>
               <w:bottom w:val="single" w:sz="4" w:color="D9E1E8"/>
             </w:tcBorders>
+            <w:vAlign w:val="center"/>
           </w:tcPr>
           <w:p>
             <w:pPr>
@@ -7746,6 +7801,7 @@
               <w:top w:val="nil"/>
               <w:bottom w:val="single" w:sz="4" w:color="D9E1E8"/>
             </w:tcBorders>
+            <w:vAlign w:val="center"/>
           </w:tcPr>
           <w:p>
             <w:pPr>
@@ -7773,6 +7829,7 @@
               <w:top w:val="nil"/>
               <w:bottom w:val="single" w:sz="4" w:color="D9E1E8"/>
             </w:tcBorders>
+            <w:vAlign w:val="center"/>
           </w:tcPr>
           <w:p>
             <w:pPr>
@@ -7800,6 +7857,7 @@
               <w:top w:val="nil"/>
               <w:bottom w:val="single" w:sz="4" w:color="D9E1E8"/>
             </w:tcBorders>
+            <w:vAlign w:val="center"/>
           </w:tcPr>
           <w:p>
             <w:pPr>
@@ -7867,6 +7925,7 @@
               <w:top w:val="nil"/>
               <w:bottom w:val="nil"/>
             </w:tcBorders>
+            <w:vAlign w:val="center"/>
           </w:tcPr>
           <w:p>
             <w:pPr>
@@ -7894,6 +7953,7 @@
               <w:top w:val="nil"/>
               <w:bottom w:val="nil"/>
             </w:tcBorders>
+            <w:vAlign w:val="center"/>
           </w:tcPr>
           <w:p>
             <w:pPr>
@@ -7923,6 +7983,7 @@
               <w:top w:val="nil"/>
               <w:bottom w:val="nil"/>
             </w:tcBorders>
+            <w:vAlign w:val="center"/>
           </w:tcPr>
           <w:p>
             <w:pPr>
@@ -7950,6 +8011,7 @@
               <w:top w:val="nil"/>
               <w:bottom w:val="nil"/>
             </w:tcBorders>
+            <w:vAlign w:val="center"/>
           </w:tcPr>
           <w:p>
             <w:pPr>
@@ -7979,6 +8041,7 @@
               <w:top w:val="nil"/>
               <w:bottom w:val="nil"/>
             </w:tcBorders>
+            <w:vAlign w:val="center"/>
           </w:tcPr>
           <w:p>
             <w:pPr>
@@ -8252,6 +8315,37 @@
     </w:p>
     <w:p>
       <w:pPr>
+        <w:pStyle w:val="ImageCaption"/>
+        <w:spacing w:before="80" w:after="120" w:line="240" w:lineRule="auto"/>
+        <w:jc w:val="center"/>
+        <w:keepNext w:val="0"/>
+        <w:keepLines/>
+        <w:widowControl w:val="1"/>
+      </w:pPr>
+      <w:r>
+        <w:rPr>
+          <w:b/>
+          <w:i/>
+        </w:rPr>
+        <w:t>Figure 3.</w:t>
+      </w:r>
+      <w:r>
+        <w:rPr>
+          <w:b w:val="0"/>
+          <w:i/>
+        </w:rPr>
+        <w:t xml:space="preserve"> </w:t>
+      </w:r>
+      <w:r>
+        <w:rPr>
+          <w:b w:val="0"/>
+          <w:i/>
+        </w:rPr>
+        <w:t>Effect of manipulating each skill's competence (columns) on each skill's grade (rows). Each cell is the grade change (strong minus weak) on the 3-point scale (A=3, B=2, C=1); warmer cells are larger positive effects. The diagonal (own-skill effect) dominates; off-diagonal (cross-skill) effects are near zero.</w:t>
+      </w:r>
+    </w:p>
+    <w:p>
+      <w:pPr>
         <w:spacing w:before="0" w:after="0" w:line="440" w:lineRule="exact"/>
         <w:rPr>
           <w:sz w:val="2"/>
@@ -8274,37 +8368,6 @@
           <w:docGrid w:linePitch="360"/>
         </w:sectPr>
       </w:pPr>
-    </w:p>
-    <w:p>
-      <w:pPr>
-        <w:pStyle w:val="ImageCaption"/>
-        <w:spacing w:before="80" w:after="120" w:line="240" w:lineRule="auto"/>
-        <w:jc w:val="center"/>
-        <w:keepNext w:val="0"/>
-        <w:keepLines/>
-        <w:widowControl w:val="1"/>
-      </w:pPr>
-      <w:r>
-        <w:rPr>
-          <w:b/>
-          <w:i/>
-        </w:rPr>
-        <w:t>Figure 3.</w:t>
-      </w:r>
-      <w:r>
-        <w:rPr>
-          <w:b w:val="0"/>
-          <w:i/>
-        </w:rPr>
-        <w:t xml:space="preserve"> </w:t>
-      </w:r>
-      <w:r>
-        <w:rPr>
-          <w:b w:val="0"/>
-          <w:i/>
-        </w:rPr>
-        <w:t>Effect of manipulating each skill's competence (columns) on each skill's grade (rows). Each cell is the grade change (strong minus weak) on the 3-point scale (A=3, B=2, C=1); warmer cells are larger positive effects. The diagonal (own-skill effect) dominates; off-diagonal (cross-skill) effects are near zero.</w:t>
-      </w:r>
     </w:p>
     <w:p>
       <w:pPr>
@@ -9764,6 +9827,37 @@
     </w:p>
     <w:p>
       <w:pPr>
+        <w:pStyle w:val="ImageCaption"/>
+        <w:spacing w:before="80" w:after="120" w:line="240" w:lineRule="auto"/>
+        <w:jc w:val="center"/>
+        <w:keepNext w:val="0"/>
+        <w:keepLines/>
+        <w:widowControl w:val="1"/>
+      </w:pPr>
+      <w:r>
+        <w:rPr>
+          <w:b/>
+          <w:i/>
+        </w:rPr>
+        <w:t>Figure A2.</w:t>
+      </w:r>
+      <w:r>
+        <w:rPr>
+          <w:b w:val="0"/>
+          <w:i/>
+        </w:rPr>
+        <w:t xml:space="preserve"> </w:t>
+      </w:r>
+      <w:r>
+        <w:rPr>
+          <w:b w:val="0"/>
+          <w:i/>
+        </w:rPr>
+        <w:t>Screenshot of the running platform: the instructor course-analytics view. Grade distribution is broken out into separate Framing, Judging, and Steering panels, and the per-student results list the three skills as distinct columns, the interface-level expression of the framework's central claim that productive AI use is not one skill but three.</w:t>
+      </w:r>
+    </w:p>
+    <w:p>
+      <w:pPr>
         <w:spacing w:before="0" w:after="0" w:line="440" w:lineRule="exact"/>
         <w:rPr>
           <w:sz w:val="2"/>
@@ -9786,37 +9880,6 @@
           <w:docGrid w:linePitch="360"/>
         </w:sectPr>
       </w:pPr>
-    </w:p>
-    <w:p>
-      <w:pPr>
-        <w:pStyle w:val="ImageCaption"/>
-        <w:spacing w:before="80" w:after="120" w:line="240" w:lineRule="auto"/>
-        <w:jc w:val="center"/>
-        <w:keepNext w:val="0"/>
-        <w:keepLines/>
-        <w:widowControl w:val="1"/>
-      </w:pPr>
-      <w:r>
-        <w:rPr>
-          <w:b/>
-          <w:i/>
-        </w:rPr>
-        <w:t>Figure A2.</w:t>
-      </w:r>
-      <w:r>
-        <w:rPr>
-          <w:b w:val="0"/>
-          <w:i/>
-        </w:rPr>
-        <w:t xml:space="preserve"> </w:t>
-      </w:r>
-      <w:r>
-        <w:rPr>
-          <w:b w:val="0"/>
-          <w:i/>
-        </w:rPr>
-        <w:t>Screenshot of the running platform: the instructor course-analytics view. Grade distribution is broken out into separate Framing, Judging, and Steering panels, and the per-student results list the three skills as distinct columns, the interface-level expression of the framework's central claim that productive AI use is not one skill but three.</w:t>
-      </w:r>
     </w:p>
     <w:p>
       <w:pPr>
@@ -9836,7 +9899,7 @@
               <a:graphicData uri="http://schemas.openxmlformats.org/drawingml/2006/picture">
                 <pic:pic>
                   <pic:nvPicPr>
-                    <pic:cNvPr descr="C:/Users/apart/AppData/Local/Temp/html2doc_svg_baqNz7/svg_2.png" id="46" name="Picture"/>
+                    <pic:cNvPr descr="C:/Users/apart/AppData/Local/Temp/html2doc_svg_aA3z3Y/svg_2.png" id="46" name="Picture"/>
                     <pic:cNvPicPr>
                       <a:picLocks noChangeArrowheads="1" noChangeAspect="1"/>
                     </pic:cNvPicPr>
@@ -10440,6 +10503,7 @@
               <w:top w:val="nil"/>
               <w:bottom w:val="single" w:sz="8" w:color="9FB0C2"/>
             </w:tcBorders>
+            <w:vAlign w:val="center"/>
           </w:tcPr>
           <w:p>
             <w:pPr>
@@ -10469,6 +10533,7 @@
               <w:top w:val="nil"/>
               <w:bottom w:val="single" w:sz="8" w:color="9FB0C2"/>
             </w:tcBorders>
+            <w:vAlign w:val="center"/>
           </w:tcPr>
           <w:p>
             <w:pPr>
@@ -10499,6 +10564,7 @@
               <w:top w:val="nil"/>
               <w:bottom w:val="single" w:sz="4" w:color="D9E1E8"/>
             </w:tcBorders>
+            <w:vAlign w:val="center"/>
           </w:tcPr>
           <w:p>
             <w:pPr>
@@ -10526,6 +10592,7 @@
               <w:top w:val="nil"/>
               <w:bottom w:val="single" w:sz="4" w:color="D9E1E8"/>
             </w:tcBorders>
+            <w:vAlign w:val="center"/>
           </w:tcPr>
           <w:p>
             <w:pPr>
@@ -10555,6 +10622,7 @@
               <w:top w:val="nil"/>
               <w:bottom w:val="single" w:sz="4" w:color="D9E1E8"/>
             </w:tcBorders>
+            <w:vAlign w:val="center"/>
           </w:tcPr>
           <w:p>
             <w:pPr>
@@ -10582,6 +10650,7 @@
               <w:top w:val="nil"/>
               <w:bottom w:val="single" w:sz="4" w:color="D9E1E8"/>
             </w:tcBorders>
+            <w:vAlign w:val="center"/>
           </w:tcPr>
           <w:p>
             <w:pPr>
@@ -10611,6 +10680,7 @@
               <w:top w:val="nil"/>
               <w:bottom w:val="single" w:sz="4" w:color="D9E1E8"/>
             </w:tcBorders>
+            <w:vAlign w:val="center"/>
           </w:tcPr>
           <w:p>
             <w:pPr>
@@ -10638,6 +10708,7 @@
               <w:top w:val="nil"/>
               <w:bottom w:val="single" w:sz="4" w:color="D9E1E8"/>
             </w:tcBorders>
+            <w:vAlign w:val="center"/>
           </w:tcPr>
           <w:p>
             <w:pPr>
@@ -10667,6 +10738,7 @@
               <w:top w:val="nil"/>
               <w:bottom w:val="nil"/>
             </w:tcBorders>
+            <w:vAlign w:val="center"/>
           </w:tcPr>
           <w:p>
             <w:pPr>
@@ -10694,6 +10766,7 @@
               <w:top w:val="nil"/>
               <w:bottom w:val="nil"/>
             </w:tcBorders>
+            <w:vAlign w:val="center"/>
           </w:tcPr>
           <w:p>
             <w:pPr>

</xml_diff>

<commit_message>
Move appendices after the references section
Co-Authored-By: Claude Opus 4.8 <noreply@anthropic.com>
</commit_message>
<xml_diff>
--- a/docs/coreasoning-2col.docx
+++ b/docs/coreasoning-2col.docx
@@ -680,7 +680,7 @@
               <a:graphicData uri="http://schemas.openxmlformats.org/drawingml/2006/picture">
                 <pic:pic>
                   <pic:nvPicPr>
-                    <pic:cNvPr descr="C:/Users/apart/AppData/Local/Temp/html2doc_svg_aA3z3Y/svg_0.png" id="12" name="Picture"/>
+                    <pic:cNvPr descr="C:/Users/apart/AppData/Local/Temp/html2doc_svg_he6DYr/svg_0.png" id="12" name="Picture"/>
                     <pic:cNvPicPr>
                       <a:picLocks noChangeArrowheads="1" noChangeAspect="1"/>
                     </pic:cNvPicPr>
@@ -1784,7 +1784,7 @@
               <a:graphicData uri="http://schemas.openxmlformats.org/drawingml/2006/picture">
                 <pic:pic>
                   <pic:nvPicPr>
-                    <pic:cNvPr descr="C:/Users/apart/AppData/Local/Temp/html2doc_svg_aA3z3Y/svg_1.png" id="17" name="Picture"/>
+                    <pic:cNvPr descr="C:/Users/apart/AppData/Local/Temp/html2doc_svg_he6DYr/svg_1.png" id="17" name="Picture"/>
                     <pic:cNvPicPr>
                       <a:picLocks noChangeArrowheads="1" noChangeAspect="1"/>
                     </pic:cNvPicPr>
@@ -9590,7 +9590,2268 @@
       </w:r>
     </w:p>
     <w:bookmarkEnd w:id="37"/>
-    <w:bookmarkStart w:id="47" w:name="appendix-a-system-walkthrough"/>
+    <w:bookmarkStart w:id="38" w:name="references"/>
+    <w:p>
+      <w:pPr>
+        <w:pStyle w:val="ReferencesHeading"/>
+        <w:jc w:val="left"/>
+        <w:keepNext/>
+        <w:keepLines/>
+        <w:widowControl w:val="1"/>
+      </w:pPr>
+      <w:r>
+        <w:t xml:space="preserve">References</w:t>
+      </w:r>
+    </w:p>
+    <w:p>
+      <w:pPr>
+        <w:pStyle w:val="ReferenceEntry"/>
+        <w:spacing w:after="60"/>
+        <w:ind w:left="403" w:hanging="403"/>
+        <w:jc w:val="left"/>
+        <w:keepNext w:val="0"/>
+        <w:keepLines w:val="0"/>
+        <w:widowControl w:val="1"/>
+      </w:pPr>
+      <w:r>
+        <w:rPr>
+          <w:rFonts w:ascii="Georgia" w:hAnsi="Georgia"/>
+          <w:sz w:val="18"/>
+        </w:rPr>
+        <w:t xml:space="preserve">1. </w:t>
+      </w:r>
+      <w:r>
+        <w:t xml:space="preserve">Acar, O. A. (2023). AI Prompt Engineering Isn't the Future.</w:t>
+      </w:r>
+      <w:r>
+        <w:t xml:space="preserve"> </w:t>
+      </w:r>
+      <w:r>
+        <w:rPr>
+          <w:i/>
+          <w:iCs/>
+        </w:rPr>
+        <w:t xml:space="preserve">Harvard Business Review, June 6</w:t>
+      </w:r>
+      <w:r>
+        <w:t xml:space="preserve">.</w:t>
+      </w:r>
+    </w:p>
+    <w:p>
+      <w:pPr>
+        <w:pStyle w:val="ReferenceEntry"/>
+        <w:spacing w:after="60"/>
+        <w:ind w:left="403" w:hanging="403"/>
+        <w:jc w:val="left"/>
+        <w:keepNext w:val="0"/>
+        <w:keepLines w:val="0"/>
+        <w:widowControl w:val="1"/>
+      </w:pPr>
+      <w:r>
+        <w:rPr>
+          <w:rFonts w:ascii="Georgia" w:hAnsi="Georgia"/>
+          <w:sz w:val="18"/>
+        </w:rPr>
+        <w:t xml:space="preserve">2. </w:t>
+      </w:r>
+      <w:r>
+        <w:t xml:space="preserve">Anderson, L. W., &amp; Krathwohl, D. R. (2001). A Taxonomy for Learning, Teaching, and Assessing: A Revision of Bloom's Taxonomy of Educational Objectives.</w:t>
+      </w:r>
+      <w:r>
+        <w:t xml:space="preserve"> </w:t>
+      </w:r>
+      <w:r>
+        <w:rPr>
+          <w:i/>
+          <w:iCs/>
+        </w:rPr>
+        <w:t xml:space="preserve">Longman</w:t>
+      </w:r>
+      <w:r>
+        <w:t xml:space="preserve">.</w:t>
+      </w:r>
+    </w:p>
+    <w:p>
+      <w:pPr>
+        <w:pStyle w:val="ReferenceEntry"/>
+        <w:spacing w:after="60"/>
+        <w:ind w:left="403" w:hanging="403"/>
+        <w:jc w:val="left"/>
+        <w:keepNext w:val="0"/>
+        <w:keepLines w:val="0"/>
+        <w:widowControl w:val="1"/>
+      </w:pPr>
+      <w:r>
+        <w:rPr>
+          <w:rFonts w:ascii="Georgia" w:hAnsi="Georgia"/>
+          <w:sz w:val="18"/>
+        </w:rPr>
+        <w:t xml:space="preserve">3. </w:t>
+      </w:r>
+      <w:r>
+        <w:t xml:space="preserve">Annapureddy, R., Fornaroli, A., &amp; Gatica-Perez, D. (2024). Generative AI Literacy: Twelve Defining Competencies.</w:t>
+      </w:r>
+      <w:r>
+        <w:t xml:space="preserve"> </w:t>
+      </w:r>
+      <w:r>
+        <w:rPr>
+          <w:i/>
+          <w:iCs/>
+        </w:rPr>
+        <w:t xml:space="preserve">Digital Government: Research and Practice</w:t>
+      </w:r>
+      <w:r>
+        <w:t xml:space="preserve">.</w:t>
+      </w:r>
+    </w:p>
+    <w:p>
+      <w:pPr>
+        <w:pStyle w:val="ReferenceEntry"/>
+        <w:spacing w:after="60"/>
+        <w:ind w:left="403" w:hanging="403"/>
+        <w:jc w:val="left"/>
+        <w:keepNext w:val="0"/>
+        <w:keepLines w:val="0"/>
+        <w:widowControl w:val="1"/>
+      </w:pPr>
+      <w:r>
+        <w:rPr>
+          <w:rFonts w:ascii="Georgia" w:hAnsi="Georgia"/>
+          <w:sz w:val="18"/>
+        </w:rPr>
+        <w:t xml:space="preserve">4. </w:t>
+      </w:r>
+      <w:r>
+        <w:t xml:space="preserve">Bansal, G., Wu, T., Zhou, J., Fok, R., Nushi, B., Kamar, E., Ribeiro, M. T., &amp; Weld, D. S. (2021). Does the Whole Exceed Its Parts? The Effect of AI Explanations on Complementary Team Performance.</w:t>
+      </w:r>
+      <w:r>
+        <w:t xml:space="preserve"> </w:t>
+      </w:r>
+      <w:r>
+        <w:rPr>
+          <w:i/>
+          <w:iCs/>
+        </w:rPr>
+        <w:t xml:space="preserve">Proceedings of the 2021 CHI Conference on Human Factors in Computing Systems</w:t>
+      </w:r>
+      <w:r>
+        <w:t xml:space="preserve">.</w:t>
+      </w:r>
+    </w:p>
+    <w:p>
+      <w:pPr>
+        <w:pStyle w:val="ReferenceEntry"/>
+        <w:spacing w:after="60"/>
+        <w:ind w:left="403" w:hanging="403"/>
+        <w:jc w:val="left"/>
+        <w:keepNext w:val="0"/>
+        <w:keepLines w:val="0"/>
+        <w:widowControl w:val="1"/>
+      </w:pPr>
+      <w:r>
+        <w:rPr>
+          <w:rFonts w:ascii="Georgia" w:hAnsi="Georgia"/>
+          <w:sz w:val="18"/>
+        </w:rPr>
+        <w:t xml:space="preserve">5. </w:t>
+      </w:r>
+      <w:r>
+        <w:t xml:space="preserve">Barzilai, S., &amp; Chinn, C. A. (2018). On the Goals of Epistemic Education: Promoting Apt Epistemic Performance.</w:t>
+      </w:r>
+      <w:r>
+        <w:t xml:space="preserve"> </w:t>
+      </w:r>
+      <w:r>
+        <w:rPr>
+          <w:i/>
+          <w:iCs/>
+        </w:rPr>
+        <w:t xml:space="preserve">Journal of the Learning Sciences</w:t>
+      </w:r>
+      <w:r>
+        <w:t xml:space="preserve">, 27(3), 353–389.</w:t>
+      </w:r>
+    </w:p>
+    <w:p>
+      <w:pPr>
+        <w:pStyle w:val="ReferenceEntry"/>
+        <w:spacing w:after="60"/>
+        <w:ind w:left="403" w:hanging="403"/>
+        <w:jc w:val="left"/>
+        <w:keepNext w:val="0"/>
+        <w:keepLines w:val="0"/>
+        <w:widowControl w:val="1"/>
+      </w:pPr>
+      <w:r>
+        <w:rPr>
+          <w:rFonts w:ascii="Georgia" w:hAnsi="Georgia"/>
+          <w:sz w:val="18"/>
+        </w:rPr>
+        <w:t xml:space="preserve">6. </w:t>
+      </w:r>
+      <w:r>
+        <w:t xml:space="preserve">Bearman, M., Tai, J., Dawson, P., Boud, D., &amp; Ajjawi, R. (2024). Developing Evaluative Judgement for a Time of Generative Artificial Intelligence.</w:t>
+      </w:r>
+      <w:r>
+        <w:t xml:space="preserve"> </w:t>
+      </w:r>
+      <w:r>
+        <w:rPr>
+          <w:i/>
+          <w:iCs/>
+        </w:rPr>
+        <w:t xml:space="preserve">Assessment &amp; Evaluation in Higher Education</w:t>
+      </w:r>
+      <w:r>
+        <w:t xml:space="preserve">, 49(6), 893–905. https://doi.org/10.1080/02602938.2024.2335321</w:t>
+      </w:r>
+    </w:p>
+    <w:p>
+      <w:pPr>
+        <w:pStyle w:val="ReferenceEntry"/>
+        <w:spacing w:after="60"/>
+        <w:ind w:left="403" w:hanging="403"/>
+        <w:jc w:val="left"/>
+        <w:keepNext w:val="0"/>
+        <w:keepLines w:val="0"/>
+        <w:widowControl w:val="1"/>
+      </w:pPr>
+      <w:r>
+        <w:rPr>
+          <w:rFonts w:ascii="Georgia" w:hAnsi="Georgia"/>
+          <w:sz w:val="18"/>
+        </w:rPr>
+        <w:t xml:space="preserve">7. </w:t>
+      </w:r>
+      <w:r>
+        <w:t xml:space="preserve">Bjork, E. L., &amp; Bjork, R. A. (2011). Making Things Hard on Yourself, but in a Good Way: Creating Desirable Difficulties to Enhance Learning.</w:t>
+      </w:r>
+      <w:r>
+        <w:t xml:space="preserve"> </w:t>
+      </w:r>
+      <w:r>
+        <w:rPr>
+          <w:i/>
+          <w:iCs/>
+        </w:rPr>
+        <w:t xml:space="preserve">Psychology and the Real World</w:t>
+      </w:r>
+      <w:r>
+        <w:t xml:space="preserve">, 56–64.</w:t>
+      </w:r>
+    </w:p>
+    <w:p>
+      <w:pPr>
+        <w:pStyle w:val="ReferenceEntry"/>
+        <w:spacing w:after="60"/>
+        <w:ind w:left="403" w:hanging="403"/>
+        <w:jc w:val="left"/>
+        <w:keepNext w:val="0"/>
+        <w:keepLines w:val="0"/>
+        <w:widowControl w:val="1"/>
+      </w:pPr>
+      <w:r>
+        <w:rPr>
+          <w:rFonts w:ascii="Georgia" w:hAnsi="Georgia"/>
+          <w:sz w:val="18"/>
+        </w:rPr>
+        <w:t xml:space="preserve">8. </w:t>
+      </w:r>
+      <w:r>
+        <w:t xml:space="preserve">Buçinca, Z., Malaya, M. B., &amp; Gajos, K. Z. (2021). To Trust or to Think: Cognitive Forcing Functions Can Reduce Overreliance on AI in AI-Assisted Decision-Making.</w:t>
+      </w:r>
+      <w:r>
+        <w:t xml:space="preserve"> </w:t>
+      </w:r>
+      <w:r>
+        <w:rPr>
+          <w:i/>
+          <w:iCs/>
+        </w:rPr>
+        <w:t xml:space="preserve">Proceedings of the ACM on Human-Computer Interaction</w:t>
+      </w:r>
+      <w:r>
+        <w:t xml:space="preserve">, 5(CSCW1), 1–21.</w:t>
+      </w:r>
+    </w:p>
+    <w:p>
+      <w:pPr>
+        <w:pStyle w:val="ReferenceEntry"/>
+        <w:spacing w:after="60"/>
+        <w:ind w:left="403" w:hanging="403"/>
+        <w:jc w:val="left"/>
+        <w:keepNext w:val="0"/>
+        <w:keepLines w:val="0"/>
+        <w:widowControl w:val="1"/>
+      </w:pPr>
+      <w:r>
+        <w:rPr>
+          <w:rFonts w:ascii="Georgia" w:hAnsi="Georgia"/>
+          <w:sz w:val="18"/>
+        </w:rPr>
+        <w:t xml:space="preserve">9. </w:t>
+      </w:r>
+      <w:r>
+        <w:t xml:space="preserve">Campbell, D. T., &amp; Fiske, D. W. (1959). Convergent and Discriminant Validation by the Multitrait-Multimethod Matrix.</w:t>
+      </w:r>
+      <w:r>
+        <w:t xml:space="preserve"> </w:t>
+      </w:r>
+      <w:r>
+        <w:rPr>
+          <w:i/>
+          <w:iCs/>
+        </w:rPr>
+        <w:t xml:space="preserve">Psychological Bulletin</w:t>
+      </w:r>
+      <w:r>
+        <w:t xml:space="preserve">, 56(2), 81–105.</w:t>
+      </w:r>
+    </w:p>
+    <w:p>
+      <w:pPr>
+        <w:pStyle w:val="ReferenceEntry"/>
+        <w:spacing w:after="60"/>
+        <w:ind w:left="403" w:hanging="403"/>
+        <w:jc w:val="left"/>
+        <w:keepNext w:val="0"/>
+        <w:keepLines w:val="0"/>
+        <w:widowControl w:val="1"/>
+      </w:pPr>
+      <w:r>
+        <w:rPr>
+          <w:rFonts w:ascii="Georgia" w:hAnsi="Georgia"/>
+          <w:sz w:val="18"/>
+        </w:rPr>
+        <w:t xml:space="preserve">10. </w:t>
+      </w:r>
+      <w:r>
+        <w:t xml:space="preserve">Chi, M. T. H., &amp; Wylie, R. (2014). The ICAP Framework: Linking Cognitive Engagement to Active Learning Outcomes.</w:t>
+      </w:r>
+      <w:r>
+        <w:t xml:space="preserve"> </w:t>
+      </w:r>
+      <w:r>
+        <w:rPr>
+          <w:i/>
+          <w:iCs/>
+        </w:rPr>
+        <w:t xml:space="preserve">Educational Psychologist</w:t>
+      </w:r>
+      <w:r>
+        <w:t xml:space="preserve">, 49(4), 219–243.</w:t>
+      </w:r>
+    </w:p>
+    <w:p>
+      <w:pPr>
+        <w:pStyle w:val="ReferenceEntry"/>
+        <w:spacing w:after="60"/>
+        <w:ind w:left="403" w:hanging="403"/>
+        <w:jc w:val="left"/>
+        <w:keepNext w:val="0"/>
+        <w:keepLines w:val="0"/>
+        <w:widowControl w:val="1"/>
+      </w:pPr>
+      <w:r>
+        <w:rPr>
+          <w:rFonts w:ascii="Georgia" w:hAnsi="Georgia"/>
+          <w:sz w:val="18"/>
+        </w:rPr>
+        <w:t xml:space="preserve">11. </w:t>
+      </w:r>
+      <w:r>
+        <w:t xml:space="preserve">Clerc, O., Abdelghani, R., Desvaux, C., Poisson, E., Oudeyer, P., &amp; Sauzéon, H. (2026). Teaching Students to Question the Machine: An AI Literacy Intervention Improves Students' Regulation of LLM Use in a Science Task.</w:t>
+      </w:r>
+      <w:r>
+        <w:t xml:space="preserve"> </w:t>
+      </w:r>
+      <w:r>
+        <w:rPr>
+          <w:i/>
+          <w:iCs/>
+        </w:rPr>
+        <w:t xml:space="preserve">arXiv preprint arXiv:2604.01955</w:t>
+      </w:r>
+      <w:r>
+        <w:t xml:space="preserve">.</w:t>
+      </w:r>
+    </w:p>
+    <w:p>
+      <w:pPr>
+        <w:pStyle w:val="ReferenceEntry"/>
+        <w:spacing w:after="60"/>
+        <w:ind w:left="403" w:hanging="403"/>
+        <w:jc w:val="left"/>
+        <w:keepNext w:val="0"/>
+        <w:keepLines w:val="0"/>
+        <w:widowControl w:val="1"/>
+      </w:pPr>
+      <w:r>
+        <w:rPr>
+          <w:rFonts w:ascii="Georgia" w:hAnsi="Georgia"/>
+          <w:sz w:val="18"/>
+        </w:rPr>
+        <w:t xml:space="preserve">12. </w:t>
+      </w:r>
+      <w:r>
+        <w:t xml:space="preserve">Collins, A., Brown, J. S., &amp; Newman, S. E. (1989). Cognitive Apprenticeship: Teaching the Crafts of Reading, Writing, and Mathematics.</w:t>
+      </w:r>
+      <w:r>
+        <w:t xml:space="preserve"> </w:t>
+      </w:r>
+      <w:r>
+        <w:rPr>
+          <w:i/>
+          <w:iCs/>
+        </w:rPr>
+        <w:t xml:space="preserve">Knowing, Learning, and Instruction: Essays in Honor of Robert Glaser</w:t>
+      </w:r>
+      <w:r>
+        <w:t xml:space="preserve">, 453–494.</w:t>
+      </w:r>
+    </w:p>
+    <w:p>
+      <w:pPr>
+        <w:pStyle w:val="ReferenceEntry"/>
+        <w:spacing w:after="60"/>
+        <w:ind w:left="403" w:hanging="403"/>
+        <w:jc w:val="left"/>
+        <w:keepNext w:val="0"/>
+        <w:keepLines w:val="0"/>
+        <w:widowControl w:val="1"/>
+      </w:pPr>
+      <w:r>
+        <w:rPr>
+          <w:rFonts w:ascii="Georgia" w:hAnsi="Georgia"/>
+          <w:sz w:val="18"/>
+        </w:rPr>
+        <w:t xml:space="preserve">13. </w:t>
+      </w:r>
+      <w:r>
+        <w:t xml:space="preserve">Dakan, R., &amp; Feller, J. (2025). Framework for AI Fluency.</w:t>
+      </w:r>
+      <w:r>
+        <w:t xml:space="preserve"> </w:t>
+      </w:r>
+      <w:r>
+        <w:rPr>
+          <w:i/>
+          <w:iCs/>
+        </w:rPr>
+        <w:t xml:space="preserve">Anthropic</w:t>
+      </w:r>
+      <w:r>
+        <w:t xml:space="preserve">.</w:t>
+      </w:r>
+    </w:p>
+    <w:p>
+      <w:pPr>
+        <w:pStyle w:val="ReferenceEntry"/>
+        <w:spacing w:after="60"/>
+        <w:ind w:left="403" w:hanging="403"/>
+        <w:jc w:val="left"/>
+        <w:keepNext w:val="0"/>
+        <w:keepLines w:val="0"/>
+        <w:widowControl w:val="1"/>
+      </w:pPr>
+      <w:r>
+        <w:rPr>
+          <w:rFonts w:ascii="Georgia" w:hAnsi="Georgia"/>
+          <w:sz w:val="18"/>
+        </w:rPr>
+        <w:t xml:space="preserve">14. </w:t>
+      </w:r>
+      <w:r>
+        <w:t xml:space="preserve">Dell'Acqua, F., McFowland III, E., Mollick, E., Lifshitz-Assaf, H., Kellogg, K., Rajendran, S., Krayer, L., Candelon, F., &amp; Lakhani, K. R. (2023). Navigating the Jagged Technological Frontier.</w:t>
+      </w:r>
+      <w:r>
+        <w:t xml:space="preserve"> </w:t>
+      </w:r>
+      <w:r>
+        <w:rPr>
+          <w:i/>
+          <w:iCs/>
+        </w:rPr>
+        <w:t xml:space="preserve">Harvard Business School Working Paper 24-013</w:t>
+      </w:r>
+      <w:r>
+        <w:t xml:space="preserve">.</w:t>
+      </w:r>
+    </w:p>
+    <w:p>
+      <w:pPr>
+        <w:pStyle w:val="ReferenceEntry"/>
+        <w:spacing w:after="60"/>
+        <w:ind w:left="403" w:hanging="403"/>
+        <w:jc w:val="left"/>
+        <w:keepNext w:val="0"/>
+        <w:keepLines w:val="0"/>
+        <w:widowControl w:val="1"/>
+      </w:pPr>
+      <w:r>
+        <w:rPr>
+          <w:rFonts w:ascii="Georgia" w:hAnsi="Georgia"/>
+          <w:sz w:val="18"/>
+        </w:rPr>
+        <w:t xml:space="preserve">15. </w:t>
+      </w:r>
+      <w:r>
+        <w:t xml:space="preserve">Denny, P., Leinonen, J., Prather, J., Luxton-Reilly, A., Amarouche, T., Becker, B. A., &amp; Reeves, B. N. (2024). Prompt Problems: A New Programming Exercise for the Generative AI Era.</w:t>
+      </w:r>
+      <w:r>
+        <w:t xml:space="preserve"> </w:t>
+      </w:r>
+      <w:r>
+        <w:rPr>
+          <w:i/>
+          <w:iCs/>
+        </w:rPr>
+        <w:t xml:space="preserve">Proceedings of the 55th ACM Technical Symposium on Computer Science Education (SIGCSE)</w:t>
+      </w:r>
+      <w:r>
+        <w:t xml:space="preserve">.</w:t>
+      </w:r>
+    </w:p>
+    <w:p>
+      <w:pPr>
+        <w:pStyle w:val="ReferenceEntry"/>
+        <w:spacing w:after="60"/>
+        <w:ind w:left="403" w:hanging="403"/>
+        <w:jc w:val="left"/>
+        <w:keepNext w:val="0"/>
+        <w:keepLines w:val="0"/>
+        <w:widowControl w:val="1"/>
+      </w:pPr>
+      <w:r>
+        <w:rPr>
+          <w:rFonts w:ascii="Georgia" w:hAnsi="Georgia"/>
+          <w:sz w:val="18"/>
+        </w:rPr>
+        <w:t xml:space="preserve">16. </w:t>
+      </w:r>
+      <w:r>
+        <w:t xml:space="preserve">Di Santi, E. (2026). Cognitive Amplification vs Cognitive Delegation in Human-AI Systems: A Metric Framework.</w:t>
+      </w:r>
+      <w:r>
+        <w:t xml:space="preserve"> </w:t>
+      </w:r>
+      <w:r>
+        <w:rPr>
+          <w:i/>
+          <w:iCs/>
+        </w:rPr>
+        <w:t xml:space="preserve">arXiv preprint arXiv:2603.18677</w:t>
+      </w:r>
+      <w:r>
+        <w:t xml:space="preserve">.</w:t>
+      </w:r>
+    </w:p>
+    <w:p>
+      <w:pPr>
+        <w:pStyle w:val="ReferenceEntry"/>
+        <w:spacing w:after="60"/>
+        <w:ind w:left="403" w:hanging="403"/>
+        <w:jc w:val="left"/>
+        <w:keepNext w:val="0"/>
+        <w:keepLines w:val="0"/>
+        <w:widowControl w:val="1"/>
+      </w:pPr>
+      <w:r>
+        <w:rPr>
+          <w:rFonts w:ascii="Georgia" w:hAnsi="Georgia"/>
+          <w:sz w:val="18"/>
+        </w:rPr>
+        <w:t xml:space="preserve">17. </w:t>
+      </w:r>
+      <w:r>
+        <w:t xml:space="preserve">Durkin, K., &amp; Rittle-Johnson, B. (2012). The Effectiveness of Using Incorrect Examples to Support Learning about Decimal Magnitude.</w:t>
+      </w:r>
+      <w:r>
+        <w:t xml:space="preserve"> </w:t>
+      </w:r>
+      <w:r>
+        <w:rPr>
+          <w:i/>
+          <w:iCs/>
+        </w:rPr>
+        <w:t xml:space="preserve">Learning and Instruction</w:t>
+      </w:r>
+      <w:r>
+        <w:t xml:space="preserve">, 22(3), 206–214. https://doi.org/10.1016/j.learninstruc.2011.11.001</w:t>
+      </w:r>
+    </w:p>
+    <w:p>
+      <w:pPr>
+        <w:pStyle w:val="ReferenceEntry"/>
+        <w:spacing w:after="60"/>
+        <w:ind w:left="403" w:hanging="403"/>
+        <w:jc w:val="left"/>
+        <w:keepNext w:val="0"/>
+        <w:keepLines w:val="0"/>
+        <w:widowControl w:val="1"/>
+      </w:pPr>
+      <w:r>
+        <w:rPr>
+          <w:rFonts w:ascii="Georgia" w:hAnsi="Georgia"/>
+          <w:sz w:val="18"/>
+        </w:rPr>
+        <w:t xml:space="preserve">18. </w:t>
+      </w:r>
+      <w:r>
+        <w:t xml:space="preserve">Elshall, A. S., &amp; Badir, A. (2025). Balancing AI-Assisted Learning and Traditional Assessment: The FACT Assessment in Environmental Data Science Education.</w:t>
+      </w:r>
+      <w:r>
+        <w:t xml:space="preserve"> </w:t>
+      </w:r>
+      <w:r>
+        <w:rPr>
+          <w:i/>
+          <w:iCs/>
+        </w:rPr>
+        <w:t xml:space="preserve">Frontiers in Education</w:t>
+      </w:r>
+      <w:r>
+        <w:t xml:space="preserve">, 10, 1596462. https://doi.org/10.3389/feduc.2025.1596462</w:t>
+      </w:r>
+    </w:p>
+    <w:p>
+      <w:pPr>
+        <w:pStyle w:val="ReferenceEntry"/>
+        <w:spacing w:after="60"/>
+        <w:ind w:left="403" w:hanging="403"/>
+        <w:jc w:val="left"/>
+        <w:keepNext w:val="0"/>
+        <w:keepLines w:val="0"/>
+        <w:widowControl w:val="1"/>
+      </w:pPr>
+      <w:r>
+        <w:rPr>
+          <w:rFonts w:ascii="Georgia" w:hAnsi="Georgia"/>
+          <w:sz w:val="18"/>
+        </w:rPr>
+        <w:t xml:space="preserve">19. </w:t>
+      </w:r>
+      <w:r>
+        <w:t xml:space="preserve">Facione, P. A. (1990). Critical Thinking: A Statement of Expert Consensus for Purposes of Educational Assessment and Instruction (The Delphi Report).</w:t>
+      </w:r>
+      <w:r>
+        <w:t xml:space="preserve"> </w:t>
+      </w:r>
+      <w:r>
+        <w:rPr>
+          <w:i/>
+          <w:iCs/>
+        </w:rPr>
+        <w:t xml:space="preserve">American Philosophical Association</w:t>
+      </w:r>
+      <w:r>
+        <w:t xml:space="preserve">.</w:t>
+      </w:r>
+    </w:p>
+    <w:p>
+      <w:pPr>
+        <w:pStyle w:val="ReferenceEntry"/>
+        <w:spacing w:after="60"/>
+        <w:ind w:left="403" w:hanging="403"/>
+        <w:jc w:val="left"/>
+        <w:keepNext w:val="0"/>
+        <w:keepLines w:val="0"/>
+        <w:widowControl w:val="1"/>
+      </w:pPr>
+      <w:r>
+        <w:rPr>
+          <w:rFonts w:ascii="Georgia" w:hAnsi="Georgia"/>
+          <w:sz w:val="18"/>
+        </w:rPr>
+        <w:t xml:space="preserve">20. </w:t>
+      </w:r>
+      <w:r>
+        <w:t xml:space="preserve">Fan, Y., Tang, L., Le, H., Shen, K., Tan, S., Zhao, Y., Shen, Y., Li, X., &amp; Gašević, D. (2025). Beware of Metacognitive Laziness: Effects of Generative Artificial Intelligence on Learning Motivation, Processes, and Performance.</w:t>
+      </w:r>
+      <w:r>
+        <w:t xml:space="preserve"> </w:t>
+      </w:r>
+      <w:r>
+        <w:rPr>
+          <w:i/>
+          <w:iCs/>
+        </w:rPr>
+        <w:t xml:space="preserve">British Journal of Educational Technology</w:t>
+      </w:r>
+      <w:r>
+        <w:t xml:space="preserve">, 56(2), 489–530. https://doi.org/10.1111/bjet.13544</w:t>
+      </w:r>
+    </w:p>
+    <w:p>
+      <w:pPr>
+        <w:pStyle w:val="ReferenceEntry"/>
+        <w:spacing w:after="60"/>
+        <w:ind w:left="403" w:hanging="403"/>
+        <w:jc w:val="left"/>
+        <w:keepNext w:val="0"/>
+        <w:keepLines w:val="0"/>
+        <w:widowControl w:val="1"/>
+      </w:pPr>
+      <w:r>
+        <w:rPr>
+          <w:rFonts w:ascii="Georgia" w:hAnsi="Georgia"/>
+          <w:sz w:val="18"/>
+        </w:rPr>
+        <w:t xml:space="preserve">21. </w:t>
+      </w:r>
+      <w:r>
+        <w:t xml:space="preserve">Feng, Y., Wang, S., Cheng, Z., Wan, Y., &amp; Chen, D. (2025). Are We on the Right Way to Assessing LLM-as-a-Judge?.</w:t>
+      </w:r>
+      <w:r>
+        <w:t xml:space="preserve"> </w:t>
+      </w:r>
+      <w:r>
+        <w:rPr>
+          <w:i/>
+          <w:iCs/>
+        </w:rPr>
+        <w:t xml:space="preserve">arXiv preprint arXiv:2512.16041</w:t>
+      </w:r>
+      <w:r>
+        <w:t xml:space="preserve">.</w:t>
+      </w:r>
+    </w:p>
+    <w:p>
+      <w:pPr>
+        <w:pStyle w:val="ReferenceEntry"/>
+        <w:spacing w:after="60"/>
+        <w:ind w:left="403" w:hanging="403"/>
+        <w:jc w:val="left"/>
+        <w:keepNext w:val="0"/>
+        <w:keepLines w:val="0"/>
+        <w:widowControl w:val="1"/>
+      </w:pPr>
+      <w:r>
+        <w:rPr>
+          <w:rFonts w:ascii="Georgia" w:hAnsi="Georgia"/>
+          <w:sz w:val="18"/>
+        </w:rPr>
+        <w:t xml:space="preserve">22. </w:t>
+      </w:r>
+      <w:r>
+        <w:t xml:space="preserve">Fernandes, D., Villa, S., Nicholls, S., Haavisto, O., Buschek, D., Schmidt, A., Kosch, T., Shen, C., &amp; Welsch, R. (2024). Performance and Metacognition Disconnect when Reasoning in Human-AI Interaction.</w:t>
+      </w:r>
+      <w:r>
+        <w:t xml:space="preserve"> </w:t>
+      </w:r>
+      <w:r>
+        <w:rPr>
+          <w:i/>
+          <w:iCs/>
+        </w:rPr>
+        <w:t xml:space="preserve">arXiv preprint arXiv:2409.16708</w:t>
+      </w:r>
+      <w:r>
+        <w:t xml:space="preserve">.</w:t>
+      </w:r>
+    </w:p>
+    <w:p>
+      <w:pPr>
+        <w:pStyle w:val="ReferenceEntry"/>
+        <w:spacing w:after="60"/>
+        <w:ind w:left="403" w:hanging="403"/>
+        <w:jc w:val="left"/>
+        <w:keepNext w:val="0"/>
+        <w:keepLines w:val="0"/>
+        <w:widowControl w:val="1"/>
+      </w:pPr>
+      <w:r>
+        <w:rPr>
+          <w:rFonts w:ascii="Georgia" w:hAnsi="Georgia"/>
+          <w:sz w:val="18"/>
+        </w:rPr>
+        <w:t xml:space="preserve">23. </w:t>
+      </w:r>
+      <w:r>
+        <w:t xml:space="preserve">Flavell, J. H. (1979). Metacognition and Cognitive Monitoring: A New Area of Cognitive-Developmental Inquiry.</w:t>
+      </w:r>
+      <w:r>
+        <w:t xml:space="preserve"> </w:t>
+      </w:r>
+      <w:r>
+        <w:rPr>
+          <w:i/>
+          <w:iCs/>
+        </w:rPr>
+        <w:t xml:space="preserve">American Psychologist</w:t>
+      </w:r>
+      <w:r>
+        <w:t xml:space="preserve">, 34(10), 906–911.</w:t>
+      </w:r>
+    </w:p>
+    <w:p>
+      <w:pPr>
+        <w:pStyle w:val="ReferenceEntry"/>
+        <w:spacing w:after="60"/>
+        <w:ind w:left="403" w:hanging="403"/>
+        <w:jc w:val="left"/>
+        <w:keepNext w:val="0"/>
+        <w:keepLines w:val="0"/>
+        <w:widowControl w:val="1"/>
+      </w:pPr>
+      <w:r>
+        <w:rPr>
+          <w:rFonts w:ascii="Georgia" w:hAnsi="Georgia"/>
+          <w:sz w:val="18"/>
+        </w:rPr>
+        <w:t xml:space="preserve">24. </w:t>
+      </w:r>
+      <w:r>
+        <w:t xml:space="preserve">Ganuthula, V. R. R., &amp; Balaraman, K. K. (2025). Artificial Intelligence Quotient Framework for Measuring Human Collaboration with Artificial Intelligence.</w:t>
+      </w:r>
+      <w:r>
+        <w:t xml:space="preserve"> </w:t>
+      </w:r>
+      <w:r>
+        <w:rPr>
+          <w:i/>
+          <w:iCs/>
+        </w:rPr>
+        <w:t xml:space="preserve">Discover Artificial Intelligence</w:t>
+      </w:r>
+      <w:r>
+        <w:t xml:space="preserve">, 5, 268. https://doi.org/10.1007/s44163-025-00516-1</w:t>
+      </w:r>
+    </w:p>
+    <w:p>
+      <w:pPr>
+        <w:pStyle w:val="ReferenceEntry"/>
+        <w:spacing w:after="60"/>
+        <w:ind w:left="403" w:hanging="403"/>
+        <w:jc w:val="left"/>
+        <w:keepNext w:val="0"/>
+        <w:keepLines w:val="0"/>
+        <w:widowControl w:val="1"/>
+      </w:pPr>
+      <w:r>
+        <w:rPr>
+          <w:rFonts w:ascii="Georgia" w:hAnsi="Georgia"/>
+          <w:sz w:val="18"/>
+        </w:rPr>
+        <w:t xml:space="preserve">25. </w:t>
+      </w:r>
+      <w:r>
+        <w:t xml:space="preserve">Gerlich, M. (2025). AI Tools in Society: Impacts on Cognitive Offloading and the Future of Critical Thinking.</w:t>
+      </w:r>
+      <w:r>
+        <w:t xml:space="preserve"> </w:t>
+      </w:r>
+      <w:r>
+        <w:rPr>
+          <w:i/>
+          <w:iCs/>
+        </w:rPr>
+        <w:t xml:space="preserve">Societies</w:t>
+      </w:r>
+      <w:r>
+        <w:t xml:space="preserve">, 15(1), 6.</w:t>
+      </w:r>
+    </w:p>
+    <w:p>
+      <w:pPr>
+        <w:pStyle w:val="ReferenceEntry"/>
+        <w:spacing w:after="60"/>
+        <w:ind w:left="403" w:hanging="403"/>
+        <w:jc w:val="left"/>
+        <w:keepNext w:val="0"/>
+        <w:keepLines w:val="0"/>
+        <w:widowControl w:val="1"/>
+      </w:pPr>
+      <w:r>
+        <w:rPr>
+          <w:rFonts w:ascii="Georgia" w:hAnsi="Georgia"/>
+          <w:sz w:val="18"/>
+        </w:rPr>
+        <w:t xml:space="preserve">26. </w:t>
+      </w:r>
+      <w:r>
+        <w:t xml:space="preserve">Gilson, L. L., &amp; Goldberg, C. B. (2015). Editors' Comment: So, What Is a Conceptual Paper?.</w:t>
+      </w:r>
+      <w:r>
+        <w:t xml:space="preserve"> </w:t>
+      </w:r>
+      <w:r>
+        <w:rPr>
+          <w:i/>
+          <w:iCs/>
+        </w:rPr>
+        <w:t xml:space="preserve">Group &amp; Organization Management</w:t>
+      </w:r>
+      <w:r>
+        <w:t xml:space="preserve">, 40(2), 127–130. https://doi.org/10.1177/1059601115576425</w:t>
+      </w:r>
+    </w:p>
+    <w:p>
+      <w:pPr>
+        <w:pStyle w:val="ReferenceEntry"/>
+        <w:spacing w:after="60"/>
+        <w:ind w:left="403" w:hanging="403"/>
+        <w:jc w:val="left"/>
+        <w:keepNext w:val="0"/>
+        <w:keepLines w:val="0"/>
+        <w:widowControl w:val="1"/>
+      </w:pPr>
+      <w:r>
+        <w:rPr>
+          <w:rFonts w:ascii="Georgia" w:hAnsi="Georgia"/>
+          <w:sz w:val="18"/>
+        </w:rPr>
+        <w:t xml:space="preserve">27. </w:t>
+      </w:r>
+      <w:r>
+        <w:t xml:space="preserve">Große, C. S., &amp; Renkl, A. (2007). Finding and Fixing Errors in Worked Examples: Can This Foster Learning Outcomes?.</w:t>
+      </w:r>
+      <w:r>
+        <w:t xml:space="preserve"> </w:t>
+      </w:r>
+      <w:r>
+        <w:rPr>
+          <w:i/>
+          <w:iCs/>
+        </w:rPr>
+        <w:t xml:space="preserve">Learning and Instruction</w:t>
+      </w:r>
+      <w:r>
+        <w:t xml:space="preserve">, 17(6), 612–634. https://doi.org/10.1016/j.learninstruc.2007.09.008</w:t>
+      </w:r>
+    </w:p>
+    <w:p>
+      <w:pPr>
+        <w:pStyle w:val="ReferenceEntry"/>
+        <w:spacing w:after="60"/>
+        <w:ind w:left="403" w:hanging="403"/>
+        <w:jc w:val="left"/>
+        <w:keepNext w:val="0"/>
+        <w:keepLines w:val="0"/>
+        <w:widowControl w:val="1"/>
+      </w:pPr>
+      <w:r>
+        <w:rPr>
+          <w:rFonts w:ascii="Georgia" w:hAnsi="Georgia"/>
+          <w:sz w:val="18"/>
+        </w:rPr>
+        <w:t xml:space="preserve">28. </w:t>
+      </w:r>
+      <w:r>
+        <w:t xml:space="preserve">Gu, X., &amp; Ericson, B. J. (2025). AI Literacy in K-12 and Higher Education in the Wake of Generative AI: An Integrative Review.</w:t>
+      </w:r>
+      <w:r>
+        <w:t xml:space="preserve"> </w:t>
+      </w:r>
+      <w:r>
+        <w:rPr>
+          <w:i/>
+          <w:iCs/>
+        </w:rPr>
+        <w:t xml:space="preserve">Proceedings of the 2025 ACM Conference on International Computing Education Research (ICER)</w:t>
+      </w:r>
+      <w:r>
+        <w:t xml:space="preserve">, 125–140. https://doi.org/10.1145/3702652.3744217</w:t>
+      </w:r>
+    </w:p>
+    <w:p>
+      <w:pPr>
+        <w:pStyle w:val="ReferenceEntry"/>
+        <w:spacing w:after="60"/>
+        <w:ind w:left="403" w:hanging="403"/>
+        <w:jc w:val="left"/>
+        <w:keepNext w:val="0"/>
+        <w:keepLines w:val="0"/>
+        <w:widowControl w:val="1"/>
+      </w:pPr>
+      <w:r>
+        <w:rPr>
+          <w:rFonts w:ascii="Georgia" w:hAnsi="Georgia"/>
+          <w:sz w:val="18"/>
+        </w:rPr>
+        <w:t xml:space="preserve">29. </w:t>
+      </w:r>
+      <w:r>
+        <w:t xml:space="preserve">Hattie, J., &amp; Timperley, H. (2007). The Power of Feedback.</w:t>
+      </w:r>
+      <w:r>
+        <w:t xml:space="preserve"> </w:t>
+      </w:r>
+      <w:r>
+        <w:rPr>
+          <w:i/>
+          <w:iCs/>
+        </w:rPr>
+        <w:t xml:space="preserve">Review of Educational Research</w:t>
+      </w:r>
+      <w:r>
+        <w:t xml:space="preserve">, 77(1), 81–112.</w:t>
+      </w:r>
+    </w:p>
+    <w:p>
+      <w:pPr>
+        <w:pStyle w:val="ReferenceEntry"/>
+        <w:spacing w:after="60"/>
+        <w:ind w:left="403" w:hanging="403"/>
+        <w:jc w:val="left"/>
+        <w:keepNext w:val="0"/>
+        <w:keepLines w:val="0"/>
+        <w:widowControl w:val="1"/>
+      </w:pPr>
+      <w:r>
+        <w:rPr>
+          <w:rFonts w:ascii="Georgia" w:hAnsi="Georgia"/>
+          <w:sz w:val="18"/>
+        </w:rPr>
+        <w:t xml:space="preserve">30. </w:t>
+      </w:r>
+      <w:r>
+        <w:t xml:space="preserve">Jaakkola, E. (2020). Designing Conceptual Articles: Four Approaches.</w:t>
+      </w:r>
+      <w:r>
+        <w:t xml:space="preserve"> </w:t>
+      </w:r>
+      <w:r>
+        <w:rPr>
+          <w:i/>
+          <w:iCs/>
+        </w:rPr>
+        <w:t xml:space="preserve">AMS Review</w:t>
+      </w:r>
+      <w:r>
+        <w:t xml:space="preserve">, 10, 18–26.</w:t>
+      </w:r>
+    </w:p>
+    <w:p>
+      <w:pPr>
+        <w:pStyle w:val="ReferenceEntry"/>
+        <w:spacing w:after="60"/>
+        <w:ind w:left="403" w:hanging="403"/>
+        <w:jc w:val="left"/>
+        <w:keepNext w:val="0"/>
+        <w:keepLines w:val="0"/>
+        <w:widowControl w:val="1"/>
+      </w:pPr>
+      <w:r>
+        <w:rPr>
+          <w:rFonts w:ascii="Georgia" w:hAnsi="Georgia"/>
+          <w:sz w:val="18"/>
+        </w:rPr>
+        <w:t xml:space="preserve">31. </w:t>
+      </w:r>
+      <w:r>
+        <w:t xml:space="preserve">Jin, Y., Martinez-Maldonado, R., Gašević, D., &amp; Yan, L. (2024). GLAT: The Generative AI Literacy Assessment Test.</w:t>
+      </w:r>
+      <w:r>
+        <w:t xml:space="preserve"> </w:t>
+      </w:r>
+      <w:r>
+        <w:rPr>
+          <w:i/>
+          <w:iCs/>
+        </w:rPr>
+        <w:t xml:space="preserve">arXiv preprint arXiv:2411.00283</w:t>
+      </w:r>
+      <w:r>
+        <w:t xml:space="preserve">.</w:t>
+      </w:r>
+    </w:p>
+    <w:p>
+      <w:pPr>
+        <w:pStyle w:val="ReferenceEntry"/>
+        <w:spacing w:after="60"/>
+        <w:ind w:left="403" w:hanging="403"/>
+        <w:jc w:val="left"/>
+        <w:keepNext w:val="0"/>
+        <w:keepLines w:val="0"/>
+        <w:widowControl w:val="1"/>
+      </w:pPr>
+      <w:r>
+        <w:rPr>
+          <w:rFonts w:ascii="Georgia" w:hAnsi="Georgia"/>
+          <w:sz w:val="18"/>
+        </w:rPr>
+        <w:t xml:space="preserve">32. </w:t>
+      </w:r>
+      <w:r>
+        <w:t xml:space="preserve">Kane, M. T. (2013). Validating the Interpretations and Uses of Test Scores.</w:t>
+      </w:r>
+      <w:r>
+        <w:t xml:space="preserve"> </w:t>
+      </w:r>
+      <w:r>
+        <w:rPr>
+          <w:i/>
+          <w:iCs/>
+        </w:rPr>
+        <w:t xml:space="preserve">Journal of Educational Measurement</w:t>
+      </w:r>
+      <w:r>
+        <w:t xml:space="preserve">, 50(1), 1–73. https://doi.org/10.1111/jedm.12000</w:t>
+      </w:r>
+    </w:p>
+    <w:p>
+      <w:pPr>
+        <w:pStyle w:val="ReferenceEntry"/>
+        <w:spacing w:after="60"/>
+        <w:ind w:left="403" w:hanging="403"/>
+        <w:jc w:val="left"/>
+        <w:keepNext w:val="0"/>
+        <w:keepLines w:val="0"/>
+        <w:widowControl w:val="1"/>
+      </w:pPr>
+      <w:r>
+        <w:rPr>
+          <w:rFonts w:ascii="Georgia" w:hAnsi="Georgia"/>
+          <w:sz w:val="18"/>
+        </w:rPr>
+        <w:t xml:space="preserve">33. </w:t>
+      </w:r>
+      <w:r>
+        <w:t xml:space="preserve">Kapur, M. (2008). Productive Failure.</w:t>
+      </w:r>
+      <w:r>
+        <w:t xml:space="preserve"> </w:t>
+      </w:r>
+      <w:r>
+        <w:rPr>
+          <w:i/>
+          <w:iCs/>
+        </w:rPr>
+        <w:t xml:space="preserve">Cognition and Instruction</w:t>
+      </w:r>
+      <w:r>
+        <w:t xml:space="preserve">, 26(3), 379–424.</w:t>
+      </w:r>
+    </w:p>
+    <w:p>
+      <w:pPr>
+        <w:pStyle w:val="ReferenceEntry"/>
+        <w:spacing w:after="60"/>
+        <w:ind w:left="403" w:hanging="403"/>
+        <w:jc w:val="left"/>
+        <w:keepNext w:val="0"/>
+        <w:keepLines w:val="0"/>
+        <w:widowControl w:val="1"/>
+      </w:pPr>
+      <w:r>
+        <w:rPr>
+          <w:rFonts w:ascii="Georgia" w:hAnsi="Georgia"/>
+          <w:sz w:val="18"/>
+        </w:rPr>
+        <w:t xml:space="preserve">34. </w:t>
+      </w:r>
+      <w:r>
+        <w:t xml:space="preserve">Kim, P., Wang, W., &amp; Bonk, C. J. (2025). Generative AI as a Coach to Help Students Enhance Proficiency in Question Formulation.</w:t>
+      </w:r>
+      <w:r>
+        <w:t xml:space="preserve"> </w:t>
+      </w:r>
+      <w:r>
+        <w:rPr>
+          <w:i/>
+          <w:iCs/>
+        </w:rPr>
+        <w:t xml:space="preserve">Journal of Educational Computing Research</w:t>
+      </w:r>
+      <w:r>
+        <w:t xml:space="preserve">, 63(3), 565–586. https://doi.org/10.1177/07356331251314222</w:t>
+      </w:r>
+    </w:p>
+    <w:p>
+      <w:pPr>
+        <w:pStyle w:val="ReferenceEntry"/>
+        <w:spacing w:after="60"/>
+        <w:ind w:left="403" w:hanging="403"/>
+        <w:jc w:val="left"/>
+        <w:keepNext w:val="0"/>
+        <w:keepLines w:val="0"/>
+        <w:widowControl w:val="1"/>
+      </w:pPr>
+      <w:r>
+        <w:rPr>
+          <w:rFonts w:ascii="Georgia" w:hAnsi="Georgia"/>
+          <w:sz w:val="18"/>
+        </w:rPr>
+        <w:t xml:space="preserve">35. </w:t>
+      </w:r>
+      <w:r>
+        <w:t xml:space="preserve">Kosmyna, N., Hauptmann, E., Yuan, Y. T., Situ, J., Liao, X., Beresnitzky, A. V., Braunstein, I., &amp; Maes, P. (2025). Your Brain on ChatGPT: Accumulation of Cognitive Debt when Using an AI Assistant for Essay Writing Task.</w:t>
+      </w:r>
+      <w:r>
+        <w:t xml:space="preserve"> </w:t>
+      </w:r>
+      <w:r>
+        <w:rPr>
+          <w:i/>
+          <w:iCs/>
+        </w:rPr>
+        <w:t xml:space="preserve">arXiv preprint arXiv:2506.08872</w:t>
+      </w:r>
+      <w:r>
+        <w:t xml:space="preserve">.</w:t>
+      </w:r>
+    </w:p>
+    <w:p>
+      <w:pPr>
+        <w:pStyle w:val="ReferenceEntry"/>
+        <w:spacing w:after="60"/>
+        <w:ind w:left="403" w:hanging="403"/>
+        <w:jc w:val="left"/>
+        <w:keepNext w:val="0"/>
+        <w:keepLines w:val="0"/>
+        <w:widowControl w:val="1"/>
+      </w:pPr>
+      <w:r>
+        <w:rPr>
+          <w:rFonts w:ascii="Georgia" w:hAnsi="Georgia"/>
+          <w:sz w:val="18"/>
+        </w:rPr>
+        <w:t xml:space="preserve">36. </w:t>
+      </w:r>
+      <w:r>
+        <w:t xml:space="preserve">Lee, H., &amp; Bosch, N. (2025). Calibration Discrepancy Predicts Students' Subsequent Metacognitive Strategy Use in Computer-Based Learning Environments.</w:t>
+      </w:r>
+      <w:r>
+        <w:t xml:space="preserve"> </w:t>
+      </w:r>
+      <w:r>
+        <w:rPr>
+          <w:i/>
+          <w:iCs/>
+        </w:rPr>
+        <w:t xml:space="preserve">International Journal of Artificial Intelligence in Education</w:t>
+      </w:r>
+      <w:r>
+        <w:t xml:space="preserve">, 35(6), 3746–3779. https://doi.org/10.1007/s40593-025-00514-5</w:t>
+      </w:r>
+    </w:p>
+    <w:p>
+      <w:pPr>
+        <w:pStyle w:val="ReferenceEntry"/>
+        <w:spacing w:after="60"/>
+        <w:ind w:left="403" w:hanging="403"/>
+        <w:jc w:val="left"/>
+        <w:keepNext w:val="0"/>
+        <w:keepLines w:val="0"/>
+        <w:widowControl w:val="1"/>
+      </w:pPr>
+      <w:r>
+        <w:rPr>
+          <w:rFonts w:ascii="Georgia" w:hAnsi="Georgia"/>
+          <w:sz w:val="18"/>
+        </w:rPr>
+        <w:t xml:space="preserve">37. </w:t>
+      </w:r>
+      <w:r>
+        <w:t xml:space="preserve">Lee, J. D., &amp; See, K. A. (2004). Trust in Automation: Designing for Appropriate Reliance.</w:t>
+      </w:r>
+      <w:r>
+        <w:t xml:space="preserve"> </w:t>
+      </w:r>
+      <w:r>
+        <w:rPr>
+          <w:i/>
+          <w:iCs/>
+        </w:rPr>
+        <w:t xml:space="preserve">Human Factors</w:t>
+      </w:r>
+      <w:r>
+        <w:t xml:space="preserve">, 46(1), 50–80.</w:t>
+      </w:r>
+    </w:p>
+    <w:p>
+      <w:pPr>
+        <w:pStyle w:val="ReferenceEntry"/>
+        <w:spacing w:after="60"/>
+        <w:ind w:left="403" w:hanging="403"/>
+        <w:jc w:val="left"/>
+        <w:keepNext w:val="0"/>
+        <w:keepLines w:val="0"/>
+        <w:widowControl w:val="1"/>
+      </w:pPr>
+      <w:r>
+        <w:rPr>
+          <w:rFonts w:ascii="Georgia" w:hAnsi="Georgia"/>
+          <w:sz w:val="18"/>
+        </w:rPr>
+        <w:t xml:space="preserve">38. </w:t>
+      </w:r>
+      <w:r>
+        <w:t xml:space="preserve">Lee, S. C., Baby, T., Vongvit, R., Lee, J., Kim, Y., Min, C., &amp; Yoon, S. H. (2025). Development and Validation of a Generative AI Competence Scale.</w:t>
+      </w:r>
+      <w:r>
+        <w:t xml:space="preserve"> </w:t>
+      </w:r>
+      <w:r>
+        <w:rPr>
+          <w:i/>
+          <w:iCs/>
+        </w:rPr>
+        <w:t xml:space="preserve">Technology in Society</w:t>
+      </w:r>
+      <w:r>
+        <w:t xml:space="preserve">. https://doi.org/10.1016/j.techsoc.2025.103059</w:t>
+      </w:r>
+    </w:p>
+    <w:p>
+      <w:pPr>
+        <w:pStyle w:val="ReferenceEntry"/>
+        <w:spacing w:after="60"/>
+        <w:ind w:left="403" w:hanging="403"/>
+        <w:jc w:val="left"/>
+        <w:keepNext w:val="0"/>
+        <w:keepLines w:val="0"/>
+        <w:widowControl w:val="1"/>
+      </w:pPr>
+      <w:r>
+        <w:rPr>
+          <w:rFonts w:ascii="Georgia" w:hAnsi="Georgia"/>
+          <w:sz w:val="18"/>
+        </w:rPr>
+        <w:t xml:space="preserve">39. </w:t>
+      </w:r>
+      <w:r>
+        <w:t xml:space="preserve">Li, C., Cui, H., &amp; Hagedorn, L. S. (2026). The Cognitive Impact of ChatGPT in Higher Education: A Systematic Review of Critical and Creative Thinking Outcomes.</w:t>
+      </w:r>
+      <w:r>
+        <w:t xml:space="preserve"> </w:t>
+      </w:r>
+      <w:r>
+        <w:rPr>
+          <w:i/>
+          <w:iCs/>
+        </w:rPr>
+        <w:t xml:space="preserve">Computers and Education: Artificial Intelligence</w:t>
+      </w:r>
+      <w:r>
+        <w:t xml:space="preserve">, 10, 100571. https://doi.org/10.1016/j.caeai.2026.100571</w:t>
+      </w:r>
+    </w:p>
+    <w:p>
+      <w:pPr>
+        <w:pStyle w:val="ReferenceEntry"/>
+        <w:spacing w:after="60"/>
+        <w:ind w:left="403" w:hanging="403"/>
+        <w:jc w:val="left"/>
+        <w:keepNext w:val="0"/>
+        <w:keepLines w:val="0"/>
+        <w:widowControl w:val="1"/>
+      </w:pPr>
+      <w:r>
+        <w:rPr>
+          <w:rFonts w:ascii="Georgia" w:hAnsi="Georgia"/>
+          <w:sz w:val="18"/>
+        </w:rPr>
+        <w:t xml:space="preserve">40. </w:t>
+      </w:r>
+      <w:r>
+        <w:t xml:space="preserve">Lo, L. S. (2023). The CLEAR Path: A Framework for Enhancing Information Literacy through Prompt Engineering.</w:t>
+      </w:r>
+      <w:r>
+        <w:t xml:space="preserve"> </w:t>
+      </w:r>
+      <w:r>
+        <w:rPr>
+          <w:i/>
+          <w:iCs/>
+        </w:rPr>
+        <w:t xml:space="preserve">The Journal of Academic Librarianship</w:t>
+      </w:r>
+      <w:r>
+        <w:t xml:space="preserve">, 49(4).</w:t>
+      </w:r>
+    </w:p>
+    <w:p>
+      <w:pPr>
+        <w:pStyle w:val="ReferenceEntry"/>
+        <w:spacing w:after="60"/>
+        <w:ind w:left="403" w:hanging="403"/>
+        <w:jc w:val="left"/>
+        <w:keepNext w:val="0"/>
+        <w:keepLines w:val="0"/>
+        <w:widowControl w:val="1"/>
+      </w:pPr>
+      <w:r>
+        <w:rPr>
+          <w:rFonts w:ascii="Georgia" w:hAnsi="Georgia"/>
+          <w:sz w:val="18"/>
+        </w:rPr>
+        <w:t xml:space="preserve">41. </w:t>
+      </w:r>
+      <w:r>
+        <w:t xml:space="preserve">Long, D., &amp; Magerko, B. (2020). What Is AI Literacy? Competencies and Design Considerations.</w:t>
+      </w:r>
+      <w:r>
+        <w:t xml:space="preserve"> </w:t>
+      </w:r>
+      <w:r>
+        <w:rPr>
+          <w:i/>
+          <w:iCs/>
+        </w:rPr>
+        <w:t xml:space="preserve">Proceedings of the 2020 CHI Conference on Human Factors in Computing Systems</w:t>
+      </w:r>
+      <w:r>
+        <w:t xml:space="preserve">, 1–16.</w:t>
+      </w:r>
+    </w:p>
+    <w:p>
+      <w:pPr>
+        <w:pStyle w:val="ReferenceEntry"/>
+        <w:spacing w:after="60"/>
+        <w:ind w:left="403" w:hanging="403"/>
+        <w:jc w:val="left"/>
+        <w:keepNext w:val="0"/>
+        <w:keepLines w:val="0"/>
+        <w:widowControl w:val="1"/>
+      </w:pPr>
+      <w:r>
+        <w:rPr>
+          <w:rFonts w:ascii="Georgia" w:hAnsi="Georgia"/>
+          <w:sz w:val="18"/>
+        </w:rPr>
+        <w:t xml:space="preserve">42. </w:t>
+      </w:r>
+      <w:r>
+        <w:t xml:space="preserve">McNichols, H., Ikram, F., &amp; Lan, A. (2025). The StudyChat Dataset: Student Dialogues With ChatGPT in an Artificial Intelligence Course.</w:t>
+      </w:r>
+      <w:r>
+        <w:t xml:space="preserve"> </w:t>
+      </w:r>
+      <w:r>
+        <w:rPr>
+          <w:i/>
+          <w:iCs/>
+        </w:rPr>
+        <w:t xml:space="preserve">arXiv preprint arXiv:2503.07928</w:t>
+      </w:r>
+      <w:r>
+        <w:t xml:space="preserve">. https://doi.org/10.48550/arXiv.2503.07928</w:t>
+      </w:r>
+    </w:p>
+    <w:p>
+      <w:pPr>
+        <w:pStyle w:val="ReferenceEntry"/>
+        <w:spacing w:after="60"/>
+        <w:ind w:left="403" w:hanging="403"/>
+        <w:jc w:val="left"/>
+        <w:keepNext w:val="0"/>
+        <w:keepLines w:val="0"/>
+        <w:widowControl w:val="1"/>
+      </w:pPr>
+      <w:r>
+        <w:rPr>
+          <w:rFonts w:ascii="Georgia" w:hAnsi="Georgia"/>
+          <w:sz w:val="18"/>
+        </w:rPr>
+        <w:t xml:space="preserve">43. </w:t>
+      </w:r>
+      <w:r>
+        <w:t xml:space="preserve">Messick, S. (1995). Validity of Psychological Assessment: Validation of Inferences from Persons' Responses and Performances as Scientific Inquiry into Score Meaning.</w:t>
+      </w:r>
+      <w:r>
+        <w:t xml:space="preserve"> </w:t>
+      </w:r>
+      <w:r>
+        <w:rPr>
+          <w:i/>
+          <w:iCs/>
+        </w:rPr>
+        <w:t xml:space="preserve">American Psychologist</w:t>
+      </w:r>
+      <w:r>
+        <w:t xml:space="preserve">, 50(9), 741–749. https://doi.org/10.1037/0003-066X.50.9.741</w:t>
+      </w:r>
+    </w:p>
+    <w:p>
+      <w:pPr>
+        <w:pStyle w:val="ReferenceEntry"/>
+        <w:spacing w:after="60"/>
+        <w:ind w:left="403" w:hanging="403"/>
+        <w:jc w:val="left"/>
+        <w:keepNext w:val="0"/>
+        <w:keepLines w:val="0"/>
+        <w:widowControl w:val="1"/>
+      </w:pPr>
+      <w:r>
+        <w:rPr>
+          <w:rFonts w:ascii="Georgia" w:hAnsi="Georgia"/>
+          <w:sz w:val="18"/>
+        </w:rPr>
+        <w:t xml:space="preserve">44. </w:t>
+      </w:r>
+      <w:r>
+        <w:t xml:space="preserve">Nazaretsky, T., Gabbay, H., &amp; Käser, T. (2025). Can Students Judge Like Experts? A Large-Scale Study on AI and Human Personalized Formative Feedback.</w:t>
+      </w:r>
+      <w:r>
+        <w:t xml:space="preserve"> </w:t>
+      </w:r>
+      <w:r>
+        <w:rPr>
+          <w:i/>
+          <w:iCs/>
+        </w:rPr>
+        <w:t xml:space="preserve">Computers and Education: Artificial Intelligence</w:t>
+      </w:r>
+      <w:r>
+        <w:t xml:space="preserve">. https://doi.org/10.1016/j.caeai.2025.100533</w:t>
+      </w:r>
+    </w:p>
+    <w:p>
+      <w:pPr>
+        <w:pStyle w:val="ReferenceEntry"/>
+        <w:spacing w:after="60"/>
+        <w:ind w:left="403" w:hanging="403"/>
+        <w:jc w:val="left"/>
+        <w:keepNext w:val="0"/>
+        <w:keepLines w:val="0"/>
+        <w:widowControl w:val="1"/>
+      </w:pPr>
+      <w:r>
+        <w:rPr>
+          <w:rFonts w:ascii="Georgia" w:hAnsi="Georgia"/>
+          <w:sz w:val="18"/>
+        </w:rPr>
+        <w:t xml:space="preserve">45. </w:t>
+      </w:r>
+      <w:r>
+        <w:t xml:space="preserve">Nelson, T. O., &amp; Narens, L. (1990). Metamemory: A Theoretical Framework and New Findings.</w:t>
+      </w:r>
+      <w:r>
+        <w:t xml:space="preserve"> </w:t>
+      </w:r>
+      <w:r>
+        <w:rPr>
+          <w:i/>
+          <w:iCs/>
+        </w:rPr>
+        <w:t xml:space="preserve">The Psychology of Learning and Motivation</w:t>
+      </w:r>
+      <w:r>
+        <w:t xml:space="preserve">, 26, 125–173.</w:t>
+      </w:r>
+    </w:p>
+    <w:p>
+      <w:pPr>
+        <w:pStyle w:val="ReferenceEntry"/>
+        <w:spacing w:after="60"/>
+        <w:ind w:left="403" w:hanging="403"/>
+        <w:jc w:val="left"/>
+        <w:keepNext w:val="0"/>
+        <w:keepLines w:val="0"/>
+        <w:widowControl w:val="1"/>
+      </w:pPr>
+      <w:r>
+        <w:rPr>
+          <w:rFonts w:ascii="Georgia" w:hAnsi="Georgia"/>
+          <w:sz w:val="18"/>
+        </w:rPr>
+        <w:t xml:space="preserve">46. </w:t>
+      </w:r>
+      <w:r>
+        <w:t xml:space="preserve">Parasuraman, R., &amp; Manzey, D. H. (2010). Complacency and Bias in Human Use of Automation: An Attentional Integration.</w:t>
+      </w:r>
+      <w:r>
+        <w:t xml:space="preserve"> </w:t>
+      </w:r>
+      <w:r>
+        <w:rPr>
+          <w:i/>
+          <w:iCs/>
+        </w:rPr>
+        <w:t xml:space="preserve">Human Factors</w:t>
+      </w:r>
+      <w:r>
+        <w:t xml:space="preserve">, 52(3), 381–410.</w:t>
+      </w:r>
+    </w:p>
+    <w:p>
+      <w:pPr>
+        <w:pStyle w:val="ReferenceEntry"/>
+        <w:spacing w:after="60"/>
+        <w:ind w:left="403" w:hanging="403"/>
+        <w:jc w:val="left"/>
+        <w:keepNext w:val="0"/>
+        <w:keepLines w:val="0"/>
+        <w:widowControl w:val="1"/>
+      </w:pPr>
+      <w:r>
+        <w:rPr>
+          <w:rFonts w:ascii="Georgia" w:hAnsi="Georgia"/>
+          <w:sz w:val="18"/>
+        </w:rPr>
+        <w:t xml:space="preserve">47. </w:t>
+      </w:r>
+      <w:r>
+        <w:t xml:space="preserve">Paul, R., &amp; Elder, L. (2006). The Miniature Guide to Critical Thinking: Concepts and Tools.</w:t>
+      </w:r>
+      <w:r>
+        <w:t xml:space="preserve"> </w:t>
+      </w:r>
+      <w:r>
+        <w:rPr>
+          <w:i/>
+          <w:iCs/>
+        </w:rPr>
+        <w:t xml:space="preserve">Foundation for Critical Thinking</w:t>
+      </w:r>
+      <w:r>
+        <w:t xml:space="preserve">.</w:t>
+      </w:r>
+    </w:p>
+    <w:p>
+      <w:pPr>
+        <w:pStyle w:val="ReferenceEntry"/>
+        <w:spacing w:after="60"/>
+        <w:ind w:left="403" w:hanging="403"/>
+        <w:jc w:val="left"/>
+        <w:keepNext w:val="0"/>
+        <w:keepLines w:val="0"/>
+        <w:widowControl w:val="1"/>
+      </w:pPr>
+      <w:r>
+        <w:rPr>
+          <w:rFonts w:ascii="Georgia" w:hAnsi="Georgia"/>
+          <w:sz w:val="18"/>
+        </w:rPr>
+        <w:t xml:space="preserve">48. </w:t>
+      </w:r>
+      <w:r>
+        <w:t xml:space="preserve">Randazzo, B., Lifshitz-Assaf, H., Kellogg, K., Dell'Acqua, F., Mollick, E., Candelon, F., &amp; Lakhani, K. R. (2025). Cyborgs, Centaurs and Self-Automators: Modes of Human-AI Collaboration in Knowledge Work.</w:t>
+      </w:r>
+      <w:r>
+        <w:t xml:space="preserve"> </w:t>
+      </w:r>
+      <w:r>
+        <w:rPr>
+          <w:i/>
+          <w:iCs/>
+        </w:rPr>
+        <w:t xml:space="preserve">Harvard Business School Working Paper 26-036</w:t>
+      </w:r>
+      <w:r>
+        <w:t xml:space="preserve">.</w:t>
+      </w:r>
+    </w:p>
+    <w:p>
+      <w:pPr>
+        <w:pStyle w:val="ReferenceEntry"/>
+        <w:spacing w:after="60"/>
+        <w:ind w:left="403" w:hanging="403"/>
+        <w:jc w:val="left"/>
+        <w:keepNext w:val="0"/>
+        <w:keepLines w:val="0"/>
+        <w:widowControl w:val="1"/>
+      </w:pPr>
+      <w:r>
+        <w:rPr>
+          <w:rFonts w:ascii="Georgia" w:hAnsi="Georgia"/>
+          <w:sz w:val="18"/>
+        </w:rPr>
+        <w:t xml:space="preserve">49. </w:t>
+      </w:r>
+      <w:r>
+        <w:t xml:space="preserve">Runco, M. A., &amp; Chand, I. (1995). Cognition and Creativity.</w:t>
+      </w:r>
+      <w:r>
+        <w:t xml:space="preserve"> </w:t>
+      </w:r>
+      <w:r>
+        <w:rPr>
+          <w:i/>
+          <w:iCs/>
+        </w:rPr>
+        <w:t xml:space="preserve">Educational Psychology Review</w:t>
+      </w:r>
+      <w:r>
+        <w:t xml:space="preserve">, 7(3), 243–267.</w:t>
+      </w:r>
+    </w:p>
+    <w:p>
+      <w:pPr>
+        <w:pStyle w:val="ReferenceEntry"/>
+        <w:spacing w:after="60"/>
+        <w:ind w:left="403" w:hanging="403"/>
+        <w:jc w:val="left"/>
+        <w:keepNext w:val="0"/>
+        <w:keepLines w:val="0"/>
+        <w:widowControl w:val="1"/>
+      </w:pPr>
+      <w:r>
+        <w:rPr>
+          <w:rFonts w:ascii="Georgia" w:hAnsi="Georgia"/>
+          <w:sz w:val="18"/>
+        </w:rPr>
+        <w:t xml:space="preserve">50. </w:t>
+      </w:r>
+      <w:r>
+        <w:t xml:space="preserve">Sadler, D. R. (1989). Formative Assessment and the Design of Instructional Systems.</w:t>
+      </w:r>
+      <w:r>
+        <w:t xml:space="preserve"> </w:t>
+      </w:r>
+      <w:r>
+        <w:rPr>
+          <w:i/>
+          <w:iCs/>
+        </w:rPr>
+        <w:t xml:space="preserve">Instructional Science</w:t>
+      </w:r>
+      <w:r>
+        <w:t xml:space="preserve">, 18(2), 119–144.</w:t>
+      </w:r>
+    </w:p>
+    <w:p>
+      <w:pPr>
+        <w:pStyle w:val="ReferenceEntry"/>
+        <w:spacing w:after="60"/>
+        <w:ind w:left="403" w:hanging="403"/>
+        <w:jc w:val="left"/>
+        <w:keepNext w:val="0"/>
+        <w:keepLines w:val="0"/>
+        <w:widowControl w:val="1"/>
+      </w:pPr>
+      <w:r>
+        <w:rPr>
+          <w:rFonts w:ascii="Georgia" w:hAnsi="Georgia"/>
+          <w:sz w:val="18"/>
+        </w:rPr>
+        <w:t xml:space="preserve">51. </w:t>
+      </w:r>
+      <w:r>
+        <w:t xml:space="preserve">Salomon, G., Perkins, D. N., &amp; Globerson, T. (1991). Partners in Cognition: Extending Human Intelligence with Intelligent Technologies.</w:t>
+      </w:r>
+      <w:r>
+        <w:t xml:space="preserve"> </w:t>
+      </w:r>
+      <w:r>
+        <w:rPr>
+          <w:i/>
+          <w:iCs/>
+        </w:rPr>
+        <w:t xml:space="preserve">Educational Researcher</w:t>
+      </w:r>
+      <w:r>
+        <w:t xml:space="preserve">, 20(3), 2–9.</w:t>
+      </w:r>
+    </w:p>
+    <w:p>
+      <w:pPr>
+        <w:pStyle w:val="ReferenceEntry"/>
+        <w:spacing w:after="60"/>
+        <w:ind w:left="403" w:hanging="403"/>
+        <w:jc w:val="left"/>
+        <w:keepNext w:val="0"/>
+        <w:keepLines w:val="0"/>
+        <w:widowControl w:val="1"/>
+      </w:pPr>
+      <w:r>
+        <w:rPr>
+          <w:rFonts w:ascii="Georgia" w:hAnsi="Georgia"/>
+          <w:sz w:val="18"/>
+        </w:rPr>
+        <w:t xml:space="preserve">52. </w:t>
+      </w:r>
+      <w:r>
+        <w:t xml:space="preserve">Sidra, S., &amp; Mason, C. (2025). Generative AI in Human-AI Collaboration: Validation of the Collaborative AI Literacy and Collaborative AI Metacognition Scales.</w:t>
+      </w:r>
+      <w:r>
+        <w:t xml:space="preserve"> </w:t>
+      </w:r>
+      <w:r>
+        <w:rPr>
+          <w:i/>
+          <w:iCs/>
+        </w:rPr>
+        <w:t xml:space="preserve">International Journal of Human-Computer Interaction</w:t>
+      </w:r>
+      <w:r>
+        <w:t xml:space="preserve">. https://doi.org/10.1080/10447318.2025.2543997</w:t>
+      </w:r>
+    </w:p>
+    <w:p>
+      <w:pPr>
+        <w:pStyle w:val="ReferenceEntry"/>
+        <w:spacing w:after="60"/>
+        <w:ind w:left="403" w:hanging="403"/>
+        <w:jc w:val="left"/>
+        <w:keepNext w:val="0"/>
+        <w:keepLines w:val="0"/>
+        <w:widowControl w:val="1"/>
+      </w:pPr>
+      <w:r>
+        <w:rPr>
+          <w:rFonts w:ascii="Georgia" w:hAnsi="Georgia"/>
+          <w:sz w:val="18"/>
+        </w:rPr>
+        <w:t xml:space="preserve">53. </w:t>
+      </w:r>
+      <w:r>
+        <w:t xml:space="preserve">Sperber, D., Clément, F., Heintz, C., Mascaro, O., Mercier, H., Origgi, G., &amp; Wilson, D. (2010). Epistemic Vigilance.</w:t>
+      </w:r>
+      <w:r>
+        <w:t xml:space="preserve"> </w:t>
+      </w:r>
+      <w:r>
+        <w:rPr>
+          <w:i/>
+          <w:iCs/>
+        </w:rPr>
+        <w:t xml:space="preserve">Mind &amp; Language</w:t>
+      </w:r>
+      <w:r>
+        <w:t xml:space="preserve">, 25(4), 359–393.</w:t>
+      </w:r>
+    </w:p>
+    <w:p>
+      <w:pPr>
+        <w:pStyle w:val="ReferenceEntry"/>
+        <w:spacing w:after="60"/>
+        <w:ind w:left="403" w:hanging="403"/>
+        <w:jc w:val="left"/>
+        <w:keepNext w:val="0"/>
+        <w:keepLines w:val="0"/>
+        <w:widowControl w:val="1"/>
+      </w:pPr>
+      <w:r>
+        <w:rPr>
+          <w:rFonts w:ascii="Georgia" w:hAnsi="Georgia"/>
+          <w:sz w:val="18"/>
+        </w:rPr>
+        <w:t xml:space="preserve">54. </w:t>
+      </w:r>
+      <w:r>
+        <w:t xml:space="preserve">Srinath, S., Vadaparty, A., Smith IV, D. H., Porter, L., &amp; Zingaro, D. (2025). Assessing Problem Decomposition in CS1 for the GenAI Era.</w:t>
+      </w:r>
+      <w:r>
+        <w:t xml:space="preserve"> </w:t>
+      </w:r>
+      <w:r>
+        <w:rPr>
+          <w:i/>
+          <w:iCs/>
+        </w:rPr>
+        <w:t xml:space="preserve">arXiv preprint arXiv:2511.05764</w:t>
+      </w:r>
+      <w:r>
+        <w:t xml:space="preserve">.</w:t>
+      </w:r>
+    </w:p>
+    <w:p>
+      <w:pPr>
+        <w:pStyle w:val="ReferenceEntry"/>
+        <w:spacing w:after="60"/>
+        <w:ind w:left="403" w:hanging="403"/>
+        <w:jc w:val="left"/>
+        <w:keepNext w:val="0"/>
+        <w:keepLines w:val="0"/>
+        <w:widowControl w:val="1"/>
+      </w:pPr>
+      <w:r>
+        <w:rPr>
+          <w:rFonts w:ascii="Georgia" w:hAnsi="Georgia"/>
+          <w:sz w:val="18"/>
+        </w:rPr>
+        <w:t xml:space="preserve">55. </w:t>
+      </w:r>
+      <w:r>
+        <w:t xml:space="preserve">Tankelevitch, L., Kewenig, V., Simkute, A., Scott, A. E., Sarkar, A., Sellen, A., &amp; Rintel, S. (2024). The Metacognitive Demands and Opportunities of Generative AI.</w:t>
+      </w:r>
+      <w:r>
+        <w:t xml:space="preserve"> </w:t>
+      </w:r>
+      <w:r>
+        <w:rPr>
+          <w:i/>
+          <w:iCs/>
+        </w:rPr>
+        <w:t xml:space="preserve">Proceedings of the 2024 CHI Conference on Human Factors in Computing Systems</w:t>
+      </w:r>
+      <w:r>
+        <w:t xml:space="preserve">.</w:t>
+      </w:r>
+    </w:p>
+    <w:p>
+      <w:pPr>
+        <w:pStyle w:val="ReferenceEntry"/>
+        <w:spacing w:after="60"/>
+        <w:ind w:left="403" w:hanging="403"/>
+        <w:jc w:val="left"/>
+        <w:keepNext w:val="0"/>
+        <w:keepLines w:val="0"/>
+        <w:widowControl w:val="1"/>
+      </w:pPr>
+      <w:r>
+        <w:rPr>
+          <w:rFonts w:ascii="Georgia" w:hAnsi="Georgia"/>
+          <w:sz w:val="18"/>
+        </w:rPr>
+        <w:t xml:space="preserve">56. </w:t>
+      </w:r>
+      <w:r>
+        <w:t xml:space="preserve">Tour, E., &amp; Zadorozhnyy, A. (2025). Conceptualizing and Operationalizing Prompt Literacy for English Language Learners.</w:t>
+      </w:r>
+      <w:r>
+        <w:t xml:space="preserve"> </w:t>
+      </w:r>
+      <w:r>
+        <w:rPr>
+          <w:i/>
+          <w:iCs/>
+        </w:rPr>
+        <w:t xml:space="preserve">Journal of Adolescent &amp; Adult Literacy</w:t>
+      </w:r>
+      <w:r>
+        <w:t xml:space="preserve">. https://doi.org/10.1002/jaal.70020</w:t>
+      </w:r>
+    </w:p>
+    <w:p>
+      <w:pPr>
+        <w:pStyle w:val="ReferenceEntry"/>
+        <w:spacing w:after="60"/>
+        <w:ind w:left="403" w:hanging="403"/>
+        <w:jc w:val="left"/>
+        <w:keepNext w:val="0"/>
+        <w:keepLines w:val="0"/>
+        <w:widowControl w:val="1"/>
+      </w:pPr>
+      <w:r>
+        <w:rPr>
+          <w:rFonts w:ascii="Georgia" w:hAnsi="Georgia"/>
+          <w:sz w:val="18"/>
+        </w:rPr>
+        <w:t xml:space="preserve">57. </w:t>
+      </w:r>
+      <w:r>
+        <w:t xml:space="preserve">Vaccaro, M., Almaatouq, A., &amp; Malone, T. (2024). When Combinations of Humans and AI Are Useful: A Systematic Review and Meta-Analysis.</w:t>
+      </w:r>
+      <w:r>
+        <w:t xml:space="preserve"> </w:t>
+      </w:r>
+      <w:r>
+        <w:rPr>
+          <w:i/>
+          <w:iCs/>
+        </w:rPr>
+        <w:t xml:space="preserve">Nature Human Behaviour</w:t>
+      </w:r>
+      <w:r>
+        <w:t xml:space="preserve">, 8, 2293–2303.</w:t>
+      </w:r>
+    </w:p>
+    <w:p>
+      <w:pPr>
+        <w:pStyle w:val="ReferenceEntry"/>
+        <w:spacing w:after="60"/>
+        <w:ind w:left="403" w:hanging="403"/>
+        <w:jc w:val="left"/>
+        <w:keepNext w:val="0"/>
+        <w:keepLines w:val="0"/>
+        <w:widowControl w:val="1"/>
+      </w:pPr>
+      <w:r>
+        <w:rPr>
+          <w:rFonts w:ascii="Georgia" w:hAnsi="Georgia"/>
+          <w:sz w:val="18"/>
+        </w:rPr>
+        <w:t xml:space="preserve">58. </w:t>
+      </w:r>
+      <w:r>
+        <w:t xml:space="preserve">Vygotsky, L. S. (1978). Mind in Society: The Development of Higher Psychological Processes.</w:t>
+      </w:r>
+      <w:r>
+        <w:t xml:space="preserve"> </w:t>
+      </w:r>
+      <w:r>
+        <w:rPr>
+          <w:i/>
+          <w:iCs/>
+        </w:rPr>
+        <w:t xml:space="preserve">Harvard University Press</w:t>
+      </w:r>
+      <w:r>
+        <w:t xml:space="preserve">.</w:t>
+      </w:r>
+    </w:p>
+    <w:p>
+      <w:pPr>
+        <w:pStyle w:val="ReferenceEntry"/>
+        <w:spacing w:after="60"/>
+        <w:ind w:left="403" w:hanging="403"/>
+        <w:jc w:val="left"/>
+        <w:keepNext w:val="0"/>
+        <w:keepLines w:val="0"/>
+        <w:widowControl w:val="1"/>
+      </w:pPr>
+      <w:r>
+        <w:rPr>
+          <w:rFonts w:ascii="Georgia" w:hAnsi="Georgia"/>
+          <w:sz w:val="18"/>
+        </w:rPr>
+        <w:t xml:space="preserve">59. </w:t>
+      </w:r>
+      <w:r>
+        <w:t xml:space="preserve">Walton, J., Bearman, M., Crawford, N., Tai, J., &amp; Boud, D. (2025). How University Students Work on Assessment Tasks with Generative Artificial Intelligence: Matters of Judgement.</w:t>
+      </w:r>
+      <w:r>
+        <w:t xml:space="preserve"> </w:t>
+      </w:r>
+      <w:r>
+        <w:rPr>
+          <w:i/>
+          <w:iCs/>
+        </w:rPr>
+        <w:t xml:space="preserve">Assessment &amp; Evaluation in Higher Education</w:t>
+      </w:r>
+      <w:r>
+        <w:t xml:space="preserve"> </w:t>
+      </w:r>
+      <w:r>
+        <w:t xml:space="preserve">(advance online publication). https://doi.org/10.1080/02602938.2025.2570328</w:t>
+      </w:r>
+    </w:p>
+    <w:p>
+      <w:pPr>
+        <w:pStyle w:val="ReferenceEntry"/>
+        <w:spacing w:after="60"/>
+        <w:ind w:left="403" w:hanging="403"/>
+        <w:jc w:val="left"/>
+        <w:keepNext w:val="0"/>
+        <w:keepLines w:val="0"/>
+        <w:widowControl w:val="1"/>
+      </w:pPr>
+      <w:r>
+        <w:rPr>
+          <w:rFonts w:ascii="Georgia" w:hAnsi="Georgia"/>
+          <w:sz w:val="18"/>
+        </w:rPr>
+        <w:t xml:space="preserve">60. </w:t>
+      </w:r>
+      <w:r>
+        <w:t xml:space="preserve">Wingerter, T. L., Straub, T., &amp; Schweitzer, S. (2025). Mitigating Automation Bias in Generative AI through Nudges: A Cognitive Reflection Test Study.</w:t>
+      </w:r>
+      <w:r>
+        <w:t xml:space="preserve"> </w:t>
+      </w:r>
+      <w:r>
+        <w:rPr>
+          <w:i/>
+          <w:iCs/>
+        </w:rPr>
+        <w:t xml:space="preserve">Procedia Computer Science</w:t>
+      </w:r>
+      <w:r>
+        <w:t xml:space="preserve">, 270, 2106–2114. https://doi.org/10.1016/j.procs.2025.09.331</w:t>
+      </w:r>
+    </w:p>
+    <w:p>
+      <w:pPr>
+        <w:pStyle w:val="ReferenceEntry"/>
+        <w:spacing w:after="60"/>
+        <w:ind w:left="403" w:hanging="403"/>
+        <w:jc w:val="left"/>
+        <w:keepNext w:val="0"/>
+        <w:keepLines w:val="0"/>
+        <w:widowControl w:val="1"/>
+      </w:pPr>
+      <w:r>
+        <w:rPr>
+          <w:rFonts w:ascii="Georgia" w:hAnsi="Georgia"/>
+          <w:sz w:val="18"/>
+        </w:rPr>
+        <w:t xml:space="preserve">61. </w:t>
+      </w:r>
+      <w:r>
+        <w:t xml:space="preserve">Winne, P. H., &amp; Hadwin, A. F. (1998). Studying as Self-Regulated Learning.</w:t>
+      </w:r>
+      <w:r>
+        <w:t xml:space="preserve"> </w:t>
+      </w:r>
+      <w:r>
+        <w:rPr>
+          <w:i/>
+          <w:iCs/>
+        </w:rPr>
+        <w:t xml:space="preserve">Metacognition in Educational Theory and Practice</w:t>
+      </w:r>
+      <w:r>
+        <w:t xml:space="preserve">, 277–304.</w:t>
+      </w:r>
+    </w:p>
+    <w:p>
+      <w:pPr>
+        <w:pStyle w:val="ReferenceEntry"/>
+        <w:spacing w:after="60"/>
+        <w:ind w:left="403" w:hanging="403"/>
+        <w:jc w:val="left"/>
+        <w:keepNext w:val="0"/>
+        <w:keepLines w:val="0"/>
+        <w:widowControl w:val="1"/>
+      </w:pPr>
+      <w:r>
+        <w:rPr>
+          <w:rFonts w:ascii="Georgia" w:hAnsi="Georgia"/>
+          <w:sz w:val="18"/>
+        </w:rPr>
+        <w:t xml:space="preserve">62. </w:t>
+      </w:r>
+      <w:r>
+        <w:t xml:space="preserve">Wirth, J., Weber-Reuter, X.-L., Schuster, C., Fleischer, J., Leutner, D., &amp; Stebner, F. (2025). Far Transfer of Metacognitive Regulation: From Cognitive Learning Strategy Use to Mental Effort Regulation.</w:t>
+      </w:r>
+      <w:r>
+        <w:t xml:space="preserve"> </w:t>
+      </w:r>
+      <w:r>
+        <w:rPr>
+          <w:i/>
+          <w:iCs/>
+        </w:rPr>
+        <w:t xml:space="preserve">Educational Psychology Review</w:t>
+      </w:r>
+      <w:r>
+        <w:t xml:space="preserve">, 37(1), 7. https://doi.org/10.1007/s10648-024-09983-x</w:t>
+      </w:r>
+    </w:p>
+    <w:p>
+      <w:pPr>
+        <w:pStyle w:val="ReferenceEntry"/>
+        <w:spacing w:after="60"/>
+        <w:ind w:left="403" w:hanging="403"/>
+        <w:jc w:val="left"/>
+        <w:keepNext w:val="0"/>
+        <w:keepLines w:val="0"/>
+        <w:widowControl w:val="1"/>
+      </w:pPr>
+      <w:r>
+        <w:rPr>
+          <w:rFonts w:ascii="Georgia" w:hAnsi="Georgia"/>
+          <w:sz w:val="18"/>
+        </w:rPr>
+        <w:t xml:space="preserve">63. </w:t>
+      </w:r>
+      <w:r>
+        <w:t xml:space="preserve">Yao, G., &amp; Fan, L. (2025). Cognitive Load Scale for AI-Assisted L2 Writing: Scale Development and Validation.</w:t>
+      </w:r>
+      <w:r>
+        <w:t xml:space="preserve"> </w:t>
+      </w:r>
+      <w:r>
+        <w:rPr>
+          <w:i/>
+          <w:iCs/>
+        </w:rPr>
+        <w:t xml:space="preserve">Frontiers in Psychology</w:t>
+      </w:r>
+      <w:r>
+        <w:t xml:space="preserve">, 16, 1666974. https://doi.org/10.3389/fpsyg.2025.1666974</w:t>
+      </w:r>
+    </w:p>
+    <w:p>
+      <w:pPr>
+        <w:pStyle w:val="ReferenceEntry"/>
+        <w:spacing w:after="60"/>
+        <w:ind w:left="403" w:hanging="403"/>
+        <w:jc w:val="left"/>
+        <w:keepNext w:val="0"/>
+        <w:keepLines w:val="0"/>
+        <w:widowControl w:val="1"/>
+      </w:pPr>
+      <w:r>
+        <w:rPr>
+          <w:rFonts w:ascii="Georgia" w:hAnsi="Georgia"/>
+          <w:sz w:val="18"/>
+        </w:rPr>
+        <w:t xml:space="preserve">64. </w:t>
+      </w:r>
+      <w:r>
+        <w:t xml:space="preserve">Yavuz, F., Çelik, Ö., &amp; Yavaş Çelik, G. (2025). Utilizing Large Language Models for EFL Essay Grading: An Examination of Reliability and Validity in Rubric-Based Assessments.</w:t>
+      </w:r>
+      <w:r>
+        <w:t xml:space="preserve"> </w:t>
+      </w:r>
+      <w:r>
+        <w:rPr>
+          <w:i/>
+          <w:iCs/>
+        </w:rPr>
+        <w:t xml:space="preserve">British Journal of Educational Technology</w:t>
+      </w:r>
+      <w:r>
+        <w:t xml:space="preserve">, 56(4), 1–17. https://doi.org/10.1111/bjet.13494</w:t>
+      </w:r>
+    </w:p>
+    <w:p>
+      <w:pPr>
+        <w:pStyle w:val="ReferenceEntry"/>
+        <w:spacing w:after="60"/>
+        <w:ind w:left="403" w:hanging="403"/>
+        <w:jc w:val="left"/>
+        <w:keepNext w:val="0"/>
+        <w:keepLines w:val="0"/>
+        <w:widowControl w:val="1"/>
+      </w:pPr>
+      <w:r>
+        <w:rPr>
+          <w:rFonts w:ascii="Georgia" w:hAnsi="Georgia"/>
+          <w:sz w:val="18"/>
+        </w:rPr>
+        <w:t xml:space="preserve">65. </w:t>
+      </w:r>
+      <w:r>
+        <w:t xml:space="preserve">Zimmerman, B. J. (2000). Attaining Self-Regulation: A Social Cognitive Perspective.</w:t>
+      </w:r>
+      <w:r>
+        <w:t xml:space="preserve"> </w:t>
+      </w:r>
+      <w:r>
+        <w:rPr>
+          <w:i/>
+          <w:iCs/>
+        </w:rPr>
+        <w:t xml:space="preserve">Handbook of Self-Regulation</w:t>
+      </w:r>
+      <w:r>
+        <w:t xml:space="preserve">, 13–39.</w:t>
+      </w:r>
+    </w:p>
+    <w:p>
+      <w:pPr>
+        <w:pStyle w:val="ReferenceEntry"/>
+        <w:spacing w:after="60"/>
+        <w:ind w:left="403" w:hanging="403"/>
+        <w:jc w:val="left"/>
+        <w:keepNext w:val="0"/>
+        <w:keepLines w:val="0"/>
+        <w:widowControl w:val="1"/>
+      </w:pPr>
+      <w:r>
+        <w:rPr>
+          <w:rFonts w:ascii="Georgia" w:hAnsi="Georgia"/>
+          <w:sz w:val="18"/>
+        </w:rPr>
+        <w:t xml:space="preserve">66. </w:t>
+      </w:r>
+      <w:r>
+        <w:t xml:space="preserve">UNESCO (2024). AI Competency Framework for Students.</w:t>
+      </w:r>
+      <w:r>
+        <w:t xml:space="preserve"> </w:t>
+      </w:r>
+      <w:r>
+        <w:rPr>
+          <w:i/>
+          <w:iCs/>
+        </w:rPr>
+        <w:t xml:space="preserve">UNESCO</w:t>
+      </w:r>
+      <w:r>
+        <w:t xml:space="preserve">.</w:t>
+      </w:r>
+    </w:p>
+    <w:bookmarkEnd w:id="38"/>
+    <w:bookmarkStart w:id="48" w:name="appendix-a-system-walkthrough"/>
     <w:p>
       <w:pPr>
         <w:pStyle w:val="Heading2"/>
@@ -9663,18 +11924,18 @@
           <wp:inline>
             <wp:extent cx="2984601" cy="2403411"/>
             <wp:effectExtent b="0" l="0" r="0" t="0"/>
-            <wp:docPr descr="Figure A1. A CoReasoning Lab challenge run." title="" id="39" name="Picture"/>
+            <wp:docPr descr="Figure A1. A CoReasoning Lab challenge run." title="" id="40" name="Picture"/>
             <a:graphic>
               <a:graphicData uri="http://schemas.openxmlformats.org/drawingml/2006/picture">
                 <pic:pic>
                   <pic:nvPicPr>
-                    <pic:cNvPr descr="assets/system-challenge-run.png" id="40" name="Picture"/>
+                    <pic:cNvPr descr="assets/system-challenge-run.png" id="41" name="Picture"/>
                     <pic:cNvPicPr>
                       <a:picLocks noChangeArrowheads="1" noChangeAspect="1"/>
                     </pic:cNvPicPr>
                   </pic:nvPicPr>
                   <pic:blipFill>
-                    <a:blip r:embed="rId38"/>
+                    <a:blip r:embed="rId39"/>
                     <a:stretch>
                       <a:fillRect/>
                     </a:stretch>
@@ -9787,18 +12048,18 @@
           <wp:inline>
             <wp:extent cx="2984601" cy="2215840"/>
             <wp:effectExtent b="0" l="0" r="0" t="0"/>
-            <wp:docPr descr="Figure A2. CoReasoning Lab instructor course analytics." title="" id="42" name="Picture"/>
+            <wp:docPr descr="Figure A2. CoReasoning Lab instructor course analytics." title="" id="43" name="Picture"/>
             <a:graphic>
               <a:graphicData uri="http://schemas.openxmlformats.org/drawingml/2006/picture">
                 <pic:pic>
                   <pic:nvPicPr>
-                    <pic:cNvPr descr="assets/system-instructor-analytics.png" id="43" name="Picture"/>
+                    <pic:cNvPr descr="assets/system-instructor-analytics.png" id="44" name="Picture"/>
                     <pic:cNvPicPr>
                       <a:picLocks noChangeArrowheads="1" noChangeAspect="1"/>
                     </pic:cNvPicPr>
                   </pic:nvPicPr>
                   <pic:blipFill>
-                    <a:blip r:embed="rId41"/>
+                    <a:blip r:embed="rId42"/>
                     <a:stretch>
                       <a:fillRect/>
                     </a:stretch>
@@ -9894,18 +12155,18 @@
           <wp:inline>
             <wp:extent cx="6400800" cy="4310742"/>
             <wp:effectExtent b="0" l="0" r="0" t="0"/>
-            <wp:docPr descr="Figure A3. Auto-generation and assessment pipeline of the CoReasoning Lab engine." title="" id="45" name="Picture"/>
+            <wp:docPr descr="Figure A3. Auto-generation and assessment pipeline of the CoReasoning Lab engine." title="" id="46" name="Picture"/>
             <a:graphic>
               <a:graphicData uri="http://schemas.openxmlformats.org/drawingml/2006/picture">
                 <pic:pic>
                   <pic:nvPicPr>
-                    <pic:cNvPr descr="C:/Users/apart/AppData/Local/Temp/html2doc_svg_aA3z3Y/svg_2.png" id="46" name="Picture"/>
+                    <pic:cNvPr descr="C:/Users/apart/AppData/Local/Temp/html2doc_svg_he6DYr/svg_2.png" id="47" name="Picture"/>
                     <pic:cNvPicPr>
                       <a:picLocks noChangeArrowheads="1" noChangeAspect="1"/>
                     </pic:cNvPicPr>
                   </pic:nvPicPr>
                   <pic:blipFill>
-                    <a:blip r:embed="rId44"/>
+                    <a:blip r:embed="rId45"/>
                     <a:stretch>
                       <a:fillRect/>
                     </a:stretch>
@@ -9988,8 +12249,8 @@
         </w:sectPr>
       </w:pPr>
     </w:p>
-    <w:bookmarkEnd w:id="47"/>
-    <w:bookmarkStart w:id="48" w:name="appendix-b-robustness-and-ablations"/>
+    <w:bookmarkEnd w:id="48"/>
+    <w:bookmarkStart w:id="49" w:name="appendix-b-robustness-and-ablations"/>
     <w:p>
       <w:pPr>
         <w:pStyle w:val="Heading2"/>
@@ -10353,8 +12614,8 @@
         <w:t xml:space="preserve">distinct instrumentation Section 10 specifies.</w:t>
       </w:r>
     </w:p>
-    <w:bookmarkEnd w:id="48"/>
-    <w:bookmarkStart w:id="49" w:name="X20431813dc1d9ebe06088c2967a8c6d7cfc2771"/>
+    <w:bookmarkEnd w:id="49"/>
+    <w:bookmarkStart w:id="50" w:name="X20431813dc1d9ebe06088c2967a8c6d7cfc2771"/>
     <w:p>
       <w:pPr>
         <w:pStyle w:val="Heading2"/>
@@ -10979,2267 +13240,6 @@
       </w:r>
       <w:r>
         <w:t xml:space="preserve">logs ship with the platform.</w:t>
-      </w:r>
-    </w:p>
-    <w:bookmarkEnd w:id="49"/>
-    <w:bookmarkStart w:id="50" w:name="references"/>
-    <w:p>
-      <w:pPr>
-        <w:pStyle w:val="ReferencesHeading"/>
-        <w:jc w:val="left"/>
-        <w:keepNext/>
-        <w:keepLines/>
-        <w:widowControl w:val="1"/>
-      </w:pPr>
-      <w:r>
-        <w:t xml:space="preserve">References</w:t>
-      </w:r>
-    </w:p>
-    <w:p>
-      <w:pPr>
-        <w:pStyle w:val="ReferenceEntry"/>
-        <w:spacing w:after="60"/>
-        <w:ind w:left="403" w:hanging="403"/>
-        <w:jc w:val="left"/>
-        <w:keepNext w:val="0"/>
-        <w:keepLines w:val="0"/>
-        <w:widowControl w:val="1"/>
-      </w:pPr>
-      <w:r>
-        <w:rPr>
-          <w:rFonts w:ascii="Georgia" w:hAnsi="Georgia"/>
-          <w:sz w:val="18"/>
-        </w:rPr>
-        <w:t xml:space="preserve">1. </w:t>
-      </w:r>
-      <w:r>
-        <w:t xml:space="preserve">Acar, O. A. (2023). AI Prompt Engineering Isn't the Future.</w:t>
-      </w:r>
-      <w:r>
-        <w:t xml:space="preserve"> </w:t>
-      </w:r>
-      <w:r>
-        <w:rPr>
-          <w:i/>
-          <w:iCs/>
-        </w:rPr>
-        <w:t xml:space="preserve">Harvard Business Review, June 6</w:t>
-      </w:r>
-      <w:r>
-        <w:t xml:space="preserve">.</w:t>
-      </w:r>
-    </w:p>
-    <w:p>
-      <w:pPr>
-        <w:pStyle w:val="ReferenceEntry"/>
-        <w:spacing w:after="60"/>
-        <w:ind w:left="403" w:hanging="403"/>
-        <w:jc w:val="left"/>
-        <w:keepNext w:val="0"/>
-        <w:keepLines w:val="0"/>
-        <w:widowControl w:val="1"/>
-      </w:pPr>
-      <w:r>
-        <w:rPr>
-          <w:rFonts w:ascii="Georgia" w:hAnsi="Georgia"/>
-          <w:sz w:val="18"/>
-        </w:rPr>
-        <w:t xml:space="preserve">2. </w:t>
-      </w:r>
-      <w:r>
-        <w:t xml:space="preserve">Anderson, L. W., &amp; Krathwohl, D. R. (2001). A Taxonomy for Learning, Teaching, and Assessing: A Revision of Bloom's Taxonomy of Educational Objectives.</w:t>
-      </w:r>
-      <w:r>
-        <w:t xml:space="preserve"> </w:t>
-      </w:r>
-      <w:r>
-        <w:rPr>
-          <w:i/>
-          <w:iCs/>
-        </w:rPr>
-        <w:t xml:space="preserve">Longman</w:t>
-      </w:r>
-      <w:r>
-        <w:t xml:space="preserve">.</w:t>
-      </w:r>
-    </w:p>
-    <w:p>
-      <w:pPr>
-        <w:pStyle w:val="ReferenceEntry"/>
-        <w:spacing w:after="60"/>
-        <w:ind w:left="403" w:hanging="403"/>
-        <w:jc w:val="left"/>
-        <w:keepNext w:val="0"/>
-        <w:keepLines w:val="0"/>
-        <w:widowControl w:val="1"/>
-      </w:pPr>
-      <w:r>
-        <w:rPr>
-          <w:rFonts w:ascii="Georgia" w:hAnsi="Georgia"/>
-          <w:sz w:val="18"/>
-        </w:rPr>
-        <w:t xml:space="preserve">3. </w:t>
-      </w:r>
-      <w:r>
-        <w:t xml:space="preserve">Annapureddy, R., Fornaroli, A., &amp; Gatica-Perez, D. (2024). Generative AI Literacy: Twelve Defining Competencies.</w:t>
-      </w:r>
-      <w:r>
-        <w:t xml:space="preserve"> </w:t>
-      </w:r>
-      <w:r>
-        <w:rPr>
-          <w:i/>
-          <w:iCs/>
-        </w:rPr>
-        <w:t xml:space="preserve">Digital Government: Research and Practice</w:t>
-      </w:r>
-      <w:r>
-        <w:t xml:space="preserve">.</w:t>
-      </w:r>
-    </w:p>
-    <w:p>
-      <w:pPr>
-        <w:pStyle w:val="ReferenceEntry"/>
-        <w:spacing w:after="60"/>
-        <w:ind w:left="403" w:hanging="403"/>
-        <w:jc w:val="left"/>
-        <w:keepNext w:val="0"/>
-        <w:keepLines w:val="0"/>
-        <w:widowControl w:val="1"/>
-      </w:pPr>
-      <w:r>
-        <w:rPr>
-          <w:rFonts w:ascii="Georgia" w:hAnsi="Georgia"/>
-          <w:sz w:val="18"/>
-        </w:rPr>
-        <w:t xml:space="preserve">4. </w:t>
-      </w:r>
-      <w:r>
-        <w:t xml:space="preserve">Bansal, G., Wu, T., Zhou, J., Fok, R., Nushi, B., Kamar, E., Ribeiro, M. T., &amp; Weld, D. S. (2021). Does the Whole Exceed Its Parts? The Effect of AI Explanations on Complementary Team Performance.</w:t>
-      </w:r>
-      <w:r>
-        <w:t xml:space="preserve"> </w:t>
-      </w:r>
-      <w:r>
-        <w:rPr>
-          <w:i/>
-          <w:iCs/>
-        </w:rPr>
-        <w:t xml:space="preserve">Proceedings of the 2021 CHI Conference on Human Factors in Computing Systems</w:t>
-      </w:r>
-      <w:r>
-        <w:t xml:space="preserve">.</w:t>
-      </w:r>
-    </w:p>
-    <w:p>
-      <w:pPr>
-        <w:pStyle w:val="ReferenceEntry"/>
-        <w:spacing w:after="60"/>
-        <w:ind w:left="403" w:hanging="403"/>
-        <w:jc w:val="left"/>
-        <w:keepNext w:val="0"/>
-        <w:keepLines w:val="0"/>
-        <w:widowControl w:val="1"/>
-      </w:pPr>
-      <w:r>
-        <w:rPr>
-          <w:rFonts w:ascii="Georgia" w:hAnsi="Georgia"/>
-          <w:sz w:val="18"/>
-        </w:rPr>
-        <w:t xml:space="preserve">5. </w:t>
-      </w:r>
-      <w:r>
-        <w:t xml:space="preserve">Barzilai, S., &amp; Chinn, C. A. (2018). On the Goals of Epistemic Education: Promoting Apt Epistemic Performance.</w:t>
-      </w:r>
-      <w:r>
-        <w:t xml:space="preserve"> </w:t>
-      </w:r>
-      <w:r>
-        <w:rPr>
-          <w:i/>
-          <w:iCs/>
-        </w:rPr>
-        <w:t xml:space="preserve">Journal of the Learning Sciences</w:t>
-      </w:r>
-      <w:r>
-        <w:t xml:space="preserve">, 27(3), 353–389.</w:t>
-      </w:r>
-    </w:p>
-    <w:p>
-      <w:pPr>
-        <w:pStyle w:val="ReferenceEntry"/>
-        <w:spacing w:after="60"/>
-        <w:ind w:left="403" w:hanging="403"/>
-        <w:jc w:val="left"/>
-        <w:keepNext w:val="0"/>
-        <w:keepLines w:val="0"/>
-        <w:widowControl w:val="1"/>
-      </w:pPr>
-      <w:r>
-        <w:rPr>
-          <w:rFonts w:ascii="Georgia" w:hAnsi="Georgia"/>
-          <w:sz w:val="18"/>
-        </w:rPr>
-        <w:t xml:space="preserve">6. </w:t>
-      </w:r>
-      <w:r>
-        <w:t xml:space="preserve">Bearman, M., Tai, J., Dawson, P., Boud, D., &amp; Ajjawi, R. (2024). Developing Evaluative Judgement for a Time of Generative Artificial Intelligence.</w:t>
-      </w:r>
-      <w:r>
-        <w:t xml:space="preserve"> </w:t>
-      </w:r>
-      <w:r>
-        <w:rPr>
-          <w:i/>
-          <w:iCs/>
-        </w:rPr>
-        <w:t xml:space="preserve">Assessment &amp; Evaluation in Higher Education</w:t>
-      </w:r>
-      <w:r>
-        <w:t xml:space="preserve">, 49(6), 893–905. https://doi.org/10.1080/02602938.2024.2335321</w:t>
-      </w:r>
-    </w:p>
-    <w:p>
-      <w:pPr>
-        <w:pStyle w:val="ReferenceEntry"/>
-        <w:spacing w:after="60"/>
-        <w:ind w:left="403" w:hanging="403"/>
-        <w:jc w:val="left"/>
-        <w:keepNext w:val="0"/>
-        <w:keepLines w:val="0"/>
-        <w:widowControl w:val="1"/>
-      </w:pPr>
-      <w:r>
-        <w:rPr>
-          <w:rFonts w:ascii="Georgia" w:hAnsi="Georgia"/>
-          <w:sz w:val="18"/>
-        </w:rPr>
-        <w:t xml:space="preserve">7. </w:t>
-      </w:r>
-      <w:r>
-        <w:t xml:space="preserve">Bjork, E. L., &amp; Bjork, R. A. (2011). Making Things Hard on Yourself, but in a Good Way: Creating Desirable Difficulties to Enhance Learning.</w:t>
-      </w:r>
-      <w:r>
-        <w:t xml:space="preserve"> </w:t>
-      </w:r>
-      <w:r>
-        <w:rPr>
-          <w:i/>
-          <w:iCs/>
-        </w:rPr>
-        <w:t xml:space="preserve">Psychology and the Real World</w:t>
-      </w:r>
-      <w:r>
-        <w:t xml:space="preserve">, 56–64.</w:t>
-      </w:r>
-    </w:p>
-    <w:p>
-      <w:pPr>
-        <w:pStyle w:val="ReferenceEntry"/>
-        <w:spacing w:after="60"/>
-        <w:ind w:left="403" w:hanging="403"/>
-        <w:jc w:val="left"/>
-        <w:keepNext w:val="0"/>
-        <w:keepLines w:val="0"/>
-        <w:widowControl w:val="1"/>
-      </w:pPr>
-      <w:r>
-        <w:rPr>
-          <w:rFonts w:ascii="Georgia" w:hAnsi="Georgia"/>
-          <w:sz w:val="18"/>
-        </w:rPr>
-        <w:t xml:space="preserve">8. </w:t>
-      </w:r>
-      <w:r>
-        <w:t xml:space="preserve">Buçinca, Z., Malaya, M. B., &amp; Gajos, K. Z. (2021). To Trust or to Think: Cognitive Forcing Functions Can Reduce Overreliance on AI in AI-Assisted Decision-Making.</w:t>
-      </w:r>
-      <w:r>
-        <w:t xml:space="preserve"> </w:t>
-      </w:r>
-      <w:r>
-        <w:rPr>
-          <w:i/>
-          <w:iCs/>
-        </w:rPr>
-        <w:t xml:space="preserve">Proceedings of the ACM on Human-Computer Interaction</w:t>
-      </w:r>
-      <w:r>
-        <w:t xml:space="preserve">, 5(CSCW1), 1–21.</w:t>
-      </w:r>
-    </w:p>
-    <w:p>
-      <w:pPr>
-        <w:pStyle w:val="ReferenceEntry"/>
-        <w:spacing w:after="60"/>
-        <w:ind w:left="403" w:hanging="403"/>
-        <w:jc w:val="left"/>
-        <w:keepNext w:val="0"/>
-        <w:keepLines w:val="0"/>
-        <w:widowControl w:val="1"/>
-      </w:pPr>
-      <w:r>
-        <w:rPr>
-          <w:rFonts w:ascii="Georgia" w:hAnsi="Georgia"/>
-          <w:sz w:val="18"/>
-        </w:rPr>
-        <w:t xml:space="preserve">9. </w:t>
-      </w:r>
-      <w:r>
-        <w:t xml:space="preserve">Campbell, D. T., &amp; Fiske, D. W. (1959). Convergent and Discriminant Validation by the Multitrait-Multimethod Matrix.</w:t>
-      </w:r>
-      <w:r>
-        <w:t xml:space="preserve"> </w:t>
-      </w:r>
-      <w:r>
-        <w:rPr>
-          <w:i/>
-          <w:iCs/>
-        </w:rPr>
-        <w:t xml:space="preserve">Psychological Bulletin</w:t>
-      </w:r>
-      <w:r>
-        <w:t xml:space="preserve">, 56(2), 81–105.</w:t>
-      </w:r>
-    </w:p>
-    <w:p>
-      <w:pPr>
-        <w:pStyle w:val="ReferenceEntry"/>
-        <w:spacing w:after="60"/>
-        <w:ind w:left="403" w:hanging="403"/>
-        <w:jc w:val="left"/>
-        <w:keepNext w:val="0"/>
-        <w:keepLines w:val="0"/>
-        <w:widowControl w:val="1"/>
-      </w:pPr>
-      <w:r>
-        <w:rPr>
-          <w:rFonts w:ascii="Georgia" w:hAnsi="Georgia"/>
-          <w:sz w:val="18"/>
-        </w:rPr>
-        <w:t xml:space="preserve">10. </w:t>
-      </w:r>
-      <w:r>
-        <w:t xml:space="preserve">Chi, M. T. H., &amp; Wylie, R. (2014). The ICAP Framework: Linking Cognitive Engagement to Active Learning Outcomes.</w:t>
-      </w:r>
-      <w:r>
-        <w:t xml:space="preserve"> </w:t>
-      </w:r>
-      <w:r>
-        <w:rPr>
-          <w:i/>
-          <w:iCs/>
-        </w:rPr>
-        <w:t xml:space="preserve">Educational Psychologist</w:t>
-      </w:r>
-      <w:r>
-        <w:t xml:space="preserve">, 49(4), 219–243.</w:t>
-      </w:r>
-    </w:p>
-    <w:p>
-      <w:pPr>
-        <w:pStyle w:val="ReferenceEntry"/>
-        <w:spacing w:after="60"/>
-        <w:ind w:left="403" w:hanging="403"/>
-        <w:jc w:val="left"/>
-        <w:keepNext w:val="0"/>
-        <w:keepLines w:val="0"/>
-        <w:widowControl w:val="1"/>
-      </w:pPr>
-      <w:r>
-        <w:rPr>
-          <w:rFonts w:ascii="Georgia" w:hAnsi="Georgia"/>
-          <w:sz w:val="18"/>
-        </w:rPr>
-        <w:t xml:space="preserve">11. </w:t>
-      </w:r>
-      <w:r>
-        <w:t xml:space="preserve">Clerc, O., Abdelghani, R., Desvaux, C., Poisson, E., Oudeyer, P., &amp; Sauzéon, H. (2026). Teaching Students to Question the Machine: An AI Literacy Intervention Improves Students' Regulation of LLM Use in a Science Task.</w:t>
-      </w:r>
-      <w:r>
-        <w:t xml:space="preserve"> </w:t>
-      </w:r>
-      <w:r>
-        <w:rPr>
-          <w:i/>
-          <w:iCs/>
-        </w:rPr>
-        <w:t xml:space="preserve">arXiv preprint arXiv:2604.01955</w:t>
-      </w:r>
-      <w:r>
-        <w:t xml:space="preserve">.</w:t>
-      </w:r>
-    </w:p>
-    <w:p>
-      <w:pPr>
-        <w:pStyle w:val="ReferenceEntry"/>
-        <w:spacing w:after="60"/>
-        <w:ind w:left="403" w:hanging="403"/>
-        <w:jc w:val="left"/>
-        <w:keepNext w:val="0"/>
-        <w:keepLines w:val="0"/>
-        <w:widowControl w:val="1"/>
-      </w:pPr>
-      <w:r>
-        <w:rPr>
-          <w:rFonts w:ascii="Georgia" w:hAnsi="Georgia"/>
-          <w:sz w:val="18"/>
-        </w:rPr>
-        <w:t xml:space="preserve">12. </w:t>
-      </w:r>
-      <w:r>
-        <w:t xml:space="preserve">Collins, A., Brown, J. S., &amp; Newman, S. E. (1989). Cognitive Apprenticeship: Teaching the Crafts of Reading, Writing, and Mathematics.</w:t>
-      </w:r>
-      <w:r>
-        <w:t xml:space="preserve"> </w:t>
-      </w:r>
-      <w:r>
-        <w:rPr>
-          <w:i/>
-          <w:iCs/>
-        </w:rPr>
-        <w:t xml:space="preserve">Knowing, Learning, and Instruction: Essays in Honor of Robert Glaser</w:t>
-      </w:r>
-      <w:r>
-        <w:t xml:space="preserve">, 453–494.</w:t>
-      </w:r>
-    </w:p>
-    <w:p>
-      <w:pPr>
-        <w:pStyle w:val="ReferenceEntry"/>
-        <w:spacing w:after="60"/>
-        <w:ind w:left="403" w:hanging="403"/>
-        <w:jc w:val="left"/>
-        <w:keepNext w:val="0"/>
-        <w:keepLines w:val="0"/>
-        <w:widowControl w:val="1"/>
-      </w:pPr>
-      <w:r>
-        <w:rPr>
-          <w:rFonts w:ascii="Georgia" w:hAnsi="Georgia"/>
-          <w:sz w:val="18"/>
-        </w:rPr>
-        <w:t xml:space="preserve">13. </w:t>
-      </w:r>
-      <w:r>
-        <w:t xml:space="preserve">Dakan, R., &amp; Feller, J. (2025). Framework for AI Fluency.</w:t>
-      </w:r>
-      <w:r>
-        <w:t xml:space="preserve"> </w:t>
-      </w:r>
-      <w:r>
-        <w:rPr>
-          <w:i/>
-          <w:iCs/>
-        </w:rPr>
-        <w:t xml:space="preserve">Anthropic</w:t>
-      </w:r>
-      <w:r>
-        <w:t xml:space="preserve">.</w:t>
-      </w:r>
-    </w:p>
-    <w:p>
-      <w:pPr>
-        <w:pStyle w:val="ReferenceEntry"/>
-        <w:spacing w:after="60"/>
-        <w:ind w:left="403" w:hanging="403"/>
-        <w:jc w:val="left"/>
-        <w:keepNext w:val="0"/>
-        <w:keepLines w:val="0"/>
-        <w:widowControl w:val="1"/>
-      </w:pPr>
-      <w:r>
-        <w:rPr>
-          <w:rFonts w:ascii="Georgia" w:hAnsi="Georgia"/>
-          <w:sz w:val="18"/>
-        </w:rPr>
-        <w:t xml:space="preserve">14. </w:t>
-      </w:r>
-      <w:r>
-        <w:t xml:space="preserve">Dell'Acqua, F., McFowland III, E., Mollick, E., Lifshitz-Assaf, H., Kellogg, K., Rajendran, S., Krayer, L., Candelon, F., &amp; Lakhani, K. R. (2023). Navigating the Jagged Technological Frontier.</w:t>
-      </w:r>
-      <w:r>
-        <w:t xml:space="preserve"> </w:t>
-      </w:r>
-      <w:r>
-        <w:rPr>
-          <w:i/>
-          <w:iCs/>
-        </w:rPr>
-        <w:t xml:space="preserve">Harvard Business School Working Paper 24-013</w:t>
-      </w:r>
-      <w:r>
-        <w:t xml:space="preserve">.</w:t>
-      </w:r>
-    </w:p>
-    <w:p>
-      <w:pPr>
-        <w:pStyle w:val="ReferenceEntry"/>
-        <w:spacing w:after="60"/>
-        <w:ind w:left="403" w:hanging="403"/>
-        <w:jc w:val="left"/>
-        <w:keepNext w:val="0"/>
-        <w:keepLines w:val="0"/>
-        <w:widowControl w:val="1"/>
-      </w:pPr>
-      <w:r>
-        <w:rPr>
-          <w:rFonts w:ascii="Georgia" w:hAnsi="Georgia"/>
-          <w:sz w:val="18"/>
-        </w:rPr>
-        <w:t xml:space="preserve">15. </w:t>
-      </w:r>
-      <w:r>
-        <w:t xml:space="preserve">Denny, P., Leinonen, J., Prather, J., Luxton-Reilly, A., Amarouche, T., Becker, B. A., &amp; Reeves, B. N. (2024). Prompt Problems: A New Programming Exercise for the Generative AI Era.</w:t>
-      </w:r>
-      <w:r>
-        <w:t xml:space="preserve"> </w:t>
-      </w:r>
-      <w:r>
-        <w:rPr>
-          <w:i/>
-          <w:iCs/>
-        </w:rPr>
-        <w:t xml:space="preserve">Proceedings of the 55th ACM Technical Symposium on Computer Science Education (SIGCSE)</w:t>
-      </w:r>
-      <w:r>
-        <w:t xml:space="preserve">.</w:t>
-      </w:r>
-    </w:p>
-    <w:p>
-      <w:pPr>
-        <w:pStyle w:val="ReferenceEntry"/>
-        <w:spacing w:after="60"/>
-        <w:ind w:left="403" w:hanging="403"/>
-        <w:jc w:val="left"/>
-        <w:keepNext w:val="0"/>
-        <w:keepLines w:val="0"/>
-        <w:widowControl w:val="1"/>
-      </w:pPr>
-      <w:r>
-        <w:rPr>
-          <w:rFonts w:ascii="Georgia" w:hAnsi="Georgia"/>
-          <w:sz w:val="18"/>
-        </w:rPr>
-        <w:t xml:space="preserve">16. </w:t>
-      </w:r>
-      <w:r>
-        <w:t xml:space="preserve">Di Santi, E. (2026). Cognitive Amplification vs Cognitive Delegation in Human-AI Systems: A Metric Framework.</w:t>
-      </w:r>
-      <w:r>
-        <w:t xml:space="preserve"> </w:t>
-      </w:r>
-      <w:r>
-        <w:rPr>
-          <w:i/>
-          <w:iCs/>
-        </w:rPr>
-        <w:t xml:space="preserve">arXiv preprint arXiv:2603.18677</w:t>
-      </w:r>
-      <w:r>
-        <w:t xml:space="preserve">.</w:t>
-      </w:r>
-    </w:p>
-    <w:p>
-      <w:pPr>
-        <w:pStyle w:val="ReferenceEntry"/>
-        <w:spacing w:after="60"/>
-        <w:ind w:left="403" w:hanging="403"/>
-        <w:jc w:val="left"/>
-        <w:keepNext w:val="0"/>
-        <w:keepLines w:val="0"/>
-        <w:widowControl w:val="1"/>
-      </w:pPr>
-      <w:r>
-        <w:rPr>
-          <w:rFonts w:ascii="Georgia" w:hAnsi="Georgia"/>
-          <w:sz w:val="18"/>
-        </w:rPr>
-        <w:t xml:space="preserve">17. </w:t>
-      </w:r>
-      <w:r>
-        <w:t xml:space="preserve">Durkin, K., &amp; Rittle-Johnson, B. (2012). The Effectiveness of Using Incorrect Examples to Support Learning about Decimal Magnitude.</w:t>
-      </w:r>
-      <w:r>
-        <w:t xml:space="preserve"> </w:t>
-      </w:r>
-      <w:r>
-        <w:rPr>
-          <w:i/>
-          <w:iCs/>
-        </w:rPr>
-        <w:t xml:space="preserve">Learning and Instruction</w:t>
-      </w:r>
-      <w:r>
-        <w:t xml:space="preserve">, 22(3), 206–214. https://doi.org/10.1016/j.learninstruc.2011.11.001</w:t>
-      </w:r>
-    </w:p>
-    <w:p>
-      <w:pPr>
-        <w:pStyle w:val="ReferenceEntry"/>
-        <w:spacing w:after="60"/>
-        <w:ind w:left="403" w:hanging="403"/>
-        <w:jc w:val="left"/>
-        <w:keepNext w:val="0"/>
-        <w:keepLines w:val="0"/>
-        <w:widowControl w:val="1"/>
-      </w:pPr>
-      <w:r>
-        <w:rPr>
-          <w:rFonts w:ascii="Georgia" w:hAnsi="Georgia"/>
-          <w:sz w:val="18"/>
-        </w:rPr>
-        <w:t xml:space="preserve">18. </w:t>
-      </w:r>
-      <w:r>
-        <w:t xml:space="preserve">Elshall, A. S., &amp; Badir, A. (2025). Balancing AI-Assisted Learning and Traditional Assessment: The FACT Assessment in Environmental Data Science Education.</w:t>
-      </w:r>
-      <w:r>
-        <w:t xml:space="preserve"> </w:t>
-      </w:r>
-      <w:r>
-        <w:rPr>
-          <w:i/>
-          <w:iCs/>
-        </w:rPr>
-        <w:t xml:space="preserve">Frontiers in Education</w:t>
-      </w:r>
-      <w:r>
-        <w:t xml:space="preserve">, 10, 1596462. https://doi.org/10.3389/feduc.2025.1596462</w:t>
-      </w:r>
-    </w:p>
-    <w:p>
-      <w:pPr>
-        <w:pStyle w:val="ReferenceEntry"/>
-        <w:spacing w:after="60"/>
-        <w:ind w:left="403" w:hanging="403"/>
-        <w:jc w:val="left"/>
-        <w:keepNext w:val="0"/>
-        <w:keepLines w:val="0"/>
-        <w:widowControl w:val="1"/>
-      </w:pPr>
-      <w:r>
-        <w:rPr>
-          <w:rFonts w:ascii="Georgia" w:hAnsi="Georgia"/>
-          <w:sz w:val="18"/>
-        </w:rPr>
-        <w:t xml:space="preserve">19. </w:t>
-      </w:r>
-      <w:r>
-        <w:t xml:space="preserve">Facione, P. A. (1990). Critical Thinking: A Statement of Expert Consensus for Purposes of Educational Assessment and Instruction (The Delphi Report).</w:t>
-      </w:r>
-      <w:r>
-        <w:t xml:space="preserve"> </w:t>
-      </w:r>
-      <w:r>
-        <w:rPr>
-          <w:i/>
-          <w:iCs/>
-        </w:rPr>
-        <w:t xml:space="preserve">American Philosophical Association</w:t>
-      </w:r>
-      <w:r>
-        <w:t xml:space="preserve">.</w:t>
-      </w:r>
-    </w:p>
-    <w:p>
-      <w:pPr>
-        <w:pStyle w:val="ReferenceEntry"/>
-        <w:spacing w:after="60"/>
-        <w:ind w:left="403" w:hanging="403"/>
-        <w:jc w:val="left"/>
-        <w:keepNext w:val="0"/>
-        <w:keepLines w:val="0"/>
-        <w:widowControl w:val="1"/>
-      </w:pPr>
-      <w:r>
-        <w:rPr>
-          <w:rFonts w:ascii="Georgia" w:hAnsi="Georgia"/>
-          <w:sz w:val="18"/>
-        </w:rPr>
-        <w:t xml:space="preserve">20. </w:t>
-      </w:r>
-      <w:r>
-        <w:t xml:space="preserve">Fan, Y., Tang, L., Le, H., Shen, K., Tan, S., Zhao, Y., Shen, Y., Li, X., &amp; Gašević, D. (2025). Beware of Metacognitive Laziness: Effects of Generative Artificial Intelligence on Learning Motivation, Processes, and Performance.</w:t>
-      </w:r>
-      <w:r>
-        <w:t xml:space="preserve"> </w:t>
-      </w:r>
-      <w:r>
-        <w:rPr>
-          <w:i/>
-          <w:iCs/>
-        </w:rPr>
-        <w:t xml:space="preserve">British Journal of Educational Technology</w:t>
-      </w:r>
-      <w:r>
-        <w:t xml:space="preserve">, 56(2), 489–530. https://doi.org/10.1111/bjet.13544</w:t>
-      </w:r>
-    </w:p>
-    <w:p>
-      <w:pPr>
-        <w:pStyle w:val="ReferenceEntry"/>
-        <w:spacing w:after="60"/>
-        <w:ind w:left="403" w:hanging="403"/>
-        <w:jc w:val="left"/>
-        <w:keepNext w:val="0"/>
-        <w:keepLines w:val="0"/>
-        <w:widowControl w:val="1"/>
-      </w:pPr>
-      <w:r>
-        <w:rPr>
-          <w:rFonts w:ascii="Georgia" w:hAnsi="Georgia"/>
-          <w:sz w:val="18"/>
-        </w:rPr>
-        <w:t xml:space="preserve">21. </w:t>
-      </w:r>
-      <w:r>
-        <w:t xml:space="preserve">Feng, Y., Wang, S., Cheng, Z., Wan, Y., &amp; Chen, D. (2025). Are We on the Right Way to Assessing LLM-as-a-Judge?.</w:t>
-      </w:r>
-      <w:r>
-        <w:t xml:space="preserve"> </w:t>
-      </w:r>
-      <w:r>
-        <w:rPr>
-          <w:i/>
-          <w:iCs/>
-        </w:rPr>
-        <w:t xml:space="preserve">arXiv preprint arXiv:2512.16041</w:t>
-      </w:r>
-      <w:r>
-        <w:t xml:space="preserve">.</w:t>
-      </w:r>
-    </w:p>
-    <w:p>
-      <w:pPr>
-        <w:pStyle w:val="ReferenceEntry"/>
-        <w:spacing w:after="60"/>
-        <w:ind w:left="403" w:hanging="403"/>
-        <w:jc w:val="left"/>
-        <w:keepNext w:val="0"/>
-        <w:keepLines w:val="0"/>
-        <w:widowControl w:val="1"/>
-      </w:pPr>
-      <w:r>
-        <w:rPr>
-          <w:rFonts w:ascii="Georgia" w:hAnsi="Georgia"/>
-          <w:sz w:val="18"/>
-        </w:rPr>
-        <w:t xml:space="preserve">22. </w:t>
-      </w:r>
-      <w:r>
-        <w:t xml:space="preserve">Fernandes, D., Villa, S., Nicholls, S., Haavisto, O., Buschek, D., Schmidt, A., Kosch, T., Shen, C., &amp; Welsch, R. (2024). Performance and Metacognition Disconnect when Reasoning in Human-AI Interaction.</w:t>
-      </w:r>
-      <w:r>
-        <w:t xml:space="preserve"> </w:t>
-      </w:r>
-      <w:r>
-        <w:rPr>
-          <w:i/>
-          <w:iCs/>
-        </w:rPr>
-        <w:t xml:space="preserve">arXiv preprint arXiv:2409.16708</w:t>
-      </w:r>
-      <w:r>
-        <w:t xml:space="preserve">.</w:t>
-      </w:r>
-    </w:p>
-    <w:p>
-      <w:pPr>
-        <w:pStyle w:val="ReferenceEntry"/>
-        <w:spacing w:after="60"/>
-        <w:ind w:left="403" w:hanging="403"/>
-        <w:jc w:val="left"/>
-        <w:keepNext w:val="0"/>
-        <w:keepLines w:val="0"/>
-        <w:widowControl w:val="1"/>
-      </w:pPr>
-      <w:r>
-        <w:rPr>
-          <w:rFonts w:ascii="Georgia" w:hAnsi="Georgia"/>
-          <w:sz w:val="18"/>
-        </w:rPr>
-        <w:t xml:space="preserve">23. </w:t>
-      </w:r>
-      <w:r>
-        <w:t xml:space="preserve">Flavell, J. H. (1979). Metacognition and Cognitive Monitoring: A New Area of Cognitive-Developmental Inquiry.</w:t>
-      </w:r>
-      <w:r>
-        <w:t xml:space="preserve"> </w:t>
-      </w:r>
-      <w:r>
-        <w:rPr>
-          <w:i/>
-          <w:iCs/>
-        </w:rPr>
-        <w:t xml:space="preserve">American Psychologist</w:t>
-      </w:r>
-      <w:r>
-        <w:t xml:space="preserve">, 34(10), 906–911.</w:t>
-      </w:r>
-    </w:p>
-    <w:p>
-      <w:pPr>
-        <w:pStyle w:val="ReferenceEntry"/>
-        <w:spacing w:after="60"/>
-        <w:ind w:left="403" w:hanging="403"/>
-        <w:jc w:val="left"/>
-        <w:keepNext w:val="0"/>
-        <w:keepLines w:val="0"/>
-        <w:widowControl w:val="1"/>
-      </w:pPr>
-      <w:r>
-        <w:rPr>
-          <w:rFonts w:ascii="Georgia" w:hAnsi="Georgia"/>
-          <w:sz w:val="18"/>
-        </w:rPr>
-        <w:t xml:space="preserve">24. </w:t>
-      </w:r>
-      <w:r>
-        <w:t xml:space="preserve">Ganuthula, V. R. R., &amp; Balaraman, K. K. (2025). Artificial Intelligence Quotient Framework for Measuring Human Collaboration with Artificial Intelligence.</w:t>
-      </w:r>
-      <w:r>
-        <w:t xml:space="preserve"> </w:t>
-      </w:r>
-      <w:r>
-        <w:rPr>
-          <w:i/>
-          <w:iCs/>
-        </w:rPr>
-        <w:t xml:space="preserve">Discover Artificial Intelligence</w:t>
-      </w:r>
-      <w:r>
-        <w:t xml:space="preserve">, 5, 268. https://doi.org/10.1007/s44163-025-00516-1</w:t>
-      </w:r>
-    </w:p>
-    <w:p>
-      <w:pPr>
-        <w:pStyle w:val="ReferenceEntry"/>
-        <w:spacing w:after="60"/>
-        <w:ind w:left="403" w:hanging="403"/>
-        <w:jc w:val="left"/>
-        <w:keepNext w:val="0"/>
-        <w:keepLines w:val="0"/>
-        <w:widowControl w:val="1"/>
-      </w:pPr>
-      <w:r>
-        <w:rPr>
-          <w:rFonts w:ascii="Georgia" w:hAnsi="Georgia"/>
-          <w:sz w:val="18"/>
-        </w:rPr>
-        <w:t xml:space="preserve">25. </w:t>
-      </w:r>
-      <w:r>
-        <w:t xml:space="preserve">Gerlich, M. (2025). AI Tools in Society: Impacts on Cognitive Offloading and the Future of Critical Thinking.</w:t>
-      </w:r>
-      <w:r>
-        <w:t xml:space="preserve"> </w:t>
-      </w:r>
-      <w:r>
-        <w:rPr>
-          <w:i/>
-          <w:iCs/>
-        </w:rPr>
-        <w:t xml:space="preserve">Societies</w:t>
-      </w:r>
-      <w:r>
-        <w:t xml:space="preserve">, 15(1), 6.</w:t>
-      </w:r>
-    </w:p>
-    <w:p>
-      <w:pPr>
-        <w:pStyle w:val="ReferenceEntry"/>
-        <w:spacing w:after="60"/>
-        <w:ind w:left="403" w:hanging="403"/>
-        <w:jc w:val="left"/>
-        <w:keepNext w:val="0"/>
-        <w:keepLines w:val="0"/>
-        <w:widowControl w:val="1"/>
-      </w:pPr>
-      <w:r>
-        <w:rPr>
-          <w:rFonts w:ascii="Georgia" w:hAnsi="Georgia"/>
-          <w:sz w:val="18"/>
-        </w:rPr>
-        <w:t xml:space="preserve">26. </w:t>
-      </w:r>
-      <w:r>
-        <w:t xml:space="preserve">Gilson, L. L., &amp; Goldberg, C. B. (2015). Editors' Comment: So, What Is a Conceptual Paper?.</w:t>
-      </w:r>
-      <w:r>
-        <w:t xml:space="preserve"> </w:t>
-      </w:r>
-      <w:r>
-        <w:rPr>
-          <w:i/>
-          <w:iCs/>
-        </w:rPr>
-        <w:t xml:space="preserve">Group &amp; Organization Management</w:t>
-      </w:r>
-      <w:r>
-        <w:t xml:space="preserve">, 40(2), 127–130. https://doi.org/10.1177/1059601115576425</w:t>
-      </w:r>
-    </w:p>
-    <w:p>
-      <w:pPr>
-        <w:pStyle w:val="ReferenceEntry"/>
-        <w:spacing w:after="60"/>
-        <w:ind w:left="403" w:hanging="403"/>
-        <w:jc w:val="left"/>
-        <w:keepNext w:val="0"/>
-        <w:keepLines w:val="0"/>
-        <w:widowControl w:val="1"/>
-      </w:pPr>
-      <w:r>
-        <w:rPr>
-          <w:rFonts w:ascii="Georgia" w:hAnsi="Georgia"/>
-          <w:sz w:val="18"/>
-        </w:rPr>
-        <w:t xml:space="preserve">27. </w:t>
-      </w:r>
-      <w:r>
-        <w:t xml:space="preserve">Große, C. S., &amp; Renkl, A. (2007). Finding and Fixing Errors in Worked Examples: Can This Foster Learning Outcomes?.</w:t>
-      </w:r>
-      <w:r>
-        <w:t xml:space="preserve"> </w:t>
-      </w:r>
-      <w:r>
-        <w:rPr>
-          <w:i/>
-          <w:iCs/>
-        </w:rPr>
-        <w:t xml:space="preserve">Learning and Instruction</w:t>
-      </w:r>
-      <w:r>
-        <w:t xml:space="preserve">, 17(6), 612–634. https://doi.org/10.1016/j.learninstruc.2007.09.008</w:t>
-      </w:r>
-    </w:p>
-    <w:p>
-      <w:pPr>
-        <w:pStyle w:val="ReferenceEntry"/>
-        <w:spacing w:after="60"/>
-        <w:ind w:left="403" w:hanging="403"/>
-        <w:jc w:val="left"/>
-        <w:keepNext w:val="0"/>
-        <w:keepLines w:val="0"/>
-        <w:widowControl w:val="1"/>
-      </w:pPr>
-      <w:r>
-        <w:rPr>
-          <w:rFonts w:ascii="Georgia" w:hAnsi="Georgia"/>
-          <w:sz w:val="18"/>
-        </w:rPr>
-        <w:t xml:space="preserve">28. </w:t>
-      </w:r>
-      <w:r>
-        <w:t xml:space="preserve">Gu, X., &amp; Ericson, B. J. (2025). AI Literacy in K-12 and Higher Education in the Wake of Generative AI: An Integrative Review.</w:t>
-      </w:r>
-      <w:r>
-        <w:t xml:space="preserve"> </w:t>
-      </w:r>
-      <w:r>
-        <w:rPr>
-          <w:i/>
-          <w:iCs/>
-        </w:rPr>
-        <w:t xml:space="preserve">Proceedings of the 2025 ACM Conference on International Computing Education Research (ICER)</w:t>
-      </w:r>
-      <w:r>
-        <w:t xml:space="preserve">, 125–140. https://doi.org/10.1145/3702652.3744217</w:t>
-      </w:r>
-    </w:p>
-    <w:p>
-      <w:pPr>
-        <w:pStyle w:val="ReferenceEntry"/>
-        <w:spacing w:after="60"/>
-        <w:ind w:left="403" w:hanging="403"/>
-        <w:jc w:val="left"/>
-        <w:keepNext w:val="0"/>
-        <w:keepLines w:val="0"/>
-        <w:widowControl w:val="1"/>
-      </w:pPr>
-      <w:r>
-        <w:rPr>
-          <w:rFonts w:ascii="Georgia" w:hAnsi="Georgia"/>
-          <w:sz w:val="18"/>
-        </w:rPr>
-        <w:t xml:space="preserve">29. </w:t>
-      </w:r>
-      <w:r>
-        <w:t xml:space="preserve">Hattie, J., &amp; Timperley, H. (2007). The Power of Feedback.</w:t>
-      </w:r>
-      <w:r>
-        <w:t xml:space="preserve"> </w:t>
-      </w:r>
-      <w:r>
-        <w:rPr>
-          <w:i/>
-          <w:iCs/>
-        </w:rPr>
-        <w:t xml:space="preserve">Review of Educational Research</w:t>
-      </w:r>
-      <w:r>
-        <w:t xml:space="preserve">, 77(1), 81–112.</w:t>
-      </w:r>
-    </w:p>
-    <w:p>
-      <w:pPr>
-        <w:pStyle w:val="ReferenceEntry"/>
-        <w:spacing w:after="60"/>
-        <w:ind w:left="403" w:hanging="403"/>
-        <w:jc w:val="left"/>
-        <w:keepNext w:val="0"/>
-        <w:keepLines w:val="0"/>
-        <w:widowControl w:val="1"/>
-      </w:pPr>
-      <w:r>
-        <w:rPr>
-          <w:rFonts w:ascii="Georgia" w:hAnsi="Georgia"/>
-          <w:sz w:val="18"/>
-        </w:rPr>
-        <w:t xml:space="preserve">30. </w:t>
-      </w:r>
-      <w:r>
-        <w:t xml:space="preserve">Jaakkola, E. (2020). Designing Conceptual Articles: Four Approaches.</w:t>
-      </w:r>
-      <w:r>
-        <w:t xml:space="preserve"> </w:t>
-      </w:r>
-      <w:r>
-        <w:rPr>
-          <w:i/>
-          <w:iCs/>
-        </w:rPr>
-        <w:t xml:space="preserve">AMS Review</w:t>
-      </w:r>
-      <w:r>
-        <w:t xml:space="preserve">, 10, 18–26.</w:t>
-      </w:r>
-    </w:p>
-    <w:p>
-      <w:pPr>
-        <w:pStyle w:val="ReferenceEntry"/>
-        <w:spacing w:after="60"/>
-        <w:ind w:left="403" w:hanging="403"/>
-        <w:jc w:val="left"/>
-        <w:keepNext w:val="0"/>
-        <w:keepLines w:val="0"/>
-        <w:widowControl w:val="1"/>
-      </w:pPr>
-      <w:r>
-        <w:rPr>
-          <w:rFonts w:ascii="Georgia" w:hAnsi="Georgia"/>
-          <w:sz w:val="18"/>
-        </w:rPr>
-        <w:t xml:space="preserve">31. </w:t>
-      </w:r>
-      <w:r>
-        <w:t xml:space="preserve">Jin, Y., Martinez-Maldonado, R., Gašević, D., &amp; Yan, L. (2024). GLAT: The Generative AI Literacy Assessment Test.</w:t>
-      </w:r>
-      <w:r>
-        <w:t xml:space="preserve"> </w:t>
-      </w:r>
-      <w:r>
-        <w:rPr>
-          <w:i/>
-          <w:iCs/>
-        </w:rPr>
-        <w:t xml:space="preserve">arXiv preprint arXiv:2411.00283</w:t>
-      </w:r>
-      <w:r>
-        <w:t xml:space="preserve">.</w:t>
-      </w:r>
-    </w:p>
-    <w:p>
-      <w:pPr>
-        <w:pStyle w:val="ReferenceEntry"/>
-        <w:spacing w:after="60"/>
-        <w:ind w:left="403" w:hanging="403"/>
-        <w:jc w:val="left"/>
-        <w:keepNext w:val="0"/>
-        <w:keepLines w:val="0"/>
-        <w:widowControl w:val="1"/>
-      </w:pPr>
-      <w:r>
-        <w:rPr>
-          <w:rFonts w:ascii="Georgia" w:hAnsi="Georgia"/>
-          <w:sz w:val="18"/>
-        </w:rPr>
-        <w:t xml:space="preserve">32. </w:t>
-      </w:r>
-      <w:r>
-        <w:t xml:space="preserve">Kane, M. T. (2013). Validating the Interpretations and Uses of Test Scores.</w:t>
-      </w:r>
-      <w:r>
-        <w:t xml:space="preserve"> </w:t>
-      </w:r>
-      <w:r>
-        <w:rPr>
-          <w:i/>
-          <w:iCs/>
-        </w:rPr>
-        <w:t xml:space="preserve">Journal of Educational Measurement</w:t>
-      </w:r>
-      <w:r>
-        <w:t xml:space="preserve">, 50(1), 1–73. https://doi.org/10.1111/jedm.12000</w:t>
-      </w:r>
-    </w:p>
-    <w:p>
-      <w:pPr>
-        <w:pStyle w:val="ReferenceEntry"/>
-        <w:spacing w:after="60"/>
-        <w:ind w:left="403" w:hanging="403"/>
-        <w:jc w:val="left"/>
-        <w:keepNext w:val="0"/>
-        <w:keepLines w:val="0"/>
-        <w:widowControl w:val="1"/>
-      </w:pPr>
-      <w:r>
-        <w:rPr>
-          <w:rFonts w:ascii="Georgia" w:hAnsi="Georgia"/>
-          <w:sz w:val="18"/>
-        </w:rPr>
-        <w:t xml:space="preserve">33. </w:t>
-      </w:r>
-      <w:r>
-        <w:t xml:space="preserve">Kapur, M. (2008). Productive Failure.</w:t>
-      </w:r>
-      <w:r>
-        <w:t xml:space="preserve"> </w:t>
-      </w:r>
-      <w:r>
-        <w:rPr>
-          <w:i/>
-          <w:iCs/>
-        </w:rPr>
-        <w:t xml:space="preserve">Cognition and Instruction</w:t>
-      </w:r>
-      <w:r>
-        <w:t xml:space="preserve">, 26(3), 379–424.</w:t>
-      </w:r>
-    </w:p>
-    <w:p>
-      <w:pPr>
-        <w:pStyle w:val="ReferenceEntry"/>
-        <w:spacing w:after="60"/>
-        <w:ind w:left="403" w:hanging="403"/>
-        <w:jc w:val="left"/>
-        <w:keepNext w:val="0"/>
-        <w:keepLines w:val="0"/>
-        <w:widowControl w:val="1"/>
-      </w:pPr>
-      <w:r>
-        <w:rPr>
-          <w:rFonts w:ascii="Georgia" w:hAnsi="Georgia"/>
-          <w:sz w:val="18"/>
-        </w:rPr>
-        <w:t xml:space="preserve">34. </w:t>
-      </w:r>
-      <w:r>
-        <w:t xml:space="preserve">Kim, P., Wang, W., &amp; Bonk, C. J. (2025). Generative AI as a Coach to Help Students Enhance Proficiency in Question Formulation.</w:t>
-      </w:r>
-      <w:r>
-        <w:t xml:space="preserve"> </w:t>
-      </w:r>
-      <w:r>
-        <w:rPr>
-          <w:i/>
-          <w:iCs/>
-        </w:rPr>
-        <w:t xml:space="preserve">Journal of Educational Computing Research</w:t>
-      </w:r>
-      <w:r>
-        <w:t xml:space="preserve">, 63(3), 565–586. https://doi.org/10.1177/07356331251314222</w:t>
-      </w:r>
-    </w:p>
-    <w:p>
-      <w:pPr>
-        <w:pStyle w:val="ReferenceEntry"/>
-        <w:spacing w:after="60"/>
-        <w:ind w:left="403" w:hanging="403"/>
-        <w:jc w:val="left"/>
-        <w:keepNext w:val="0"/>
-        <w:keepLines w:val="0"/>
-        <w:widowControl w:val="1"/>
-      </w:pPr>
-      <w:r>
-        <w:rPr>
-          <w:rFonts w:ascii="Georgia" w:hAnsi="Georgia"/>
-          <w:sz w:val="18"/>
-        </w:rPr>
-        <w:t xml:space="preserve">35. </w:t>
-      </w:r>
-      <w:r>
-        <w:t xml:space="preserve">Kosmyna, N., Hauptmann, E., Yuan, Y. T., Situ, J., Liao, X., Beresnitzky, A. V., Braunstein, I., &amp; Maes, P. (2025). Your Brain on ChatGPT: Accumulation of Cognitive Debt when Using an AI Assistant for Essay Writing Task.</w:t>
-      </w:r>
-      <w:r>
-        <w:t xml:space="preserve"> </w:t>
-      </w:r>
-      <w:r>
-        <w:rPr>
-          <w:i/>
-          <w:iCs/>
-        </w:rPr>
-        <w:t xml:space="preserve">arXiv preprint arXiv:2506.08872</w:t>
-      </w:r>
-      <w:r>
-        <w:t xml:space="preserve">.</w:t>
-      </w:r>
-    </w:p>
-    <w:p>
-      <w:pPr>
-        <w:pStyle w:val="ReferenceEntry"/>
-        <w:spacing w:after="60"/>
-        <w:ind w:left="403" w:hanging="403"/>
-        <w:jc w:val="left"/>
-        <w:keepNext w:val="0"/>
-        <w:keepLines w:val="0"/>
-        <w:widowControl w:val="1"/>
-      </w:pPr>
-      <w:r>
-        <w:rPr>
-          <w:rFonts w:ascii="Georgia" w:hAnsi="Georgia"/>
-          <w:sz w:val="18"/>
-        </w:rPr>
-        <w:t xml:space="preserve">36. </w:t>
-      </w:r>
-      <w:r>
-        <w:t xml:space="preserve">Lee, H., &amp; Bosch, N. (2025). Calibration Discrepancy Predicts Students' Subsequent Metacognitive Strategy Use in Computer-Based Learning Environments.</w:t>
-      </w:r>
-      <w:r>
-        <w:t xml:space="preserve"> </w:t>
-      </w:r>
-      <w:r>
-        <w:rPr>
-          <w:i/>
-          <w:iCs/>
-        </w:rPr>
-        <w:t xml:space="preserve">International Journal of Artificial Intelligence in Education</w:t>
-      </w:r>
-      <w:r>
-        <w:t xml:space="preserve">, 35(6), 3746–3779. https://doi.org/10.1007/s40593-025-00514-5</w:t>
-      </w:r>
-    </w:p>
-    <w:p>
-      <w:pPr>
-        <w:pStyle w:val="ReferenceEntry"/>
-        <w:spacing w:after="60"/>
-        <w:ind w:left="403" w:hanging="403"/>
-        <w:jc w:val="left"/>
-        <w:keepNext w:val="0"/>
-        <w:keepLines w:val="0"/>
-        <w:widowControl w:val="1"/>
-      </w:pPr>
-      <w:r>
-        <w:rPr>
-          <w:rFonts w:ascii="Georgia" w:hAnsi="Georgia"/>
-          <w:sz w:val="18"/>
-        </w:rPr>
-        <w:t xml:space="preserve">37. </w:t>
-      </w:r>
-      <w:r>
-        <w:t xml:space="preserve">Lee, J. D., &amp; See, K. A. (2004). Trust in Automation: Designing for Appropriate Reliance.</w:t>
-      </w:r>
-      <w:r>
-        <w:t xml:space="preserve"> </w:t>
-      </w:r>
-      <w:r>
-        <w:rPr>
-          <w:i/>
-          <w:iCs/>
-        </w:rPr>
-        <w:t xml:space="preserve">Human Factors</w:t>
-      </w:r>
-      <w:r>
-        <w:t xml:space="preserve">, 46(1), 50–80.</w:t>
-      </w:r>
-    </w:p>
-    <w:p>
-      <w:pPr>
-        <w:pStyle w:val="ReferenceEntry"/>
-        <w:spacing w:after="60"/>
-        <w:ind w:left="403" w:hanging="403"/>
-        <w:jc w:val="left"/>
-        <w:keepNext w:val="0"/>
-        <w:keepLines w:val="0"/>
-        <w:widowControl w:val="1"/>
-      </w:pPr>
-      <w:r>
-        <w:rPr>
-          <w:rFonts w:ascii="Georgia" w:hAnsi="Georgia"/>
-          <w:sz w:val="18"/>
-        </w:rPr>
-        <w:t xml:space="preserve">38. </w:t>
-      </w:r>
-      <w:r>
-        <w:t xml:space="preserve">Lee, S. C., Baby, T., Vongvit, R., Lee, J., Kim, Y., Min, C., &amp; Yoon, S. H. (2025). Development and Validation of a Generative AI Competence Scale.</w:t>
-      </w:r>
-      <w:r>
-        <w:t xml:space="preserve"> </w:t>
-      </w:r>
-      <w:r>
-        <w:rPr>
-          <w:i/>
-          <w:iCs/>
-        </w:rPr>
-        <w:t xml:space="preserve">Technology in Society</w:t>
-      </w:r>
-      <w:r>
-        <w:t xml:space="preserve">. https://doi.org/10.1016/j.techsoc.2025.103059</w:t>
-      </w:r>
-    </w:p>
-    <w:p>
-      <w:pPr>
-        <w:pStyle w:val="ReferenceEntry"/>
-        <w:spacing w:after="60"/>
-        <w:ind w:left="403" w:hanging="403"/>
-        <w:jc w:val="left"/>
-        <w:keepNext w:val="0"/>
-        <w:keepLines w:val="0"/>
-        <w:widowControl w:val="1"/>
-      </w:pPr>
-      <w:r>
-        <w:rPr>
-          <w:rFonts w:ascii="Georgia" w:hAnsi="Georgia"/>
-          <w:sz w:val="18"/>
-        </w:rPr>
-        <w:t xml:space="preserve">39. </w:t>
-      </w:r>
-      <w:r>
-        <w:t xml:space="preserve">Li, C., Cui, H., &amp; Hagedorn, L. S. (2026). The Cognitive Impact of ChatGPT in Higher Education: A Systematic Review of Critical and Creative Thinking Outcomes.</w:t>
-      </w:r>
-      <w:r>
-        <w:t xml:space="preserve"> </w:t>
-      </w:r>
-      <w:r>
-        <w:rPr>
-          <w:i/>
-          <w:iCs/>
-        </w:rPr>
-        <w:t xml:space="preserve">Computers and Education: Artificial Intelligence</w:t>
-      </w:r>
-      <w:r>
-        <w:t xml:space="preserve">, 10, 100571. https://doi.org/10.1016/j.caeai.2026.100571</w:t>
-      </w:r>
-    </w:p>
-    <w:p>
-      <w:pPr>
-        <w:pStyle w:val="ReferenceEntry"/>
-        <w:spacing w:after="60"/>
-        <w:ind w:left="403" w:hanging="403"/>
-        <w:jc w:val="left"/>
-        <w:keepNext w:val="0"/>
-        <w:keepLines w:val="0"/>
-        <w:widowControl w:val="1"/>
-      </w:pPr>
-      <w:r>
-        <w:rPr>
-          <w:rFonts w:ascii="Georgia" w:hAnsi="Georgia"/>
-          <w:sz w:val="18"/>
-        </w:rPr>
-        <w:t xml:space="preserve">40. </w:t>
-      </w:r>
-      <w:r>
-        <w:t xml:space="preserve">Lo, L. S. (2023). The CLEAR Path: A Framework for Enhancing Information Literacy through Prompt Engineering.</w:t>
-      </w:r>
-      <w:r>
-        <w:t xml:space="preserve"> </w:t>
-      </w:r>
-      <w:r>
-        <w:rPr>
-          <w:i/>
-          <w:iCs/>
-        </w:rPr>
-        <w:t xml:space="preserve">The Journal of Academic Librarianship</w:t>
-      </w:r>
-      <w:r>
-        <w:t xml:space="preserve">, 49(4).</w:t>
-      </w:r>
-    </w:p>
-    <w:p>
-      <w:pPr>
-        <w:pStyle w:val="ReferenceEntry"/>
-        <w:spacing w:after="60"/>
-        <w:ind w:left="403" w:hanging="403"/>
-        <w:jc w:val="left"/>
-        <w:keepNext w:val="0"/>
-        <w:keepLines w:val="0"/>
-        <w:widowControl w:val="1"/>
-      </w:pPr>
-      <w:r>
-        <w:rPr>
-          <w:rFonts w:ascii="Georgia" w:hAnsi="Georgia"/>
-          <w:sz w:val="18"/>
-        </w:rPr>
-        <w:t xml:space="preserve">41. </w:t>
-      </w:r>
-      <w:r>
-        <w:t xml:space="preserve">Long, D., &amp; Magerko, B. (2020). What Is AI Literacy? Competencies and Design Considerations.</w:t>
-      </w:r>
-      <w:r>
-        <w:t xml:space="preserve"> </w:t>
-      </w:r>
-      <w:r>
-        <w:rPr>
-          <w:i/>
-          <w:iCs/>
-        </w:rPr>
-        <w:t xml:space="preserve">Proceedings of the 2020 CHI Conference on Human Factors in Computing Systems</w:t>
-      </w:r>
-      <w:r>
-        <w:t xml:space="preserve">, 1–16.</w:t>
-      </w:r>
-    </w:p>
-    <w:p>
-      <w:pPr>
-        <w:pStyle w:val="ReferenceEntry"/>
-        <w:spacing w:after="60"/>
-        <w:ind w:left="403" w:hanging="403"/>
-        <w:jc w:val="left"/>
-        <w:keepNext w:val="0"/>
-        <w:keepLines w:val="0"/>
-        <w:widowControl w:val="1"/>
-      </w:pPr>
-      <w:r>
-        <w:rPr>
-          <w:rFonts w:ascii="Georgia" w:hAnsi="Georgia"/>
-          <w:sz w:val="18"/>
-        </w:rPr>
-        <w:t xml:space="preserve">42. </w:t>
-      </w:r>
-      <w:r>
-        <w:t xml:space="preserve">McNichols, H., Ikram, F., &amp; Lan, A. (2025). The StudyChat Dataset: Student Dialogues With ChatGPT in an Artificial Intelligence Course.</w:t>
-      </w:r>
-      <w:r>
-        <w:t xml:space="preserve"> </w:t>
-      </w:r>
-      <w:r>
-        <w:rPr>
-          <w:i/>
-          <w:iCs/>
-        </w:rPr>
-        <w:t xml:space="preserve">arXiv preprint arXiv:2503.07928</w:t>
-      </w:r>
-      <w:r>
-        <w:t xml:space="preserve">. https://doi.org/10.48550/arXiv.2503.07928</w:t>
-      </w:r>
-    </w:p>
-    <w:p>
-      <w:pPr>
-        <w:pStyle w:val="ReferenceEntry"/>
-        <w:spacing w:after="60"/>
-        <w:ind w:left="403" w:hanging="403"/>
-        <w:jc w:val="left"/>
-        <w:keepNext w:val="0"/>
-        <w:keepLines w:val="0"/>
-        <w:widowControl w:val="1"/>
-      </w:pPr>
-      <w:r>
-        <w:rPr>
-          <w:rFonts w:ascii="Georgia" w:hAnsi="Georgia"/>
-          <w:sz w:val="18"/>
-        </w:rPr>
-        <w:t xml:space="preserve">43. </w:t>
-      </w:r>
-      <w:r>
-        <w:t xml:space="preserve">Messick, S. (1995). Validity of Psychological Assessment: Validation of Inferences from Persons' Responses and Performances as Scientific Inquiry into Score Meaning.</w:t>
-      </w:r>
-      <w:r>
-        <w:t xml:space="preserve"> </w:t>
-      </w:r>
-      <w:r>
-        <w:rPr>
-          <w:i/>
-          <w:iCs/>
-        </w:rPr>
-        <w:t xml:space="preserve">American Psychologist</w:t>
-      </w:r>
-      <w:r>
-        <w:t xml:space="preserve">, 50(9), 741–749. https://doi.org/10.1037/0003-066X.50.9.741</w:t>
-      </w:r>
-    </w:p>
-    <w:p>
-      <w:pPr>
-        <w:pStyle w:val="ReferenceEntry"/>
-        <w:spacing w:after="60"/>
-        <w:ind w:left="403" w:hanging="403"/>
-        <w:jc w:val="left"/>
-        <w:keepNext w:val="0"/>
-        <w:keepLines w:val="0"/>
-        <w:widowControl w:val="1"/>
-      </w:pPr>
-      <w:r>
-        <w:rPr>
-          <w:rFonts w:ascii="Georgia" w:hAnsi="Georgia"/>
-          <w:sz w:val="18"/>
-        </w:rPr>
-        <w:t xml:space="preserve">44. </w:t>
-      </w:r>
-      <w:r>
-        <w:t xml:space="preserve">Nazaretsky, T., Gabbay, H., &amp; Käser, T. (2025). Can Students Judge Like Experts? A Large-Scale Study on AI and Human Personalized Formative Feedback.</w:t>
-      </w:r>
-      <w:r>
-        <w:t xml:space="preserve"> </w:t>
-      </w:r>
-      <w:r>
-        <w:rPr>
-          <w:i/>
-          <w:iCs/>
-        </w:rPr>
-        <w:t xml:space="preserve">Computers and Education: Artificial Intelligence</w:t>
-      </w:r>
-      <w:r>
-        <w:t xml:space="preserve">. https://doi.org/10.1016/j.caeai.2025.100533</w:t>
-      </w:r>
-    </w:p>
-    <w:p>
-      <w:pPr>
-        <w:pStyle w:val="ReferenceEntry"/>
-        <w:spacing w:after="60"/>
-        <w:ind w:left="403" w:hanging="403"/>
-        <w:jc w:val="left"/>
-        <w:keepNext w:val="0"/>
-        <w:keepLines w:val="0"/>
-        <w:widowControl w:val="1"/>
-      </w:pPr>
-      <w:r>
-        <w:rPr>
-          <w:rFonts w:ascii="Georgia" w:hAnsi="Georgia"/>
-          <w:sz w:val="18"/>
-        </w:rPr>
-        <w:t xml:space="preserve">45. </w:t>
-      </w:r>
-      <w:r>
-        <w:t xml:space="preserve">Nelson, T. O., &amp; Narens, L. (1990). Metamemory: A Theoretical Framework and New Findings.</w:t>
-      </w:r>
-      <w:r>
-        <w:t xml:space="preserve"> </w:t>
-      </w:r>
-      <w:r>
-        <w:rPr>
-          <w:i/>
-          <w:iCs/>
-        </w:rPr>
-        <w:t xml:space="preserve">The Psychology of Learning and Motivation</w:t>
-      </w:r>
-      <w:r>
-        <w:t xml:space="preserve">, 26, 125–173.</w:t>
-      </w:r>
-    </w:p>
-    <w:p>
-      <w:pPr>
-        <w:pStyle w:val="ReferenceEntry"/>
-        <w:spacing w:after="60"/>
-        <w:ind w:left="403" w:hanging="403"/>
-        <w:jc w:val="left"/>
-        <w:keepNext w:val="0"/>
-        <w:keepLines w:val="0"/>
-        <w:widowControl w:val="1"/>
-      </w:pPr>
-      <w:r>
-        <w:rPr>
-          <w:rFonts w:ascii="Georgia" w:hAnsi="Georgia"/>
-          <w:sz w:val="18"/>
-        </w:rPr>
-        <w:t xml:space="preserve">46. </w:t>
-      </w:r>
-      <w:r>
-        <w:t xml:space="preserve">Parasuraman, R., &amp; Manzey, D. H. (2010). Complacency and Bias in Human Use of Automation: An Attentional Integration.</w:t>
-      </w:r>
-      <w:r>
-        <w:t xml:space="preserve"> </w:t>
-      </w:r>
-      <w:r>
-        <w:rPr>
-          <w:i/>
-          <w:iCs/>
-        </w:rPr>
-        <w:t xml:space="preserve">Human Factors</w:t>
-      </w:r>
-      <w:r>
-        <w:t xml:space="preserve">, 52(3), 381–410.</w:t>
-      </w:r>
-    </w:p>
-    <w:p>
-      <w:pPr>
-        <w:pStyle w:val="ReferenceEntry"/>
-        <w:spacing w:after="60"/>
-        <w:ind w:left="403" w:hanging="403"/>
-        <w:jc w:val="left"/>
-        <w:keepNext w:val="0"/>
-        <w:keepLines w:val="0"/>
-        <w:widowControl w:val="1"/>
-      </w:pPr>
-      <w:r>
-        <w:rPr>
-          <w:rFonts w:ascii="Georgia" w:hAnsi="Georgia"/>
-          <w:sz w:val="18"/>
-        </w:rPr>
-        <w:t xml:space="preserve">47. </w:t>
-      </w:r>
-      <w:r>
-        <w:t xml:space="preserve">Paul, R., &amp; Elder, L. (2006). The Miniature Guide to Critical Thinking: Concepts and Tools.</w:t>
-      </w:r>
-      <w:r>
-        <w:t xml:space="preserve"> </w:t>
-      </w:r>
-      <w:r>
-        <w:rPr>
-          <w:i/>
-          <w:iCs/>
-        </w:rPr>
-        <w:t xml:space="preserve">Foundation for Critical Thinking</w:t>
-      </w:r>
-      <w:r>
-        <w:t xml:space="preserve">.</w:t>
-      </w:r>
-    </w:p>
-    <w:p>
-      <w:pPr>
-        <w:pStyle w:val="ReferenceEntry"/>
-        <w:spacing w:after="60"/>
-        <w:ind w:left="403" w:hanging="403"/>
-        <w:jc w:val="left"/>
-        <w:keepNext w:val="0"/>
-        <w:keepLines w:val="0"/>
-        <w:widowControl w:val="1"/>
-      </w:pPr>
-      <w:r>
-        <w:rPr>
-          <w:rFonts w:ascii="Georgia" w:hAnsi="Georgia"/>
-          <w:sz w:val="18"/>
-        </w:rPr>
-        <w:t xml:space="preserve">48. </w:t>
-      </w:r>
-      <w:r>
-        <w:t xml:space="preserve">Randazzo, B., Lifshitz-Assaf, H., Kellogg, K., Dell'Acqua, F., Mollick, E., Candelon, F., &amp; Lakhani, K. R. (2025). Cyborgs, Centaurs and Self-Automators: Modes of Human-AI Collaboration in Knowledge Work.</w:t>
-      </w:r>
-      <w:r>
-        <w:t xml:space="preserve"> </w:t>
-      </w:r>
-      <w:r>
-        <w:rPr>
-          <w:i/>
-          <w:iCs/>
-        </w:rPr>
-        <w:t xml:space="preserve">Harvard Business School Working Paper 26-036</w:t>
-      </w:r>
-      <w:r>
-        <w:t xml:space="preserve">.</w:t>
-      </w:r>
-    </w:p>
-    <w:p>
-      <w:pPr>
-        <w:pStyle w:val="ReferenceEntry"/>
-        <w:spacing w:after="60"/>
-        <w:ind w:left="403" w:hanging="403"/>
-        <w:jc w:val="left"/>
-        <w:keepNext w:val="0"/>
-        <w:keepLines w:val="0"/>
-        <w:widowControl w:val="1"/>
-      </w:pPr>
-      <w:r>
-        <w:rPr>
-          <w:rFonts w:ascii="Georgia" w:hAnsi="Georgia"/>
-          <w:sz w:val="18"/>
-        </w:rPr>
-        <w:t xml:space="preserve">49. </w:t>
-      </w:r>
-      <w:r>
-        <w:t xml:space="preserve">Runco, M. A., &amp; Chand, I. (1995). Cognition and Creativity.</w:t>
-      </w:r>
-      <w:r>
-        <w:t xml:space="preserve"> </w:t>
-      </w:r>
-      <w:r>
-        <w:rPr>
-          <w:i/>
-          <w:iCs/>
-        </w:rPr>
-        <w:t xml:space="preserve">Educational Psychology Review</w:t>
-      </w:r>
-      <w:r>
-        <w:t xml:space="preserve">, 7(3), 243–267.</w:t>
-      </w:r>
-    </w:p>
-    <w:p>
-      <w:pPr>
-        <w:pStyle w:val="ReferenceEntry"/>
-        <w:spacing w:after="60"/>
-        <w:ind w:left="403" w:hanging="403"/>
-        <w:jc w:val="left"/>
-        <w:keepNext w:val="0"/>
-        <w:keepLines w:val="0"/>
-        <w:widowControl w:val="1"/>
-      </w:pPr>
-      <w:r>
-        <w:rPr>
-          <w:rFonts w:ascii="Georgia" w:hAnsi="Georgia"/>
-          <w:sz w:val="18"/>
-        </w:rPr>
-        <w:t xml:space="preserve">50. </w:t>
-      </w:r>
-      <w:r>
-        <w:t xml:space="preserve">Sadler, D. R. (1989). Formative Assessment and the Design of Instructional Systems.</w:t>
-      </w:r>
-      <w:r>
-        <w:t xml:space="preserve"> </w:t>
-      </w:r>
-      <w:r>
-        <w:rPr>
-          <w:i/>
-          <w:iCs/>
-        </w:rPr>
-        <w:t xml:space="preserve">Instructional Science</w:t>
-      </w:r>
-      <w:r>
-        <w:t xml:space="preserve">, 18(2), 119–144.</w:t>
-      </w:r>
-    </w:p>
-    <w:p>
-      <w:pPr>
-        <w:pStyle w:val="ReferenceEntry"/>
-        <w:spacing w:after="60"/>
-        <w:ind w:left="403" w:hanging="403"/>
-        <w:jc w:val="left"/>
-        <w:keepNext w:val="0"/>
-        <w:keepLines w:val="0"/>
-        <w:widowControl w:val="1"/>
-      </w:pPr>
-      <w:r>
-        <w:rPr>
-          <w:rFonts w:ascii="Georgia" w:hAnsi="Georgia"/>
-          <w:sz w:val="18"/>
-        </w:rPr>
-        <w:t xml:space="preserve">51. </w:t>
-      </w:r>
-      <w:r>
-        <w:t xml:space="preserve">Salomon, G., Perkins, D. N., &amp; Globerson, T. (1991). Partners in Cognition: Extending Human Intelligence with Intelligent Technologies.</w:t>
-      </w:r>
-      <w:r>
-        <w:t xml:space="preserve"> </w:t>
-      </w:r>
-      <w:r>
-        <w:rPr>
-          <w:i/>
-          <w:iCs/>
-        </w:rPr>
-        <w:t xml:space="preserve">Educational Researcher</w:t>
-      </w:r>
-      <w:r>
-        <w:t xml:space="preserve">, 20(3), 2–9.</w:t>
-      </w:r>
-    </w:p>
-    <w:p>
-      <w:pPr>
-        <w:pStyle w:val="ReferenceEntry"/>
-        <w:spacing w:after="60"/>
-        <w:ind w:left="403" w:hanging="403"/>
-        <w:jc w:val="left"/>
-        <w:keepNext w:val="0"/>
-        <w:keepLines w:val="0"/>
-        <w:widowControl w:val="1"/>
-      </w:pPr>
-      <w:r>
-        <w:rPr>
-          <w:rFonts w:ascii="Georgia" w:hAnsi="Georgia"/>
-          <w:sz w:val="18"/>
-        </w:rPr>
-        <w:t xml:space="preserve">52. </w:t>
-      </w:r>
-      <w:r>
-        <w:t xml:space="preserve">Sidra, S., &amp; Mason, C. (2025). Generative AI in Human-AI Collaboration: Validation of the Collaborative AI Literacy and Collaborative AI Metacognition Scales.</w:t>
-      </w:r>
-      <w:r>
-        <w:t xml:space="preserve"> </w:t>
-      </w:r>
-      <w:r>
-        <w:rPr>
-          <w:i/>
-          <w:iCs/>
-        </w:rPr>
-        <w:t xml:space="preserve">International Journal of Human-Computer Interaction</w:t>
-      </w:r>
-      <w:r>
-        <w:t xml:space="preserve">. https://doi.org/10.1080/10447318.2025.2543997</w:t>
-      </w:r>
-    </w:p>
-    <w:p>
-      <w:pPr>
-        <w:pStyle w:val="ReferenceEntry"/>
-        <w:spacing w:after="60"/>
-        <w:ind w:left="403" w:hanging="403"/>
-        <w:jc w:val="left"/>
-        <w:keepNext w:val="0"/>
-        <w:keepLines w:val="0"/>
-        <w:widowControl w:val="1"/>
-      </w:pPr>
-      <w:r>
-        <w:rPr>
-          <w:rFonts w:ascii="Georgia" w:hAnsi="Georgia"/>
-          <w:sz w:val="18"/>
-        </w:rPr>
-        <w:t xml:space="preserve">53. </w:t>
-      </w:r>
-      <w:r>
-        <w:t xml:space="preserve">Sperber, D., Clément, F., Heintz, C., Mascaro, O., Mercier, H., Origgi, G., &amp; Wilson, D. (2010). Epistemic Vigilance.</w:t>
-      </w:r>
-      <w:r>
-        <w:t xml:space="preserve"> </w:t>
-      </w:r>
-      <w:r>
-        <w:rPr>
-          <w:i/>
-          <w:iCs/>
-        </w:rPr>
-        <w:t xml:space="preserve">Mind &amp; Language</w:t>
-      </w:r>
-      <w:r>
-        <w:t xml:space="preserve">, 25(4), 359–393.</w:t>
-      </w:r>
-    </w:p>
-    <w:p>
-      <w:pPr>
-        <w:pStyle w:val="ReferenceEntry"/>
-        <w:spacing w:after="60"/>
-        <w:ind w:left="403" w:hanging="403"/>
-        <w:jc w:val="left"/>
-        <w:keepNext w:val="0"/>
-        <w:keepLines w:val="0"/>
-        <w:widowControl w:val="1"/>
-      </w:pPr>
-      <w:r>
-        <w:rPr>
-          <w:rFonts w:ascii="Georgia" w:hAnsi="Georgia"/>
-          <w:sz w:val="18"/>
-        </w:rPr>
-        <w:t xml:space="preserve">54. </w:t>
-      </w:r>
-      <w:r>
-        <w:t xml:space="preserve">Srinath, S., Vadaparty, A., Smith IV, D. H., Porter, L., &amp; Zingaro, D. (2025). Assessing Problem Decomposition in CS1 for the GenAI Era.</w:t>
-      </w:r>
-      <w:r>
-        <w:t xml:space="preserve"> </w:t>
-      </w:r>
-      <w:r>
-        <w:rPr>
-          <w:i/>
-          <w:iCs/>
-        </w:rPr>
-        <w:t xml:space="preserve">arXiv preprint arXiv:2511.05764</w:t>
-      </w:r>
-      <w:r>
-        <w:t xml:space="preserve">.</w:t>
-      </w:r>
-    </w:p>
-    <w:p>
-      <w:pPr>
-        <w:pStyle w:val="ReferenceEntry"/>
-        <w:spacing w:after="60"/>
-        <w:ind w:left="403" w:hanging="403"/>
-        <w:jc w:val="left"/>
-        <w:keepNext w:val="0"/>
-        <w:keepLines w:val="0"/>
-        <w:widowControl w:val="1"/>
-      </w:pPr>
-      <w:r>
-        <w:rPr>
-          <w:rFonts w:ascii="Georgia" w:hAnsi="Georgia"/>
-          <w:sz w:val="18"/>
-        </w:rPr>
-        <w:t xml:space="preserve">55. </w:t>
-      </w:r>
-      <w:r>
-        <w:t xml:space="preserve">Tankelevitch, L., Kewenig, V., Simkute, A., Scott, A. E., Sarkar, A., Sellen, A., &amp; Rintel, S. (2024). The Metacognitive Demands and Opportunities of Generative AI.</w:t>
-      </w:r>
-      <w:r>
-        <w:t xml:space="preserve"> </w:t>
-      </w:r>
-      <w:r>
-        <w:rPr>
-          <w:i/>
-          <w:iCs/>
-        </w:rPr>
-        <w:t xml:space="preserve">Proceedings of the 2024 CHI Conference on Human Factors in Computing Systems</w:t>
-      </w:r>
-      <w:r>
-        <w:t xml:space="preserve">.</w:t>
-      </w:r>
-    </w:p>
-    <w:p>
-      <w:pPr>
-        <w:pStyle w:val="ReferenceEntry"/>
-        <w:spacing w:after="60"/>
-        <w:ind w:left="403" w:hanging="403"/>
-        <w:jc w:val="left"/>
-        <w:keepNext w:val="0"/>
-        <w:keepLines w:val="0"/>
-        <w:widowControl w:val="1"/>
-      </w:pPr>
-      <w:r>
-        <w:rPr>
-          <w:rFonts w:ascii="Georgia" w:hAnsi="Georgia"/>
-          <w:sz w:val="18"/>
-        </w:rPr>
-        <w:t xml:space="preserve">56. </w:t>
-      </w:r>
-      <w:r>
-        <w:t xml:space="preserve">Tour, E., &amp; Zadorozhnyy, A. (2025). Conceptualizing and Operationalizing Prompt Literacy for English Language Learners.</w:t>
-      </w:r>
-      <w:r>
-        <w:t xml:space="preserve"> </w:t>
-      </w:r>
-      <w:r>
-        <w:rPr>
-          <w:i/>
-          <w:iCs/>
-        </w:rPr>
-        <w:t xml:space="preserve">Journal of Adolescent &amp; Adult Literacy</w:t>
-      </w:r>
-      <w:r>
-        <w:t xml:space="preserve">. https://doi.org/10.1002/jaal.70020</w:t>
-      </w:r>
-    </w:p>
-    <w:p>
-      <w:pPr>
-        <w:pStyle w:val="ReferenceEntry"/>
-        <w:spacing w:after="60"/>
-        <w:ind w:left="403" w:hanging="403"/>
-        <w:jc w:val="left"/>
-        <w:keepNext w:val="0"/>
-        <w:keepLines w:val="0"/>
-        <w:widowControl w:val="1"/>
-      </w:pPr>
-      <w:r>
-        <w:rPr>
-          <w:rFonts w:ascii="Georgia" w:hAnsi="Georgia"/>
-          <w:sz w:val="18"/>
-        </w:rPr>
-        <w:t xml:space="preserve">57. </w:t>
-      </w:r>
-      <w:r>
-        <w:t xml:space="preserve">Vaccaro, M., Almaatouq, A., &amp; Malone, T. (2024). When Combinations of Humans and AI Are Useful: A Systematic Review and Meta-Analysis.</w:t>
-      </w:r>
-      <w:r>
-        <w:t xml:space="preserve"> </w:t>
-      </w:r>
-      <w:r>
-        <w:rPr>
-          <w:i/>
-          <w:iCs/>
-        </w:rPr>
-        <w:t xml:space="preserve">Nature Human Behaviour</w:t>
-      </w:r>
-      <w:r>
-        <w:t xml:space="preserve">, 8, 2293–2303.</w:t>
-      </w:r>
-    </w:p>
-    <w:p>
-      <w:pPr>
-        <w:pStyle w:val="ReferenceEntry"/>
-        <w:spacing w:after="60"/>
-        <w:ind w:left="403" w:hanging="403"/>
-        <w:jc w:val="left"/>
-        <w:keepNext w:val="0"/>
-        <w:keepLines w:val="0"/>
-        <w:widowControl w:val="1"/>
-      </w:pPr>
-      <w:r>
-        <w:rPr>
-          <w:rFonts w:ascii="Georgia" w:hAnsi="Georgia"/>
-          <w:sz w:val="18"/>
-        </w:rPr>
-        <w:t xml:space="preserve">58. </w:t>
-      </w:r>
-      <w:r>
-        <w:t xml:space="preserve">Vygotsky, L. S. (1978). Mind in Society: The Development of Higher Psychological Processes.</w:t>
-      </w:r>
-      <w:r>
-        <w:t xml:space="preserve"> </w:t>
-      </w:r>
-      <w:r>
-        <w:rPr>
-          <w:i/>
-          <w:iCs/>
-        </w:rPr>
-        <w:t xml:space="preserve">Harvard University Press</w:t>
-      </w:r>
-      <w:r>
-        <w:t xml:space="preserve">.</w:t>
-      </w:r>
-    </w:p>
-    <w:p>
-      <w:pPr>
-        <w:pStyle w:val="ReferenceEntry"/>
-        <w:spacing w:after="60"/>
-        <w:ind w:left="403" w:hanging="403"/>
-        <w:jc w:val="left"/>
-        <w:keepNext w:val="0"/>
-        <w:keepLines w:val="0"/>
-        <w:widowControl w:val="1"/>
-      </w:pPr>
-      <w:r>
-        <w:rPr>
-          <w:rFonts w:ascii="Georgia" w:hAnsi="Georgia"/>
-          <w:sz w:val="18"/>
-        </w:rPr>
-        <w:t xml:space="preserve">59. </w:t>
-      </w:r>
-      <w:r>
-        <w:t xml:space="preserve">Walton, J., Bearman, M., Crawford, N., Tai, J., &amp; Boud, D. (2025). How University Students Work on Assessment Tasks with Generative Artificial Intelligence: Matters of Judgement.</w:t>
-      </w:r>
-      <w:r>
-        <w:t xml:space="preserve"> </w:t>
-      </w:r>
-      <w:r>
-        <w:rPr>
-          <w:i/>
-          <w:iCs/>
-        </w:rPr>
-        <w:t xml:space="preserve">Assessment &amp; Evaluation in Higher Education</w:t>
-      </w:r>
-      <w:r>
-        <w:t xml:space="preserve"> </w:t>
-      </w:r>
-      <w:r>
-        <w:t xml:space="preserve">(advance online publication). https://doi.org/10.1080/02602938.2025.2570328</w:t>
-      </w:r>
-    </w:p>
-    <w:p>
-      <w:pPr>
-        <w:pStyle w:val="ReferenceEntry"/>
-        <w:spacing w:after="60"/>
-        <w:ind w:left="403" w:hanging="403"/>
-        <w:jc w:val="left"/>
-        <w:keepNext w:val="0"/>
-        <w:keepLines w:val="0"/>
-        <w:widowControl w:val="1"/>
-      </w:pPr>
-      <w:r>
-        <w:rPr>
-          <w:rFonts w:ascii="Georgia" w:hAnsi="Georgia"/>
-          <w:sz w:val="18"/>
-        </w:rPr>
-        <w:t xml:space="preserve">60. </w:t>
-      </w:r>
-      <w:r>
-        <w:t xml:space="preserve">Wingerter, T. L., Straub, T., &amp; Schweitzer, S. (2025). Mitigating Automation Bias in Generative AI through Nudges: A Cognitive Reflection Test Study.</w:t>
-      </w:r>
-      <w:r>
-        <w:t xml:space="preserve"> </w:t>
-      </w:r>
-      <w:r>
-        <w:rPr>
-          <w:i/>
-          <w:iCs/>
-        </w:rPr>
-        <w:t xml:space="preserve">Procedia Computer Science</w:t>
-      </w:r>
-      <w:r>
-        <w:t xml:space="preserve">, 270, 2106–2114. https://doi.org/10.1016/j.procs.2025.09.331</w:t>
-      </w:r>
-    </w:p>
-    <w:p>
-      <w:pPr>
-        <w:pStyle w:val="ReferenceEntry"/>
-        <w:spacing w:after="60"/>
-        <w:ind w:left="403" w:hanging="403"/>
-        <w:jc w:val="left"/>
-        <w:keepNext w:val="0"/>
-        <w:keepLines w:val="0"/>
-        <w:widowControl w:val="1"/>
-      </w:pPr>
-      <w:r>
-        <w:rPr>
-          <w:rFonts w:ascii="Georgia" w:hAnsi="Georgia"/>
-          <w:sz w:val="18"/>
-        </w:rPr>
-        <w:t xml:space="preserve">61. </w:t>
-      </w:r>
-      <w:r>
-        <w:t xml:space="preserve">Winne, P. H., &amp; Hadwin, A. F. (1998). Studying as Self-Regulated Learning.</w:t>
-      </w:r>
-      <w:r>
-        <w:t xml:space="preserve"> </w:t>
-      </w:r>
-      <w:r>
-        <w:rPr>
-          <w:i/>
-          <w:iCs/>
-        </w:rPr>
-        <w:t xml:space="preserve">Metacognition in Educational Theory and Practice</w:t>
-      </w:r>
-      <w:r>
-        <w:t xml:space="preserve">, 277–304.</w:t>
-      </w:r>
-    </w:p>
-    <w:p>
-      <w:pPr>
-        <w:pStyle w:val="ReferenceEntry"/>
-        <w:spacing w:after="60"/>
-        <w:ind w:left="403" w:hanging="403"/>
-        <w:jc w:val="left"/>
-        <w:keepNext w:val="0"/>
-        <w:keepLines w:val="0"/>
-        <w:widowControl w:val="1"/>
-      </w:pPr>
-      <w:r>
-        <w:rPr>
-          <w:rFonts w:ascii="Georgia" w:hAnsi="Georgia"/>
-          <w:sz w:val="18"/>
-        </w:rPr>
-        <w:t xml:space="preserve">62. </w:t>
-      </w:r>
-      <w:r>
-        <w:t xml:space="preserve">Wirth, J., Weber-Reuter, X.-L., Schuster, C., Fleischer, J., Leutner, D., &amp; Stebner, F. (2025). Far Transfer of Metacognitive Regulation: From Cognitive Learning Strategy Use to Mental Effort Regulation.</w:t>
-      </w:r>
-      <w:r>
-        <w:t xml:space="preserve"> </w:t>
-      </w:r>
-      <w:r>
-        <w:rPr>
-          <w:i/>
-          <w:iCs/>
-        </w:rPr>
-        <w:t xml:space="preserve">Educational Psychology Review</w:t>
-      </w:r>
-      <w:r>
-        <w:t xml:space="preserve">, 37(1), 7. https://doi.org/10.1007/s10648-024-09983-x</w:t>
-      </w:r>
-    </w:p>
-    <w:p>
-      <w:pPr>
-        <w:pStyle w:val="ReferenceEntry"/>
-        <w:spacing w:after="60"/>
-        <w:ind w:left="403" w:hanging="403"/>
-        <w:jc w:val="left"/>
-        <w:keepNext w:val="0"/>
-        <w:keepLines w:val="0"/>
-        <w:widowControl w:val="1"/>
-      </w:pPr>
-      <w:r>
-        <w:rPr>
-          <w:rFonts w:ascii="Georgia" w:hAnsi="Georgia"/>
-          <w:sz w:val="18"/>
-        </w:rPr>
-        <w:t xml:space="preserve">63. </w:t>
-      </w:r>
-      <w:r>
-        <w:t xml:space="preserve">Yao, G., &amp; Fan, L. (2025). Cognitive Load Scale for AI-Assisted L2 Writing: Scale Development and Validation.</w:t>
-      </w:r>
-      <w:r>
-        <w:t xml:space="preserve"> </w:t>
-      </w:r>
-      <w:r>
-        <w:rPr>
-          <w:i/>
-          <w:iCs/>
-        </w:rPr>
-        <w:t xml:space="preserve">Frontiers in Psychology</w:t>
-      </w:r>
-      <w:r>
-        <w:t xml:space="preserve">, 16, 1666974. https://doi.org/10.3389/fpsyg.2025.1666974</w:t>
-      </w:r>
-    </w:p>
-    <w:p>
-      <w:pPr>
-        <w:pStyle w:val="ReferenceEntry"/>
-        <w:spacing w:after="60"/>
-        <w:ind w:left="403" w:hanging="403"/>
-        <w:jc w:val="left"/>
-        <w:keepNext w:val="0"/>
-        <w:keepLines w:val="0"/>
-        <w:widowControl w:val="1"/>
-      </w:pPr>
-      <w:r>
-        <w:rPr>
-          <w:rFonts w:ascii="Georgia" w:hAnsi="Georgia"/>
-          <w:sz w:val="18"/>
-        </w:rPr>
-        <w:t xml:space="preserve">64. </w:t>
-      </w:r>
-      <w:r>
-        <w:t xml:space="preserve">Yavuz, F., Çelik, Ö., &amp; Yavaş Çelik, G. (2025). Utilizing Large Language Models for EFL Essay Grading: An Examination of Reliability and Validity in Rubric-Based Assessments.</w:t>
-      </w:r>
-      <w:r>
-        <w:t xml:space="preserve"> </w:t>
-      </w:r>
-      <w:r>
-        <w:rPr>
-          <w:i/>
-          <w:iCs/>
-        </w:rPr>
-        <w:t xml:space="preserve">British Journal of Educational Technology</w:t>
-      </w:r>
-      <w:r>
-        <w:t xml:space="preserve">, 56(4), 1–17. https://doi.org/10.1111/bjet.13494</w:t>
-      </w:r>
-    </w:p>
-    <w:p>
-      <w:pPr>
-        <w:pStyle w:val="ReferenceEntry"/>
-        <w:spacing w:after="60"/>
-        <w:ind w:left="403" w:hanging="403"/>
-        <w:jc w:val="left"/>
-        <w:keepNext w:val="0"/>
-        <w:keepLines w:val="0"/>
-        <w:widowControl w:val="1"/>
-      </w:pPr>
-      <w:r>
-        <w:rPr>
-          <w:rFonts w:ascii="Georgia" w:hAnsi="Georgia"/>
-          <w:sz w:val="18"/>
-        </w:rPr>
-        <w:t xml:space="preserve">65. </w:t>
-      </w:r>
-      <w:r>
-        <w:t xml:space="preserve">Zimmerman, B. J. (2000). Attaining Self-Regulation: A Social Cognitive Perspective.</w:t>
-      </w:r>
-      <w:r>
-        <w:t xml:space="preserve"> </w:t>
-      </w:r>
-      <w:r>
-        <w:rPr>
-          <w:i/>
-          <w:iCs/>
-        </w:rPr>
-        <w:t xml:space="preserve">Handbook of Self-Regulation</w:t>
-      </w:r>
-      <w:r>
-        <w:t xml:space="preserve">, 13–39.</w:t>
-      </w:r>
-    </w:p>
-    <w:p>
-      <w:pPr>
-        <w:pStyle w:val="ReferenceEntry"/>
-        <w:spacing w:after="60"/>
-        <w:ind w:left="403" w:hanging="403"/>
-        <w:jc w:val="left"/>
-        <w:keepNext w:val="0"/>
-        <w:keepLines w:val="0"/>
-        <w:widowControl w:val="1"/>
-      </w:pPr>
-      <w:r>
-        <w:rPr>
-          <w:rFonts w:ascii="Georgia" w:hAnsi="Georgia"/>
-          <w:sz w:val="18"/>
-        </w:rPr>
-        <w:t xml:space="preserve">66. </w:t>
-      </w:r>
-      <w:r>
-        <w:t xml:space="preserve">UNESCO (2024). AI Competency Framework for Students.</w:t>
-      </w:r>
-      <w:r>
-        <w:t xml:space="preserve"> </w:t>
-      </w:r>
-      <w:r>
-        <w:rPr>
-          <w:i/>
-          <w:iCs/>
-        </w:rPr>
-        <w:t xml:space="preserve">UNESCO</w:t>
-      </w:r>
-      <w:r>
-        <w:t xml:space="preserve">.</w:t>
       </w:r>
     </w:p>
     <w:bookmarkEnd w:id="50"/>
@@ -25722,7 +25722,7 @@
     <w:pPr>
       <w:keepNext w:val="0"/>
       <w:spacing w:after="0" w:before="0" w:line="240" w:lineRule="auto"/>
-      <w:ind w:firstLine="288"/>
+      <w:ind w:firstLine="0"/>
       <w:jc w:val="both"/>
     </w:pPr>
     <w:rPr>

</xml_diff>

<commit_message>
Name the theory CoRe-3, the system CoReasoningLab; add FJS shorthand
Thread consistent naming through the paper:
- CoRe-3 (Co-Reasoning) = the competency-model theory (24 model mentions renamed)
- CoReasoningLab = the runnable system/platform (9 mentions, now one word)
- FJS = shorthand for the three skills (Framing, Judging, Steering)

Define CoRe-3 and FJS at first use in the abstract and Section 1; use FJS in the
Table 1 caption and the Section 3 framework intro. Update the HTML <title>.

paper-reviewer self-consistency + tone pass: 0 blocking, 0 tone hits, 0 em-dashes;
FJS/CoRe-3 glossed before first use; abstract trimmed back to 1487<=1500 chars.
Rebuilt all derived artifacts via build_html.py + build_docx.sh: canaries 7/7
figures embedded, 6 tables, 0 stray "CoReasoning" in both 1-col and 2-col DOCX.
No citations touched (bibtest not required).

Co-Authored-By: Claude Opus 4.8 <noreply@anthropic.com>
</commit_message>
<xml_diff>
--- a/docs/coreasoning-2col.docx
+++ b/docs/coreasoning-2col.docx
@@ -164,7 +164,7 @@
         <w:t xml:space="preserve"> </w:t>
       </w:r>
       <w:r>
-        <w:t xml:space="preserve">a learner's AI use succeeds or fails. We propose</w:t>
+        <w:t xml:space="preserve">AI use succeeds or fails. We propose</w:t>
       </w:r>
       <w:r>
         <w:t xml:space="preserve"> </w:t>
@@ -174,10 +174,13 @@
           <w:b/>
           <w:bCs/>
         </w:rPr>
-        <w:t xml:space="preserve">CoReasoning</w:t>
-      </w:r>
-      <w:r>
-        <w:t xml:space="preserve">, a competency model factoring productive AI use into three assessable skills:</w:t>
+        <w:t xml:space="preserve">CoRe-3</w:t>
+      </w:r>
+      <w:r>
+        <w:t xml:space="preserve"> </w:t>
+      </w:r>
+      <w:r>
+        <w:t xml:space="preserve">(Co-Reasoning), a competency model factoring productive AI use into three assessable skills we abbreviate</w:t>
       </w:r>
       <w:r>
         <w:t xml:space="preserve"> </w:t>
@@ -187,13 +190,10 @@
           <w:b/>
           <w:bCs/>
         </w:rPr>
-        <w:t xml:space="preserve">Framing</w:t>
-      </w:r>
-      <w:r>
-        <w:t xml:space="preserve"> </w:t>
-      </w:r>
-      <w:r>
-        <w:t xml:space="preserve">(specifying an ill-defined task before invoking AI),</w:t>
+        <w:t xml:space="preserve">FJS</w:t>
+      </w:r>
+      <w:r>
+        <w:t xml:space="preserve">:</w:t>
       </w:r>
       <w:r>
         <w:t xml:space="preserve"> </w:t>
@@ -203,13 +203,13 @@
           <w:b/>
           <w:bCs/>
         </w:rPr>
-        <w:t xml:space="preserve">Judging</w:t>
-      </w:r>
-      <w:r>
-        <w:t xml:space="preserve"> </w:t>
-      </w:r>
-      <w:r>
-        <w:t xml:space="preserve">(evaluating output for errors and unstated assumptions), and</w:t>
+        <w:t xml:space="preserve">Framing</w:t>
+      </w:r>
+      <w:r>
+        <w:t xml:space="preserve"> </w:t>
+      </w:r>
+      <w:r>
+        <w:t xml:space="preserve">(specifying an ill-defined task before invoking AI),</w:t>
       </w:r>
       <w:r>
         <w:t xml:space="preserve"> </w:t>
@@ -219,13 +219,13 @@
           <w:b/>
           <w:bCs/>
         </w:rPr>
-        <w:t xml:space="preserve">Steering</w:t>
-      </w:r>
-      <w:r>
-        <w:t xml:space="preserve"> </w:t>
-      </w:r>
-      <w:r>
-        <w:t xml:space="preserve">(iteratively redirecting the model). Its distinguishing claim is the separation of pre-generation Framing from post-generation Steering, with Judging as the gate between. We ground the skills in theory, state five testable propositions, and instantiate them in</w:t>
+        <w:t xml:space="preserve">Judging</w:t>
+      </w:r>
+      <w:r>
+        <w:t xml:space="preserve"> </w:t>
+      </w:r>
+      <w:r>
+        <w:t xml:space="preserve">(evaluating output for errors and unstated assumptions), and</w:t>
       </w:r>
       <w:r>
         <w:t xml:space="preserve"> </w:t>
@@ -235,10 +235,26 @@
           <w:b/>
           <w:bCs/>
         </w:rPr>
-        <w:t xml:space="preserve">CoReasoning Lab</w:t>
-      </w:r>
-      <w:r>
-        <w:t xml:space="preserve">, an open platform that presents flawed AI output and scores the three skills independently. Over simulated learners (generated and graded by different models), the skills dissociate: each tracks its own manipulated competence while flat in the others, and grades become correlated when one competence is shared across all three (convergent and discriminant validity), across grader backends from two providers. Human-rater agreement and outcomes are the next steps; we release the instrument, data, and protocol.</w:t>
+        <w:t xml:space="preserve">Steering</w:t>
+      </w:r>
+      <w:r>
+        <w:t xml:space="preserve"> </w:t>
+      </w:r>
+      <w:r>
+        <w:t xml:space="preserve">(iteratively redirecting the model). Its distinguishing claim is the separation of pre-generation Framing from post-generation Steering, with Judging as the gate between. We ground the skills in theory, state five testable propositions, and instantiate them in</w:t>
+      </w:r>
+      <w:r>
+        <w:t xml:space="preserve"> </w:t>
+      </w:r>
+      <w:r>
+        <w:rPr>
+          <w:b/>
+          <w:bCs/>
+        </w:rPr>
+        <w:t xml:space="preserve">CoReasoningLab</w:t>
+      </w:r>
+      <w:r>
+        <w:t xml:space="preserve">, an open platform that presents flawed AI output and scores them independently. Over simulated learners (generated and graded by different models), the skills dissociate: each tracks its own manipulated competence while flat in the others, and grades become correlated when one competence is shared across all three (convergent and discriminant validity), across grader backends from two providers. Human-rater agreement and outcomes are next; we release the instrument, data, and protocol.</w:t>
       </w:r>
     </w:p>
     <w:p>
@@ -680,7 +696,7 @@
               <a:graphicData uri="http://schemas.openxmlformats.org/drawingml/2006/picture">
                 <pic:pic>
                   <pic:nvPicPr>
-                    <pic:cNvPr descr="C:/Users/apart/AppData/Local/Temp/html2doc_svg_he6DYr/svg_0.png" id="12" name="Picture"/>
+                    <pic:cNvPr descr="C:/Users/apart/AppData/Local/Temp/html2doc_svg_ItCGX9/svg_0.png" id="12" name="Picture"/>
                     <pic:cNvPicPr>
                       <a:picLocks noChangeArrowheads="1" noChangeAspect="1"/>
                     </pic:cNvPicPr>
@@ -741,7 +757,7 @@
           <w:b w:val="0"/>
           <w:i/>
         </w:rPr>
-        <w:t>As models absorb more of the execution, the part of a task a competent person must still own shifts from doing the work toward framing, judging, and steering it; the axes are conceptual, not quantitative. CoReasoning is a decomposition and assessment of that shifting contribution.</w:t>
+        <w:t>As models absorb more of the execution, the part of a task a competent person must still own shifts from doing the work toward framing, judging, and steering it; the axes are conceptual, not quantitative. CoRe-3 is a decomposition and assessment of that shifting contribution.</w:t>
       </w:r>
     </w:p>
     <w:p>
@@ -788,16 +804,32 @@
           <w:b/>
           <w:bCs/>
         </w:rPr>
-        <w:t xml:space="preserve">CoReasoning</w:t>
-      </w:r>
-      <w:r>
-        <w:t xml:space="preserve">, a competency model that decomposes productive work with generative AI into</w:t>
-      </w:r>
-      <w:r>
-        <w:t xml:space="preserve"> </w:t>
-      </w:r>
-      <w:r>
-        <w:t xml:space="preserve">three distinct skills, each independently assessable:</w:t>
+        <w:t xml:space="preserve">CoRe-3</w:t>
+      </w:r>
+      <w:r>
+        <w:t xml:space="preserve"> </w:t>
+      </w:r>
+      <w:r>
+        <w:t xml:space="preserve">(Co-Reasoning), a competency model that decomposes productive work with generative AI into</w:t>
+      </w:r>
+      <w:r>
+        <w:t xml:space="preserve"> </w:t>
+      </w:r>
+      <w:r>
+        <w:t xml:space="preserve">three distinct skills, each independently assessable and collectively abbreviated</w:t>
+      </w:r>
+      <w:r>
+        <w:t xml:space="preserve"> </w:t>
+      </w:r>
+      <w:r>
+        <w:rPr>
+          <w:b/>
+          <w:bCs/>
+        </w:rPr>
+        <w:t xml:space="preserve">FJS</w:t>
+      </w:r>
+      <w:r>
+        <w:t xml:space="preserve">:</w:t>
       </w:r>
     </w:p>
     <w:p>
@@ -1429,11 +1461,11 @@
         <w:t xml:space="preserve"> </w:t>
       </w:r>
       <w:r>
-        <w:t xml:space="preserve">operations are in fact separable in learners. That is the gap CoReasoning addresses.</w:t>
+        <w:t xml:space="preserve">operations are in fact separable in learners. That is the gap CoRe-3 addresses.</w:t>
       </w:r>
     </w:p>
     <w:bookmarkEnd w:id="14"/>
-    <w:bookmarkStart w:id="21" w:name="X633cad0d74cfeb5d5acc5b289e740398e9962c8"/>
+    <w:bookmarkStart w:id="21" w:name="X49d7beb9babb458bb4a3c64984f644552ecde42"/>
     <w:p>
       <w:pPr>
         <w:pStyle w:val="Heading2"/>
@@ -1442,7 +1474,7 @@
         <w:widowControl w:val="1"/>
       </w:pPr>
       <w:r>
-        <w:t xml:space="preserve">3. The CoReasoning framework</w:t>
+        <w:t xml:space="preserve">3. The CoRe-3 framework</w:t>
       </w:r>
     </w:p>
     <w:bookmarkStart w:id="18" w:name="Xe68b6e3303f1e693b99eac37e4ff2b8b0d9c1ec"/>
@@ -1466,7 +1498,7 @@
         <w:widowControl w:val="1"/>
       </w:pPr>
       <w:r>
-        <w:t xml:space="preserve">The three skills are not an arbitrary list; they instantiate a well-understood cognitive</w:t>
+        <w:t xml:space="preserve">The three FJS skills are not an arbitrary list; they instantiate a well-understood cognitive</w:t>
       </w:r>
       <w:r>
         <w:t xml:space="preserve"> </w:t>
@@ -1516,7 +1548,7 @@
         <w:t xml:space="preserve"> </w:t>
       </w:r>
       <w:r>
-        <w:t xml:space="preserve">In CoReasoning, the learner's meta level supervises an object level that is</w:t>
+        <w:t xml:space="preserve">In CoRe-3, the learner's meta level supervises an object level that is</w:t>
       </w:r>
       <w:r>
         <w:t xml:space="preserve"> </w:t>
@@ -1779,12 +1811,12 @@
           <wp:inline>
             <wp:extent cx="6400800" cy="3756991"/>
             <wp:effectExtent b="0" l="0" r="0" t="0"/>
-            <wp:docPr descr="Figure 2. The CoReasoning architecture." title="" id="16" name="Picture"/>
+            <wp:docPr descr="Figure 2. The CoRe-3 architecture." title="" id="16" name="Picture"/>
             <a:graphic>
               <a:graphicData uri="http://schemas.openxmlformats.org/drawingml/2006/picture">
                 <pic:pic>
                   <pic:nvPicPr>
-                    <pic:cNvPr descr="C:/Users/apart/AppData/Local/Temp/html2doc_svg_he6DYr/svg_1.png" id="17" name="Picture"/>
+                    <pic:cNvPr descr="C:/Users/apart/AppData/Local/Temp/html2doc_svg_ItCGX9/svg_1.png" id="17" name="Picture"/>
                     <pic:cNvPicPr>
                       <a:picLocks noChangeArrowheads="1" noChangeAspect="1"/>
                     </pic:cNvPicPr>
@@ -1845,7 +1877,7 @@
           <w:b w:val="0"/>
           <w:i/>
         </w:rPr>
-        <w:t>The CoReasoning loop. An upstream task definition (Framing, a self-regulated-learning forethought activity) sets the standards against which a metacognitive monitor-control cycle (Judging then Steering) supervises a fallible AI at the object level. Judging is the monitor's read-out; Steering is the controller's write.</w:t>
+        <w:t>The CoRe-3 loop. An upstream task definition (Framing, a self-regulated-learning forethought activity) sets the standards against which a metacognitive monitor-control cycle (Judging then Steering) supervises a fallible AI at the object level. Judging is the monitor's read-out; Steering is the controller's write.</w:t>
       </w:r>
     </w:p>
     <w:p>
@@ -1901,7 +1933,7 @@
         <w:t xml:space="preserve"> </w:t>
       </w:r>
       <w:r>
-        <w:t xml:space="preserve">CoReasoning's distinctive move is to separate two operations that prior models fuse: the</w:t>
+        <w:t xml:space="preserve">CoRe-3's distinctive move is to separate two operations that prior models fuse: the</w:t>
       </w:r>
       <w:r>
         <w:t xml:space="preserve"> </w:t>
@@ -2556,7 +2588,7 @@
         <w:t xml:space="preserve"> </w:t>
       </w:r>
       <w:r>
-        <w:t xml:space="preserve">CoReasoning's rejection of speed-to-answer rests on the literature of</w:t>
+        <w:t xml:space="preserve">CoRe-3's rejection of speed-to-answer rests on the literature of</w:t>
       </w:r>
       <w:r>
         <w:t xml:space="preserve"> </w:t>
@@ -2958,7 +2990,7 @@
         <w:widowControl w:val="1"/>
       </w:pPr>
       <w:r>
-        <w:t xml:space="preserve">The constructs that compose CoReasoning are not individually new; what is new is their separation into</w:t>
+        <w:t xml:space="preserve">The constructs that compose CoRe-3 are not individually new; what is new is their separation into</w:t>
       </w:r>
       <w:r>
         <w:t xml:space="preserve"> </w:t>
@@ -3010,7 +3042,7 @@
         <w:t xml:space="preserve"> </w:t>
       </w:r>
       <w:r>
-        <w:t xml:space="preserve">specification and conducting the iterative back-and-forth. CoReasoning's contention is that these are</w:t>
+        <w:t xml:space="preserve">specification and conducting the iterative back-and-forth. CoRe-3's contention is that these are</w:t>
       </w:r>
       <w:r>
         <w:t xml:space="preserve"> </w:t>
@@ -3028,7 +3060,7 @@
         <w:t xml:space="preserve"> </w:t>
       </w:r>
       <w:r>
-        <w:t xml:space="preserve">instructional remedies. CoReasoning also derives its skills from learning theory and an assessment</w:t>
+        <w:t xml:space="preserve">instructional remedies. CoRe-3 also derives its skills from learning theory and an assessment</w:t>
       </w:r>
       <w:r>
         <w:t xml:space="preserve"> </w:t>
@@ -3162,7 +3194,7 @@
         <w:t xml:space="preserve"> </w:t>
       </w:r>
       <w:r>
-        <w:t xml:space="preserve">into a single "prompting" skill is exactly the conflation CoReasoning rejects. Treating them</w:t>
+        <w:t xml:space="preserve">into a single "prompting" skill is exactly the conflation CoRe-3 rejects. Treating them</w:t>
       </w:r>
       <w:r>
         <w:t xml:space="preserve"> </w:t>
@@ -3282,7 +3314,7 @@
         <w:t xml:space="preserve"> </w:t>
       </w:r>
       <w:r>
-        <w:t xml:space="preserve">that partly overlaps Judging. CoReasoning is orthogonal: it specifies the task-execution competencies</w:t>
+        <w:t xml:space="preserve">that partly overlaps Judging. CoRe-3 is orthogonal: it specifies the task-execution competencies</w:t>
       </w:r>
       <w:r>
         <w:t xml:space="preserve"> </w:t>
@@ -3328,7 +3360,7 @@
         <w:t xml:space="preserve"> </w:t>
       </w:r>
       <w:r>
-        <w:t xml:space="preserve">behaviour; CoReasoning supplies the assessable skill decomposition that underlies it.</w:t>
+        <w:t xml:space="preserve">behaviour; CoRe-3 supplies the assessable skill decomposition that underlies it.</w:t>
       </w:r>
     </w:p>
     <w:p>
@@ -3424,7 +3456,7 @@
           <w:b w:val="0"/>
           <w:i/>
         </w:rPr>
-        <w:t>Where prior frameworks place the three CoReasoning skills.</w:t>
+        <w:t>Where prior frameworks place the three FJS skills (Framing, Judging, Steering).</w:t>
       </w:r>
     </w:p>
     <w:tbl>
@@ -4325,7 +4357,7 @@
         <w:t xml:space="preserve"> </w:t>
       </w:r>
       <w:r>
-        <w:t xml:space="preserve">CoReasoning is complementary to this measurement program: it supplies the specific, theory-derived</w:t>
+        <w:t xml:space="preserve">CoRe-3 is complementary to this measurement program: it supplies the specific, theory-derived</w:t>
       </w:r>
       <w:r>
         <w:t xml:space="preserve"> </w:t>
@@ -4505,7 +4537,7 @@
         <w:t xml:space="preserve"> </w:t>
       </w:r>
       <w:r>
-        <w:t xml:space="preserve">judgement specifically for AI output; CoReasoning then departs from a unified-judgement account by</w:t>
+        <w:t xml:space="preserve">judgement specifically for AI output; CoRe-3 then departs from a unified-judgement account by</w:t>
       </w:r>
       <w:r>
         <w:t xml:space="preserve"> </w:t>
@@ -4541,7 +4573,7 @@
         <w:t xml:space="preserve"> </w:t>
       </w:r>
       <w:r>
-        <w:t xml:space="preserve">enumerates eight broad collaboration dimensions (Ganuthula &amp; Balaraman, 2025); CoReasoning instead</w:t>
+        <w:t xml:space="preserve">enumerates eight broad collaboration dimensions (Ganuthula &amp; Balaraman, 2025); CoRe-3 instead</w:t>
       </w:r>
       <w:r>
         <w:t xml:space="preserve"> </w:t>
@@ -4587,7 +4619,7 @@
         <w:t xml:space="preserve"> </w:t>
       </w:r>
       <w:r>
-        <w:t xml:space="preserve">CoReasoning is, to our knowledge, the first theoretically-grounded decomposition</w:t>
+        <w:t xml:space="preserve">CoRe-3 is, to our knowledge, the first theoretically-grounded decomposition</w:t>
       </w:r>
       <w:r>
         <w:t xml:space="preserve"> </w:t>
@@ -4637,7 +4669,7 @@
       </w:r>
     </w:p>
     <w:bookmarkEnd w:id="24"/>
-    <w:bookmarkStart w:id="25" w:name="Xeee0f31b39981a3e100f5aaf50a49be1e1b4285"/>
+    <w:bookmarkStart w:id="25" w:name="Xb469208b37f38982902a67bd55b39b9d5195787"/>
     <w:p>
       <w:pPr>
         <w:pStyle w:val="Heading2"/>
@@ -4646,7 +4678,7 @@
         <w:widowControl w:val="1"/>
       </w:pPr>
       <w:r>
-        <w:t xml:space="preserve">7. The CoReasoning Lab system</w:t>
+        <w:t xml:space="preserve">7. The CoReasoningLab system</w:t>
       </w:r>
     </w:p>
     <w:p>
@@ -4668,7 +4700,7 @@
           <w:i/>
           <w:iCs/>
         </w:rPr>
-        <w:t xml:space="preserve">CoReasoning Lab</w:t>
+        <w:t xml:space="preserve">CoReasoningLab</w:t>
       </w:r>
       <w:r>
         <w:t xml:space="preserve">, a runnable open-source web platform, which we</w:t>
@@ -5265,7 +5297,7 @@
         <w:t xml:space="preserve"> </w:t>
       </w:r>
       <w:r>
-        <w:t xml:space="preserve">2012); CoReasoning generalizes that paradigm from static worked examples to an interactive,</w:t>
+        <w:t xml:space="preserve">2012); CoRe-3 generalizes that paradigm from static worked examples to an interactive,</w:t>
       </w:r>
       <w:r>
         <w:t xml:space="preserve"> </w:t>
@@ -5418,7 +5450,7 @@
         <w:widowControl w:val="1"/>
       </w:pPr>
       <w:r>
-        <w:t xml:space="preserve">The instrument used in this paper is the scoring engine of the CoReasoning Lab platform, a library</w:t>
+        <w:t xml:space="preserve">The instrument used in this paper is the scoring engine of the CoReasoningLab platform, a library</w:t>
       </w:r>
       <w:r>
         <w:t xml:space="preserve"> </w:t>
@@ -8676,7 +8708,7 @@
         <w:t xml:space="preserve"> </w:t>
       </w:r>
       <w:r>
-        <w:t xml:space="preserve">stance: CoReasoning treats the AI as a mediating tool whose purpose is the learner's eventual</w:t>
+        <w:t xml:space="preserve">stance: CoRe-3 treats the AI as a mediating tool whose purpose is the learner's eventual</w:t>
       </w:r>
       <w:r>
         <w:t xml:space="preserve"> </w:t>
@@ -9538,7 +9570,7 @@
         <w:t xml:space="preserve"> </w:t>
       </w:r>
       <w:r>
-        <w:t xml:space="preserve">named and assessed. CoReasoning offers a decomposition of it into three theoretically-grounded,</w:t>
+        <w:t xml:space="preserve">named and assessed. CoRe-3 offers a decomposition of it into three theoretically-grounded,</w:t>
       </w:r>
       <w:r>
         <w:t xml:space="preserve"> </w:t>
@@ -11872,7 +11904,7 @@
         <w:widowControl w:val="1"/>
       </w:pPr>
       <w:r>
-        <w:t xml:space="preserve">Figure A1 shows a single challenge run in CoReasoning Lab, illustrating how the three skills appear as</w:t>
+        <w:t xml:space="preserve">Figure A1 shows a single challenge run in CoReasoningLab, illustrating how the three skills appear as</w:t>
       </w:r>
       <w:r>
         <w:t xml:space="preserve"> </w:t>
@@ -11924,7 +11956,7 @@
           <wp:inline>
             <wp:extent cx="2984601" cy="2403411"/>
             <wp:effectExtent b="0" l="0" r="0" t="0"/>
-            <wp:docPr descr="Figure A1. A CoReasoning Lab challenge run." title="" id="40" name="Picture"/>
+            <wp:docPr descr="Figure A1. A CoReasoningLab challenge run." title="" id="40" name="Picture"/>
             <a:graphic>
               <a:graphicData uri="http://schemas.openxmlformats.org/drawingml/2006/picture">
                 <pic:pic>
@@ -12048,7 +12080,7 @@
           <wp:inline>
             <wp:extent cx="2984601" cy="2215840"/>
             <wp:effectExtent b="0" l="0" r="0" t="0"/>
-            <wp:docPr descr="Figure A2. CoReasoning Lab instructor course analytics." title="" id="43" name="Picture"/>
+            <wp:docPr descr="Figure A2. CoReasoningLab instructor course analytics." title="" id="43" name="Picture"/>
             <a:graphic>
               <a:graphicData uri="http://schemas.openxmlformats.org/drawingml/2006/picture">
                 <pic:pic>
@@ -12155,12 +12187,12 @@
           <wp:inline>
             <wp:extent cx="6400800" cy="4310742"/>
             <wp:effectExtent b="0" l="0" r="0" t="0"/>
-            <wp:docPr descr="Figure A3. Auto-generation and assessment pipeline of the CoReasoning Lab engine." title="" id="46" name="Picture"/>
+            <wp:docPr descr="Figure A3. Auto-generation and assessment pipeline of the CoReasoningLab engine." title="" id="46" name="Picture"/>
             <a:graphic>
               <a:graphicData uri="http://schemas.openxmlformats.org/drawingml/2006/picture">
                 <pic:pic>
                   <pic:nvPicPr>
-                    <pic:cNvPr descr="C:/Users/apart/AppData/Local/Temp/html2doc_svg_he6DYr/svg_2.png" id="47" name="Picture"/>
+                    <pic:cNvPr descr="C:/Users/apart/AppData/Local/Temp/html2doc_svg_ItCGX9/svg_2.png" id="47" name="Picture"/>
                     <pic:cNvPicPr>
                       <a:picLocks noChangeArrowheads="1" noChangeAspect="1"/>
                     </pic:cNvPicPr>
@@ -12660,7 +12692,7 @@
         <w:t xml:space="preserve"> </w:t>
       </w:r>
       <w:r>
-        <w:t xml:space="preserve">sciences, the humanities, law, and professional and education fields. CoReasoning Lab is in this sense</w:t>
+        <w:t xml:space="preserve">sciences, the humanities, law, and professional and education fields. CoReasoningLab is in this sense</w:t>
       </w:r>
       <w:r>
         <w:t xml:space="preserve"> </w:t>

</xml_diff>

<commit_message>
Rebuild DOCX with uniform 9.5pt table cells (header == body)
Regenerate both 1-col and 2-col DOCX after the html2doc font_size_for_table fix.
Every data table now renders at a single 9.5pt size (header bold + shaded, body
regular) instead of the prior 9.5pt-header / 10pt-body split where headers read
smaller than the data they label.

Verified: all 5 data tables UNIFORM at 9.5pt in both builds (XML run-size audit);
render-checked Table 1 (6x4) and the multi-panel Table 3 to PDF -- bold headers
at body size, clean booktabs rules. 7/7 figures embedded, 6 tables intact.

Co-Authored-By: Claude Opus 4.8 <noreply@anthropic.com>
</commit_message>
<xml_diff>
--- a/docs/coreasoning-2col.docx
+++ b/docs/coreasoning-2col.docx
@@ -696,7 +696,7 @@
               <a:graphicData uri="http://schemas.openxmlformats.org/drawingml/2006/picture">
                 <pic:pic>
                   <pic:nvPicPr>
-                    <pic:cNvPr descr="C:/Users/apart/AppData/Local/Temp/html2doc_svg_ItCGX9/svg_0.png" id="12" name="Picture"/>
+                    <pic:cNvPr descr="C:/Users/apart/AppData/Local/Temp/html2doc_svg_R3x6K1/svg_0.png" id="12" name="Picture"/>
                     <pic:cNvPicPr>
                       <a:picLocks noChangeArrowheads="1" noChangeAspect="1"/>
                     </pic:cNvPicPr>
@@ -1816,7 +1816,7 @@
               <a:graphicData uri="http://schemas.openxmlformats.org/drawingml/2006/picture">
                 <pic:pic>
                   <pic:nvPicPr>
-                    <pic:cNvPr descr="C:/Users/apart/AppData/Local/Temp/html2doc_svg_ItCGX9/svg_1.png" id="17" name="Picture"/>
+                    <pic:cNvPr descr="C:/Users/apart/AppData/Local/Temp/html2doc_svg_R3x6K1/svg_1.png" id="17" name="Picture"/>
                     <pic:cNvPicPr>
                       <a:picLocks noChangeArrowheads="1" noChangeAspect="1"/>
                     </pic:cNvPicPr>
@@ -3629,7 +3629,7 @@
             <w:r>
               <w:rPr>
                 <w:rFonts w:ascii="Georgia" w:hAnsi="Georgia"/>
-                <w:sz w:val="20"/>
+                <w:sz w:val="19"/>
               </w:rPr>
               <w:t xml:space="preserve">4D AI Fluency (Dakan &amp; Feller, 2025)</w:t>
             </w:r>
@@ -3657,7 +3657,7 @@
             <w:r>
               <w:rPr>
                 <w:rFonts w:ascii="Georgia" w:hAnsi="Georgia"/>
-                <w:sz w:val="20"/>
+                <w:sz w:val="19"/>
               </w:rPr>
               <w:t xml:space="preserve">Delegation + part of Description</w:t>
             </w:r>
@@ -3685,7 +3685,7 @@
             <w:r>
               <w:rPr>
                 <w:rFonts w:ascii="Georgia" w:hAnsi="Georgia"/>
-                <w:sz w:val="20"/>
+                <w:sz w:val="19"/>
               </w:rPr>
               <w:t xml:space="preserve">Discernment</w:t>
             </w:r>
@@ -3715,21 +3715,21 @@
                 <w:rFonts w:ascii="Georgia" w:hAnsi="Georgia"/>
                 <w:i/>
                 <w:iCs/>
-                <w:sz w:val="20"/>
+                <w:sz w:val="19"/>
               </w:rPr>
               <w:t xml:space="preserve">fused into</w:t>
             </w:r>
             <w:r>
               <w:rPr>
                 <w:rFonts w:ascii="Georgia" w:hAnsi="Georgia"/>
-                <w:sz w:val="20"/>
+                <w:sz w:val="19"/>
               </w:rPr>
               <w:t xml:space="preserve"> </w:t>
             </w:r>
             <w:r>
               <w:rPr>
                 <w:rFonts w:ascii="Georgia" w:hAnsi="Georgia"/>
-                <w:sz w:val="20"/>
+                <w:sz w:val="19"/>
               </w:rPr>
               <w:t xml:space="preserve">Description</w:t>
             </w:r>
@@ -3759,7 +3759,7 @@
             <w:r>
               <w:rPr>
                 <w:rFonts w:ascii="Georgia" w:hAnsi="Georgia"/>
-                <w:sz w:val="20"/>
+                <w:sz w:val="19"/>
               </w:rPr>
               <w:t xml:space="preserve">Metacognitive demands (Tankelevitch et al., 2024)</w:t>
             </w:r>
@@ -3787,7 +3787,7 @@
             <w:r>
               <w:rPr>
                 <w:rFonts w:ascii="Georgia" w:hAnsi="Georgia"/>
-                <w:sz w:val="20"/>
+                <w:sz w:val="19"/>
               </w:rPr>
               <w:t xml:space="preserve">"prompting" (as a demand, not a skill)</w:t>
             </w:r>
@@ -3815,7 +3815,7 @@
             <w:r>
               <w:rPr>
                 <w:rFonts w:ascii="Georgia" w:hAnsi="Georgia"/>
-                <w:sz w:val="20"/>
+                <w:sz w:val="19"/>
               </w:rPr>
               <w:t xml:space="preserve">"evaluating outputs"</w:t>
             </w:r>
@@ -3843,7 +3843,7 @@
             <w:r>
               <w:rPr>
                 <w:rFonts w:ascii="Georgia" w:hAnsi="Georgia"/>
-                <w:sz w:val="20"/>
+                <w:sz w:val="19"/>
               </w:rPr>
               <w:t xml:space="preserve">"workflow iteration"</w:t>
             </w:r>
@@ -3873,7 +3873,7 @@
             <w:r>
               <w:rPr>
                 <w:rFonts w:ascii="Georgia" w:hAnsi="Georgia"/>
-                <w:sz w:val="20"/>
+                <w:sz w:val="19"/>
               </w:rPr>
               <w:t xml:space="preserve">Prompt literacy / CLEAR (Lo, 2023)</w:t>
             </w:r>
@@ -3903,21 +3903,21 @@
                 <w:rFonts w:ascii="Georgia" w:hAnsi="Georgia"/>
                 <w:i/>
                 <w:iCs/>
-                <w:sz w:val="20"/>
+                <w:sz w:val="19"/>
               </w:rPr>
               <w:t xml:space="preserve">fused into</w:t>
             </w:r>
             <w:r>
               <w:rPr>
                 <w:rFonts w:ascii="Georgia" w:hAnsi="Georgia"/>
-                <w:sz w:val="20"/>
+                <w:sz w:val="19"/>
               </w:rPr>
               <w:t xml:space="preserve"> </w:t>
             </w:r>
             <w:r>
               <w:rPr>
                 <w:rFonts w:ascii="Georgia" w:hAnsi="Georgia"/>
-                <w:sz w:val="20"/>
+                <w:sz w:val="19"/>
               </w:rPr>
               <w:t xml:space="preserve">"prompting"</w:t>
             </w:r>
@@ -3945,7 +3945,7 @@
             <w:r>
               <w:rPr>
                 <w:rFonts w:ascii="Georgia" w:hAnsi="Georgia"/>
-                <w:sz w:val="20"/>
+                <w:sz w:val="19"/>
               </w:rPr>
               <w:t xml:space="preserve">weakly present</w:t>
             </w:r>
@@ -3975,21 +3975,21 @@
                 <w:rFonts w:ascii="Georgia" w:hAnsi="Georgia"/>
                 <w:i/>
                 <w:iCs/>
-                <w:sz w:val="20"/>
+                <w:sz w:val="19"/>
               </w:rPr>
               <w:t xml:space="preserve">fused into</w:t>
             </w:r>
             <w:r>
               <w:rPr>
                 <w:rFonts w:ascii="Georgia" w:hAnsi="Georgia"/>
-                <w:sz w:val="20"/>
+                <w:sz w:val="19"/>
               </w:rPr>
               <w:t xml:space="preserve"> </w:t>
             </w:r>
             <w:r>
               <w:rPr>
                 <w:rFonts w:ascii="Georgia" w:hAnsi="Georgia"/>
-                <w:sz w:val="20"/>
+                <w:sz w:val="19"/>
               </w:rPr>
               <w:t xml:space="preserve">"iterative refinement"</w:t>
             </w:r>
@@ -4019,7 +4019,7 @@
             <w:r>
               <w:rPr>
                 <w:rFonts w:ascii="Georgia" w:hAnsi="Georgia"/>
-                <w:sz w:val="20"/>
+                <w:sz w:val="19"/>
               </w:rPr>
               <w:t xml:space="preserve">AI literacy (Long &amp; Magerko, 2020; UNESCO, 2024)</w:t>
             </w:r>
@@ -4047,7 +4047,7 @@
             <w:r>
               <w:rPr>
                 <w:rFonts w:ascii="Georgia" w:hAnsi="Georgia"/>
-                <w:sz w:val="20"/>
+                <w:sz w:val="19"/>
               </w:rPr>
               <w:t xml:space="preserve">absent</w:t>
             </w:r>
@@ -4075,7 +4075,7 @@
             <w:r>
               <w:rPr>
                 <w:rFonts w:ascii="Georgia" w:hAnsi="Georgia"/>
-                <w:sz w:val="20"/>
+                <w:sz w:val="19"/>
               </w:rPr>
               <w:t xml:space="preserve">diffuse "critical evaluation"</w:t>
             </w:r>
@@ -4103,7 +4103,7 @@
             <w:r>
               <w:rPr>
                 <w:rFonts w:ascii="Georgia" w:hAnsi="Georgia"/>
-                <w:sz w:val="20"/>
+                <w:sz w:val="19"/>
               </w:rPr>
               <w:t xml:space="preserve">absent</w:t>
             </w:r>
@@ -4133,7 +4133,7 @@
             <w:r>
               <w:rPr>
                 <w:rFonts w:ascii="Georgia" w:hAnsi="Georgia"/>
-                <w:sz w:val="20"/>
+                <w:sz w:val="19"/>
               </w:rPr>
               <w:t xml:space="preserve">Cyborg/Centaur modes (Randazzo et al., 2025)</w:t>
             </w:r>
@@ -4161,7 +4161,7 @@
             <w:r>
               <w:rPr>
                 <w:rFonts w:ascii="Georgia" w:hAnsi="Georgia"/>
-                <w:sz w:val="20"/>
+                <w:sz w:val="19"/>
               </w:rPr>
               <w:t xml:space="preserve">"directed" mode (described, not assessed)</w:t>
             </w:r>
@@ -4189,7 +4189,7 @@
             <w:r>
               <w:rPr>
                 <w:rFonts w:ascii="Georgia" w:hAnsi="Georgia"/>
-                <w:sz w:val="20"/>
+                <w:sz w:val="19"/>
               </w:rPr>
               <w:t xml:space="preserve">"push back / validate"</w:t>
             </w:r>
@@ -4217,7 +4217,7 @@
             <w:r>
               <w:rPr>
                 <w:rFonts w:ascii="Georgia" w:hAnsi="Georgia"/>
-                <w:sz w:val="20"/>
+                <w:sz w:val="19"/>
               </w:rPr>
               <w:t xml:space="preserve">"continuous dialogue"</w:t>
             </w:r>
@@ -6227,7 +6227,7 @@
                 <w:rFonts w:ascii="Georgia" w:hAnsi="Georgia"/>
                 <w:b/>
                 <w:bCs/>
-                <w:sz w:val="20"/>
+                <w:sz w:val="19"/>
               </w:rPr>
               <w:t xml:space="preserve">Framing</w:t>
             </w:r>
@@ -6257,7 +6257,7 @@
                 <w:rFonts w:ascii="Georgia" w:hAnsi="Georgia"/>
                 <w:b/>
                 <w:bCs/>
-                <w:sz w:val="20"/>
+                <w:sz w:val="19"/>
               </w:rPr>
               <w:t xml:space="preserve">+0.62</w:t>
             </w:r>
@@ -6285,7 +6285,7 @@
             <w:r>
               <w:rPr>
                 <w:rFonts w:ascii="Georgia" w:hAnsi="Georgia"/>
-                <w:sz w:val="20"/>
+                <w:sz w:val="19"/>
               </w:rPr>
               <w:t xml:space="preserve">−0.02</w:t>
             </w:r>
@@ -6313,7 +6313,7 @@
             <w:r>
               <w:rPr>
                 <w:rFonts w:ascii="Georgia" w:hAnsi="Georgia"/>
-                <w:sz w:val="20"/>
+                <w:sz w:val="19"/>
               </w:rPr>
               <w:t xml:space="preserve">−0.07</w:t>
             </w:r>
@@ -6345,7 +6345,7 @@
                 <w:rFonts w:ascii="Georgia" w:hAnsi="Georgia"/>
                 <w:b/>
                 <w:bCs/>
-                <w:sz w:val="20"/>
+                <w:sz w:val="19"/>
               </w:rPr>
               <w:t xml:space="preserve">Judging</w:t>
             </w:r>
@@ -6373,7 +6373,7 @@
             <w:r>
               <w:rPr>
                 <w:rFonts w:ascii="Georgia" w:hAnsi="Georgia"/>
-                <w:sz w:val="20"/>
+                <w:sz w:val="19"/>
               </w:rPr>
               <w:t xml:space="preserve">+0.00</w:t>
             </w:r>
@@ -6403,7 +6403,7 @@
                 <w:rFonts w:ascii="Georgia" w:hAnsi="Georgia"/>
                 <w:b/>
                 <w:bCs/>
-                <w:sz w:val="20"/>
+                <w:sz w:val="19"/>
               </w:rPr>
               <w:t xml:space="preserve">+2.00</w:t>
             </w:r>
@@ -6431,7 +6431,7 @@
             <w:r>
               <w:rPr>
                 <w:rFonts w:ascii="Georgia" w:hAnsi="Georgia"/>
-                <w:sz w:val="20"/>
+                <w:sz w:val="19"/>
               </w:rPr>
               <w:t xml:space="preserve">+0.00</w:t>
             </w:r>
@@ -6463,7 +6463,7 @@
                 <w:rFonts w:ascii="Georgia" w:hAnsi="Georgia"/>
                 <w:b/>
                 <w:bCs/>
-                <w:sz w:val="20"/>
+                <w:sz w:val="19"/>
               </w:rPr>
               <w:t xml:space="preserve">Steering</w:t>
             </w:r>
@@ -6491,7 +6491,7 @@
             <w:r>
               <w:rPr>
                 <w:rFonts w:ascii="Georgia" w:hAnsi="Georgia"/>
-                <w:sz w:val="20"/>
+                <w:sz w:val="19"/>
               </w:rPr>
               <w:t xml:space="preserve">−0.12</w:t>
             </w:r>
@@ -6519,7 +6519,7 @@
             <w:r>
               <w:rPr>
                 <w:rFonts w:ascii="Georgia" w:hAnsi="Georgia"/>
-                <w:sz w:val="20"/>
+                <w:sz w:val="19"/>
               </w:rPr>
               <w:t xml:space="preserve">+0.27</w:t>
             </w:r>
@@ -6549,7 +6549,7 @@
                 <w:rFonts w:ascii="Georgia" w:hAnsi="Georgia"/>
                 <w:b/>
                 <w:bCs/>
-                <w:sz w:val="20"/>
+                <w:sz w:val="19"/>
               </w:rPr>
               <w:t xml:space="preserve">+0.43</w:t>
             </w:r>
@@ -7414,7 +7414,7 @@
             <w:r>
               <w:rPr>
                 <w:rFonts w:ascii="Georgia" w:hAnsi="Georgia"/>
-                <w:sz w:val="20"/>
+                <w:sz w:val="19"/>
               </w:rPr>
               <w:t xml:space="preserve">same skill across gpt-4o, gpt-4o-mini, llama-3.3-70b</w:t>
             </w:r>
@@ -7444,7 +7444,7 @@
                 <w:rFonts w:ascii="Georgia" w:hAnsi="Georgia"/>
                 <w:b/>
                 <w:bCs/>
-                <w:sz w:val="20"/>
+                <w:sz w:val="19"/>
               </w:rPr>
               <w:t xml:space="preserve">+0.57</w:t>
             </w:r>
@@ -7474,7 +7474,7 @@
                 <w:rFonts w:ascii="Georgia" w:hAnsi="Georgia"/>
                 <w:b/>
                 <w:bCs/>
-                <w:sz w:val="20"/>
+                <w:sz w:val="19"/>
               </w:rPr>
               <w:t xml:space="preserve">+0.67</w:t>
             </w:r>
@@ -7502,7 +7502,7 @@
             <w:r>
               <w:rPr>
                 <w:rFonts w:ascii="Georgia" w:hAnsi="Georgia"/>
-                <w:sz w:val="20"/>
+                <w:sz w:val="19"/>
               </w:rPr>
               <w:t xml:space="preserve">+0.21</w:t>
             </w:r>
@@ -7791,7 +7791,7 @@
             <w:r>
               <w:rPr>
                 <w:rFonts w:ascii="Georgia" w:hAnsi="Georgia"/>
-                <w:sz w:val="20"/>
+                <w:sz w:val="19"/>
               </w:rPr>
               <w:t xml:space="preserve">independent (crossed) competences</w:t>
             </w:r>
@@ -7819,7 +7819,7 @@
             <w:r>
               <w:rPr>
                 <w:rFonts w:ascii="Georgia" w:hAnsi="Georgia"/>
-                <w:sz w:val="20"/>
+                <w:sz w:val="19"/>
               </w:rPr>
               <w:t xml:space="preserve">−0.03</w:t>
             </w:r>
@@ -7847,7 +7847,7 @@
             <w:r>
               <w:rPr>
                 <w:rFonts w:ascii="Georgia" w:hAnsi="Georgia"/>
-                <w:sz w:val="20"/>
+                <w:sz w:val="19"/>
               </w:rPr>
               <w:t xml:space="preserve">−0.12</w:t>
             </w:r>
@@ -7875,7 +7875,7 @@
             <w:r>
               <w:rPr>
                 <w:rFonts w:ascii="Georgia" w:hAnsi="Georgia"/>
-                <w:sz w:val="20"/>
+                <w:sz w:val="19"/>
               </w:rPr>
               <w:t xml:space="preserve">+0.25</w:t>
             </w:r>
@@ -7903,14 +7903,14 @@
             <w:r>
               <w:rPr>
                 <w:rFonts w:ascii="Georgia" w:hAnsi="Georgia"/>
-                <w:sz w:val="20"/>
+                <w:sz w:val="19"/>
               </w:rPr>
               <w:t xml:space="preserve">mean</w:t>
             </w:r>
             <w:r>
               <w:rPr>
                 <w:rFonts w:ascii="Georgia" w:hAnsi="Georgia"/>
-                <w:sz w:val="20"/>
+                <w:sz w:val="19"/>
               </w:rPr>
               <w:t xml:space="preserve"> </w:t>
             </w:r>
@@ -7934,14 +7934,14 @@
             <w:r>
               <w:rPr>
                 <w:rFonts w:ascii="Georgia" w:hAnsi="Georgia"/>
-                <w:sz w:val="20"/>
+                <w:sz w:val="19"/>
               </w:rPr>
               <w:t xml:space="preserve"> </w:t>
             </w:r>
             <w:r>
               <w:rPr>
                 <w:rFonts w:ascii="Georgia" w:hAnsi="Georgia"/>
-                <w:sz w:val="20"/>
+                <w:sz w:val="19"/>
               </w:rPr>
               <w:t xml:space="preserve">= 0.13</w:t>
             </w:r>
@@ -7971,7 +7971,7 @@
             <w:r>
               <w:rPr>
                 <w:rFonts w:ascii="Georgia" w:hAnsi="Georgia"/>
-                <w:sz w:val="20"/>
+                <w:sz w:val="19"/>
               </w:rPr>
               <w:t xml:space="preserve">shared single-ability level</w:t>
             </w:r>
@@ -8001,7 +8001,7 @@
                 <w:rFonts w:ascii="Georgia" w:hAnsi="Georgia"/>
                 <w:b/>
                 <w:bCs/>
-                <w:sz w:val="20"/>
+                <w:sz w:val="19"/>
               </w:rPr>
               <w:t xml:space="preserve">+0.52</w:t>
             </w:r>
@@ -8029,7 +8029,7 @@
             <w:r>
               <w:rPr>
                 <w:rFonts w:ascii="Georgia" w:hAnsi="Georgia"/>
-                <w:sz w:val="20"/>
+                <w:sz w:val="19"/>
               </w:rPr>
               <w:t xml:space="preserve">+0.14</w:t>
             </w:r>
@@ -8059,7 +8059,7 @@
                 <w:rFonts w:ascii="Georgia" w:hAnsi="Georgia"/>
                 <w:b/>
                 <w:bCs/>
-                <w:sz w:val="20"/>
+                <w:sz w:val="19"/>
               </w:rPr>
               <w:t xml:space="preserve">+0.56</w:t>
             </w:r>
@@ -8087,14 +8087,14 @@
             <w:r>
               <w:rPr>
                 <w:rFonts w:ascii="Georgia" w:hAnsi="Georgia"/>
-                <w:sz w:val="20"/>
+                <w:sz w:val="19"/>
               </w:rPr>
               <w:t xml:space="preserve">mean</w:t>
             </w:r>
             <w:r>
               <w:rPr>
                 <w:rFonts w:ascii="Georgia" w:hAnsi="Georgia"/>
-                <w:sz w:val="20"/>
+                <w:sz w:val="19"/>
               </w:rPr>
               <w:t xml:space="preserve"> </w:t>
             </w:r>
@@ -8106,14 +8106,14 @@
             <w:r>
               <w:rPr>
                 <w:rFonts w:ascii="Georgia" w:hAnsi="Georgia"/>
-                <w:sz w:val="20"/>
+                <w:sz w:val="19"/>
               </w:rPr>
               <w:t xml:space="preserve"> </w:t>
             </w:r>
             <w:r>
               <w:rPr>
                 <w:rFonts w:ascii="Georgia" w:hAnsi="Georgia"/>
-                <w:sz w:val="20"/>
+                <w:sz w:val="19"/>
               </w:rPr>
               <w:t xml:space="preserve">= +0.41</w:t>
             </w:r>
@@ -12192,7 +12192,7 @@
               <a:graphicData uri="http://schemas.openxmlformats.org/drawingml/2006/picture">
                 <pic:pic>
                   <pic:nvPicPr>
-                    <pic:cNvPr descr="C:/Users/apart/AppData/Local/Temp/html2doc_svg_ItCGX9/svg_2.png" id="47" name="Picture"/>
+                    <pic:cNvPr descr="C:/Users/apart/AppData/Local/Temp/html2doc_svg_R3x6K1/svg_2.png" id="47" name="Picture"/>
                     <pic:cNvPicPr>
                       <a:picLocks noChangeArrowheads="1" noChangeAspect="1"/>
                     </pic:cNvPicPr>
@@ -12871,7 +12871,7 @@
             <w:r>
               <w:rPr>
                 <w:rFonts w:ascii="Georgia" w:hAnsi="Georgia"/>
-                <w:sz w:val="20"/>
+                <w:sz w:val="19"/>
               </w:rPr>
               <w:t xml:space="preserve">STEM</w:t>
             </w:r>
@@ -12899,7 +12899,7 @@
             <w:r>
               <w:rPr>
                 <w:rFonts w:ascii="Georgia" w:hAnsi="Georgia"/>
-                <w:sz w:val="20"/>
+                <w:sz w:val="19"/>
               </w:rPr>
               <w:t xml:space="preserve">Computer Science (algorithms); Physics (classical mechanics); Mathematics (linear algebra); Electrical Engineering (signal processing); Biology (molecular biology)</w:t>
             </w:r>
@@ -12929,7 +12929,7 @@
             <w:r>
               <w:rPr>
                 <w:rFonts w:ascii="Georgia" w:hAnsi="Georgia"/>
-                <w:sz w:val="20"/>
+                <w:sz w:val="19"/>
               </w:rPr>
               <w:t xml:space="preserve">Social sciences</w:t>
             </w:r>
@@ -12957,7 +12957,7 @@
             <w:r>
               <w:rPr>
                 <w:rFonts w:ascii="Georgia" w:hAnsi="Georgia"/>
-                <w:sz w:val="20"/>
+                <w:sz w:val="19"/>
               </w:rPr>
               <w:t xml:space="preserve">Economics (microeconomics); Political Science (international relations); Psychology (cognitive psychology)</w:t>
             </w:r>
@@ -12987,7 +12987,7 @@
             <w:r>
               <w:rPr>
                 <w:rFonts w:ascii="Georgia" w:hAnsi="Georgia"/>
-                <w:sz w:val="20"/>
+                <w:sz w:val="19"/>
               </w:rPr>
               <w:t xml:space="preserve">Humanities and law</w:t>
             </w:r>
@@ -13015,7 +13015,7 @@
             <w:r>
               <w:rPr>
                 <w:rFonts w:ascii="Georgia" w:hAnsi="Georgia"/>
-                <w:sz w:val="20"/>
+                <w:sz w:val="19"/>
               </w:rPr>
               <w:t xml:space="preserve">Philosophy (applied ethics); Law (constitutional law)</w:t>
             </w:r>
@@ -13045,7 +13045,7 @@
             <w:r>
               <w:rPr>
                 <w:rFonts w:ascii="Georgia" w:hAnsi="Georgia"/>
-                <w:sz w:val="20"/>
+                <w:sz w:val="19"/>
               </w:rPr>
               <w:t xml:space="preserve">Professional and education</w:t>
             </w:r>
@@ -13073,7 +13073,7 @@
             <w:r>
               <w:rPr>
                 <w:rFonts w:ascii="Georgia" w:hAnsi="Georgia"/>
-                <w:sz w:val="20"/>
+                <w:sz w:val="19"/>
               </w:rPr>
               <w:t xml:space="preserve">Business (organizational behavior); Education (educational technology)</w:t>
             </w:r>

</xml_diff>